<commit_message>
THE GROUND, revision 4 (Edwin Boston III, 2026-10-28 23:xx): the strong-coupling gap attributed in place
Section 8.1's first feature now names the source of the lattice gaps that are proved directly: at strong coupling, for SU(2) by the theorem of Osterwalder and Seiler (1978), and for every finite gauge group by the theorems checked by the Lean kernel in Section 8.2, whose finite-group form with its explicit coefficients is Edwin Boston III's. The paper names no threshold of the kernel as an SU(2) number and cites no reading of the crossover scale.

No number, quotation or record changed.
</commit_message>
<xml_diff>
--- a/THE-GROUND-Edwin-Boston-III.docx
+++ b/THE-GROUND-Edwin-Boston-III.docx
@@ -156,7 +156,7 @@
     <w:sdt>
       <w:sdtPr>
         <w:alias w:val="Contents"/>
-        <w:id w:val="-836846405"/>
+        <w:id w:val="531461489"/>
       </w:sdtPr>
       <w:sdtEndPr/>
       <w:sdtContent>
@@ -184,7 +184,7 @@
           <w:r>
             <w:fldChar w:fldCharType="separate"/>
           </w:r>
-          <w:hyperlink w:anchor="_Toc244120796" w:history="1">
+          <w:hyperlink w:anchor="_Toc244121032" w:history="1">
             <w:r>
               <w:rPr>
                 <w:rStyle w:val="Hyperlink"/>
@@ -208,7 +208,7 @@
               <w:rPr>
                 <w:noProof/>
               </w:rPr>
-              <w:instrText xml:space="preserve"> PAGEREF _Toc244120796 \h </w:instrText>
+              <w:instrText xml:space="preserve"> PAGEREF _Toc244121032 \h </w:instrText>
             </w:r>
             <w:r>
               <w:rPr>
@@ -250,7 +250,7 @@
               <w14:ligatures w14:val="standardContextual"/>
             </w:rPr>
           </w:pPr>
-          <w:hyperlink w:anchor="_Toc244120797" w:history="1">
+          <w:hyperlink w:anchor="_Toc244121033" w:history="1">
             <w:r>
               <w:rPr>
                 <w:rStyle w:val="Hyperlink"/>
@@ -274,7 +274,7 @@
               <w:rPr>
                 <w:noProof/>
               </w:rPr>
-              <w:instrText xml:space="preserve"> PAGEREF _Toc244120797 \h </w:instrText>
+              <w:instrText xml:space="preserve"> PAGEREF _Toc244121033 \h </w:instrText>
             </w:r>
             <w:r>
               <w:rPr>
@@ -316,7 +316,7 @@
               <w14:ligatures w14:val="standardContextual"/>
             </w:rPr>
           </w:pPr>
-          <w:hyperlink w:anchor="_Toc244120798" w:history="1">
+          <w:hyperlink w:anchor="_Toc244121034" w:history="1">
             <w:r>
               <w:rPr>
                 <w:rStyle w:val="Hyperlink"/>
@@ -340,7 +340,7 @@
               <w:rPr>
                 <w:noProof/>
               </w:rPr>
-              <w:instrText xml:space="preserve"> PAGEREF _Toc244120798 \h </w:instrText>
+              <w:instrText xml:space="preserve"> PAGEREF _Toc244121034 \h </w:instrText>
             </w:r>
             <w:r>
               <w:rPr>
@@ -382,7 +382,7 @@
               <w14:ligatures w14:val="standardContextual"/>
             </w:rPr>
           </w:pPr>
-          <w:hyperlink w:anchor="_Toc244120799" w:history="1">
+          <w:hyperlink w:anchor="_Toc244121035" w:history="1">
             <w:r>
               <w:rPr>
                 <w:rStyle w:val="Hyperlink"/>
@@ -406,7 +406,7 @@
               <w:rPr>
                 <w:noProof/>
               </w:rPr>
-              <w:instrText xml:space="preserve"> PAGEREF _Toc244120799 \h </w:instrText>
+              <w:instrText xml:space="preserve"> PAGEREF _Toc244121035 \h </w:instrText>
             </w:r>
             <w:r>
               <w:rPr>
@@ -448,7 +448,7 @@
               <w14:ligatures w14:val="standardContextual"/>
             </w:rPr>
           </w:pPr>
-          <w:hyperlink w:anchor="_Toc244120800" w:history="1">
+          <w:hyperlink w:anchor="_Toc244121036" w:history="1">
             <w:r>
               <w:rPr>
                 <w:rStyle w:val="Hyperlink"/>
@@ -472,7 +472,7 @@
               <w:rPr>
                 <w:noProof/>
               </w:rPr>
-              <w:instrText xml:space="preserve"> PAGEREF _Toc244120800 \h </w:instrText>
+              <w:instrText xml:space="preserve"> PAGEREF _Toc244121036 \h </w:instrText>
             </w:r>
             <w:r>
               <w:rPr>
@@ -514,7 +514,7 @@
               <w14:ligatures w14:val="standardContextual"/>
             </w:rPr>
           </w:pPr>
-          <w:hyperlink w:anchor="_Toc244120801" w:history="1">
+          <w:hyperlink w:anchor="_Toc244121037" w:history="1">
             <w:r>
               <w:rPr>
                 <w:rStyle w:val="Hyperlink"/>
@@ -538,7 +538,7 @@
               <w:rPr>
                 <w:noProof/>
               </w:rPr>
-              <w:instrText xml:space="preserve"> PAGEREF _Toc244120801 \h </w:instrText>
+              <w:instrText xml:space="preserve"> PAGEREF _Toc244121037 \h </w:instrText>
             </w:r>
             <w:r>
               <w:rPr>
@@ -580,7 +580,7 @@
               <w14:ligatures w14:val="standardContextual"/>
             </w:rPr>
           </w:pPr>
-          <w:hyperlink w:anchor="_Toc244120802" w:history="1">
+          <w:hyperlink w:anchor="_Toc244121038" w:history="1">
             <w:r>
               <w:rPr>
                 <w:rStyle w:val="Hyperlink"/>
@@ -604,7 +604,7 @@
               <w:rPr>
                 <w:noProof/>
               </w:rPr>
-              <w:instrText xml:space="preserve"> PAGEREF _Toc244120802 \h </w:instrText>
+              <w:instrText xml:space="preserve"> PAGEREF _Toc244121038 \h </w:instrText>
             </w:r>
             <w:r>
               <w:rPr>
@@ -646,7 +646,7 @@
               <w14:ligatures w14:val="standardContextual"/>
             </w:rPr>
           </w:pPr>
-          <w:hyperlink w:anchor="_Toc244120803" w:history="1">
+          <w:hyperlink w:anchor="_Toc244121039" w:history="1">
             <w:r>
               <w:rPr>
                 <w:rStyle w:val="Hyperlink"/>
@@ -670,7 +670,7 @@
               <w:rPr>
                 <w:noProof/>
               </w:rPr>
-              <w:instrText xml:space="preserve"> PAGEREF _Toc244120803 \h </w:instrText>
+              <w:instrText xml:space="preserve"> PAGEREF _Toc244121039 \h </w:instrText>
             </w:r>
             <w:r>
               <w:rPr>
@@ -712,7 +712,7 @@
               <w14:ligatures w14:val="standardContextual"/>
             </w:rPr>
           </w:pPr>
-          <w:hyperlink w:anchor="_Toc244120804" w:history="1">
+          <w:hyperlink w:anchor="_Toc244121040" w:history="1">
             <w:r>
               <w:rPr>
                 <w:rStyle w:val="Hyperlink"/>
@@ -736,7 +736,7 @@
               <w:rPr>
                 <w:noProof/>
               </w:rPr>
-              <w:instrText xml:space="preserve"> PAGEREF _Toc244120804 \h </w:instrText>
+              <w:instrText xml:space="preserve"> PAGEREF _Toc244121040 \h </w:instrText>
             </w:r>
             <w:r>
               <w:rPr>
@@ -778,7 +778,7 @@
               <w14:ligatures w14:val="standardContextual"/>
             </w:rPr>
           </w:pPr>
-          <w:hyperlink w:anchor="_Toc244120805" w:history="1">
+          <w:hyperlink w:anchor="_Toc244121041" w:history="1">
             <w:r>
               <w:rPr>
                 <w:rStyle w:val="Hyperlink"/>
@@ -802,7 +802,7 @@
               <w:rPr>
                 <w:noProof/>
               </w:rPr>
-              <w:instrText xml:space="preserve"> PAGEREF _Toc244120805 \h </w:instrText>
+              <w:instrText xml:space="preserve"> PAGEREF _Toc244121041 \h </w:instrText>
             </w:r>
             <w:r>
               <w:rPr>
@@ -844,7 +844,7 @@
               <w14:ligatures w14:val="standardContextual"/>
             </w:rPr>
           </w:pPr>
-          <w:hyperlink w:anchor="_Toc244120806" w:history="1">
+          <w:hyperlink w:anchor="_Toc244121042" w:history="1">
             <w:r>
               <w:rPr>
                 <w:rStyle w:val="Hyperlink"/>
@@ -868,7 +868,7 @@
               <w:rPr>
                 <w:noProof/>
               </w:rPr>
-              <w:instrText xml:space="preserve"> PAGEREF _Toc244120806 \h </w:instrText>
+              <w:instrText xml:space="preserve"> PAGEREF _Toc244121042 \h </w:instrText>
             </w:r>
             <w:r>
               <w:rPr>
@@ -910,7 +910,7 @@
               <w14:ligatures w14:val="standardContextual"/>
             </w:rPr>
           </w:pPr>
-          <w:hyperlink w:anchor="_Toc244120807" w:history="1">
+          <w:hyperlink w:anchor="_Toc244121043" w:history="1">
             <w:r>
               <w:rPr>
                 <w:rStyle w:val="Hyperlink"/>
@@ -934,7 +934,7 @@
               <w:rPr>
                 <w:noProof/>
               </w:rPr>
-              <w:instrText xml:space="preserve"> PAGEREF _Toc244120807 \h </w:instrText>
+              <w:instrText xml:space="preserve"> PAGEREF _Toc244121043 \h </w:instrText>
             </w:r>
             <w:r>
               <w:rPr>
@@ -976,7 +976,7 @@
               <w14:ligatures w14:val="standardContextual"/>
             </w:rPr>
           </w:pPr>
-          <w:hyperlink w:anchor="_Toc244120808" w:history="1">
+          <w:hyperlink w:anchor="_Toc244121044" w:history="1">
             <w:r>
               <w:rPr>
                 <w:rStyle w:val="Hyperlink"/>
@@ -1000,7 +1000,7 @@
               <w:rPr>
                 <w:noProof/>
               </w:rPr>
-              <w:instrText xml:space="preserve"> PAGEREF _Toc244120808 \h </w:instrText>
+              <w:instrText xml:space="preserve"> PAGEREF _Toc244121044 \h </w:instrText>
             </w:r>
             <w:r>
               <w:rPr>
@@ -1042,7 +1042,7 @@
               <w14:ligatures w14:val="standardContextual"/>
             </w:rPr>
           </w:pPr>
-          <w:hyperlink w:anchor="_Toc244120809" w:history="1">
+          <w:hyperlink w:anchor="_Toc244121045" w:history="1">
             <w:r>
               <w:rPr>
                 <w:rStyle w:val="Hyperlink"/>
@@ -1066,7 +1066,7 @@
               <w:rPr>
                 <w:noProof/>
               </w:rPr>
-              <w:instrText xml:space="preserve"> PAGEREF _Toc244120809 \h </w:instrText>
+              <w:instrText xml:space="preserve"> PAGEREF _Toc244121045 \h </w:instrText>
             </w:r>
             <w:r>
               <w:rPr>
@@ -1108,7 +1108,7 @@
               <w14:ligatures w14:val="standardContextual"/>
             </w:rPr>
           </w:pPr>
-          <w:hyperlink w:anchor="_Toc244120810" w:history="1">
+          <w:hyperlink w:anchor="_Toc244121046" w:history="1">
             <w:r>
               <w:rPr>
                 <w:rStyle w:val="Hyperlink"/>
@@ -1132,7 +1132,7 @@
               <w:rPr>
                 <w:noProof/>
               </w:rPr>
-              <w:instrText xml:space="preserve"> PAGEREF _Toc244120810 \h </w:instrText>
+              <w:instrText xml:space="preserve"> PAGEREF _Toc244121046 \h </w:instrText>
             </w:r>
             <w:r>
               <w:rPr>
@@ -1174,7 +1174,7 @@
               <w14:ligatures w14:val="standardContextual"/>
             </w:rPr>
           </w:pPr>
-          <w:hyperlink w:anchor="_Toc244120811" w:history="1">
+          <w:hyperlink w:anchor="_Toc244121047" w:history="1">
             <w:r>
               <w:rPr>
                 <w:rStyle w:val="Hyperlink"/>
@@ -1198,7 +1198,7 @@
               <w:rPr>
                 <w:noProof/>
               </w:rPr>
-              <w:instrText xml:space="preserve"> PAGEREF _Toc244120811 \h </w:instrText>
+              <w:instrText xml:space="preserve"> PAGEREF _Toc244121047 \h </w:instrText>
             </w:r>
             <w:r>
               <w:rPr>
@@ -1240,7 +1240,7 @@
               <w14:ligatures w14:val="standardContextual"/>
             </w:rPr>
           </w:pPr>
-          <w:hyperlink w:anchor="_Toc244120812" w:history="1">
+          <w:hyperlink w:anchor="_Toc244121048" w:history="1">
             <w:r>
               <w:rPr>
                 <w:rStyle w:val="Hyperlink"/>
@@ -1264,7 +1264,7 @@
               <w:rPr>
                 <w:noProof/>
               </w:rPr>
-              <w:instrText xml:space="preserve"> PAGEREF _Toc244120812 \h </w:instrText>
+              <w:instrText xml:space="preserve"> PAGEREF _Toc244121048 \h </w:instrText>
             </w:r>
             <w:r>
               <w:rPr>
@@ -1306,7 +1306,7 @@
               <w14:ligatures w14:val="standardContextual"/>
             </w:rPr>
           </w:pPr>
-          <w:hyperlink w:anchor="_Toc244120813" w:history="1">
+          <w:hyperlink w:anchor="_Toc244121049" w:history="1">
             <w:r>
               <w:rPr>
                 <w:rStyle w:val="Hyperlink"/>
@@ -1330,7 +1330,7 @@
               <w:rPr>
                 <w:noProof/>
               </w:rPr>
-              <w:instrText xml:space="preserve"> PAGEREF _Toc244120813 \h </w:instrText>
+              <w:instrText xml:space="preserve"> PAGEREF _Toc244121049 \h </w:instrText>
             </w:r>
             <w:r>
               <w:rPr>
@@ -1372,7 +1372,7 @@
               <w14:ligatures w14:val="standardContextual"/>
             </w:rPr>
           </w:pPr>
-          <w:hyperlink w:anchor="_Toc244120814" w:history="1">
+          <w:hyperlink w:anchor="_Toc244121050" w:history="1">
             <w:r>
               <w:rPr>
                 <w:rStyle w:val="Hyperlink"/>
@@ -1396,7 +1396,7 @@
               <w:rPr>
                 <w:noProof/>
               </w:rPr>
-              <w:instrText xml:space="preserve"> PAGEREF _Toc244120814 \h </w:instrText>
+              <w:instrText xml:space="preserve"> PAGEREF _Toc244121050 \h </w:instrText>
             </w:r>
             <w:r>
               <w:rPr>
@@ -1438,7 +1438,7 @@
               <w14:ligatures w14:val="standardContextual"/>
             </w:rPr>
           </w:pPr>
-          <w:hyperlink w:anchor="_Toc244120815" w:history="1">
+          <w:hyperlink w:anchor="_Toc244121051" w:history="1">
             <w:r>
               <w:rPr>
                 <w:rStyle w:val="Hyperlink"/>
@@ -1462,7 +1462,7 @@
               <w:rPr>
                 <w:noProof/>
               </w:rPr>
-              <w:instrText xml:space="preserve"> PAGEREF _Toc244120815 \h </w:instrText>
+              <w:instrText xml:space="preserve"> PAGEREF _Toc244121051 \h </w:instrText>
             </w:r>
             <w:r>
               <w:rPr>
@@ -1504,7 +1504,7 @@
               <w14:ligatures w14:val="standardContextual"/>
             </w:rPr>
           </w:pPr>
-          <w:hyperlink w:anchor="_Toc244120816" w:history="1">
+          <w:hyperlink w:anchor="_Toc244121052" w:history="1">
             <w:r>
               <w:rPr>
                 <w:rStyle w:val="Hyperlink"/>
@@ -1528,7 +1528,7 @@
               <w:rPr>
                 <w:noProof/>
               </w:rPr>
-              <w:instrText xml:space="preserve"> PAGEREF _Toc244120816 \h </w:instrText>
+              <w:instrText xml:space="preserve"> PAGEREF _Toc244121052 \h </w:instrText>
             </w:r>
             <w:r>
               <w:rPr>
@@ -1570,7 +1570,7 @@
               <w14:ligatures w14:val="standardContextual"/>
             </w:rPr>
           </w:pPr>
-          <w:hyperlink w:anchor="_Toc244120817" w:history="1">
+          <w:hyperlink w:anchor="_Toc244121053" w:history="1">
             <w:r>
               <w:rPr>
                 <w:rStyle w:val="Hyperlink"/>
@@ -1594,7 +1594,7 @@
               <w:rPr>
                 <w:noProof/>
               </w:rPr>
-              <w:instrText xml:space="preserve"> PAGEREF _Toc244120817 \h </w:instrText>
+              <w:instrText xml:space="preserve"> PAGEREF _Toc244121053 \h </w:instrText>
             </w:r>
             <w:r>
               <w:rPr>
@@ -1636,7 +1636,7 @@
               <w14:ligatures w14:val="standardContextual"/>
             </w:rPr>
           </w:pPr>
-          <w:hyperlink w:anchor="_Toc244120818" w:history="1">
+          <w:hyperlink w:anchor="_Toc244121054" w:history="1">
             <w:r>
               <w:rPr>
                 <w:rStyle w:val="Hyperlink"/>
@@ -1660,7 +1660,7 @@
               <w:rPr>
                 <w:noProof/>
               </w:rPr>
-              <w:instrText xml:space="preserve"> PAGEREF _Toc244120818 \h </w:instrText>
+              <w:instrText xml:space="preserve"> PAGEREF _Toc244121054 \h </w:instrText>
             </w:r>
             <w:r>
               <w:rPr>
@@ -1702,7 +1702,7 @@
               <w14:ligatures w14:val="standardContextual"/>
             </w:rPr>
           </w:pPr>
-          <w:hyperlink w:anchor="_Toc244120819" w:history="1">
+          <w:hyperlink w:anchor="_Toc244121055" w:history="1">
             <w:r>
               <w:rPr>
                 <w:rStyle w:val="Hyperlink"/>
@@ -1726,7 +1726,7 @@
               <w:rPr>
                 <w:noProof/>
               </w:rPr>
-              <w:instrText xml:space="preserve"> PAGEREF _Toc244120819 \h </w:instrText>
+              <w:instrText xml:space="preserve"> PAGEREF _Toc244121055 \h </w:instrText>
             </w:r>
             <w:r>
               <w:rPr>
@@ -1768,7 +1768,7 @@
               <w14:ligatures w14:val="standardContextual"/>
             </w:rPr>
           </w:pPr>
-          <w:hyperlink w:anchor="_Toc244120820" w:history="1">
+          <w:hyperlink w:anchor="_Toc244121056" w:history="1">
             <w:r>
               <w:rPr>
                 <w:rStyle w:val="Hyperlink"/>
@@ -1792,7 +1792,7 @@
               <w:rPr>
                 <w:noProof/>
               </w:rPr>
-              <w:instrText xml:space="preserve"> PAGEREF _Toc244120820 \h </w:instrText>
+              <w:instrText xml:space="preserve"> PAGEREF _Toc244121056 \h </w:instrText>
             </w:r>
             <w:r>
               <w:rPr>
@@ -1834,7 +1834,7 @@
               <w14:ligatures w14:val="standardContextual"/>
             </w:rPr>
           </w:pPr>
-          <w:hyperlink w:anchor="_Toc244120821" w:history="1">
+          <w:hyperlink w:anchor="_Toc244121057" w:history="1">
             <w:r>
               <w:rPr>
                 <w:rStyle w:val="Hyperlink"/>
@@ -1858,7 +1858,7 @@
               <w:rPr>
                 <w:noProof/>
               </w:rPr>
-              <w:instrText xml:space="preserve"> PAGEREF _Toc244120821 \h </w:instrText>
+              <w:instrText xml:space="preserve"> PAGEREF _Toc244121057 \h </w:instrText>
             </w:r>
             <w:r>
               <w:rPr>
@@ -1900,7 +1900,7 @@
               <w14:ligatures w14:val="standardContextual"/>
             </w:rPr>
           </w:pPr>
-          <w:hyperlink w:anchor="_Toc244120822" w:history="1">
+          <w:hyperlink w:anchor="_Toc244121058" w:history="1">
             <w:r>
               <w:rPr>
                 <w:rStyle w:val="Hyperlink"/>
@@ -1924,7 +1924,7 @@
               <w:rPr>
                 <w:noProof/>
               </w:rPr>
-              <w:instrText xml:space="preserve"> PAGEREF _Toc244120822 \h </w:instrText>
+              <w:instrText xml:space="preserve"> PAGEREF _Toc244121058 \h </w:instrText>
             </w:r>
             <w:r>
               <w:rPr>
@@ -1966,7 +1966,7 @@
               <w14:ligatures w14:val="standardContextual"/>
             </w:rPr>
           </w:pPr>
-          <w:hyperlink w:anchor="_Toc244120823" w:history="1">
+          <w:hyperlink w:anchor="_Toc244121059" w:history="1">
             <w:r>
               <w:rPr>
                 <w:rStyle w:val="Hyperlink"/>
@@ -1990,7 +1990,7 @@
               <w:rPr>
                 <w:noProof/>
               </w:rPr>
-              <w:instrText xml:space="preserve"> PAGEREF _Toc244120823 \h </w:instrText>
+              <w:instrText xml:space="preserve"> PAGEREF _Toc244121059 \h </w:instrText>
             </w:r>
             <w:r>
               <w:rPr>
@@ -2032,7 +2032,7 @@
               <w14:ligatures w14:val="standardContextual"/>
             </w:rPr>
           </w:pPr>
-          <w:hyperlink w:anchor="_Toc244120824" w:history="1">
+          <w:hyperlink w:anchor="_Toc244121060" w:history="1">
             <w:r>
               <w:rPr>
                 <w:rStyle w:val="Hyperlink"/>
@@ -2056,7 +2056,7 @@
               <w:rPr>
                 <w:noProof/>
               </w:rPr>
-              <w:instrText xml:space="preserve"> PAGEREF _Toc244120824 \h </w:instrText>
+              <w:instrText xml:space="preserve"> PAGEREF _Toc244121060 \h </w:instrText>
             </w:r>
             <w:r>
               <w:rPr>
@@ -2098,7 +2098,7 @@
               <w14:ligatures w14:val="standardContextual"/>
             </w:rPr>
           </w:pPr>
-          <w:hyperlink w:anchor="_Toc244120825" w:history="1">
+          <w:hyperlink w:anchor="_Toc244121061" w:history="1">
             <w:r>
               <w:rPr>
                 <w:rStyle w:val="Hyperlink"/>
@@ -2122,7 +2122,7 @@
               <w:rPr>
                 <w:noProof/>
               </w:rPr>
-              <w:instrText xml:space="preserve"> PAGEREF _Toc244120825 \h </w:instrText>
+              <w:instrText xml:space="preserve"> PAGEREF _Toc244121061 \h </w:instrText>
             </w:r>
             <w:r>
               <w:rPr>
@@ -2164,7 +2164,7 @@
               <w14:ligatures w14:val="standardContextual"/>
             </w:rPr>
           </w:pPr>
-          <w:hyperlink w:anchor="_Toc244120826" w:history="1">
+          <w:hyperlink w:anchor="_Toc244121062" w:history="1">
             <w:r>
               <w:rPr>
                 <w:rStyle w:val="Hyperlink"/>
@@ -2188,7 +2188,7 @@
               <w:rPr>
                 <w:noProof/>
               </w:rPr>
-              <w:instrText xml:space="preserve"> PAGEREF _Toc244120826 \h </w:instrText>
+              <w:instrText xml:space="preserve"> PAGEREF _Toc244121062 \h </w:instrText>
             </w:r>
             <w:r>
               <w:rPr>
@@ -2230,7 +2230,7 @@
               <w14:ligatures w14:val="standardContextual"/>
             </w:rPr>
           </w:pPr>
-          <w:hyperlink w:anchor="_Toc244120827" w:history="1">
+          <w:hyperlink w:anchor="_Toc244121063" w:history="1">
             <w:r>
               <w:rPr>
                 <w:rStyle w:val="Hyperlink"/>
@@ -2254,7 +2254,7 @@
               <w:rPr>
                 <w:noProof/>
               </w:rPr>
-              <w:instrText xml:space="preserve"> PAGEREF _Toc244120827 \h </w:instrText>
+              <w:instrText xml:space="preserve"> PAGEREF _Toc244121063 \h </w:instrText>
             </w:r>
             <w:r>
               <w:rPr>
@@ -2296,7 +2296,7 @@
               <w14:ligatures w14:val="standardContextual"/>
             </w:rPr>
           </w:pPr>
-          <w:hyperlink w:anchor="_Toc244120828" w:history="1">
+          <w:hyperlink w:anchor="_Toc244121064" w:history="1">
             <w:r>
               <w:rPr>
                 <w:rStyle w:val="Hyperlink"/>
@@ -2320,7 +2320,7 @@
               <w:rPr>
                 <w:noProof/>
               </w:rPr>
-              <w:instrText xml:space="preserve"> PAGEREF _Toc244120828 \h </w:instrText>
+              <w:instrText xml:space="preserve"> PAGEREF _Toc244121064 \h </w:instrText>
             </w:r>
             <w:r>
               <w:rPr>
@@ -2362,7 +2362,7 @@
               <w14:ligatures w14:val="standardContextual"/>
             </w:rPr>
           </w:pPr>
-          <w:hyperlink w:anchor="_Toc244120829" w:history="1">
+          <w:hyperlink w:anchor="_Toc244121065" w:history="1">
             <w:r>
               <w:rPr>
                 <w:rStyle w:val="Hyperlink"/>
@@ -2386,7 +2386,7 @@
               <w:rPr>
                 <w:noProof/>
               </w:rPr>
-              <w:instrText xml:space="preserve"> PAGEREF _Toc244120829 \h </w:instrText>
+              <w:instrText xml:space="preserve"> PAGEREF _Toc244121065 \h </w:instrText>
             </w:r>
             <w:r>
               <w:rPr>
@@ -2428,7 +2428,7 @@
               <w14:ligatures w14:val="standardContextual"/>
             </w:rPr>
           </w:pPr>
-          <w:hyperlink w:anchor="_Toc244120830" w:history="1">
+          <w:hyperlink w:anchor="_Toc244121066" w:history="1">
             <w:r>
               <w:rPr>
                 <w:rStyle w:val="Hyperlink"/>
@@ -2452,7 +2452,7 @@
               <w:rPr>
                 <w:noProof/>
               </w:rPr>
-              <w:instrText xml:space="preserve"> PAGEREF _Toc244120830 \h </w:instrText>
+              <w:instrText xml:space="preserve"> PAGEREF _Toc244121066 \h </w:instrText>
             </w:r>
             <w:r>
               <w:rPr>
@@ -2493,7 +2493,7 @@
         <w:pageBreakBefore/>
         <w:spacing w:before="0"/>
       </w:pPr>
-      <w:bookmarkStart w:id="0" w:name="_Toc244120796"/>
+      <w:bookmarkStart w:id="0" w:name="_Toc244121032"/>
       <w:r>
         <w:t>1.  Introduction</w:t>
       </w:r>
@@ -2629,7 +2629,7 @@
         <w:pStyle w:val="Heading1"/>
         <w:keepNext/>
       </w:pPr>
-      <w:bookmarkStart w:id="1" w:name="_Toc244120797"/>
+      <w:bookmarkStart w:id="1" w:name="_Toc244121033"/>
       <w:r>
         <w:t>2.  The Ground Theorem</w:t>
       </w:r>
@@ -2890,7 +2890,7 @@
         <w:pStyle w:val="Heading1"/>
         <w:keepNext/>
       </w:pPr>
-      <w:bookmarkStart w:id="2" w:name="_Toc244120798"/>
+      <w:bookmarkStart w:id="2" w:name="_Toc244121034"/>
       <w:r>
         <w:t>3.  What the Problem Demands</w:t>
       </w:r>
@@ -2901,7 +2901,7 @@
         <w:pStyle w:val="Heading2"/>
         <w:keepNext/>
       </w:pPr>
-      <w:bookmarkStart w:id="3" w:name="_Toc244120799"/>
+      <w:bookmarkStart w:id="3" w:name="_Toc244121035"/>
       <w:r>
         <w:t>3.1  Euclidean fields and the axioms of Osterwalder and Schrader</w:t>
       </w:r>
@@ -4031,7 +4031,7 @@
         <w:pStyle w:val="Heading2"/>
         <w:keepNext/>
       </w:pPr>
-      <w:bookmarkStart w:id="4" w:name="_Toc244120800"/>
+      <w:bookmarkStart w:id="4" w:name="_Toc244121036"/>
       <w:r>
         <w:t>3.2  The mass gap</w:t>
       </w:r>
@@ -4103,7 +4103,7 @@
         <w:pStyle w:val="Heading2"/>
         <w:keepNext/>
       </w:pPr>
-      <w:bookmarkStart w:id="5" w:name="_Toc244120801"/>
+      <w:bookmarkStart w:id="5" w:name="_Toc244121037"/>
       <w:r>
         <w:t>3.3  Non-triviality</w:t>
       </w:r>
@@ -4182,7 +4182,7 @@
         <w:pStyle w:val="Heading2"/>
         <w:keepNext/>
       </w:pPr>
-      <w:bookmarkStart w:id="6" w:name="_Toc244120802"/>
+      <w:bookmarkStart w:id="6" w:name="_Toc244121038"/>
       <w:r>
         <w:t>3.4  Limits obtained by compactness</w:t>
       </w:r>
@@ -4261,7 +4261,7 @@
         <w:pStyle w:val="Heading1"/>
         <w:keepNext/>
       </w:pPr>
-      <w:bookmarkStart w:id="7" w:name="_Toc244120803"/>
+      <w:bookmarkStart w:id="7" w:name="_Toc244121039"/>
       <w:r>
         <w:t>4.  The Lattice, Its Positivity and Its Gap</w:t>
       </w:r>
@@ -4272,7 +4272,7 @@
         <w:pStyle w:val="Heading2"/>
         <w:keepNext/>
       </w:pPr>
-      <w:bookmarkStart w:id="8" w:name="_Toc244120804"/>
+      <w:bookmarkStart w:id="8" w:name="_Toc244121040"/>
       <w:r>
         <w:t>4.1  Wilson's theory</w:t>
       </w:r>
@@ -4894,7 +4894,7 @@
         <w:pStyle w:val="Heading2"/>
         <w:keepNext/>
       </w:pPr>
-      <w:bookmarkStart w:id="9" w:name="_Toc244120805"/>
+      <w:bookmarkStart w:id="9" w:name="_Toc244121041"/>
       <w:r>
         <w:t>4.2  Reflection positivity and the transfer matrix</w:t>
       </w:r>
@@ -5930,7 +5930,7 @@
         <w:pStyle w:val="Heading2"/>
         <w:keepNext/>
       </w:pPr>
-      <w:bookmarkStart w:id="10" w:name="_Toc244120806"/>
+      <w:bookmarkStart w:id="10" w:name="_Toc244121042"/>
       <w:r>
         <w:t>4.3  The renormalisation group of Bałaban</w:t>
       </w:r>
@@ -5971,7 +5971,7 @@
         <w:pStyle w:val="Heading1"/>
         <w:keepNext/>
       </w:pPr>
-      <w:bookmarkStart w:id="11" w:name="_Toc244120807"/>
+      <w:bookmarkStart w:id="11" w:name="_Toc244121043"/>
       <w:r>
         <w:t>5.  The Three-Dimensional Manuscripts</w:t>
       </w:r>
@@ -5995,7 +5995,7 @@
         <w:pStyle w:val="Heading2"/>
         <w:keepNext/>
       </w:pPr>
-      <w:bookmarkStart w:id="12" w:name="_Toc244120808"/>
+      <w:bookmarkStart w:id="12" w:name="_Toc244121044"/>
       <w:r>
         <w:t>5.1  The documents</w:t>
       </w:r>
@@ -6042,7 +6042,7 @@
         <w:pStyle w:val="Heading2"/>
         <w:keepNext/>
       </w:pPr>
-      <w:bookmarkStart w:id="13" w:name="_Toc244120809"/>
+      <w:bookmarkStart w:id="13" w:name="_Toc244121045"/>
       <w:r>
         <w:t>5.2  The observable</w:t>
       </w:r>
@@ -6446,7 +6446,7 @@
         <w:pStyle w:val="Heading2"/>
         <w:keepNext/>
       </w:pPr>
-      <w:bookmarkStart w:id="14" w:name="_Toc244120810"/>
+      <w:bookmarkStart w:id="14" w:name="_Toc244121046"/>
       <w:r>
         <w:t>5.3  The torus, the infinite volume and the components</w:t>
       </w:r>
@@ -6977,7 +6977,7 @@
         <w:pStyle w:val="Heading2"/>
         <w:keepNext/>
       </w:pPr>
-      <w:bookmarkStart w:id="15" w:name="_Toc244120811"/>
+      <w:bookmarkStart w:id="15" w:name="_Toc244121047"/>
       <w:r>
         <w:t>5.4  The axioms and the reconstruction</w:t>
       </w:r>
@@ -7207,7 +7207,7 @@
         <w:pStyle w:val="Heading2"/>
         <w:keepNext/>
       </w:pPr>
-      <w:bookmarkStart w:id="16" w:name="_Toc244120812"/>
+      <w:bookmarkStart w:id="16" w:name="_Toc244121048"/>
       <w:r>
         <w:t>5.5  Non-triviality</w:t>
       </w:r>
@@ -7748,7 +7748,7 @@
         <w:pStyle w:val="Heading2"/>
         <w:keepNext/>
       </w:pPr>
-      <w:bookmarkStart w:id="17" w:name="_Toc244120813"/>
+      <w:bookmarkStart w:id="17" w:name="_Toc244121049"/>
       <w:r>
         <w:t>5.6  What the manuscript does not assert</w:t>
       </w:r>
@@ -7796,7 +7796,7 @@
         <w:pStyle w:val="Heading1"/>
         <w:keepNext/>
       </w:pPr>
-      <w:bookmarkStart w:id="18" w:name="_Toc244120814"/>
+      <w:bookmarkStart w:id="18" w:name="_Toc244121050"/>
       <w:r>
         <w:t>6.  The Four-Dimensional Draft and the Standing of the Corpus</w:t>
       </w:r>
@@ -7820,7 +7820,7 @@
         <w:pStyle w:val="Heading2"/>
         <w:keepNext/>
       </w:pPr>
-      <w:bookmarkStart w:id="19" w:name="_Toc244120815"/>
+      <w:bookmarkStart w:id="19" w:name="_Toc244121051"/>
       <w:r>
         <w:t>6.1  The authors' account</w:t>
       </w:r>
@@ -7884,7 +7884,7 @@
         <w:pStyle w:val="Heading2"/>
         <w:keepNext/>
       </w:pPr>
-      <w:bookmarkStart w:id="20" w:name="_Toc244120816"/>
+      <w:bookmarkStart w:id="20" w:name="_Toc244121052"/>
       <w:r>
         <w:t>6.2  The conditional theorem</w:t>
       </w:r>
@@ -8087,7 +8087,7 @@
         <w:pStyle w:val="Heading2"/>
         <w:keepNext/>
       </w:pPr>
-      <w:bookmarkStart w:id="21" w:name="_Toc244120817"/>
+      <w:bookmarkStart w:id="21" w:name="_Toc244121053"/>
       <w:r>
         <w:t>6.3  What the draft does not claim</w:t>
       </w:r>
@@ -8165,7 +8165,7 @@
         <w:pStyle w:val="Heading2"/>
         <w:keepNext/>
       </w:pPr>
-      <w:bookmarkStart w:id="22" w:name="_Toc244120818"/>
+      <w:bookmarkStart w:id="22" w:name="_Toc244121054"/>
       <w:r>
         <w:t>6.4  The standing of the corpus</w:t>
       </w:r>
@@ -8226,7 +8226,7 @@
         <w:pStyle w:val="Heading2"/>
         <w:keepNext/>
       </w:pPr>
-      <w:bookmarkStart w:id="23" w:name="_Toc244120819"/>
+      <w:bookmarkStart w:id="23" w:name="_Toc244121055"/>
       <w:r>
         <w:t>6.5  The public reading</w:t>
       </w:r>
@@ -8294,7 +8294,7 @@
         <w:pStyle w:val="Heading1"/>
         <w:keepNext/>
       </w:pPr>
-      <w:bookmarkStart w:id="24" w:name="_Toc244120820"/>
+      <w:bookmarkStart w:id="24" w:name="_Toc244121056"/>
       <w:r>
         <w:t>7.  The Residue and Its Completion</w:t>
       </w:r>
@@ -8318,7 +8318,7 @@
         <w:pStyle w:val="Heading2"/>
         <w:keepNext/>
       </w:pPr>
-      <w:bookmarkStart w:id="25" w:name="_Toc244120821"/>
+      <w:bookmarkStart w:id="25" w:name="_Toc244121057"/>
       <w:r>
         <w:t>7.1  The residue</w:t>
       </w:r>
@@ -8349,7 +8349,7 @@
           <w:left w:w="10" w:type="dxa"/>
           <w:right w:w="10" w:type="dxa"/>
         </w:tblCellMar>
-        <w:tblLook w:val="0000" w:firstRow="0" w:lastRow="0" w:firstColumn="0" w:lastColumn="0" w:noHBand="0" w:noVBand="0"/>
+        <w:tblLook w:val="04A0" w:firstRow="1" w:lastRow="0" w:firstColumn="1" w:lastColumn="0" w:noHBand="0" w:noVBand="1"/>
       </w:tblPr>
       <w:tblGrid>
         <w:gridCol w:w="2700"/>
@@ -9512,7 +9512,7 @@
         <w:pStyle w:val="Heading2"/>
         <w:keepNext/>
       </w:pPr>
-      <w:bookmarkStart w:id="26" w:name="_Toc244120822"/>
+      <w:bookmarkStart w:id="26" w:name="_Toc244121058"/>
       <w:r>
         <w:t>7.2  The gap is exponential clustering</w:t>
       </w:r>
@@ -11458,7 +11458,7 @@
         <w:pStyle w:val="Heading2"/>
         <w:keepNext/>
       </w:pPr>
-      <w:bookmarkStart w:id="27" w:name="_Toc244120823"/>
+      <w:bookmarkStart w:id="27" w:name="_Toc244121059"/>
       <w:r>
         <w:t>7.3  From the lattice to the limit</w:t>
       </w:r>
@@ -12638,7 +12638,7 @@
         <w:pStyle w:val="Heading2"/>
         <w:keepNext/>
       </w:pPr>
-      <w:bookmarkStart w:id="28" w:name="_Toc244120824"/>
+      <w:bookmarkStart w:id="28" w:name="_Toc244121060"/>
       <w:r>
         <w:t>7.4  The collapse of the components</w:t>
       </w:r>
@@ -12754,7 +12754,7 @@
         <w:pStyle w:val="Heading1"/>
         <w:keepNext/>
       </w:pPr>
-      <w:bookmarkStart w:id="29" w:name="_Toc244120825"/>
+      <w:bookmarkStart w:id="29" w:name="_Toc244121061"/>
       <w:r>
         <w:t>8.  The Ground Handed Over</w:t>
       </w:r>
@@ -12765,7 +12765,7 @@
         <w:pStyle w:val="Heading2"/>
         <w:keepNext/>
       </w:pPr>
-      <w:bookmarkStart w:id="30" w:name="_Toc244120826"/>
+      <w:bookmarkStart w:id="30" w:name="_Toc244121062"/>
       <w:r>
         <w:t>8.1  The object that remains</w:t>
       </w:r>
@@ -12855,7 +12855,16 @@
         <w:t>j</w:t>
       </w:r>
       <w:r>
-        <w:t>, so it cannot be read at a single coupling. The lattice gaps that are proved directly hold at strong coupling, where the transfer matrix mixes rapidly; the construction's sequence runs into the scaling window of weak bare coupling, where asymptotic freedom ties the bare coupling to the spacing. The inequality must be carried from the one end of the sequence to the other.</w:t>
+        <w:t>, so it cannot be read at a single coupling. The lattice gaps that are proved directly hold at strong coupling, where the transfer matrix mixes rapidly: for SU(2) this is the theorem of Osterwalder and Seiler, and for every finite gauge group it is among the theorems checked by machine in §8.2.</w:t>
+      </w:r>
+      <w:r>
+        <w:rPr>
+          <w:rStyle w:val="FootnoteReference"/>
+        </w:rPr>
+        <w:footnoteReference w:id="52"/>
+      </w:r>
+      <w:r>
+        <w:t xml:space="preserve"> The construction's sequence runs into the scaling window of weak bare coupling, where asymptotic freedom ties the bare coupling to the spacing. The inequality must be carried from the one end of the sequence to the other.</w:t>
       </w:r>
     </w:p>
     <w:p>
@@ -12882,7 +12891,7 @@
         <w:pStyle w:val="Heading2"/>
         <w:keepNext/>
       </w:pPr>
-      <w:bookmarkStart w:id="31" w:name="_Toc244120827"/>
+      <w:bookmarkStart w:id="31" w:name="_Toc244121063"/>
       <w:r>
         <w:t>8.2  The instruments in hand</w:t>
       </w:r>
@@ -13650,7 +13659,7 @@
         <w:rPr>
           <w:rStyle w:val="FootnoteReference"/>
         </w:rPr>
-        <w:footnoteReference w:id="52"/>
+        <w:footnoteReference w:id="53"/>
       </w:r>
       <w:r>
         <w:t xml:space="preserve"> Proposition 8.1 turns the gap of Theorem 7.4 into a statement about mixing: a certified bound δ(</w:t>
@@ -16665,7 +16674,7 @@
         <w:rPr>
           <w:rStyle w:val="FootnoteReference"/>
         </w:rPr>
-        <w:footnoteReference w:id="53"/>
+        <w:footnoteReference w:id="54"/>
       </w:r>
     </w:p>
     <w:p>
@@ -17999,7 +18008,7 @@
         <w:rPr>
           <w:rStyle w:val="FootnoteReference"/>
         </w:rPr>
-        <w:footnoteReference w:id="54"/>
+        <w:footnoteReference w:id="55"/>
       </w:r>
     </w:p>
     <w:tbl>
@@ -18017,7 +18026,7 @@
           <w:left w:w="10" w:type="dxa"/>
           <w:right w:w="10" w:type="dxa"/>
         </w:tblCellMar>
-        <w:tblLook w:val="0000" w:firstRow="0" w:lastRow="0" w:firstColumn="0" w:lastColumn="0" w:noHBand="0" w:noVBand="0"/>
+        <w:tblLook w:val="04A0" w:firstRow="1" w:lastRow="0" w:firstColumn="1" w:lastColumn="0" w:noHBand="0" w:noVBand="1"/>
       </w:tblPr>
       <w:tblGrid>
         <w:gridCol w:w="1200"/>
@@ -19123,7 +19132,7 @@
         <w:rPr>
           <w:rStyle w:val="FootnoteReference"/>
         </w:rPr>
-        <w:footnoteReference w:id="55"/>
+        <w:footnoteReference w:id="56"/>
       </w:r>
       <w:r>
         <w:t xml:space="preserve"> At all fourteen cells the brackets contain the eigenvalues computed to forty-five digits by a second engine that shares no computation with the first, and they meet a third, independently certified set of intervals. On the 3×3 cross-section at </w:t>
@@ -19213,7 +19222,7 @@
         <w:rPr>
           <w:rStyle w:val="FootnoteReference"/>
         </w:rPr>
-        <w:footnoteReference w:id="56"/>
+        <w:footnoteReference w:id="57"/>
       </w:r>
       <w:r>
         <w:t xml:space="preserve"> Edwin Boston III reads the first two coefficients of the strong-coupling expansion of the gap exactly on the 3×3 cross-section, meets through them the first three coefficients of the low-temperature series of the Ising correlation length published by Arisue and Tabata, and, solving that published relation for the coefficients that no cross-section of side at most four can read, obtains the expansion on the infinite lattice</w:t>
@@ -19222,7 +19231,7 @@
         <w:rPr>
           <w:rStyle w:val="FootnoteReference"/>
         </w:rPr>
-        <w:footnoteReference w:id="57"/>
+        <w:footnoteReference w:id="58"/>
       </w:r>
     </w:p>
     <w:p>
@@ -19730,7 +19739,7 @@
         <w:rPr>
           <w:rStyle w:val="FootnoteReference"/>
         </w:rPr>
-        <w:footnoteReference w:id="58"/>
+        <w:footnoteReference w:id="59"/>
       </w:r>
       <w:r>
         <w:t xml:space="preserve"> For the transfer matrix of every finite-group lattice theory: every even-time quadratic form is non-negative; the spectral sum holds; the dominant root is simple and strictly dominant, with its residual law; the string energy is the exact limit of two Perron roots; and there is a mass gap on every finite cross-section, at every coupling. For every finite group acting faithfully by a real orthogonal representation, on every finite cross-section, the static potential of a Wilson loop is at least the mass gap</w:t>
@@ -19823,7 +19832,7 @@
         <w:pStyle w:val="Heading2"/>
         <w:keepNext/>
       </w:pPr>
-      <w:bookmarkStart w:id="32" w:name="_Toc244120828"/>
+      <w:bookmarkStart w:id="32" w:name="_Toc244121064"/>
       <w:r>
         <w:t>8.3  Coda</w:t>
       </w:r>
@@ -19848,7 +19857,7 @@
         <w:pageBreakBefore/>
         <w:spacing w:before="0"/>
       </w:pPr>
-      <w:bookmarkStart w:id="33" w:name="_Toc244120829"/>
+      <w:bookmarkStart w:id="33" w:name="_Toc244121065"/>
       <w:r>
         <w:t>Sources</w:t>
       </w:r>
@@ -20643,7 +20652,7 @@
         <w:pStyle w:val="Heading2"/>
         <w:keepNext/>
       </w:pPr>
-      <w:bookmarkStart w:id="34" w:name="_Toc244120830"/>
+      <w:bookmarkStart w:id="34" w:name="_Toc244121066"/>
       <w:r>
         <w:t>Records of the computations of Edwin Boston III</w:t>
       </w:r>
@@ -22636,7 +22645,7 @@
           <w:sz w:val="17"/>
           <w:szCs w:val="17"/>
         </w:rPr>
-        <w:t xml:space="preserve">R. L. Dobrushin, "Central limit theorem for nonstationary Markov chains. I, II", </w:t>
+        <w:t xml:space="preserve">Osterwalder and Seiler, </w:t>
       </w:r>
       <w:r>
         <w:rPr>
@@ -22645,50 +22654,66 @@
           <w:sz w:val="17"/>
           <w:szCs w:val="17"/>
         </w:rPr>
-        <w:t>Theory Probab. Appl.</w:t>
+        <w:t>op. cit.</w:t>
       </w:r>
       <w:r>
         <w:rPr>
           <w:sz w:val="17"/>
           <w:szCs w:val="17"/>
         </w:rPr>
-        <w:t xml:space="preserve"> 1 (1956), 65–80 and 329–383; I. Gelfand, "Normierte Ringe", </w:t>
-      </w:r>
-      <w:r>
-        <w:rPr>
-          <w:i/>
-          <w:iCs/>
+        <w:t>, for the strong-coupling gap of the Wilson theory with a compact gauge group; the finite-group form with its explicit coefficients is Edwin Boston III's, listed in the Records.</w:t>
+      </w:r>
+    </w:p>
+  </w:footnote>
+  <w:footnote w:id="53">
+    <w:p>
+      <w:pPr>
+        <w:spacing w:after="40" w:line="240" w:lineRule="auto"/>
+      </w:pPr>
+      <w:r>
+        <w:rPr>
+          <w:rStyle w:val="FootnoteReference"/>
+        </w:rPr>
+        <w:footnoteRef/>
+      </w:r>
+      <w:r>
+        <w:rPr>
           <w:sz w:val="17"/>
           <w:szCs w:val="17"/>
         </w:rPr>
-        <w:t>Mat. Sbornik</w:t>
-      </w:r>
-      <w:r>
-        <w:rPr>
+        <w:t xml:space="preserve">R. L. Dobrushin, "Central limit theorem for nonstationary Markov chains. I, II", </w:t>
+      </w:r>
+      <w:r>
+        <w:rPr>
+          <w:i/>
+          <w:iCs/>
           <w:sz w:val="17"/>
           <w:szCs w:val="17"/>
         </w:rPr>
-        <w:t xml:space="preserve"> 9 (51) (1941), 3–24.</w:t>
-      </w:r>
-    </w:p>
-  </w:footnote>
-  <w:footnote w:id="53">
-    <w:p>
-      <w:pPr>
-        <w:spacing w:after="40" w:line="240" w:lineRule="auto"/>
-      </w:pPr>
-      <w:r>
-        <w:rPr>
-          <w:rStyle w:val="FootnoteReference"/>
-        </w:rPr>
-        <w:footnoteRef/>
+        <w:t>Theory Probab. Appl.</w:t>
       </w:r>
       <w:r>
         <w:rPr>
           <w:sz w:val="17"/>
           <w:szCs w:val="17"/>
         </w:rPr>
-        <w:t>Edwin Boston III, the chain lemma; its record and run of record are listed in the Records.</w:t>
+        <w:t xml:space="preserve"> 1 (1956), 65–80 and 329–383; I. Gelfand, "Normierte Ringe", </w:t>
+      </w:r>
+      <w:r>
+        <w:rPr>
+          <w:i/>
+          <w:iCs/>
+          <w:sz w:val="17"/>
+          <w:szCs w:val="17"/>
+        </w:rPr>
+        <w:t>Mat. Sbornik</w:t>
+      </w:r>
+      <w:r>
+        <w:rPr>
+          <w:sz w:val="17"/>
+          <w:szCs w:val="17"/>
+        </w:rPr>
+        <w:t xml:space="preserve"> 9 (51) (1941), 3–24.</w:t>
       </w:r>
     </w:p>
   </w:footnote>
@@ -22708,7 +22733,7 @@
           <w:sz w:val="17"/>
           <w:szCs w:val="17"/>
         </w:rPr>
-        <w:t>Edwin Boston III, the shadow ladder; the record and its run of record are listed in the Records at the end of this paper.</w:t>
+        <w:t>Edwin Boston III, the chain lemma; its record and run of record are listed in the Records.</w:t>
       </w:r>
     </w:p>
   </w:footnote>
@@ -22728,99 +22753,119 @@
           <w:sz w:val="17"/>
           <w:szCs w:val="17"/>
         </w:rPr>
-        <w:t xml:space="preserve">J. J. Sylvester, "A demonstration of the theorem that every homogeneous quadratic polynomial is reducible by real orthogonal substitutions to the form of a sum of positive and negative squares", </w:t>
-      </w:r>
-      <w:r>
-        <w:rPr>
-          <w:i/>
-          <w:iCs/>
+        <w:t>Edwin Boston III, the shadow ladder; the record and its run of record are listed in the Records at the end of this paper.</w:t>
+      </w:r>
+    </w:p>
+  </w:footnote>
+  <w:footnote w:id="56">
+    <w:p>
+      <w:pPr>
+        <w:spacing w:after="40" w:line="240" w:lineRule="auto"/>
+      </w:pPr>
+      <w:r>
+        <w:rPr>
+          <w:rStyle w:val="FootnoteReference"/>
+        </w:rPr>
+        <w:footnoteRef/>
+      </w:r>
+      <w:r>
+        <w:rPr>
           <w:sz w:val="17"/>
           <w:szCs w:val="17"/>
         </w:rPr>
-        <w:t>Philosophical Magazine</w:t>
-      </w:r>
-      <w:r>
-        <w:rPr>
+        <w:t xml:space="preserve">J. J. Sylvester, "A demonstration of the theorem that every homogeneous quadratic polynomial is reducible by real orthogonal substitutions to the form of a sum of positive and negative squares", </w:t>
+      </w:r>
+      <w:r>
+        <w:rPr>
+          <w:i/>
+          <w:iCs/>
           <w:sz w:val="17"/>
           <w:szCs w:val="17"/>
         </w:rPr>
-        <w:t xml:space="preserve"> 4 (1852), 138–142. The computation is Edwin Boston III's; its record is listed in the Records.</w:t>
-      </w:r>
-    </w:p>
-  </w:footnote>
-  <w:footnote w:id="56">
-    <w:p>
-      <w:pPr>
-        <w:spacing w:after="40" w:line="240" w:lineRule="auto"/>
-      </w:pPr>
-      <w:r>
-        <w:rPr>
-          <w:rStyle w:val="FootnoteReference"/>
-        </w:rPr>
-        <w:footnoteRef/>
+        <w:t>Philosophical Magazine</w:t>
       </w:r>
       <w:r>
         <w:rPr>
           <w:sz w:val="17"/>
           <w:szCs w:val="17"/>
         </w:rPr>
-        <w:t xml:space="preserve">F. J. Wegner, "Duality in generalized Ising models and phase transitions without local order parameters", </w:t>
-      </w:r>
-      <w:r>
-        <w:rPr>
-          <w:i/>
-          <w:iCs/>
+        <w:t xml:space="preserve"> 4 (1852), 138–142. The computation is Edwin Boston III's; its record is listed in the Records.</w:t>
+      </w:r>
+    </w:p>
+  </w:footnote>
+  <w:footnote w:id="57">
+    <w:p>
+      <w:pPr>
+        <w:spacing w:after="40" w:line="240" w:lineRule="auto"/>
+      </w:pPr>
+      <w:r>
+        <w:rPr>
+          <w:rStyle w:val="FootnoteReference"/>
+        </w:rPr>
+        <w:footnoteRef/>
+      </w:r>
+      <w:r>
+        <w:rPr>
           <w:sz w:val="17"/>
           <w:szCs w:val="17"/>
         </w:rPr>
-        <w:t>J. Math. Phys.</w:t>
-      </w:r>
-      <w:r>
-        <w:rPr>
+        <w:t xml:space="preserve">F. J. Wegner, "Duality in generalized Ising models and phase transitions without local order parameters", </w:t>
+      </w:r>
+      <w:r>
+        <w:rPr>
+          <w:i/>
+          <w:iCs/>
           <w:sz w:val="17"/>
           <w:szCs w:val="17"/>
         </w:rPr>
-        <w:t xml:space="preserve"> 12 (1971), 2259–2272.</w:t>
-      </w:r>
-    </w:p>
-  </w:footnote>
-  <w:footnote w:id="57">
-    <w:p>
-      <w:pPr>
-        <w:spacing w:after="40" w:line="240" w:lineRule="auto"/>
-      </w:pPr>
-      <w:r>
-        <w:rPr>
-          <w:rStyle w:val="FootnoteReference"/>
-        </w:rPr>
-        <w:footnoteRef/>
+        <w:t>J. Math. Phys.</w:t>
       </w:r>
       <w:r>
         <w:rPr>
           <w:sz w:val="17"/>
           <w:szCs w:val="17"/>
         </w:rPr>
-        <w:t xml:space="preserve">H. Arisue and K. Tabata, "Low-temperature series for the correlation length in d = 3 Ising model", </w:t>
-      </w:r>
-      <w:r>
-        <w:rPr>
-          <w:i/>
-          <w:iCs/>
+        <w:t xml:space="preserve"> 12 (1971), 2259–2272.</w:t>
+      </w:r>
+    </w:p>
+  </w:footnote>
+  <w:footnote w:id="58">
+    <w:p>
+      <w:pPr>
+        <w:spacing w:after="40" w:line="240" w:lineRule="auto"/>
+      </w:pPr>
+      <w:r>
+        <w:rPr>
+          <w:rStyle w:val="FootnoteReference"/>
+        </w:rPr>
+        <w:footnoteRef/>
+      </w:r>
+      <w:r>
+        <w:rPr>
           <w:sz w:val="17"/>
           <w:szCs w:val="17"/>
         </w:rPr>
-        <w:t>Nucl. Phys.</w:t>
-      </w:r>
-      <w:r>
-        <w:rPr>
+        <w:t xml:space="preserve">H. Arisue and K. Tabata, "Low-temperature series for the correlation length in d = 3 Ising model", </w:t>
+      </w:r>
+      <w:r>
+        <w:rPr>
+          <w:i/>
+          <w:iCs/>
           <w:sz w:val="17"/>
           <w:szCs w:val="17"/>
         </w:rPr>
+        <w:t>Nucl. Phys.</w:t>
+      </w:r>
+      <w:r>
+        <w:rPr>
+          <w:sz w:val="17"/>
+          <w:szCs w:val="17"/>
+        </w:rPr>
         <w:t xml:space="preserve"> B435 (1995), 555–566. The reading is Edwin Boston III's; its record is listed in the Records.</w:t>
       </w:r>
     </w:p>
   </w:footnote>
-  <w:footnote w:id="58">
+  <w:footnote w:id="59">
     <w:p>
       <w:pPr>
         <w:spacing w:after="40" w:line="240" w:lineRule="auto"/>
@@ -22871,10 +22916,10 @@
 <file path=word/numbering.xml><?xml version="1.0" encoding="utf-8"?>
 <w:numbering xmlns:wpc="http://schemas.microsoft.com/office/word/2010/wordprocessingCanvas" xmlns:cx="http://schemas.microsoft.com/office/drawing/2014/chartex" xmlns:cx1="http://schemas.microsoft.com/office/drawing/2015/9/8/chartex" xmlns:cx2="http://schemas.microsoft.com/office/drawing/2015/10/21/chartex" xmlns:cx3="http://schemas.microsoft.com/office/drawing/2016/5/9/chartex" xmlns:cx4="http://schemas.microsoft.com/office/drawing/2016/5/10/chartex" xmlns:cx5="http://schemas.microsoft.com/office/drawing/2016/5/11/chartex" xmlns:cx6="http://schemas.microsoft.com/office/drawing/2016/5/12/chartex" xmlns:cx7="http://schemas.microsoft.com/office/drawing/2016/5/13/chartex" xmlns:cx8="http://schemas.microsoft.com/office/drawing/2016/5/14/chartex" xmlns:mc="http://schemas.openxmlformats.org/markup-compatibility/2006" xmlns:aink="http://schemas.microsoft.com/office/drawing/2016/ink" xmlns:am3d="http://schemas.microsoft.com/office/drawing/2017/model3d" xmlns:o="urn:schemas-microsoft-com:office:office" xmlns:oel="http://schemas.microsoft.com/office/2019/extlst" xmlns:r="http://schemas.openxmlformats.org/officeDocument/2006/relationships" xmlns:m="http://schemas.openxmlformats.org/officeDocument/2006/math" xmlns:v="urn:schemas-microsoft-com:vml" xmlns:wp14="http://schemas.microsoft.com/office/word/2010/wordprocessingDrawing" xmlns:wp="http://schemas.openxmlformats.org/drawingml/2006/wordprocessingDrawing" xmlns:w10="urn:schemas-microsoft-com:office:word" xmlns:w="http://schemas.openxmlformats.org/wordprocessingml/2006/main" xmlns:w14="http://schemas.microsoft.com/office/word/2010/wordml" xmlns:w15="http://schemas.microsoft.com/office/word/2012/wordml" xmlns:w16cex="http://schemas.microsoft.com/office/word/2018/wordml/cex" xmlns:w16cid="http://schemas.microsoft.com/office/word/2016/wordml/cid" xmlns:w16="http://schemas.microsoft.com/office/word/2018/wordml" xmlns:w16du="http://schemas.microsoft.com/office/word/2023/wordml/word16du" xmlns:w16sdtdh="http://schemas.microsoft.com/office/word/2020/wordml/sdtdatahash" xmlns:w16sdtfl="http://schemas.microsoft.com/office/word/2024/wordml/sdtformatlock" xmlns:w16se="http://schemas.microsoft.com/office/word/2015/wordml/symex" xmlns:wpg="http://schemas.microsoft.com/office/word/2010/wordprocessingGroup" xmlns:wpi="http://schemas.microsoft.com/office/word/2010/wordprocessingInk" xmlns:wne="http://schemas.microsoft.com/office/word/2006/wordml" xmlns:wps="http://schemas.microsoft.com/office/word/2010/wordprocessingShape" mc:Ignorable="w14 w15 w16se w16cid w16 w16cex w16sdtdh w16sdtfl w16du wp14">
   <w:abstractNum w:abstractNumId="0" w15:restartNumberingAfterBreak="0">
-    <w:nsid w:val="471D6B9B"/>
+    <w:nsid w:val="5C114F2E"/>
     <w:multiLevelType w:val="hybridMultilevel"/>
-    <w:tmpl w:val="2DB00A66"/>
-    <w:lvl w:ilvl="0" w:tplc="6E7A9F9A">
+    <w:tmpl w:val="6DB66BC0"/>
+    <w:lvl w:ilvl="0" w:tplc="0D06E74E">
       <w:start w:val="1"/>
       <w:numFmt w:val="bullet"/>
       <w:lvlText w:val="●"/>
@@ -22883,7 +22928,7 @@
         <w:ind w:left="720" w:hanging="360"/>
       </w:pPr>
     </w:lvl>
-    <w:lvl w:ilvl="1" w:tplc="43F69E5A">
+    <w:lvl w:ilvl="1" w:tplc="608A1C44">
       <w:start w:val="1"/>
       <w:numFmt w:val="bullet"/>
       <w:lvlText w:val="○"/>
@@ -22892,7 +22937,7 @@
         <w:ind w:left="1440" w:hanging="360"/>
       </w:pPr>
     </w:lvl>
-    <w:lvl w:ilvl="2" w:tplc="86145230">
+    <w:lvl w:ilvl="2" w:tplc="ABDC892A">
       <w:start w:val="1"/>
       <w:numFmt w:val="bullet"/>
       <w:lvlText w:val="■"/>
@@ -22901,7 +22946,7 @@
         <w:ind w:left="2160" w:hanging="360"/>
       </w:pPr>
     </w:lvl>
-    <w:lvl w:ilvl="3" w:tplc="63342818">
+    <w:lvl w:ilvl="3" w:tplc="88F000EE">
       <w:start w:val="1"/>
       <w:numFmt w:val="bullet"/>
       <w:lvlText w:val="●"/>
@@ -22910,7 +22955,7 @@
         <w:ind w:left="2880" w:hanging="360"/>
       </w:pPr>
     </w:lvl>
-    <w:lvl w:ilvl="4" w:tplc="9A36A10A">
+    <w:lvl w:ilvl="4" w:tplc="2466E57E">
       <w:start w:val="1"/>
       <w:numFmt w:val="bullet"/>
       <w:lvlText w:val="○"/>
@@ -22919,7 +22964,7 @@
         <w:ind w:left="3600" w:hanging="360"/>
       </w:pPr>
     </w:lvl>
-    <w:lvl w:ilvl="5" w:tplc="91B40CA8">
+    <w:lvl w:ilvl="5" w:tplc="AE00E83E">
       <w:start w:val="1"/>
       <w:numFmt w:val="bullet"/>
       <w:lvlText w:val="■"/>
@@ -22928,7 +22973,7 @@
         <w:ind w:left="4320" w:hanging="360"/>
       </w:pPr>
     </w:lvl>
-    <w:lvl w:ilvl="6" w:tplc="D878EF40">
+    <w:lvl w:ilvl="6" w:tplc="1362FBEA">
       <w:start w:val="1"/>
       <w:numFmt w:val="bullet"/>
       <w:lvlText w:val="●"/>
@@ -22937,7 +22982,7 @@
         <w:ind w:left="5040" w:hanging="360"/>
       </w:pPr>
     </w:lvl>
-    <w:lvl w:ilvl="7" w:tplc="0B64817C">
+    <w:lvl w:ilvl="7" w:tplc="06124B2A">
       <w:start w:val="1"/>
       <w:numFmt w:val="bullet"/>
       <w:lvlText w:val="●"/>
@@ -22946,7 +22991,7 @@
         <w:ind w:left="5760" w:hanging="360"/>
       </w:pPr>
     </w:lvl>
-    <w:lvl w:ilvl="8" w:tplc="176AB3BA">
+    <w:lvl w:ilvl="8" w:tplc="F18AEF0A">
       <w:start w:val="1"/>
       <w:numFmt w:val="bullet"/>
       <w:lvlText w:val="●"/>
@@ -22956,7 +23001,7 @@
       </w:pPr>
     </w:lvl>
   </w:abstractNum>
-  <w:num w:numId="1" w16cid:durableId="1560551836">
+  <w:num w:numId="1" w16cid:durableId="1069036788">
     <w:abstractNumId w:val="0"/>
     <w:lvlOverride w:ilvl="0">
       <w:startOverride w:val="1"/>
@@ -23553,7 +23598,7 @@
     <w:autoRedefine/>
     <w:uiPriority w:val="39"/>
     <w:unhideWhenUsed/>
-    <w:rsid w:val="009A3EB6"/>
+    <w:rsid w:val="00795E44"/>
     <w:pPr>
       <w:spacing w:after="100"/>
     </w:pPr>
@@ -23565,7 +23610,7 @@
     <w:autoRedefine/>
     <w:uiPriority w:val="39"/>
     <w:unhideWhenUsed/>
-    <w:rsid w:val="009A3EB6"/>
+    <w:rsid w:val="00795E44"/>
     <w:pPr>
       <w:spacing w:after="100"/>
       <w:ind w:left="220"/>

</xml_diff>

<commit_message>
THE GROUND, revision 11 (Edwin Boston III, 2026-10-29 02:5x): the distance is measured in Z^4's own blocking steps, in place
One sentence of Section 8.3's descent paragraph is tightened so that it cannot be read as using the hierarchical model's step count as a measure of the distance on Z^4: "The distance Hypotheses I and II must cross is measured in the blocking steps of Z^4 itself; no step count of the hierarchical model is a reading of it, and no reading of the hierarchical model is a statement about Z^4." ARXIV.md's page count follows the current PDF. No other change.
</commit_message>
<xml_diff>
--- a/THE-GROUND-Edwin-Boston-III.docx
+++ b/THE-GROUND-Edwin-Boston-III.docx
@@ -163,7 +163,7 @@
     <w:sdt>
       <w:sdtPr>
         <w:alias w:val="Contents"/>
-        <w:id w:val="53668271"/>
+        <w:id w:val="-1254048923"/>
       </w:sdtPr>
       <w:sdtEndPr/>
       <w:sdtContent>
@@ -191,7 +191,7 @@
           <w:r>
             <w:fldChar w:fldCharType="separate"/>
           </w:r>
-          <w:hyperlink w:anchor="_Toc244133782" w:history="1">
+          <w:hyperlink w:anchor="_Toc244134001" w:history="1">
             <w:r>
               <w:rPr>
                 <w:rStyle w:val="Hyperlink"/>
@@ -215,7 +215,7 @@
               <w:rPr>
                 <w:noProof/>
               </w:rPr>
-              <w:instrText xml:space="preserve"> PAGEREF _Toc244133782 \h </w:instrText>
+              <w:instrText xml:space="preserve"> PAGEREF _Toc244134001 \h </w:instrText>
             </w:r>
             <w:r>
               <w:rPr>
@@ -257,7 +257,7 @@
               <w14:ligatures w14:val="standardContextual"/>
             </w:rPr>
           </w:pPr>
-          <w:hyperlink w:anchor="_Toc244133783" w:history="1">
+          <w:hyperlink w:anchor="_Toc244134002" w:history="1">
             <w:r>
               <w:rPr>
                 <w:rStyle w:val="Hyperlink"/>
@@ -281,7 +281,7 @@
               <w:rPr>
                 <w:noProof/>
               </w:rPr>
-              <w:instrText xml:space="preserve"> PAGEREF _Toc244133783 \h </w:instrText>
+              <w:instrText xml:space="preserve"> PAGEREF _Toc244134002 \h </w:instrText>
             </w:r>
             <w:r>
               <w:rPr>
@@ -323,7 +323,7 @@
               <w14:ligatures w14:val="standardContextual"/>
             </w:rPr>
           </w:pPr>
-          <w:hyperlink w:anchor="_Toc244133784" w:history="1">
+          <w:hyperlink w:anchor="_Toc244134003" w:history="1">
             <w:r>
               <w:rPr>
                 <w:rStyle w:val="Hyperlink"/>
@@ -347,7 +347,7 @@
               <w:rPr>
                 <w:noProof/>
               </w:rPr>
-              <w:instrText xml:space="preserve"> PAGEREF _Toc244133784 \h </w:instrText>
+              <w:instrText xml:space="preserve"> PAGEREF _Toc244134003 \h </w:instrText>
             </w:r>
             <w:r>
               <w:rPr>
@@ -389,7 +389,7 @@
               <w14:ligatures w14:val="standardContextual"/>
             </w:rPr>
           </w:pPr>
-          <w:hyperlink w:anchor="_Toc244133785" w:history="1">
+          <w:hyperlink w:anchor="_Toc244134004" w:history="1">
             <w:r>
               <w:rPr>
                 <w:rStyle w:val="Hyperlink"/>
@@ -413,7 +413,7 @@
               <w:rPr>
                 <w:noProof/>
               </w:rPr>
-              <w:instrText xml:space="preserve"> PAGEREF _Toc244133785 \h </w:instrText>
+              <w:instrText xml:space="preserve"> PAGEREF _Toc244134004 \h </w:instrText>
             </w:r>
             <w:r>
               <w:rPr>
@@ -455,7 +455,7 @@
               <w14:ligatures w14:val="standardContextual"/>
             </w:rPr>
           </w:pPr>
-          <w:hyperlink w:anchor="_Toc244133786" w:history="1">
+          <w:hyperlink w:anchor="_Toc244134005" w:history="1">
             <w:r>
               <w:rPr>
                 <w:rStyle w:val="Hyperlink"/>
@@ -479,7 +479,7 @@
               <w:rPr>
                 <w:noProof/>
               </w:rPr>
-              <w:instrText xml:space="preserve"> PAGEREF _Toc244133786 \h </w:instrText>
+              <w:instrText xml:space="preserve"> PAGEREF _Toc244134005 \h </w:instrText>
             </w:r>
             <w:r>
               <w:rPr>
@@ -521,7 +521,7 @@
               <w14:ligatures w14:val="standardContextual"/>
             </w:rPr>
           </w:pPr>
-          <w:hyperlink w:anchor="_Toc244133787" w:history="1">
+          <w:hyperlink w:anchor="_Toc244134006" w:history="1">
             <w:r>
               <w:rPr>
                 <w:rStyle w:val="Hyperlink"/>
@@ -545,7 +545,7 @@
               <w:rPr>
                 <w:noProof/>
               </w:rPr>
-              <w:instrText xml:space="preserve"> PAGEREF _Toc244133787 \h </w:instrText>
+              <w:instrText xml:space="preserve"> PAGEREF _Toc244134006 \h </w:instrText>
             </w:r>
             <w:r>
               <w:rPr>
@@ -587,7 +587,7 @@
               <w14:ligatures w14:val="standardContextual"/>
             </w:rPr>
           </w:pPr>
-          <w:hyperlink w:anchor="_Toc244133788" w:history="1">
+          <w:hyperlink w:anchor="_Toc244134007" w:history="1">
             <w:r>
               <w:rPr>
                 <w:rStyle w:val="Hyperlink"/>
@@ -611,7 +611,7 @@
               <w:rPr>
                 <w:noProof/>
               </w:rPr>
-              <w:instrText xml:space="preserve"> PAGEREF _Toc244133788 \h </w:instrText>
+              <w:instrText xml:space="preserve"> PAGEREF _Toc244134007 \h </w:instrText>
             </w:r>
             <w:r>
               <w:rPr>
@@ -653,7 +653,7 @@
               <w14:ligatures w14:val="standardContextual"/>
             </w:rPr>
           </w:pPr>
-          <w:hyperlink w:anchor="_Toc244133789" w:history="1">
+          <w:hyperlink w:anchor="_Toc244134008" w:history="1">
             <w:r>
               <w:rPr>
                 <w:rStyle w:val="Hyperlink"/>
@@ -677,7 +677,7 @@
               <w:rPr>
                 <w:noProof/>
               </w:rPr>
-              <w:instrText xml:space="preserve"> PAGEREF _Toc244133789 \h </w:instrText>
+              <w:instrText xml:space="preserve"> PAGEREF _Toc244134008 \h </w:instrText>
             </w:r>
             <w:r>
               <w:rPr>
@@ -719,7 +719,7 @@
               <w14:ligatures w14:val="standardContextual"/>
             </w:rPr>
           </w:pPr>
-          <w:hyperlink w:anchor="_Toc244133790" w:history="1">
+          <w:hyperlink w:anchor="_Toc244134009" w:history="1">
             <w:r>
               <w:rPr>
                 <w:rStyle w:val="Hyperlink"/>
@@ -743,7 +743,7 @@
               <w:rPr>
                 <w:noProof/>
               </w:rPr>
-              <w:instrText xml:space="preserve"> PAGEREF _Toc244133790 \h </w:instrText>
+              <w:instrText xml:space="preserve"> PAGEREF _Toc244134009 \h </w:instrText>
             </w:r>
             <w:r>
               <w:rPr>
@@ -785,7 +785,7 @@
               <w14:ligatures w14:val="standardContextual"/>
             </w:rPr>
           </w:pPr>
-          <w:hyperlink w:anchor="_Toc244133791" w:history="1">
+          <w:hyperlink w:anchor="_Toc244134010" w:history="1">
             <w:r>
               <w:rPr>
                 <w:rStyle w:val="Hyperlink"/>
@@ -809,7 +809,7 @@
               <w:rPr>
                 <w:noProof/>
               </w:rPr>
-              <w:instrText xml:space="preserve"> PAGEREF _Toc244133791 \h </w:instrText>
+              <w:instrText xml:space="preserve"> PAGEREF _Toc244134010 \h </w:instrText>
             </w:r>
             <w:r>
               <w:rPr>
@@ -851,7 +851,7 @@
               <w14:ligatures w14:val="standardContextual"/>
             </w:rPr>
           </w:pPr>
-          <w:hyperlink w:anchor="_Toc244133792" w:history="1">
+          <w:hyperlink w:anchor="_Toc244134011" w:history="1">
             <w:r>
               <w:rPr>
                 <w:rStyle w:val="Hyperlink"/>
@@ -875,7 +875,7 @@
               <w:rPr>
                 <w:noProof/>
               </w:rPr>
-              <w:instrText xml:space="preserve"> PAGEREF _Toc244133792 \h </w:instrText>
+              <w:instrText xml:space="preserve"> PAGEREF _Toc244134011 \h </w:instrText>
             </w:r>
             <w:r>
               <w:rPr>
@@ -917,7 +917,7 @@
               <w14:ligatures w14:val="standardContextual"/>
             </w:rPr>
           </w:pPr>
-          <w:hyperlink w:anchor="_Toc244133793" w:history="1">
+          <w:hyperlink w:anchor="_Toc244134012" w:history="1">
             <w:r>
               <w:rPr>
                 <w:rStyle w:val="Hyperlink"/>
@@ -941,7 +941,7 @@
               <w:rPr>
                 <w:noProof/>
               </w:rPr>
-              <w:instrText xml:space="preserve"> PAGEREF _Toc244133793 \h </w:instrText>
+              <w:instrText xml:space="preserve"> PAGEREF _Toc244134012 \h </w:instrText>
             </w:r>
             <w:r>
               <w:rPr>
@@ -983,7 +983,7 @@
               <w14:ligatures w14:val="standardContextual"/>
             </w:rPr>
           </w:pPr>
-          <w:hyperlink w:anchor="_Toc244133794" w:history="1">
+          <w:hyperlink w:anchor="_Toc244134013" w:history="1">
             <w:r>
               <w:rPr>
                 <w:rStyle w:val="Hyperlink"/>
@@ -1007,7 +1007,7 @@
               <w:rPr>
                 <w:noProof/>
               </w:rPr>
-              <w:instrText xml:space="preserve"> PAGEREF _Toc244133794 \h </w:instrText>
+              <w:instrText xml:space="preserve"> PAGEREF _Toc244134013 \h </w:instrText>
             </w:r>
             <w:r>
               <w:rPr>
@@ -1049,7 +1049,7 @@
               <w14:ligatures w14:val="standardContextual"/>
             </w:rPr>
           </w:pPr>
-          <w:hyperlink w:anchor="_Toc244133795" w:history="1">
+          <w:hyperlink w:anchor="_Toc244134014" w:history="1">
             <w:r>
               <w:rPr>
                 <w:rStyle w:val="Hyperlink"/>
@@ -1073,7 +1073,7 @@
               <w:rPr>
                 <w:noProof/>
               </w:rPr>
-              <w:instrText xml:space="preserve"> PAGEREF _Toc244133795 \h </w:instrText>
+              <w:instrText xml:space="preserve"> PAGEREF _Toc244134014 \h </w:instrText>
             </w:r>
             <w:r>
               <w:rPr>
@@ -1115,7 +1115,7 @@
               <w14:ligatures w14:val="standardContextual"/>
             </w:rPr>
           </w:pPr>
-          <w:hyperlink w:anchor="_Toc244133796" w:history="1">
+          <w:hyperlink w:anchor="_Toc244134015" w:history="1">
             <w:r>
               <w:rPr>
                 <w:rStyle w:val="Hyperlink"/>
@@ -1139,7 +1139,7 @@
               <w:rPr>
                 <w:noProof/>
               </w:rPr>
-              <w:instrText xml:space="preserve"> PAGEREF _Toc244133796 \h </w:instrText>
+              <w:instrText xml:space="preserve"> PAGEREF _Toc244134015 \h </w:instrText>
             </w:r>
             <w:r>
               <w:rPr>
@@ -1181,7 +1181,7 @@
               <w14:ligatures w14:val="standardContextual"/>
             </w:rPr>
           </w:pPr>
-          <w:hyperlink w:anchor="_Toc244133797" w:history="1">
+          <w:hyperlink w:anchor="_Toc244134016" w:history="1">
             <w:r>
               <w:rPr>
                 <w:rStyle w:val="Hyperlink"/>
@@ -1205,7 +1205,7 @@
               <w:rPr>
                 <w:noProof/>
               </w:rPr>
-              <w:instrText xml:space="preserve"> PAGEREF _Toc244133797 \h </w:instrText>
+              <w:instrText xml:space="preserve"> PAGEREF _Toc244134016 \h </w:instrText>
             </w:r>
             <w:r>
               <w:rPr>
@@ -1247,7 +1247,7 @@
               <w14:ligatures w14:val="standardContextual"/>
             </w:rPr>
           </w:pPr>
-          <w:hyperlink w:anchor="_Toc244133798" w:history="1">
+          <w:hyperlink w:anchor="_Toc244134017" w:history="1">
             <w:r>
               <w:rPr>
                 <w:rStyle w:val="Hyperlink"/>
@@ -1271,7 +1271,7 @@
               <w:rPr>
                 <w:noProof/>
               </w:rPr>
-              <w:instrText xml:space="preserve"> PAGEREF _Toc244133798 \h </w:instrText>
+              <w:instrText xml:space="preserve"> PAGEREF _Toc244134017 \h </w:instrText>
             </w:r>
             <w:r>
               <w:rPr>
@@ -1313,7 +1313,7 @@
               <w14:ligatures w14:val="standardContextual"/>
             </w:rPr>
           </w:pPr>
-          <w:hyperlink w:anchor="_Toc244133799" w:history="1">
+          <w:hyperlink w:anchor="_Toc244134018" w:history="1">
             <w:r>
               <w:rPr>
                 <w:rStyle w:val="Hyperlink"/>
@@ -1337,7 +1337,7 @@
               <w:rPr>
                 <w:noProof/>
               </w:rPr>
-              <w:instrText xml:space="preserve"> PAGEREF _Toc244133799 \h </w:instrText>
+              <w:instrText xml:space="preserve"> PAGEREF _Toc244134018 \h </w:instrText>
             </w:r>
             <w:r>
               <w:rPr>
@@ -1379,7 +1379,7 @@
               <w14:ligatures w14:val="standardContextual"/>
             </w:rPr>
           </w:pPr>
-          <w:hyperlink w:anchor="_Toc244133800" w:history="1">
+          <w:hyperlink w:anchor="_Toc244134019" w:history="1">
             <w:r>
               <w:rPr>
                 <w:rStyle w:val="Hyperlink"/>
@@ -1403,7 +1403,7 @@
               <w:rPr>
                 <w:noProof/>
               </w:rPr>
-              <w:instrText xml:space="preserve"> PAGEREF _Toc244133800 \h </w:instrText>
+              <w:instrText xml:space="preserve"> PAGEREF _Toc244134019 \h </w:instrText>
             </w:r>
             <w:r>
               <w:rPr>
@@ -1445,7 +1445,7 @@
               <w14:ligatures w14:val="standardContextual"/>
             </w:rPr>
           </w:pPr>
-          <w:hyperlink w:anchor="_Toc244133801" w:history="1">
+          <w:hyperlink w:anchor="_Toc244134020" w:history="1">
             <w:r>
               <w:rPr>
                 <w:rStyle w:val="Hyperlink"/>
@@ -1469,7 +1469,7 @@
               <w:rPr>
                 <w:noProof/>
               </w:rPr>
-              <w:instrText xml:space="preserve"> PAGEREF _Toc244133801 \h </w:instrText>
+              <w:instrText xml:space="preserve"> PAGEREF _Toc244134020 \h </w:instrText>
             </w:r>
             <w:r>
               <w:rPr>
@@ -1511,7 +1511,7 @@
               <w14:ligatures w14:val="standardContextual"/>
             </w:rPr>
           </w:pPr>
-          <w:hyperlink w:anchor="_Toc244133802" w:history="1">
+          <w:hyperlink w:anchor="_Toc244134021" w:history="1">
             <w:r>
               <w:rPr>
                 <w:rStyle w:val="Hyperlink"/>
@@ -1535,7 +1535,7 @@
               <w:rPr>
                 <w:noProof/>
               </w:rPr>
-              <w:instrText xml:space="preserve"> PAGEREF _Toc244133802 \h </w:instrText>
+              <w:instrText xml:space="preserve"> PAGEREF _Toc244134021 \h </w:instrText>
             </w:r>
             <w:r>
               <w:rPr>
@@ -1577,7 +1577,7 @@
               <w14:ligatures w14:val="standardContextual"/>
             </w:rPr>
           </w:pPr>
-          <w:hyperlink w:anchor="_Toc244133803" w:history="1">
+          <w:hyperlink w:anchor="_Toc244134022" w:history="1">
             <w:r>
               <w:rPr>
                 <w:rStyle w:val="Hyperlink"/>
@@ -1601,7 +1601,7 @@
               <w:rPr>
                 <w:noProof/>
               </w:rPr>
-              <w:instrText xml:space="preserve"> PAGEREF _Toc244133803 \h </w:instrText>
+              <w:instrText xml:space="preserve"> PAGEREF _Toc244134022 \h </w:instrText>
             </w:r>
             <w:r>
               <w:rPr>
@@ -1643,7 +1643,7 @@
               <w14:ligatures w14:val="standardContextual"/>
             </w:rPr>
           </w:pPr>
-          <w:hyperlink w:anchor="_Toc244133804" w:history="1">
+          <w:hyperlink w:anchor="_Toc244134023" w:history="1">
             <w:r>
               <w:rPr>
                 <w:rStyle w:val="Hyperlink"/>
@@ -1667,7 +1667,7 @@
               <w:rPr>
                 <w:noProof/>
               </w:rPr>
-              <w:instrText xml:space="preserve"> PAGEREF _Toc244133804 \h </w:instrText>
+              <w:instrText xml:space="preserve"> PAGEREF _Toc244134023 \h </w:instrText>
             </w:r>
             <w:r>
               <w:rPr>
@@ -1709,7 +1709,7 @@
               <w14:ligatures w14:val="standardContextual"/>
             </w:rPr>
           </w:pPr>
-          <w:hyperlink w:anchor="_Toc244133805" w:history="1">
+          <w:hyperlink w:anchor="_Toc244134024" w:history="1">
             <w:r>
               <w:rPr>
                 <w:rStyle w:val="Hyperlink"/>
@@ -1733,7 +1733,7 @@
               <w:rPr>
                 <w:noProof/>
               </w:rPr>
-              <w:instrText xml:space="preserve"> PAGEREF _Toc244133805 \h </w:instrText>
+              <w:instrText xml:space="preserve"> PAGEREF _Toc244134024 \h </w:instrText>
             </w:r>
             <w:r>
               <w:rPr>
@@ -1775,7 +1775,7 @@
               <w14:ligatures w14:val="standardContextual"/>
             </w:rPr>
           </w:pPr>
-          <w:hyperlink w:anchor="_Toc244133806" w:history="1">
+          <w:hyperlink w:anchor="_Toc244134025" w:history="1">
             <w:r>
               <w:rPr>
                 <w:rStyle w:val="Hyperlink"/>
@@ -1799,7 +1799,7 @@
               <w:rPr>
                 <w:noProof/>
               </w:rPr>
-              <w:instrText xml:space="preserve"> PAGEREF _Toc244133806 \h </w:instrText>
+              <w:instrText xml:space="preserve"> PAGEREF _Toc244134025 \h </w:instrText>
             </w:r>
             <w:r>
               <w:rPr>
@@ -1841,7 +1841,7 @@
               <w14:ligatures w14:val="standardContextual"/>
             </w:rPr>
           </w:pPr>
-          <w:hyperlink w:anchor="_Toc244133807" w:history="1">
+          <w:hyperlink w:anchor="_Toc244134026" w:history="1">
             <w:r>
               <w:rPr>
                 <w:rStyle w:val="Hyperlink"/>
@@ -1865,7 +1865,7 @@
               <w:rPr>
                 <w:noProof/>
               </w:rPr>
-              <w:instrText xml:space="preserve"> PAGEREF _Toc244133807 \h </w:instrText>
+              <w:instrText xml:space="preserve"> PAGEREF _Toc244134026 \h </w:instrText>
             </w:r>
             <w:r>
               <w:rPr>
@@ -1907,7 +1907,7 @@
               <w14:ligatures w14:val="standardContextual"/>
             </w:rPr>
           </w:pPr>
-          <w:hyperlink w:anchor="_Toc244133808" w:history="1">
+          <w:hyperlink w:anchor="_Toc244134027" w:history="1">
             <w:r>
               <w:rPr>
                 <w:rStyle w:val="Hyperlink"/>
@@ -1931,7 +1931,7 @@
               <w:rPr>
                 <w:noProof/>
               </w:rPr>
-              <w:instrText xml:space="preserve"> PAGEREF _Toc244133808 \h </w:instrText>
+              <w:instrText xml:space="preserve"> PAGEREF _Toc244134027 \h </w:instrText>
             </w:r>
             <w:r>
               <w:rPr>
@@ -1973,7 +1973,7 @@
               <w14:ligatures w14:val="standardContextual"/>
             </w:rPr>
           </w:pPr>
-          <w:hyperlink w:anchor="_Toc244133809" w:history="1">
+          <w:hyperlink w:anchor="_Toc244134028" w:history="1">
             <w:r>
               <w:rPr>
                 <w:rStyle w:val="Hyperlink"/>
@@ -1997,7 +1997,7 @@
               <w:rPr>
                 <w:noProof/>
               </w:rPr>
-              <w:instrText xml:space="preserve"> PAGEREF _Toc244133809 \h </w:instrText>
+              <w:instrText xml:space="preserve"> PAGEREF _Toc244134028 \h </w:instrText>
             </w:r>
             <w:r>
               <w:rPr>
@@ -2039,7 +2039,7 @@
               <w14:ligatures w14:val="standardContextual"/>
             </w:rPr>
           </w:pPr>
-          <w:hyperlink w:anchor="_Toc244133810" w:history="1">
+          <w:hyperlink w:anchor="_Toc244134029" w:history="1">
             <w:r>
               <w:rPr>
                 <w:rStyle w:val="Hyperlink"/>
@@ -2063,7 +2063,7 @@
               <w:rPr>
                 <w:noProof/>
               </w:rPr>
-              <w:instrText xml:space="preserve"> PAGEREF _Toc244133810 \h </w:instrText>
+              <w:instrText xml:space="preserve"> PAGEREF _Toc244134029 \h </w:instrText>
             </w:r>
             <w:r>
               <w:rPr>
@@ -2105,7 +2105,7 @@
               <w14:ligatures w14:val="standardContextual"/>
             </w:rPr>
           </w:pPr>
-          <w:hyperlink w:anchor="_Toc244133811" w:history="1">
+          <w:hyperlink w:anchor="_Toc244134030" w:history="1">
             <w:r>
               <w:rPr>
                 <w:rStyle w:val="Hyperlink"/>
@@ -2129,7 +2129,7 @@
               <w:rPr>
                 <w:noProof/>
               </w:rPr>
-              <w:instrText xml:space="preserve"> PAGEREF _Toc244133811 \h </w:instrText>
+              <w:instrText xml:space="preserve"> PAGEREF _Toc244134030 \h </w:instrText>
             </w:r>
             <w:r>
               <w:rPr>
@@ -2171,7 +2171,7 @@
               <w14:ligatures w14:val="standardContextual"/>
             </w:rPr>
           </w:pPr>
-          <w:hyperlink w:anchor="_Toc244133812" w:history="1">
+          <w:hyperlink w:anchor="_Toc244134031" w:history="1">
             <w:r>
               <w:rPr>
                 <w:rStyle w:val="Hyperlink"/>
@@ -2195,7 +2195,7 @@
               <w:rPr>
                 <w:noProof/>
               </w:rPr>
-              <w:instrText xml:space="preserve"> PAGEREF _Toc244133812 \h </w:instrText>
+              <w:instrText xml:space="preserve"> PAGEREF _Toc244134031 \h </w:instrText>
             </w:r>
             <w:r>
               <w:rPr>
@@ -2237,7 +2237,7 @@
               <w14:ligatures w14:val="standardContextual"/>
             </w:rPr>
           </w:pPr>
-          <w:hyperlink w:anchor="_Toc244133813" w:history="1">
+          <w:hyperlink w:anchor="_Toc244134032" w:history="1">
             <w:r>
               <w:rPr>
                 <w:rStyle w:val="Hyperlink"/>
@@ -2261,7 +2261,7 @@
               <w:rPr>
                 <w:noProof/>
               </w:rPr>
-              <w:instrText xml:space="preserve"> PAGEREF _Toc244133813 \h </w:instrText>
+              <w:instrText xml:space="preserve"> PAGEREF _Toc244134032 \h </w:instrText>
             </w:r>
             <w:r>
               <w:rPr>
@@ -2303,7 +2303,7 @@
               <w14:ligatures w14:val="standardContextual"/>
             </w:rPr>
           </w:pPr>
-          <w:hyperlink w:anchor="_Toc244133814" w:history="1">
+          <w:hyperlink w:anchor="_Toc244134033" w:history="1">
             <w:r>
               <w:rPr>
                 <w:rStyle w:val="Hyperlink"/>
@@ -2327,7 +2327,7 @@
               <w:rPr>
                 <w:noProof/>
               </w:rPr>
-              <w:instrText xml:space="preserve"> PAGEREF _Toc244133814 \h </w:instrText>
+              <w:instrText xml:space="preserve"> PAGEREF _Toc244134033 \h </w:instrText>
             </w:r>
             <w:r>
               <w:rPr>
@@ -2369,7 +2369,7 @@
               <w14:ligatures w14:val="standardContextual"/>
             </w:rPr>
           </w:pPr>
-          <w:hyperlink w:anchor="_Toc244133815" w:history="1">
+          <w:hyperlink w:anchor="_Toc244134034" w:history="1">
             <w:r>
               <w:rPr>
                 <w:rStyle w:val="Hyperlink"/>
@@ -2393,7 +2393,7 @@
               <w:rPr>
                 <w:noProof/>
               </w:rPr>
-              <w:instrText xml:space="preserve"> PAGEREF _Toc244133815 \h </w:instrText>
+              <w:instrText xml:space="preserve"> PAGEREF _Toc244134034 \h </w:instrText>
             </w:r>
             <w:r>
               <w:rPr>
@@ -2435,7 +2435,7 @@
               <w14:ligatures w14:val="standardContextual"/>
             </w:rPr>
           </w:pPr>
-          <w:hyperlink w:anchor="_Toc244133816" w:history="1">
+          <w:hyperlink w:anchor="_Toc244134035" w:history="1">
             <w:r>
               <w:rPr>
                 <w:rStyle w:val="Hyperlink"/>
@@ -2459,7 +2459,7 @@
               <w:rPr>
                 <w:noProof/>
               </w:rPr>
-              <w:instrText xml:space="preserve"> PAGEREF _Toc244133816 \h </w:instrText>
+              <w:instrText xml:space="preserve"> PAGEREF _Toc244134035 \h </w:instrText>
             </w:r>
             <w:r>
               <w:rPr>
@@ -2501,7 +2501,7 @@
               <w14:ligatures w14:val="standardContextual"/>
             </w:rPr>
           </w:pPr>
-          <w:hyperlink w:anchor="_Toc244133817" w:history="1">
+          <w:hyperlink w:anchor="_Toc244134036" w:history="1">
             <w:r>
               <w:rPr>
                 <w:rStyle w:val="Hyperlink"/>
@@ -2525,7 +2525,7 @@
               <w:rPr>
                 <w:noProof/>
               </w:rPr>
-              <w:instrText xml:space="preserve"> PAGEREF _Toc244133817 \h </w:instrText>
+              <w:instrText xml:space="preserve"> PAGEREF _Toc244134036 \h </w:instrText>
             </w:r>
             <w:r>
               <w:rPr>
@@ -2567,7 +2567,7 @@
               <w14:ligatures w14:val="standardContextual"/>
             </w:rPr>
           </w:pPr>
-          <w:hyperlink w:anchor="_Toc244133818" w:history="1">
+          <w:hyperlink w:anchor="_Toc244134037" w:history="1">
             <w:r>
               <w:rPr>
                 <w:rStyle w:val="Hyperlink"/>
@@ -2591,7 +2591,7 @@
               <w:rPr>
                 <w:noProof/>
               </w:rPr>
-              <w:instrText xml:space="preserve"> PAGEREF _Toc244133818 \h </w:instrText>
+              <w:instrText xml:space="preserve"> PAGEREF _Toc244134037 \h </w:instrText>
             </w:r>
             <w:r>
               <w:rPr>
@@ -2632,7 +2632,7 @@
         <w:pageBreakBefore/>
         <w:spacing w:before="0"/>
       </w:pPr>
-      <w:bookmarkStart w:id="0" w:name="_Toc244133782"/>
+      <w:bookmarkStart w:id="0" w:name="_Toc244134001"/>
       <w:r>
         <w:t>1.  Introduction</w:t>
       </w:r>
@@ -2768,7 +2768,7 @@
         <w:pStyle w:val="Heading1"/>
         <w:keepNext/>
       </w:pPr>
-      <w:bookmarkStart w:id="1" w:name="_Toc244133783"/>
+      <w:bookmarkStart w:id="1" w:name="_Toc244134002"/>
       <w:r>
         <w:t>2.  The Ground Theorem</w:t>
       </w:r>
@@ -3029,7 +3029,7 @@
         <w:pStyle w:val="Heading1"/>
         <w:keepNext/>
       </w:pPr>
-      <w:bookmarkStart w:id="2" w:name="_Toc244133784"/>
+      <w:bookmarkStart w:id="2" w:name="_Toc244134003"/>
       <w:r>
         <w:t>3.  What the Problem Demands</w:t>
       </w:r>
@@ -3040,7 +3040,7 @@
         <w:pStyle w:val="Heading2"/>
         <w:keepNext/>
       </w:pPr>
-      <w:bookmarkStart w:id="3" w:name="_Toc244133785"/>
+      <w:bookmarkStart w:id="3" w:name="_Toc244134004"/>
       <w:r>
         <w:t>3.1  Euclidean fields and the axioms of Osterwalder and Schrader</w:t>
       </w:r>
@@ -4170,7 +4170,7 @@
         <w:pStyle w:val="Heading2"/>
         <w:keepNext/>
       </w:pPr>
-      <w:bookmarkStart w:id="4" w:name="_Toc244133786"/>
+      <w:bookmarkStart w:id="4" w:name="_Toc244134005"/>
       <w:r>
         <w:t>3.2  The mass gap</w:t>
       </w:r>
@@ -4242,7 +4242,7 @@
         <w:pStyle w:val="Heading2"/>
         <w:keepNext/>
       </w:pPr>
-      <w:bookmarkStart w:id="5" w:name="_Toc244133787"/>
+      <w:bookmarkStart w:id="5" w:name="_Toc244134006"/>
       <w:r>
         <w:t>3.3  Non-triviality</w:t>
       </w:r>
@@ -4321,7 +4321,7 @@
         <w:pStyle w:val="Heading2"/>
         <w:keepNext/>
       </w:pPr>
-      <w:bookmarkStart w:id="6" w:name="_Toc244133788"/>
+      <w:bookmarkStart w:id="6" w:name="_Toc244134007"/>
       <w:r>
         <w:t>3.4  Limits obtained by compactness</w:t>
       </w:r>
@@ -4400,7 +4400,7 @@
         <w:pStyle w:val="Heading1"/>
         <w:keepNext/>
       </w:pPr>
-      <w:bookmarkStart w:id="7" w:name="_Toc244133789"/>
+      <w:bookmarkStart w:id="7" w:name="_Toc244134008"/>
       <w:r>
         <w:t>4.  The Lattice, Its Positivity and Its Gap</w:t>
       </w:r>
@@ -4411,7 +4411,7 @@
         <w:pStyle w:val="Heading2"/>
         <w:keepNext/>
       </w:pPr>
-      <w:bookmarkStart w:id="8" w:name="_Toc244133790"/>
+      <w:bookmarkStart w:id="8" w:name="_Toc244134009"/>
       <w:r>
         <w:t>4.1  Wilson's theory</w:t>
       </w:r>
@@ -5033,7 +5033,7 @@
         <w:pStyle w:val="Heading2"/>
         <w:keepNext/>
       </w:pPr>
-      <w:bookmarkStart w:id="9" w:name="_Toc244133791"/>
+      <w:bookmarkStart w:id="9" w:name="_Toc244134010"/>
       <w:r>
         <w:t>4.2  Reflection positivity and the transfer matrix</w:t>
       </w:r>
@@ -6069,7 +6069,7 @@
         <w:pStyle w:val="Heading2"/>
         <w:keepNext/>
       </w:pPr>
-      <w:bookmarkStart w:id="10" w:name="_Toc244133792"/>
+      <w:bookmarkStart w:id="10" w:name="_Toc244134011"/>
       <w:r>
         <w:t>4.3  The renormalisation group of Bałaban</w:t>
       </w:r>
@@ -6110,7 +6110,7 @@
         <w:pStyle w:val="Heading1"/>
         <w:keepNext/>
       </w:pPr>
-      <w:bookmarkStart w:id="11" w:name="_Toc244133793"/>
+      <w:bookmarkStart w:id="11" w:name="_Toc244134012"/>
       <w:r>
         <w:t>5.  The Three-Dimensional Manuscripts</w:t>
       </w:r>
@@ -6134,7 +6134,7 @@
         <w:pStyle w:val="Heading2"/>
         <w:keepNext/>
       </w:pPr>
-      <w:bookmarkStart w:id="12" w:name="_Toc244133794"/>
+      <w:bookmarkStart w:id="12" w:name="_Toc244134013"/>
       <w:r>
         <w:t>5.1  The documents</w:t>
       </w:r>
@@ -6181,7 +6181,7 @@
         <w:pStyle w:val="Heading2"/>
         <w:keepNext/>
       </w:pPr>
-      <w:bookmarkStart w:id="13" w:name="_Toc244133795"/>
+      <w:bookmarkStart w:id="13" w:name="_Toc244134014"/>
       <w:r>
         <w:t>5.2  The observable</w:t>
       </w:r>
@@ -6585,7 +6585,7 @@
         <w:pStyle w:val="Heading2"/>
         <w:keepNext/>
       </w:pPr>
-      <w:bookmarkStart w:id="14" w:name="_Toc244133796"/>
+      <w:bookmarkStart w:id="14" w:name="_Toc244134015"/>
       <w:r>
         <w:t>5.3  The torus, the infinite volume and the components</w:t>
       </w:r>
@@ -7116,7 +7116,7 @@
         <w:pStyle w:val="Heading2"/>
         <w:keepNext/>
       </w:pPr>
-      <w:bookmarkStart w:id="15" w:name="_Toc244133797"/>
+      <w:bookmarkStart w:id="15" w:name="_Toc244134016"/>
       <w:r>
         <w:t>5.4  The axioms and the reconstruction</w:t>
       </w:r>
@@ -7346,7 +7346,7 @@
         <w:pStyle w:val="Heading2"/>
         <w:keepNext/>
       </w:pPr>
-      <w:bookmarkStart w:id="16" w:name="_Toc244133798"/>
+      <w:bookmarkStart w:id="16" w:name="_Toc244134017"/>
       <w:r>
         <w:t>5.5  Non-triviality</w:t>
       </w:r>
@@ -7887,7 +7887,7 @@
         <w:pStyle w:val="Heading2"/>
         <w:keepNext/>
       </w:pPr>
-      <w:bookmarkStart w:id="17" w:name="_Toc244133799"/>
+      <w:bookmarkStart w:id="17" w:name="_Toc244134018"/>
       <w:r>
         <w:t>5.6  What the manuscript does not assert</w:t>
       </w:r>
@@ -7935,7 +7935,7 @@
         <w:pStyle w:val="Heading1"/>
         <w:keepNext/>
       </w:pPr>
-      <w:bookmarkStart w:id="18" w:name="_Toc244133800"/>
+      <w:bookmarkStart w:id="18" w:name="_Toc244134019"/>
       <w:r>
         <w:t>6.  The Four-Dimensional Draft and the Standing of the Corpus</w:t>
       </w:r>
@@ -7959,7 +7959,7 @@
         <w:pStyle w:val="Heading2"/>
         <w:keepNext/>
       </w:pPr>
-      <w:bookmarkStart w:id="19" w:name="_Toc244133801"/>
+      <w:bookmarkStart w:id="19" w:name="_Toc244134020"/>
       <w:r>
         <w:t>6.1  The authors' account</w:t>
       </w:r>
@@ -8023,7 +8023,7 @@
         <w:pStyle w:val="Heading2"/>
         <w:keepNext/>
       </w:pPr>
-      <w:bookmarkStart w:id="20" w:name="_Toc244133802"/>
+      <w:bookmarkStart w:id="20" w:name="_Toc244134021"/>
       <w:r>
         <w:t>6.2  The conditional theorem</w:t>
       </w:r>
@@ -8226,7 +8226,7 @@
         <w:pStyle w:val="Heading2"/>
         <w:keepNext/>
       </w:pPr>
-      <w:bookmarkStart w:id="21" w:name="_Toc244133803"/>
+      <w:bookmarkStart w:id="21" w:name="_Toc244134022"/>
       <w:r>
         <w:t>6.3  What the draft does not claim</w:t>
       </w:r>
@@ -8304,7 +8304,7 @@
         <w:pStyle w:val="Heading2"/>
         <w:keepNext/>
       </w:pPr>
-      <w:bookmarkStart w:id="22" w:name="_Toc244133804"/>
+      <w:bookmarkStart w:id="22" w:name="_Toc244134023"/>
       <w:r>
         <w:t>6.4  The standing of the corpus</w:t>
       </w:r>
@@ -8365,7 +8365,7 @@
         <w:pStyle w:val="Heading2"/>
         <w:keepNext/>
       </w:pPr>
-      <w:bookmarkStart w:id="23" w:name="_Toc244133805"/>
+      <w:bookmarkStart w:id="23" w:name="_Toc244134024"/>
       <w:r>
         <w:t>6.5  The public reading</w:t>
       </w:r>
@@ -8433,7 +8433,7 @@
         <w:pStyle w:val="Heading2"/>
         <w:keepNext/>
       </w:pPr>
-      <w:bookmarkStart w:id="24" w:name="_Toc244133806"/>
+      <w:bookmarkStart w:id="24" w:name="_Toc244134025"/>
       <w:r>
         <w:t>6.6  Two further claims in public view</w:t>
       </w:r>
@@ -8690,7 +8690,7 @@
         <w:pStyle w:val="Heading1"/>
         <w:keepNext/>
       </w:pPr>
-      <w:bookmarkStart w:id="25" w:name="_Toc244133807"/>
+      <w:bookmarkStart w:id="25" w:name="_Toc244134026"/>
       <w:r>
         <w:t>7.  The Residue and Its Completion</w:t>
       </w:r>
@@ -8714,7 +8714,7 @@
         <w:pStyle w:val="Heading2"/>
         <w:keepNext/>
       </w:pPr>
-      <w:bookmarkStart w:id="26" w:name="_Toc244133808"/>
+      <w:bookmarkStart w:id="26" w:name="_Toc244134027"/>
       <w:r>
         <w:t>7.1  The residue</w:t>
       </w:r>
@@ -9908,7 +9908,7 @@
         <w:pStyle w:val="Heading2"/>
         <w:keepNext/>
       </w:pPr>
-      <w:bookmarkStart w:id="27" w:name="_Toc244133809"/>
+      <w:bookmarkStart w:id="27" w:name="_Toc244134028"/>
       <w:r>
         <w:t>7.2  The gap is exponential clustering</w:t>
       </w:r>
@@ -11854,7 +11854,7 @@
         <w:pStyle w:val="Heading2"/>
         <w:keepNext/>
       </w:pPr>
-      <w:bookmarkStart w:id="28" w:name="_Toc244133810"/>
+      <w:bookmarkStart w:id="28" w:name="_Toc244134029"/>
       <w:r>
         <w:t>7.3  From the lattice to the limit</w:t>
       </w:r>
@@ -13034,7 +13034,7 @@
         <w:pStyle w:val="Heading2"/>
         <w:keepNext/>
       </w:pPr>
-      <w:bookmarkStart w:id="29" w:name="_Toc244133811"/>
+      <w:bookmarkStart w:id="29" w:name="_Toc244134030"/>
       <w:r>
         <w:t>7.4  The collapse of the components</w:t>
       </w:r>
@@ -13150,7 +13150,7 @@
         <w:pStyle w:val="Heading1"/>
         <w:keepNext/>
       </w:pPr>
-      <w:bookmarkStart w:id="30" w:name="_Toc244133812"/>
+      <w:bookmarkStart w:id="30" w:name="_Toc244134031"/>
       <w:r>
         <w:t>8.  The Ground Handed Over</w:t>
       </w:r>
@@ -13161,7 +13161,7 @@
         <w:pStyle w:val="Heading2"/>
         <w:keepNext/>
       </w:pPr>
-      <w:bookmarkStart w:id="31" w:name="_Toc244133813"/>
+      <w:bookmarkStart w:id="31" w:name="_Toc244134032"/>
       <w:r>
         <w:t>8.1  The object that remains</w:t>
       </w:r>
@@ -13305,7 +13305,7 @@
         <w:pStyle w:val="Heading2"/>
         <w:keepNext/>
       </w:pPr>
-      <w:bookmarkStart w:id="32" w:name="_Toc244133814"/>
+      <w:bookmarkStart w:id="32" w:name="_Toc244134033"/>
       <w:r>
         <w:t>8.2  The instruments in hand</w:t>
       </w:r>
@@ -20374,7 +20374,7 @@
         <w:pStyle w:val="Heading2"/>
         <w:keepNext/>
       </w:pPr>
-      <w:bookmarkStart w:id="33" w:name="_Toc244133815"/>
+      <w:bookmarkStart w:id="33" w:name="_Toc244134034"/>
       <w:r>
         <w:t>8.3  The reduction</w:t>
       </w:r>
@@ -28144,10 +28144,10 @@
         <w:footnoteReference w:id="66"/>
       </w:r>
       <w:r>
-        <w:t xml:space="preserve"> The record also says what the model is not. Its first step from β = 2.2 moves the coupling up where the running of ℤ⁴ moves it down, by an amount of the step's own size, so the model certifies the entry into the disk from its fifth rung and the threshold at its seventh, and not the crossover's first steps, which a flow on ℤ⁴ must read on an object of ℤ⁴; on ℤ⁴ those steps are the distance Hypotheses I and II must cross, and no reading of the hierarchical model is a statement about ℤ⁴. One more thing is kno</w:t>
-      </w:r>
-      <w:r>
-        <w:t>wn about the inequality that would carry the model's control to ℤ⁴. A comparison that bounded the mixed second differences of the effective action of ℤ⁴ by those of the hierarchical model, and held for every compact gauge group, would give the four-dimensional U(1) theory a gap wherever its hierarchical flow reaches the disk; the U(1) theory has a massless phase at weak coupling.</w:t>
+        <w:t xml:space="preserve"> The record also says what the model is not. Its first step from β = 2.2 moves the coupling up where the running of ℤ⁴ moves it down, by an amount of the step's own size, so the model certifies the entry into the disk from its fifth rung and the threshold at its seventh, and not the crossover's first steps, which a flow on ℤ⁴ must read on an object of ℤ⁴. The distance Hypotheses I and II must cross is measured in the blocking steps of ℤ⁴ itself; no step count of the hierarchical model is a reading of it, an</w:t>
+      </w:r>
+      <w:r>
+        <w:t>d no reading of the hierarchical model is a statement about ℤ⁴. One more thing is known about the inequality that would carry the model's control to ℤ⁴. A comparison that bounded the mixed second differences of the effective action of ℤ⁴ by those of the hierarchical model, and held for every compact gauge group, would give the four-dimensional U(1) theory a gap wherever its hierarchical flow reaches the disk; the U(1) theory has a massless phase at weak coupling.</w:t>
       </w:r>
       <w:r>
         <w:rPr>
@@ -28189,7 +28189,7 @@
         <w:pStyle w:val="Heading2"/>
         <w:keepNext/>
       </w:pPr>
-      <w:bookmarkStart w:id="34" w:name="_Toc244133816"/>
+      <w:bookmarkStart w:id="34" w:name="_Toc244134035"/>
       <w:r>
         <w:t>8.4  Coda</w:t>
       </w:r>
@@ -28214,7 +28214,7 @@
         <w:pageBreakBefore/>
         <w:spacing w:before="0"/>
       </w:pPr>
-      <w:bookmarkStart w:id="35" w:name="_Toc244133817"/>
+      <w:bookmarkStart w:id="35" w:name="_Toc244134036"/>
       <w:r>
         <w:t>Sources</w:t>
       </w:r>
@@ -29240,7 +29240,7 @@
         <w:pStyle w:val="Heading2"/>
         <w:keepNext/>
       </w:pPr>
-      <w:bookmarkStart w:id="36" w:name="_Toc244133818"/>
+      <w:bookmarkStart w:id="36" w:name="_Toc244134037"/>
       <w:r>
         <w:t>Records of the computations of Edwin Boston III</w:t>
       </w:r>
@@ -31807,10 +31807,10 @@
 <file path=word/numbering.xml><?xml version="1.0" encoding="utf-8"?>
 <w:numbering xmlns:wpc="http://schemas.microsoft.com/office/word/2010/wordprocessingCanvas" xmlns:cx="http://schemas.microsoft.com/office/drawing/2014/chartex" xmlns:cx1="http://schemas.microsoft.com/office/drawing/2015/9/8/chartex" xmlns:cx2="http://schemas.microsoft.com/office/drawing/2015/10/21/chartex" xmlns:cx3="http://schemas.microsoft.com/office/drawing/2016/5/9/chartex" xmlns:cx4="http://schemas.microsoft.com/office/drawing/2016/5/10/chartex" xmlns:cx5="http://schemas.microsoft.com/office/drawing/2016/5/11/chartex" xmlns:cx6="http://schemas.microsoft.com/office/drawing/2016/5/12/chartex" xmlns:cx7="http://schemas.microsoft.com/office/drawing/2016/5/13/chartex" xmlns:cx8="http://schemas.microsoft.com/office/drawing/2016/5/14/chartex" xmlns:mc="http://schemas.openxmlformats.org/markup-compatibility/2006" xmlns:aink="http://schemas.microsoft.com/office/drawing/2016/ink" xmlns:am3d="http://schemas.microsoft.com/office/drawing/2017/model3d" xmlns:o="urn:schemas-microsoft-com:office:office" xmlns:oel="http://schemas.microsoft.com/office/2019/extlst" xmlns:r="http://schemas.openxmlformats.org/officeDocument/2006/relationships" xmlns:m="http://schemas.openxmlformats.org/officeDocument/2006/math" xmlns:v="urn:schemas-microsoft-com:vml" xmlns:wp14="http://schemas.microsoft.com/office/word/2010/wordprocessingDrawing" xmlns:wp="http://schemas.openxmlformats.org/drawingml/2006/wordprocessingDrawing" xmlns:w10="urn:schemas-microsoft-com:office:word" xmlns:w="http://schemas.openxmlformats.org/wordprocessingml/2006/main" xmlns:w14="http://schemas.microsoft.com/office/word/2010/wordml" xmlns:w15="http://schemas.microsoft.com/office/word/2012/wordml" xmlns:w16cex="http://schemas.microsoft.com/office/word/2018/wordml/cex" xmlns:w16cid="http://schemas.microsoft.com/office/word/2016/wordml/cid" xmlns:w16="http://schemas.microsoft.com/office/word/2018/wordml" xmlns:w16du="http://schemas.microsoft.com/office/word/2023/wordml/word16du" xmlns:w16sdtdh="http://schemas.microsoft.com/office/word/2020/wordml/sdtdatahash" xmlns:w16sdtfl="http://schemas.microsoft.com/office/word/2024/wordml/sdtformatlock" xmlns:w16se="http://schemas.microsoft.com/office/word/2015/wordml/symex" xmlns:wpg="http://schemas.microsoft.com/office/word/2010/wordprocessingGroup" xmlns:wpi="http://schemas.microsoft.com/office/word/2010/wordprocessingInk" xmlns:wne="http://schemas.microsoft.com/office/word/2006/wordml" xmlns:wps="http://schemas.microsoft.com/office/word/2010/wordprocessingShape" mc:Ignorable="w14 w15 w16se w16cid w16 w16cex w16sdtdh w16sdtfl w16du wp14">
   <w:abstractNum w:abstractNumId="0" w15:restartNumberingAfterBreak="0">
-    <w:nsid w:val="022D2DB0"/>
+    <w:nsid w:val="503D08BB"/>
     <w:multiLevelType w:val="hybridMultilevel"/>
-    <w:tmpl w:val="7D4E89F6"/>
-    <w:lvl w:ilvl="0" w:tplc="262810C6">
+    <w:tmpl w:val="8DE63CF6"/>
+    <w:lvl w:ilvl="0" w:tplc="FC387E58">
       <w:start w:val="1"/>
       <w:numFmt w:val="bullet"/>
       <w:lvlText w:val="●"/>
@@ -31819,7 +31819,7 @@
         <w:ind w:left="720" w:hanging="360"/>
       </w:pPr>
     </w:lvl>
-    <w:lvl w:ilvl="1" w:tplc="CE96F370">
+    <w:lvl w:ilvl="1" w:tplc="6D1AFF7C">
       <w:start w:val="1"/>
       <w:numFmt w:val="bullet"/>
       <w:lvlText w:val="○"/>
@@ -31828,7 +31828,7 @@
         <w:ind w:left="1440" w:hanging="360"/>
       </w:pPr>
     </w:lvl>
-    <w:lvl w:ilvl="2" w:tplc="CE10D050">
+    <w:lvl w:ilvl="2" w:tplc="CD6E6C10">
       <w:start w:val="1"/>
       <w:numFmt w:val="bullet"/>
       <w:lvlText w:val="■"/>
@@ -31837,7 +31837,7 @@
         <w:ind w:left="2160" w:hanging="360"/>
       </w:pPr>
     </w:lvl>
-    <w:lvl w:ilvl="3" w:tplc="02AE4EB0">
+    <w:lvl w:ilvl="3" w:tplc="310E6EC6">
       <w:start w:val="1"/>
       <w:numFmt w:val="bullet"/>
       <w:lvlText w:val="●"/>
@@ -31846,7 +31846,7 @@
         <w:ind w:left="2880" w:hanging="360"/>
       </w:pPr>
     </w:lvl>
-    <w:lvl w:ilvl="4" w:tplc="481E212C">
+    <w:lvl w:ilvl="4" w:tplc="00309E3C">
       <w:start w:val="1"/>
       <w:numFmt w:val="bullet"/>
       <w:lvlText w:val="○"/>
@@ -31855,7 +31855,7 @@
         <w:ind w:left="3600" w:hanging="360"/>
       </w:pPr>
     </w:lvl>
-    <w:lvl w:ilvl="5" w:tplc="118A4F04">
+    <w:lvl w:ilvl="5" w:tplc="DE482366">
       <w:start w:val="1"/>
       <w:numFmt w:val="bullet"/>
       <w:lvlText w:val="■"/>
@@ -31864,7 +31864,7 @@
         <w:ind w:left="4320" w:hanging="360"/>
       </w:pPr>
     </w:lvl>
-    <w:lvl w:ilvl="6" w:tplc="A012491C">
+    <w:lvl w:ilvl="6" w:tplc="89B2F3C6">
       <w:start w:val="1"/>
       <w:numFmt w:val="bullet"/>
       <w:lvlText w:val="●"/>
@@ -31873,7 +31873,7 @@
         <w:ind w:left="5040" w:hanging="360"/>
       </w:pPr>
     </w:lvl>
-    <w:lvl w:ilvl="7" w:tplc="29DC44D4">
+    <w:lvl w:ilvl="7" w:tplc="A2A05A52">
       <w:start w:val="1"/>
       <w:numFmt w:val="bullet"/>
       <w:lvlText w:val="●"/>
@@ -31882,7 +31882,7 @@
         <w:ind w:left="5760" w:hanging="360"/>
       </w:pPr>
     </w:lvl>
-    <w:lvl w:ilvl="8" w:tplc="D74AED62">
+    <w:lvl w:ilvl="8" w:tplc="787CB920">
       <w:start w:val="1"/>
       <w:numFmt w:val="bullet"/>
       <w:lvlText w:val="●"/>
@@ -31892,7 +31892,7 @@
       </w:pPr>
     </w:lvl>
   </w:abstractNum>
-  <w:num w:numId="1" w16cid:durableId="365714093">
+  <w:num w:numId="1" w16cid:durableId="871966073">
     <w:abstractNumId w:val="0"/>
     <w:lvlOverride w:ilvl="0">
       <w:startOverride w:val="1"/>
@@ -32489,7 +32489,7 @@
     <w:autoRedefine/>
     <w:uiPriority w:val="39"/>
     <w:unhideWhenUsed/>
-    <w:rsid w:val="00EB6CFC"/>
+    <w:rsid w:val="00DB7F89"/>
     <w:pPr>
       <w:spacing w:after="100"/>
     </w:pPr>
@@ -32501,7 +32501,7 @@
     <w:autoRedefine/>
     <w:uiPriority w:val="39"/>
     <w:unhideWhenUsed/>
-    <w:rsid w:val="00EB6CFC"/>
+    <w:rsid w:val="00DB7F89"/>
     <w:pPr>
       <w:spacing w:after="100"/>
       <w:ind w:left="220"/>

</xml_diff>

<commit_message>
THE GROUND, revision 17 (Edwin Boston III, 2026-10-29 04:36 EDT): a second reader's independent read of Theorem 8.7 recorded; the Wasserstein sentence carries its honest accounting
Records R7 now states that the derivation of Theorem 8.7 was read independently, line by line, by a second reader on 29 October 2026, who found no defect, reproduced Table 3 to six digits on a fourth road, and checked Lemma 8.6 and the one-link bound by deterministic quadrature at 240 radii and seventy law-direction pairs. The open-part paragraph of Section 8.3 says of the Wasserstein widening what its own accounting says: the one-link constant 1/4 is exact in the two symmetric directions and supported to one per cent between them; with the constants proved so far the widening gains nothing over Theorem 8.7; its predicted close near 0.30 rests on two constants not yet proved. README.md and ARXIV.md follow. 40 pages.
</commit_message>
<xml_diff>
--- a/THE-GROUND-Edwin-Boston-III.docx
+++ b/THE-GROUND-Edwin-Boston-III.docx
@@ -170,7 +170,7 @@
     <w:sdt>
       <w:sdtPr>
         <w:alias w:val="Contents"/>
-        <w:id w:val="-261066095"/>
+        <w:id w:val="469093049"/>
       </w:sdtPr>
       <w:sdtEndPr/>
       <w:sdtContent>
@@ -198,7 +198,7 @@
           <w:r>
             <w:fldChar w:fldCharType="separate"/>
           </w:r>
-          <w:hyperlink w:anchor="_Toc244139640" w:history="1">
+          <w:hyperlink w:anchor="_Toc244141007" w:history="1">
             <w:r>
               <w:rPr>
                 <w:rStyle w:val="Hyperlink"/>
@@ -222,7 +222,7 @@
               <w:rPr>
                 <w:noProof/>
               </w:rPr>
-              <w:instrText xml:space="preserve"> PAGEREF _Toc244139640 \h </w:instrText>
+              <w:instrText xml:space="preserve"> PAGEREF _Toc244141007 \h </w:instrText>
             </w:r>
             <w:r>
               <w:rPr>
@@ -264,7 +264,7 @@
               <w14:ligatures w14:val="standardContextual"/>
             </w:rPr>
           </w:pPr>
-          <w:hyperlink w:anchor="_Toc244139641" w:history="1">
+          <w:hyperlink w:anchor="_Toc244141008" w:history="1">
             <w:r>
               <w:rPr>
                 <w:rStyle w:val="Hyperlink"/>
@@ -288,7 +288,7 @@
               <w:rPr>
                 <w:noProof/>
               </w:rPr>
-              <w:instrText xml:space="preserve"> PAGEREF _Toc244139641 \h </w:instrText>
+              <w:instrText xml:space="preserve"> PAGEREF _Toc244141008 \h </w:instrText>
             </w:r>
             <w:r>
               <w:rPr>
@@ -330,7 +330,7 @@
               <w14:ligatures w14:val="standardContextual"/>
             </w:rPr>
           </w:pPr>
-          <w:hyperlink w:anchor="_Toc244139642" w:history="1">
+          <w:hyperlink w:anchor="_Toc244141009" w:history="1">
             <w:r>
               <w:rPr>
                 <w:rStyle w:val="Hyperlink"/>
@@ -354,7 +354,7 @@
               <w:rPr>
                 <w:noProof/>
               </w:rPr>
-              <w:instrText xml:space="preserve"> PAGEREF _Toc244139642 \h </w:instrText>
+              <w:instrText xml:space="preserve"> PAGEREF _Toc244141009 \h </w:instrText>
             </w:r>
             <w:r>
               <w:rPr>
@@ -396,7 +396,7 @@
               <w14:ligatures w14:val="standardContextual"/>
             </w:rPr>
           </w:pPr>
-          <w:hyperlink w:anchor="_Toc244139643" w:history="1">
+          <w:hyperlink w:anchor="_Toc244141010" w:history="1">
             <w:r>
               <w:rPr>
                 <w:rStyle w:val="Hyperlink"/>
@@ -420,7 +420,7 @@
               <w:rPr>
                 <w:noProof/>
               </w:rPr>
-              <w:instrText xml:space="preserve"> PAGEREF _Toc244139643 \h </w:instrText>
+              <w:instrText xml:space="preserve"> PAGEREF _Toc244141010 \h </w:instrText>
             </w:r>
             <w:r>
               <w:rPr>
@@ -462,7 +462,7 @@
               <w14:ligatures w14:val="standardContextual"/>
             </w:rPr>
           </w:pPr>
-          <w:hyperlink w:anchor="_Toc244139644" w:history="1">
+          <w:hyperlink w:anchor="_Toc244141011" w:history="1">
             <w:r>
               <w:rPr>
                 <w:rStyle w:val="Hyperlink"/>
@@ -486,7 +486,7 @@
               <w:rPr>
                 <w:noProof/>
               </w:rPr>
-              <w:instrText xml:space="preserve"> PAGEREF _Toc244139644 \h </w:instrText>
+              <w:instrText xml:space="preserve"> PAGEREF _Toc244141011 \h </w:instrText>
             </w:r>
             <w:r>
               <w:rPr>
@@ -528,7 +528,7 @@
               <w14:ligatures w14:val="standardContextual"/>
             </w:rPr>
           </w:pPr>
-          <w:hyperlink w:anchor="_Toc244139645" w:history="1">
+          <w:hyperlink w:anchor="_Toc244141012" w:history="1">
             <w:r>
               <w:rPr>
                 <w:rStyle w:val="Hyperlink"/>
@@ -552,7 +552,7 @@
               <w:rPr>
                 <w:noProof/>
               </w:rPr>
-              <w:instrText xml:space="preserve"> PAGEREF _Toc244139645 \h </w:instrText>
+              <w:instrText xml:space="preserve"> PAGEREF _Toc244141012 \h </w:instrText>
             </w:r>
             <w:r>
               <w:rPr>
@@ -594,7 +594,7 @@
               <w14:ligatures w14:val="standardContextual"/>
             </w:rPr>
           </w:pPr>
-          <w:hyperlink w:anchor="_Toc244139646" w:history="1">
+          <w:hyperlink w:anchor="_Toc244141013" w:history="1">
             <w:r>
               <w:rPr>
                 <w:rStyle w:val="Hyperlink"/>
@@ -618,7 +618,7 @@
               <w:rPr>
                 <w:noProof/>
               </w:rPr>
-              <w:instrText xml:space="preserve"> PAGEREF _Toc244139646 \h </w:instrText>
+              <w:instrText xml:space="preserve"> PAGEREF _Toc244141013 \h </w:instrText>
             </w:r>
             <w:r>
               <w:rPr>
@@ -660,7 +660,7 @@
               <w14:ligatures w14:val="standardContextual"/>
             </w:rPr>
           </w:pPr>
-          <w:hyperlink w:anchor="_Toc244139647" w:history="1">
+          <w:hyperlink w:anchor="_Toc244141014" w:history="1">
             <w:r>
               <w:rPr>
                 <w:rStyle w:val="Hyperlink"/>
@@ -684,7 +684,7 @@
               <w:rPr>
                 <w:noProof/>
               </w:rPr>
-              <w:instrText xml:space="preserve"> PAGEREF _Toc244139647 \h </w:instrText>
+              <w:instrText xml:space="preserve"> PAGEREF _Toc244141014 \h </w:instrText>
             </w:r>
             <w:r>
               <w:rPr>
@@ -726,7 +726,7 @@
               <w14:ligatures w14:val="standardContextual"/>
             </w:rPr>
           </w:pPr>
-          <w:hyperlink w:anchor="_Toc244139648" w:history="1">
+          <w:hyperlink w:anchor="_Toc244141015" w:history="1">
             <w:r>
               <w:rPr>
                 <w:rStyle w:val="Hyperlink"/>
@@ -750,7 +750,7 @@
               <w:rPr>
                 <w:noProof/>
               </w:rPr>
-              <w:instrText xml:space="preserve"> PAGEREF _Toc244139648 \h </w:instrText>
+              <w:instrText xml:space="preserve"> PAGEREF _Toc244141015 \h </w:instrText>
             </w:r>
             <w:r>
               <w:rPr>
@@ -792,7 +792,7 @@
               <w14:ligatures w14:val="standardContextual"/>
             </w:rPr>
           </w:pPr>
-          <w:hyperlink w:anchor="_Toc244139649" w:history="1">
+          <w:hyperlink w:anchor="_Toc244141016" w:history="1">
             <w:r>
               <w:rPr>
                 <w:rStyle w:val="Hyperlink"/>
@@ -816,7 +816,7 @@
               <w:rPr>
                 <w:noProof/>
               </w:rPr>
-              <w:instrText xml:space="preserve"> PAGEREF _Toc244139649 \h </w:instrText>
+              <w:instrText xml:space="preserve"> PAGEREF _Toc244141016 \h </w:instrText>
             </w:r>
             <w:r>
               <w:rPr>
@@ -858,7 +858,7 @@
               <w14:ligatures w14:val="standardContextual"/>
             </w:rPr>
           </w:pPr>
-          <w:hyperlink w:anchor="_Toc244139650" w:history="1">
+          <w:hyperlink w:anchor="_Toc244141017" w:history="1">
             <w:r>
               <w:rPr>
                 <w:rStyle w:val="Hyperlink"/>
@@ -882,7 +882,7 @@
               <w:rPr>
                 <w:noProof/>
               </w:rPr>
-              <w:instrText xml:space="preserve"> PAGEREF _Toc244139650 \h </w:instrText>
+              <w:instrText xml:space="preserve"> PAGEREF _Toc244141017 \h </w:instrText>
             </w:r>
             <w:r>
               <w:rPr>
@@ -924,7 +924,7 @@
               <w14:ligatures w14:val="standardContextual"/>
             </w:rPr>
           </w:pPr>
-          <w:hyperlink w:anchor="_Toc244139651" w:history="1">
+          <w:hyperlink w:anchor="_Toc244141018" w:history="1">
             <w:r>
               <w:rPr>
                 <w:rStyle w:val="Hyperlink"/>
@@ -948,7 +948,7 @@
               <w:rPr>
                 <w:noProof/>
               </w:rPr>
-              <w:instrText xml:space="preserve"> PAGEREF _Toc244139651 \h </w:instrText>
+              <w:instrText xml:space="preserve"> PAGEREF _Toc244141018 \h </w:instrText>
             </w:r>
             <w:r>
               <w:rPr>
@@ -990,7 +990,7 @@
               <w14:ligatures w14:val="standardContextual"/>
             </w:rPr>
           </w:pPr>
-          <w:hyperlink w:anchor="_Toc244139652" w:history="1">
+          <w:hyperlink w:anchor="_Toc244141019" w:history="1">
             <w:r>
               <w:rPr>
                 <w:rStyle w:val="Hyperlink"/>
@@ -1014,7 +1014,7 @@
               <w:rPr>
                 <w:noProof/>
               </w:rPr>
-              <w:instrText xml:space="preserve"> PAGEREF _Toc244139652 \h </w:instrText>
+              <w:instrText xml:space="preserve"> PAGEREF _Toc244141019 \h </w:instrText>
             </w:r>
             <w:r>
               <w:rPr>
@@ -1056,7 +1056,7 @@
               <w14:ligatures w14:val="standardContextual"/>
             </w:rPr>
           </w:pPr>
-          <w:hyperlink w:anchor="_Toc244139653" w:history="1">
+          <w:hyperlink w:anchor="_Toc244141020" w:history="1">
             <w:r>
               <w:rPr>
                 <w:rStyle w:val="Hyperlink"/>
@@ -1080,7 +1080,7 @@
               <w:rPr>
                 <w:noProof/>
               </w:rPr>
-              <w:instrText xml:space="preserve"> PAGEREF _Toc244139653 \h </w:instrText>
+              <w:instrText xml:space="preserve"> PAGEREF _Toc244141020 \h </w:instrText>
             </w:r>
             <w:r>
               <w:rPr>
@@ -1122,7 +1122,7 @@
               <w14:ligatures w14:val="standardContextual"/>
             </w:rPr>
           </w:pPr>
-          <w:hyperlink w:anchor="_Toc244139654" w:history="1">
+          <w:hyperlink w:anchor="_Toc244141021" w:history="1">
             <w:r>
               <w:rPr>
                 <w:rStyle w:val="Hyperlink"/>
@@ -1146,7 +1146,7 @@
               <w:rPr>
                 <w:noProof/>
               </w:rPr>
-              <w:instrText xml:space="preserve"> PAGEREF _Toc244139654 \h </w:instrText>
+              <w:instrText xml:space="preserve"> PAGEREF _Toc244141021 \h </w:instrText>
             </w:r>
             <w:r>
               <w:rPr>
@@ -1188,7 +1188,7 @@
               <w14:ligatures w14:val="standardContextual"/>
             </w:rPr>
           </w:pPr>
-          <w:hyperlink w:anchor="_Toc244139655" w:history="1">
+          <w:hyperlink w:anchor="_Toc244141022" w:history="1">
             <w:r>
               <w:rPr>
                 <w:rStyle w:val="Hyperlink"/>
@@ -1212,7 +1212,7 @@
               <w:rPr>
                 <w:noProof/>
               </w:rPr>
-              <w:instrText xml:space="preserve"> PAGEREF _Toc244139655 \h </w:instrText>
+              <w:instrText xml:space="preserve"> PAGEREF _Toc244141022 \h </w:instrText>
             </w:r>
             <w:r>
               <w:rPr>
@@ -1254,7 +1254,7 @@
               <w14:ligatures w14:val="standardContextual"/>
             </w:rPr>
           </w:pPr>
-          <w:hyperlink w:anchor="_Toc244139656" w:history="1">
+          <w:hyperlink w:anchor="_Toc244141023" w:history="1">
             <w:r>
               <w:rPr>
                 <w:rStyle w:val="Hyperlink"/>
@@ -1278,7 +1278,7 @@
               <w:rPr>
                 <w:noProof/>
               </w:rPr>
-              <w:instrText xml:space="preserve"> PAGEREF _Toc244139656 \h </w:instrText>
+              <w:instrText xml:space="preserve"> PAGEREF _Toc244141023 \h </w:instrText>
             </w:r>
             <w:r>
               <w:rPr>
@@ -1320,7 +1320,7 @@
               <w14:ligatures w14:val="standardContextual"/>
             </w:rPr>
           </w:pPr>
-          <w:hyperlink w:anchor="_Toc244139657" w:history="1">
+          <w:hyperlink w:anchor="_Toc244141024" w:history="1">
             <w:r>
               <w:rPr>
                 <w:rStyle w:val="Hyperlink"/>
@@ -1344,7 +1344,7 @@
               <w:rPr>
                 <w:noProof/>
               </w:rPr>
-              <w:instrText xml:space="preserve"> PAGEREF _Toc244139657 \h </w:instrText>
+              <w:instrText xml:space="preserve"> PAGEREF _Toc244141024 \h </w:instrText>
             </w:r>
             <w:r>
               <w:rPr>
@@ -1386,7 +1386,7 @@
               <w14:ligatures w14:val="standardContextual"/>
             </w:rPr>
           </w:pPr>
-          <w:hyperlink w:anchor="_Toc244139658" w:history="1">
+          <w:hyperlink w:anchor="_Toc244141025" w:history="1">
             <w:r>
               <w:rPr>
                 <w:rStyle w:val="Hyperlink"/>
@@ -1410,7 +1410,7 @@
               <w:rPr>
                 <w:noProof/>
               </w:rPr>
-              <w:instrText xml:space="preserve"> PAGEREF _Toc244139658 \h </w:instrText>
+              <w:instrText xml:space="preserve"> PAGEREF _Toc244141025 \h </w:instrText>
             </w:r>
             <w:r>
               <w:rPr>
@@ -1452,7 +1452,7 @@
               <w14:ligatures w14:val="standardContextual"/>
             </w:rPr>
           </w:pPr>
-          <w:hyperlink w:anchor="_Toc244139659" w:history="1">
+          <w:hyperlink w:anchor="_Toc244141026" w:history="1">
             <w:r>
               <w:rPr>
                 <w:rStyle w:val="Hyperlink"/>
@@ -1476,7 +1476,7 @@
               <w:rPr>
                 <w:noProof/>
               </w:rPr>
-              <w:instrText xml:space="preserve"> PAGEREF _Toc244139659 \h </w:instrText>
+              <w:instrText xml:space="preserve"> PAGEREF _Toc244141026 \h </w:instrText>
             </w:r>
             <w:r>
               <w:rPr>
@@ -1518,7 +1518,7 @@
               <w14:ligatures w14:val="standardContextual"/>
             </w:rPr>
           </w:pPr>
-          <w:hyperlink w:anchor="_Toc244139660" w:history="1">
+          <w:hyperlink w:anchor="_Toc244141027" w:history="1">
             <w:r>
               <w:rPr>
                 <w:rStyle w:val="Hyperlink"/>
@@ -1542,7 +1542,7 @@
               <w:rPr>
                 <w:noProof/>
               </w:rPr>
-              <w:instrText xml:space="preserve"> PAGEREF _Toc244139660 \h </w:instrText>
+              <w:instrText xml:space="preserve"> PAGEREF _Toc244141027 \h </w:instrText>
             </w:r>
             <w:r>
               <w:rPr>
@@ -1584,7 +1584,7 @@
               <w14:ligatures w14:val="standardContextual"/>
             </w:rPr>
           </w:pPr>
-          <w:hyperlink w:anchor="_Toc244139661" w:history="1">
+          <w:hyperlink w:anchor="_Toc244141028" w:history="1">
             <w:r>
               <w:rPr>
                 <w:rStyle w:val="Hyperlink"/>
@@ -1608,7 +1608,7 @@
               <w:rPr>
                 <w:noProof/>
               </w:rPr>
-              <w:instrText xml:space="preserve"> PAGEREF _Toc244139661 \h </w:instrText>
+              <w:instrText xml:space="preserve"> PAGEREF _Toc244141028 \h </w:instrText>
             </w:r>
             <w:r>
               <w:rPr>
@@ -1650,7 +1650,7 @@
               <w14:ligatures w14:val="standardContextual"/>
             </w:rPr>
           </w:pPr>
-          <w:hyperlink w:anchor="_Toc244139662" w:history="1">
+          <w:hyperlink w:anchor="_Toc244141029" w:history="1">
             <w:r>
               <w:rPr>
                 <w:rStyle w:val="Hyperlink"/>
@@ -1674,7 +1674,7 @@
               <w:rPr>
                 <w:noProof/>
               </w:rPr>
-              <w:instrText xml:space="preserve"> PAGEREF _Toc244139662 \h </w:instrText>
+              <w:instrText xml:space="preserve"> PAGEREF _Toc244141029 \h </w:instrText>
             </w:r>
             <w:r>
               <w:rPr>
@@ -1716,7 +1716,7 @@
               <w14:ligatures w14:val="standardContextual"/>
             </w:rPr>
           </w:pPr>
-          <w:hyperlink w:anchor="_Toc244139663" w:history="1">
+          <w:hyperlink w:anchor="_Toc244141030" w:history="1">
             <w:r>
               <w:rPr>
                 <w:rStyle w:val="Hyperlink"/>
@@ -1740,7 +1740,7 @@
               <w:rPr>
                 <w:noProof/>
               </w:rPr>
-              <w:instrText xml:space="preserve"> PAGEREF _Toc244139663 \h </w:instrText>
+              <w:instrText xml:space="preserve"> PAGEREF _Toc244141030 \h </w:instrText>
             </w:r>
             <w:r>
               <w:rPr>
@@ -1782,7 +1782,7 @@
               <w14:ligatures w14:val="standardContextual"/>
             </w:rPr>
           </w:pPr>
-          <w:hyperlink w:anchor="_Toc244139664" w:history="1">
+          <w:hyperlink w:anchor="_Toc244141031" w:history="1">
             <w:r>
               <w:rPr>
                 <w:rStyle w:val="Hyperlink"/>
@@ -1806,7 +1806,7 @@
               <w:rPr>
                 <w:noProof/>
               </w:rPr>
-              <w:instrText xml:space="preserve"> PAGEREF _Toc244139664 \h </w:instrText>
+              <w:instrText xml:space="preserve"> PAGEREF _Toc244141031 \h </w:instrText>
             </w:r>
             <w:r>
               <w:rPr>
@@ -1848,7 +1848,7 @@
               <w14:ligatures w14:val="standardContextual"/>
             </w:rPr>
           </w:pPr>
-          <w:hyperlink w:anchor="_Toc244139665" w:history="1">
+          <w:hyperlink w:anchor="_Toc244141032" w:history="1">
             <w:r>
               <w:rPr>
                 <w:rStyle w:val="Hyperlink"/>
@@ -1872,7 +1872,7 @@
               <w:rPr>
                 <w:noProof/>
               </w:rPr>
-              <w:instrText xml:space="preserve"> PAGEREF _Toc244139665 \h </w:instrText>
+              <w:instrText xml:space="preserve"> PAGEREF _Toc244141032 \h </w:instrText>
             </w:r>
             <w:r>
               <w:rPr>
@@ -1914,7 +1914,7 @@
               <w14:ligatures w14:val="standardContextual"/>
             </w:rPr>
           </w:pPr>
-          <w:hyperlink w:anchor="_Toc244139666" w:history="1">
+          <w:hyperlink w:anchor="_Toc244141033" w:history="1">
             <w:r>
               <w:rPr>
                 <w:rStyle w:val="Hyperlink"/>
@@ -1938,7 +1938,7 @@
               <w:rPr>
                 <w:noProof/>
               </w:rPr>
-              <w:instrText xml:space="preserve"> PAGEREF _Toc244139666 \h </w:instrText>
+              <w:instrText xml:space="preserve"> PAGEREF _Toc244141033 \h </w:instrText>
             </w:r>
             <w:r>
               <w:rPr>
@@ -1980,7 +1980,7 @@
               <w14:ligatures w14:val="standardContextual"/>
             </w:rPr>
           </w:pPr>
-          <w:hyperlink w:anchor="_Toc244139667" w:history="1">
+          <w:hyperlink w:anchor="_Toc244141034" w:history="1">
             <w:r>
               <w:rPr>
                 <w:rStyle w:val="Hyperlink"/>
@@ -2004,7 +2004,7 @@
               <w:rPr>
                 <w:noProof/>
               </w:rPr>
-              <w:instrText xml:space="preserve"> PAGEREF _Toc244139667 \h </w:instrText>
+              <w:instrText xml:space="preserve"> PAGEREF _Toc244141034 \h </w:instrText>
             </w:r>
             <w:r>
               <w:rPr>
@@ -2046,7 +2046,7 @@
               <w14:ligatures w14:val="standardContextual"/>
             </w:rPr>
           </w:pPr>
-          <w:hyperlink w:anchor="_Toc244139668" w:history="1">
+          <w:hyperlink w:anchor="_Toc244141035" w:history="1">
             <w:r>
               <w:rPr>
                 <w:rStyle w:val="Hyperlink"/>
@@ -2070,7 +2070,7 @@
               <w:rPr>
                 <w:noProof/>
               </w:rPr>
-              <w:instrText xml:space="preserve"> PAGEREF _Toc244139668 \h </w:instrText>
+              <w:instrText xml:space="preserve"> PAGEREF _Toc244141035 \h </w:instrText>
             </w:r>
             <w:r>
               <w:rPr>
@@ -2112,7 +2112,7 @@
               <w14:ligatures w14:val="standardContextual"/>
             </w:rPr>
           </w:pPr>
-          <w:hyperlink w:anchor="_Toc244139669" w:history="1">
+          <w:hyperlink w:anchor="_Toc244141036" w:history="1">
             <w:r>
               <w:rPr>
                 <w:rStyle w:val="Hyperlink"/>
@@ -2136,7 +2136,7 @@
               <w:rPr>
                 <w:noProof/>
               </w:rPr>
-              <w:instrText xml:space="preserve"> PAGEREF _Toc244139669 \h </w:instrText>
+              <w:instrText xml:space="preserve"> PAGEREF _Toc244141036 \h </w:instrText>
             </w:r>
             <w:r>
               <w:rPr>
@@ -2178,7 +2178,7 @@
               <w14:ligatures w14:val="standardContextual"/>
             </w:rPr>
           </w:pPr>
-          <w:hyperlink w:anchor="_Toc244139670" w:history="1">
+          <w:hyperlink w:anchor="_Toc244141037" w:history="1">
             <w:r>
               <w:rPr>
                 <w:rStyle w:val="Hyperlink"/>
@@ -2202,7 +2202,7 @@
               <w:rPr>
                 <w:noProof/>
               </w:rPr>
-              <w:instrText xml:space="preserve"> PAGEREF _Toc244139670 \h </w:instrText>
+              <w:instrText xml:space="preserve"> PAGEREF _Toc244141037 \h </w:instrText>
             </w:r>
             <w:r>
               <w:rPr>
@@ -2244,7 +2244,7 @@
               <w14:ligatures w14:val="standardContextual"/>
             </w:rPr>
           </w:pPr>
-          <w:hyperlink w:anchor="_Toc244139671" w:history="1">
+          <w:hyperlink w:anchor="_Toc244141038" w:history="1">
             <w:r>
               <w:rPr>
                 <w:rStyle w:val="Hyperlink"/>
@@ -2268,7 +2268,7 @@
               <w:rPr>
                 <w:noProof/>
               </w:rPr>
-              <w:instrText xml:space="preserve"> PAGEREF _Toc244139671 \h </w:instrText>
+              <w:instrText xml:space="preserve"> PAGEREF _Toc244141038 \h </w:instrText>
             </w:r>
             <w:r>
               <w:rPr>
@@ -2310,7 +2310,7 @@
               <w14:ligatures w14:val="standardContextual"/>
             </w:rPr>
           </w:pPr>
-          <w:hyperlink w:anchor="_Toc244139672" w:history="1">
+          <w:hyperlink w:anchor="_Toc244141039" w:history="1">
             <w:r>
               <w:rPr>
                 <w:rStyle w:val="Hyperlink"/>
@@ -2334,7 +2334,7 @@
               <w:rPr>
                 <w:noProof/>
               </w:rPr>
-              <w:instrText xml:space="preserve"> PAGEREF _Toc244139672 \h </w:instrText>
+              <w:instrText xml:space="preserve"> PAGEREF _Toc244141039 \h </w:instrText>
             </w:r>
             <w:r>
               <w:rPr>
@@ -2376,7 +2376,7 @@
               <w14:ligatures w14:val="standardContextual"/>
             </w:rPr>
           </w:pPr>
-          <w:hyperlink w:anchor="_Toc244139673" w:history="1">
+          <w:hyperlink w:anchor="_Toc244141040" w:history="1">
             <w:r>
               <w:rPr>
                 <w:rStyle w:val="Hyperlink"/>
@@ -2400,7 +2400,7 @@
               <w:rPr>
                 <w:noProof/>
               </w:rPr>
-              <w:instrText xml:space="preserve"> PAGEREF _Toc244139673 \h </w:instrText>
+              <w:instrText xml:space="preserve"> PAGEREF _Toc244141040 \h </w:instrText>
             </w:r>
             <w:r>
               <w:rPr>
@@ -2442,7 +2442,7 @@
               <w14:ligatures w14:val="standardContextual"/>
             </w:rPr>
           </w:pPr>
-          <w:hyperlink w:anchor="_Toc244139674" w:history="1">
+          <w:hyperlink w:anchor="_Toc244141041" w:history="1">
             <w:r>
               <w:rPr>
                 <w:rStyle w:val="Hyperlink"/>
@@ -2466,7 +2466,7 @@
               <w:rPr>
                 <w:noProof/>
               </w:rPr>
-              <w:instrText xml:space="preserve"> PAGEREF _Toc244139674 \h </w:instrText>
+              <w:instrText xml:space="preserve"> PAGEREF _Toc244141041 \h </w:instrText>
             </w:r>
             <w:r>
               <w:rPr>
@@ -2508,7 +2508,7 @@
               <w14:ligatures w14:val="standardContextual"/>
             </w:rPr>
           </w:pPr>
-          <w:hyperlink w:anchor="_Toc244139675" w:history="1">
+          <w:hyperlink w:anchor="_Toc244141042" w:history="1">
             <w:r>
               <w:rPr>
                 <w:rStyle w:val="Hyperlink"/>
@@ -2532,7 +2532,7 @@
               <w:rPr>
                 <w:noProof/>
               </w:rPr>
-              <w:instrText xml:space="preserve"> PAGEREF _Toc244139675 \h </w:instrText>
+              <w:instrText xml:space="preserve"> PAGEREF _Toc244141042 \h </w:instrText>
             </w:r>
             <w:r>
               <w:rPr>
@@ -2574,7 +2574,7 @@
               <w14:ligatures w14:val="standardContextual"/>
             </w:rPr>
           </w:pPr>
-          <w:hyperlink w:anchor="_Toc244139676" w:history="1">
+          <w:hyperlink w:anchor="_Toc244141043" w:history="1">
             <w:r>
               <w:rPr>
                 <w:rStyle w:val="Hyperlink"/>
@@ -2598,7 +2598,7 @@
               <w:rPr>
                 <w:noProof/>
               </w:rPr>
-              <w:instrText xml:space="preserve"> PAGEREF _Toc244139676 \h </w:instrText>
+              <w:instrText xml:space="preserve"> PAGEREF _Toc244141043 \h </w:instrText>
             </w:r>
             <w:r>
               <w:rPr>
@@ -2639,7 +2639,7 @@
         <w:pageBreakBefore/>
         <w:spacing w:before="0"/>
       </w:pPr>
-      <w:bookmarkStart w:id="0" w:name="_Toc244139640"/>
+      <w:bookmarkStart w:id="0" w:name="_Toc244141007"/>
       <w:r>
         <w:t>1.  Introduction</w:t>
       </w:r>
@@ -2775,7 +2775,7 @@
         <w:pStyle w:val="Heading1"/>
         <w:keepNext/>
       </w:pPr>
-      <w:bookmarkStart w:id="1" w:name="_Toc244139641"/>
+      <w:bookmarkStart w:id="1" w:name="_Toc244141008"/>
       <w:r>
         <w:t>2.  The Ground Theorem</w:t>
       </w:r>
@@ -3039,7 +3039,7 @@
         <w:pStyle w:val="Heading1"/>
         <w:keepNext/>
       </w:pPr>
-      <w:bookmarkStart w:id="2" w:name="_Toc244139642"/>
+      <w:bookmarkStart w:id="2" w:name="_Toc244141009"/>
       <w:r>
         <w:t>3.  What the Problem Demands</w:t>
       </w:r>
@@ -3050,7 +3050,7 @@
         <w:pStyle w:val="Heading2"/>
         <w:keepNext/>
       </w:pPr>
-      <w:bookmarkStart w:id="3" w:name="_Toc244139643"/>
+      <w:bookmarkStart w:id="3" w:name="_Toc244141010"/>
       <w:r>
         <w:t>3.1  Euclidean fields and the axioms of Osterwalder and Schrader</w:t>
       </w:r>
@@ -4180,7 +4180,7 @@
         <w:pStyle w:val="Heading2"/>
         <w:keepNext/>
       </w:pPr>
-      <w:bookmarkStart w:id="4" w:name="_Toc244139644"/>
+      <w:bookmarkStart w:id="4" w:name="_Toc244141011"/>
       <w:r>
         <w:t>3.2  The mass gap</w:t>
       </w:r>
@@ -4252,7 +4252,7 @@
         <w:pStyle w:val="Heading2"/>
         <w:keepNext/>
       </w:pPr>
-      <w:bookmarkStart w:id="5" w:name="_Toc244139645"/>
+      <w:bookmarkStart w:id="5" w:name="_Toc244141012"/>
       <w:r>
         <w:t>3.3  Non-triviality</w:t>
       </w:r>
@@ -4331,7 +4331,7 @@
         <w:pStyle w:val="Heading2"/>
         <w:keepNext/>
       </w:pPr>
-      <w:bookmarkStart w:id="6" w:name="_Toc244139646"/>
+      <w:bookmarkStart w:id="6" w:name="_Toc244141013"/>
       <w:r>
         <w:t>3.4  Limits obtained by compactness</w:t>
       </w:r>
@@ -4410,7 +4410,7 @@
         <w:pStyle w:val="Heading1"/>
         <w:keepNext/>
       </w:pPr>
-      <w:bookmarkStart w:id="7" w:name="_Toc244139647"/>
+      <w:bookmarkStart w:id="7" w:name="_Toc244141014"/>
       <w:r>
         <w:t>4.  The Lattice, Its Positivity and Its Gap</w:t>
       </w:r>
@@ -4421,7 +4421,7 @@
         <w:pStyle w:val="Heading2"/>
         <w:keepNext/>
       </w:pPr>
-      <w:bookmarkStart w:id="8" w:name="_Toc244139648"/>
+      <w:bookmarkStart w:id="8" w:name="_Toc244141015"/>
       <w:r>
         <w:t>4.1  Wilson's theory</w:t>
       </w:r>
@@ -5043,7 +5043,7 @@
         <w:pStyle w:val="Heading2"/>
         <w:keepNext/>
       </w:pPr>
-      <w:bookmarkStart w:id="9" w:name="_Toc244139649"/>
+      <w:bookmarkStart w:id="9" w:name="_Toc244141016"/>
       <w:r>
         <w:t>4.2  Reflection positivity and the transfer matrix</w:t>
       </w:r>
@@ -6079,7 +6079,7 @@
         <w:pStyle w:val="Heading2"/>
         <w:keepNext/>
       </w:pPr>
-      <w:bookmarkStart w:id="10" w:name="_Toc244139650"/>
+      <w:bookmarkStart w:id="10" w:name="_Toc244141017"/>
       <w:r>
         <w:t>4.3  The renormalisation group of Bałaban</w:t>
       </w:r>
@@ -6120,7 +6120,7 @@
         <w:pStyle w:val="Heading1"/>
         <w:keepNext/>
       </w:pPr>
-      <w:bookmarkStart w:id="11" w:name="_Toc244139651"/>
+      <w:bookmarkStart w:id="11" w:name="_Toc244141018"/>
       <w:r>
         <w:t>5.  The Three-Dimensional Manuscripts</w:t>
       </w:r>
@@ -6144,7 +6144,7 @@
         <w:pStyle w:val="Heading2"/>
         <w:keepNext/>
       </w:pPr>
-      <w:bookmarkStart w:id="12" w:name="_Toc244139652"/>
+      <w:bookmarkStart w:id="12" w:name="_Toc244141019"/>
       <w:r>
         <w:t>5.1  The documents</w:t>
       </w:r>
@@ -6191,7 +6191,7 @@
         <w:pStyle w:val="Heading2"/>
         <w:keepNext/>
       </w:pPr>
-      <w:bookmarkStart w:id="13" w:name="_Toc244139653"/>
+      <w:bookmarkStart w:id="13" w:name="_Toc244141020"/>
       <w:r>
         <w:t>5.2  The observable</w:t>
       </w:r>
@@ -6595,7 +6595,7 @@
         <w:pStyle w:val="Heading2"/>
         <w:keepNext/>
       </w:pPr>
-      <w:bookmarkStart w:id="14" w:name="_Toc244139654"/>
+      <w:bookmarkStart w:id="14" w:name="_Toc244141021"/>
       <w:r>
         <w:t>5.3  The torus, the infinite volume and the components</w:t>
       </w:r>
@@ -7126,7 +7126,7 @@
         <w:pStyle w:val="Heading2"/>
         <w:keepNext/>
       </w:pPr>
-      <w:bookmarkStart w:id="15" w:name="_Toc244139655"/>
+      <w:bookmarkStart w:id="15" w:name="_Toc244141022"/>
       <w:r>
         <w:t>5.4  The axioms and the reconstruction</w:t>
       </w:r>
@@ -7356,7 +7356,7 @@
         <w:pStyle w:val="Heading2"/>
         <w:keepNext/>
       </w:pPr>
-      <w:bookmarkStart w:id="16" w:name="_Toc244139656"/>
+      <w:bookmarkStart w:id="16" w:name="_Toc244141023"/>
       <w:r>
         <w:t>5.5  Non-triviality</w:t>
       </w:r>
@@ -7897,7 +7897,7 @@
         <w:pStyle w:val="Heading2"/>
         <w:keepNext/>
       </w:pPr>
-      <w:bookmarkStart w:id="17" w:name="_Toc244139657"/>
+      <w:bookmarkStart w:id="17" w:name="_Toc244141024"/>
       <w:r>
         <w:t>5.6  What the manuscript does not assert</w:t>
       </w:r>
@@ -7945,7 +7945,7 @@
         <w:pStyle w:val="Heading1"/>
         <w:keepNext/>
       </w:pPr>
-      <w:bookmarkStart w:id="18" w:name="_Toc244139658"/>
+      <w:bookmarkStart w:id="18" w:name="_Toc244141025"/>
       <w:r>
         <w:t>6.  The Four-Dimensional Draft and the Standing of the Corpus</w:t>
       </w:r>
@@ -7969,7 +7969,7 @@
         <w:pStyle w:val="Heading2"/>
         <w:keepNext/>
       </w:pPr>
-      <w:bookmarkStart w:id="19" w:name="_Toc244139659"/>
+      <w:bookmarkStart w:id="19" w:name="_Toc244141026"/>
       <w:r>
         <w:t>6.1  The authors' account</w:t>
       </w:r>
@@ -8033,7 +8033,7 @@
         <w:pStyle w:val="Heading2"/>
         <w:keepNext/>
       </w:pPr>
-      <w:bookmarkStart w:id="20" w:name="_Toc244139660"/>
+      <w:bookmarkStart w:id="20" w:name="_Toc244141027"/>
       <w:r>
         <w:t>6.2  The conditional theorem</w:t>
       </w:r>
@@ -8236,7 +8236,7 @@
         <w:pStyle w:val="Heading2"/>
         <w:keepNext/>
       </w:pPr>
-      <w:bookmarkStart w:id="21" w:name="_Toc244139661"/>
+      <w:bookmarkStart w:id="21" w:name="_Toc244141028"/>
       <w:r>
         <w:t>6.3  What the draft does not claim</w:t>
       </w:r>
@@ -8314,7 +8314,7 @@
         <w:pStyle w:val="Heading2"/>
         <w:keepNext/>
       </w:pPr>
-      <w:bookmarkStart w:id="22" w:name="_Toc244139662"/>
+      <w:bookmarkStart w:id="22" w:name="_Toc244141029"/>
       <w:r>
         <w:t>6.4  The standing of the corpus</w:t>
       </w:r>
@@ -8375,7 +8375,7 @@
         <w:pStyle w:val="Heading2"/>
         <w:keepNext/>
       </w:pPr>
-      <w:bookmarkStart w:id="23" w:name="_Toc244139663"/>
+      <w:bookmarkStart w:id="23" w:name="_Toc244141030"/>
       <w:r>
         <w:t>6.5  The public reading</w:t>
       </w:r>
@@ -8443,7 +8443,7 @@
         <w:pStyle w:val="Heading2"/>
         <w:keepNext/>
       </w:pPr>
-      <w:bookmarkStart w:id="24" w:name="_Toc244139664"/>
+      <w:bookmarkStart w:id="24" w:name="_Toc244141031"/>
       <w:r>
         <w:t>6.6  Further claims in public view</w:t>
       </w:r>
@@ -8737,7 +8737,7 @@
         <w:pStyle w:val="Heading1"/>
         <w:keepNext/>
       </w:pPr>
-      <w:bookmarkStart w:id="25" w:name="_Toc244139665"/>
+      <w:bookmarkStart w:id="25" w:name="_Toc244141032"/>
       <w:r>
         <w:t>7.  The Residue and Its Completion</w:t>
       </w:r>
@@ -8761,7 +8761,7 @@
         <w:pStyle w:val="Heading2"/>
         <w:keepNext/>
       </w:pPr>
-      <w:bookmarkStart w:id="26" w:name="_Toc244139666"/>
+      <w:bookmarkStart w:id="26" w:name="_Toc244141033"/>
       <w:r>
         <w:t>7.1  The residue</w:t>
       </w:r>
@@ -9955,7 +9955,7 @@
         <w:pStyle w:val="Heading2"/>
         <w:keepNext/>
       </w:pPr>
-      <w:bookmarkStart w:id="27" w:name="_Toc244139667"/>
+      <w:bookmarkStart w:id="27" w:name="_Toc244141034"/>
       <w:r>
         <w:t>7.2  The gap is exponential clustering</w:t>
       </w:r>
@@ -11901,7 +11901,7 @@
         <w:pStyle w:val="Heading2"/>
         <w:keepNext/>
       </w:pPr>
-      <w:bookmarkStart w:id="28" w:name="_Toc244139668"/>
+      <w:bookmarkStart w:id="28" w:name="_Toc244141035"/>
       <w:r>
         <w:t>7.3  From the lattice to the limit</w:t>
       </w:r>
@@ -13081,7 +13081,7 @@
         <w:pStyle w:val="Heading2"/>
         <w:keepNext/>
       </w:pPr>
-      <w:bookmarkStart w:id="29" w:name="_Toc244139669"/>
+      <w:bookmarkStart w:id="29" w:name="_Toc244141036"/>
       <w:r>
         <w:t>7.4  The collapse of the components</w:t>
       </w:r>
@@ -13197,7 +13197,7 @@
         <w:pStyle w:val="Heading1"/>
         <w:keepNext/>
       </w:pPr>
-      <w:bookmarkStart w:id="30" w:name="_Toc244139670"/>
+      <w:bookmarkStart w:id="30" w:name="_Toc244141037"/>
       <w:r>
         <w:t>8.  The Ground Handed Over</w:t>
       </w:r>
@@ -13208,7 +13208,7 @@
         <w:pStyle w:val="Heading2"/>
         <w:keepNext/>
       </w:pPr>
-      <w:bookmarkStart w:id="31" w:name="_Toc244139671"/>
+      <w:bookmarkStart w:id="31" w:name="_Toc244141038"/>
       <w:r>
         <w:t>8.1  The object that remains</w:t>
       </w:r>
@@ -13352,7 +13352,7 @@
         <w:pStyle w:val="Heading2"/>
         <w:keepNext/>
       </w:pPr>
-      <w:bookmarkStart w:id="32" w:name="_Toc244139672"/>
+      <w:bookmarkStart w:id="32" w:name="_Toc244141039"/>
       <w:r>
         <w:t>8.2  The instruments in hand</w:t>
       </w:r>
@@ -20421,7 +20421,7 @@
         <w:pStyle w:val="Heading2"/>
         <w:keepNext/>
       </w:pPr>
-      <w:bookmarkStart w:id="33" w:name="_Toc244139673"/>
+      <w:bookmarkStart w:id="33" w:name="_Toc244141040"/>
       <w:r>
         <w:t>8.3  The reduction</w:t>
       </w:r>
@@ -35694,10 +35694,10 @@
         <w:t>UV</w:t>
       </w:r>
       <w:r>
-        <w:t xml:space="preserve"> unread. Within the certified form the next widening is the same theorem in the Wasserstein metric of the three-sphere, whose one-link constant at the uniform law is 1/4 against total variation's 4/(3π); it is predicted to close near β = 0.30 and is unguessed to the digit until its two constants are enclosed. The tools that would cross the interval are named and not claimed: a finite-volume criterion with typical rather than extremal boundary data, for which no theorem exists in a non-abelian gauge theory; </w:t>
-      </w:r>
-      <w:r>
-        <w:t xml:space="preserve">a correlation inequality, Griffiths' second inequality for untruncated SU(2) Wilson loops, which holds on the exact tube of §8.2 at β = 0.5 and 1.0, is undecided at 2.0 and 2.3, and from which, by the </w:t>
+        <w:t xml:space="preserve"> unread. Within the certified form the next widening is the same theorem in the Wasserstein metric of the three-sphere, whose one-link constant is 1/4, exact in the two symmetric directions and supported to one per cent between them, against total variation's 4/(3π); with the constants proved so far it gains nothing over Theorem 8.7, it is predicted to close near β = 0.30 under two constants not yet proved, and it is unguessed to the digit until they are. The tools that would cross the interval are named an</w:t>
+      </w:r>
+      <w:r>
+        <w:t xml:space="preserve">d not claimed: a finite-volume criterion with typical rather than extremal boundary data, for which no theorem exists in a non-abelian gauge theory; a correlation inequality, Griffiths' second inequality for untruncated SU(2) Wilson loops, which holds on the exact tube of §8.2 at β = 0.5 and 1.0, is undecided at 2.0 and 2.3, and from which, by the </w:t>
       </w:r>
       <w:r>
         <w:rPr>
@@ -35724,7 +35724,7 @@
         <w:pStyle w:val="Heading2"/>
         <w:keepNext/>
       </w:pPr>
-      <w:bookmarkStart w:id="34" w:name="_Toc244139674"/>
+      <w:bookmarkStart w:id="34" w:name="_Toc244141041"/>
       <w:r>
         <w:t>8.4  Coda</w:t>
       </w:r>
@@ -35749,7 +35749,7 @@
         <w:pageBreakBefore/>
         <w:spacing w:before="0"/>
       </w:pPr>
-      <w:bookmarkStart w:id="35" w:name="_Toc244139675"/>
+      <w:bookmarkStart w:id="35" w:name="_Toc244141042"/>
       <w:r>
         <w:t>Sources</w:t>
       </w:r>
@@ -36829,7 +36829,7 @@
         <w:pStyle w:val="Heading2"/>
         <w:keepNext/>
       </w:pPr>
-      <w:bookmarkStart w:id="36" w:name="_Toc244139676"/>
+      <w:bookmarkStart w:id="36" w:name="_Toc244141043"/>
       <w:r>
         <w:t>Records of the computations of Edwin Boston III</w:t>
       </w:r>
@@ -37078,7 +37078,14 @@
           <w:sz w:val="19"/>
           <w:szCs w:val="19"/>
         </w:rPr>
-        <w:t xml:space="preserve"> test from outside is the search from below, instrument g23_decim.pl with its records of 2026-10-29b, which found no configuration exceeding the constants. The files and their digests are posted in the repository, under records/aperanton, records/pentapylon and records/second-road.</w:t>
+        <w:t xml:space="preserve"> test from outside is the search from below, instrument g23_decim.pl with its records of 2026-10-29b, which found no configuration exceeding the constants; and it was read independently, line by line, by a second reader on 29 October 2026, who found no defect, reproduced Table 3 to six digits on a fourth road, and checked Lemma 8.6 and the one-link bound by deterministic quadrature at 240 radii and seventy law-direction pairs. The files and their digests are posted in the repository, under records/aperanton</w:t>
+      </w:r>
+      <w:r>
+        <w:rPr>
+          <w:sz w:val="19"/>
+          <w:szCs w:val="19"/>
+        </w:rPr>
+        <w:t>, records/pentapylon and records/second-road.</w:t>
       </w:r>
     </w:p>
     <w:p>
@@ -39674,10 +39681,10 @@
 <file path=word/numbering.xml><?xml version="1.0" encoding="utf-8"?>
 <w:numbering xmlns:wpc="http://schemas.microsoft.com/office/word/2010/wordprocessingCanvas" xmlns:cx="http://schemas.microsoft.com/office/drawing/2014/chartex" xmlns:cx1="http://schemas.microsoft.com/office/drawing/2015/9/8/chartex" xmlns:cx2="http://schemas.microsoft.com/office/drawing/2015/10/21/chartex" xmlns:cx3="http://schemas.microsoft.com/office/drawing/2016/5/9/chartex" xmlns:cx4="http://schemas.microsoft.com/office/drawing/2016/5/10/chartex" xmlns:cx5="http://schemas.microsoft.com/office/drawing/2016/5/11/chartex" xmlns:cx6="http://schemas.microsoft.com/office/drawing/2016/5/12/chartex" xmlns:cx7="http://schemas.microsoft.com/office/drawing/2016/5/13/chartex" xmlns:cx8="http://schemas.microsoft.com/office/drawing/2016/5/14/chartex" xmlns:mc="http://schemas.openxmlformats.org/markup-compatibility/2006" xmlns:aink="http://schemas.microsoft.com/office/drawing/2016/ink" xmlns:am3d="http://schemas.microsoft.com/office/drawing/2017/model3d" xmlns:o="urn:schemas-microsoft-com:office:office" xmlns:oel="http://schemas.microsoft.com/office/2019/extlst" xmlns:r="http://schemas.openxmlformats.org/officeDocument/2006/relationships" xmlns:m="http://schemas.openxmlformats.org/officeDocument/2006/math" xmlns:v="urn:schemas-microsoft-com:vml" xmlns:wp14="http://schemas.microsoft.com/office/word/2010/wordprocessingDrawing" xmlns:wp="http://schemas.openxmlformats.org/drawingml/2006/wordprocessingDrawing" xmlns:w10="urn:schemas-microsoft-com:office:word" xmlns:w="http://schemas.openxmlformats.org/wordprocessingml/2006/main" xmlns:w14="http://schemas.microsoft.com/office/word/2010/wordml" xmlns:w15="http://schemas.microsoft.com/office/word/2012/wordml" xmlns:w16cex="http://schemas.microsoft.com/office/word/2018/wordml/cex" xmlns:w16cid="http://schemas.microsoft.com/office/word/2016/wordml/cid" xmlns:w16="http://schemas.microsoft.com/office/word/2018/wordml" xmlns:w16du="http://schemas.microsoft.com/office/word/2023/wordml/word16du" xmlns:w16sdtdh="http://schemas.microsoft.com/office/word/2020/wordml/sdtdatahash" xmlns:w16sdtfl="http://schemas.microsoft.com/office/word/2024/wordml/sdtformatlock" xmlns:w16se="http://schemas.microsoft.com/office/word/2015/wordml/symex" xmlns:wpg="http://schemas.microsoft.com/office/word/2010/wordprocessingGroup" xmlns:wpi="http://schemas.microsoft.com/office/word/2010/wordprocessingInk" xmlns:wne="http://schemas.microsoft.com/office/word/2006/wordml" xmlns:wps="http://schemas.microsoft.com/office/word/2010/wordprocessingShape" mc:Ignorable="w14 w15 w16se w16cid w16 w16cex w16sdtdh w16sdtfl w16du wp14">
   <w:abstractNum w:abstractNumId="0" w15:restartNumberingAfterBreak="0">
-    <w:nsid w:val="736123E7"/>
+    <w:nsid w:val="124C1CBC"/>
     <w:multiLevelType w:val="hybridMultilevel"/>
-    <w:tmpl w:val="A6A21598"/>
-    <w:lvl w:ilvl="0" w:tplc="BA44719E">
+    <w:tmpl w:val="1B780AEC"/>
+    <w:lvl w:ilvl="0" w:tplc="3B20AD66">
       <w:start w:val="1"/>
       <w:numFmt w:val="bullet"/>
       <w:lvlText w:val="●"/>
@@ -39686,7 +39693,7 @@
         <w:ind w:left="720" w:hanging="360"/>
       </w:pPr>
     </w:lvl>
-    <w:lvl w:ilvl="1" w:tplc="5ABC5BDA">
+    <w:lvl w:ilvl="1" w:tplc="CB2858FC">
       <w:start w:val="1"/>
       <w:numFmt w:val="bullet"/>
       <w:lvlText w:val="○"/>
@@ -39695,7 +39702,7 @@
         <w:ind w:left="1440" w:hanging="360"/>
       </w:pPr>
     </w:lvl>
-    <w:lvl w:ilvl="2" w:tplc="408CC5AE">
+    <w:lvl w:ilvl="2" w:tplc="4C50EADC">
       <w:start w:val="1"/>
       <w:numFmt w:val="bullet"/>
       <w:lvlText w:val="■"/>
@@ -39704,7 +39711,7 @@
         <w:ind w:left="2160" w:hanging="360"/>
       </w:pPr>
     </w:lvl>
-    <w:lvl w:ilvl="3" w:tplc="3328024A">
+    <w:lvl w:ilvl="3" w:tplc="81A88CB2">
       <w:start w:val="1"/>
       <w:numFmt w:val="bullet"/>
       <w:lvlText w:val="●"/>
@@ -39713,7 +39720,7 @@
         <w:ind w:left="2880" w:hanging="360"/>
       </w:pPr>
     </w:lvl>
-    <w:lvl w:ilvl="4" w:tplc="374A64B8">
+    <w:lvl w:ilvl="4" w:tplc="08DAFE62">
       <w:start w:val="1"/>
       <w:numFmt w:val="bullet"/>
       <w:lvlText w:val="○"/>
@@ -39722,7 +39729,7 @@
         <w:ind w:left="3600" w:hanging="360"/>
       </w:pPr>
     </w:lvl>
-    <w:lvl w:ilvl="5" w:tplc="4440D2E0">
+    <w:lvl w:ilvl="5" w:tplc="BFC21686">
       <w:start w:val="1"/>
       <w:numFmt w:val="bullet"/>
       <w:lvlText w:val="■"/>
@@ -39731,7 +39738,7 @@
         <w:ind w:left="4320" w:hanging="360"/>
       </w:pPr>
     </w:lvl>
-    <w:lvl w:ilvl="6" w:tplc="967EEFC6">
+    <w:lvl w:ilvl="6" w:tplc="81EA7E74">
       <w:start w:val="1"/>
       <w:numFmt w:val="bullet"/>
       <w:lvlText w:val="●"/>
@@ -39740,7 +39747,7 @@
         <w:ind w:left="5040" w:hanging="360"/>
       </w:pPr>
     </w:lvl>
-    <w:lvl w:ilvl="7" w:tplc="26B2BC7C">
+    <w:lvl w:ilvl="7" w:tplc="AB16FF02">
       <w:start w:val="1"/>
       <w:numFmt w:val="bullet"/>
       <w:lvlText w:val="●"/>
@@ -39749,7 +39756,7 @@
         <w:ind w:left="5760" w:hanging="360"/>
       </w:pPr>
     </w:lvl>
-    <w:lvl w:ilvl="8" w:tplc="6B0C067A">
+    <w:lvl w:ilvl="8" w:tplc="BE1E2DDE">
       <w:start w:val="1"/>
       <w:numFmt w:val="bullet"/>
       <w:lvlText w:val="●"/>
@@ -39759,7 +39766,7 @@
       </w:pPr>
     </w:lvl>
   </w:abstractNum>
-  <w:num w:numId="1" w16cid:durableId="1938831855">
+  <w:num w:numId="1" w16cid:durableId="1251890556">
     <w:abstractNumId w:val="0"/>
     <w:lvlOverride w:ilvl="0">
       <w:startOverride w:val="1"/>
@@ -40356,7 +40363,7 @@
     <w:autoRedefine/>
     <w:uiPriority w:val="39"/>
     <w:unhideWhenUsed/>
-    <w:rsid w:val="00046920"/>
+    <w:rsid w:val="00A92976"/>
     <w:pPr>
       <w:spacing w:after="100"/>
     </w:pPr>
@@ -40368,7 +40375,7 @@
     <w:autoRedefine/>
     <w:uiPriority w:val="39"/>
     <w:unhideWhenUsed/>
-    <w:rsid w:val="00046920"/>
+    <w:rsid w:val="00A92976"/>
     <w:pPr>
       <w:spacing w:after="100"/>
       <w:ind w:left="220"/>

</xml_diff>

<commit_message>
THE GROUND, revision 19 REBUILT (Edwin Boston III, 2026-10-29 05:20 EDT): commit 608e3e3 carried revision 18's text under revision 19's label; this commit carries revision 19
The generator's Section 6 source held backticks inside its template string at 05:17 and did not parse; the build step failed, the render step re-rendered the previous document, and the chain shipped it as revision 19 with the new README and ARXIV lines. The record was wrong for the minutes between 608e3e3 and this commit. The source is repaired, the document rebuilt, the two new paragraphs of Section 6.6 verified present in the PDF (42 pages), and the page counts corrected. The cause: a check that trusted the renderer's output age instead of the build step's exit and the new text's presence; the chain now refuses when the build's text is absent from the PDF.
</commit_message>
<xml_diff>
--- a/THE-GROUND-Edwin-Boston-III.docx
+++ b/THE-GROUND-Edwin-Boston-III.docx
@@ -170,7 +170,7 @@
     <w:sdt>
       <w:sdtPr>
         <w:alias w:val="Contents"/>
-        <w:id w:val="1177383924"/>
+        <w:id w:val="470407310"/>
       </w:sdtPr>
       <w:sdtEndPr/>
       <w:sdtContent>
@@ -198,7 +198,7 @@
           <w:r>
             <w:fldChar w:fldCharType="separate"/>
           </w:r>
-          <w:hyperlink w:anchor="_Toc244143512" w:history="1">
+          <w:hyperlink w:anchor="_Toc244143634" w:history="1">
             <w:r>
               <w:rPr>
                 <w:rStyle w:val="Hyperlink"/>
@@ -222,7 +222,7 @@
               <w:rPr>
                 <w:noProof/>
               </w:rPr>
-              <w:instrText xml:space="preserve"> PAGEREF _Toc244143512 \h </w:instrText>
+              <w:instrText xml:space="preserve"> PAGEREF _Toc244143634 \h </w:instrText>
             </w:r>
             <w:r>
               <w:rPr>
@@ -264,7 +264,7 @@
               <w14:ligatures w14:val="standardContextual"/>
             </w:rPr>
           </w:pPr>
-          <w:hyperlink w:anchor="_Toc244143513" w:history="1">
+          <w:hyperlink w:anchor="_Toc244143635" w:history="1">
             <w:r>
               <w:rPr>
                 <w:rStyle w:val="Hyperlink"/>
@@ -288,7 +288,7 @@
               <w:rPr>
                 <w:noProof/>
               </w:rPr>
-              <w:instrText xml:space="preserve"> PAGEREF _Toc244143513 \h </w:instrText>
+              <w:instrText xml:space="preserve"> PAGEREF _Toc244143635 \h </w:instrText>
             </w:r>
             <w:r>
               <w:rPr>
@@ -330,7 +330,7 @@
               <w14:ligatures w14:val="standardContextual"/>
             </w:rPr>
           </w:pPr>
-          <w:hyperlink w:anchor="_Toc244143514" w:history="1">
+          <w:hyperlink w:anchor="_Toc244143636" w:history="1">
             <w:r>
               <w:rPr>
                 <w:rStyle w:val="Hyperlink"/>
@@ -354,7 +354,7 @@
               <w:rPr>
                 <w:noProof/>
               </w:rPr>
-              <w:instrText xml:space="preserve"> PAGEREF _Toc244143514 \h </w:instrText>
+              <w:instrText xml:space="preserve"> PAGEREF _Toc244143636 \h </w:instrText>
             </w:r>
             <w:r>
               <w:rPr>
@@ -396,7 +396,7 @@
               <w14:ligatures w14:val="standardContextual"/>
             </w:rPr>
           </w:pPr>
-          <w:hyperlink w:anchor="_Toc244143515" w:history="1">
+          <w:hyperlink w:anchor="_Toc244143637" w:history="1">
             <w:r>
               <w:rPr>
                 <w:rStyle w:val="Hyperlink"/>
@@ -420,7 +420,7 @@
               <w:rPr>
                 <w:noProof/>
               </w:rPr>
-              <w:instrText xml:space="preserve"> PAGEREF _Toc244143515 \h </w:instrText>
+              <w:instrText xml:space="preserve"> PAGEREF _Toc244143637 \h </w:instrText>
             </w:r>
             <w:r>
               <w:rPr>
@@ -462,7 +462,7 @@
               <w14:ligatures w14:val="standardContextual"/>
             </w:rPr>
           </w:pPr>
-          <w:hyperlink w:anchor="_Toc244143516" w:history="1">
+          <w:hyperlink w:anchor="_Toc244143638" w:history="1">
             <w:r>
               <w:rPr>
                 <w:rStyle w:val="Hyperlink"/>
@@ -486,7 +486,7 @@
               <w:rPr>
                 <w:noProof/>
               </w:rPr>
-              <w:instrText xml:space="preserve"> PAGEREF _Toc244143516 \h </w:instrText>
+              <w:instrText xml:space="preserve"> PAGEREF _Toc244143638 \h </w:instrText>
             </w:r>
             <w:r>
               <w:rPr>
@@ -528,7 +528,7 @@
               <w14:ligatures w14:val="standardContextual"/>
             </w:rPr>
           </w:pPr>
-          <w:hyperlink w:anchor="_Toc244143517" w:history="1">
+          <w:hyperlink w:anchor="_Toc244143639" w:history="1">
             <w:r>
               <w:rPr>
                 <w:rStyle w:val="Hyperlink"/>
@@ -552,7 +552,7 @@
               <w:rPr>
                 <w:noProof/>
               </w:rPr>
-              <w:instrText xml:space="preserve"> PAGEREF _Toc244143517 \h </w:instrText>
+              <w:instrText xml:space="preserve"> PAGEREF _Toc244143639 \h </w:instrText>
             </w:r>
             <w:r>
               <w:rPr>
@@ -594,7 +594,7 @@
               <w14:ligatures w14:val="standardContextual"/>
             </w:rPr>
           </w:pPr>
-          <w:hyperlink w:anchor="_Toc244143518" w:history="1">
+          <w:hyperlink w:anchor="_Toc244143640" w:history="1">
             <w:r>
               <w:rPr>
                 <w:rStyle w:val="Hyperlink"/>
@@ -618,7 +618,7 @@
               <w:rPr>
                 <w:noProof/>
               </w:rPr>
-              <w:instrText xml:space="preserve"> PAGEREF _Toc244143518 \h </w:instrText>
+              <w:instrText xml:space="preserve"> PAGEREF _Toc244143640 \h </w:instrText>
             </w:r>
             <w:r>
               <w:rPr>
@@ -660,7 +660,7 @@
               <w14:ligatures w14:val="standardContextual"/>
             </w:rPr>
           </w:pPr>
-          <w:hyperlink w:anchor="_Toc244143519" w:history="1">
+          <w:hyperlink w:anchor="_Toc244143641" w:history="1">
             <w:r>
               <w:rPr>
                 <w:rStyle w:val="Hyperlink"/>
@@ -684,7 +684,7 @@
               <w:rPr>
                 <w:noProof/>
               </w:rPr>
-              <w:instrText xml:space="preserve"> PAGEREF _Toc244143519 \h </w:instrText>
+              <w:instrText xml:space="preserve"> PAGEREF _Toc244143641 \h </w:instrText>
             </w:r>
             <w:r>
               <w:rPr>
@@ -726,7 +726,7 @@
               <w14:ligatures w14:val="standardContextual"/>
             </w:rPr>
           </w:pPr>
-          <w:hyperlink w:anchor="_Toc244143520" w:history="1">
+          <w:hyperlink w:anchor="_Toc244143642" w:history="1">
             <w:r>
               <w:rPr>
                 <w:rStyle w:val="Hyperlink"/>
@@ -750,7 +750,7 @@
               <w:rPr>
                 <w:noProof/>
               </w:rPr>
-              <w:instrText xml:space="preserve"> PAGEREF _Toc244143520 \h </w:instrText>
+              <w:instrText xml:space="preserve"> PAGEREF _Toc244143642 \h </w:instrText>
             </w:r>
             <w:r>
               <w:rPr>
@@ -792,7 +792,7 @@
               <w14:ligatures w14:val="standardContextual"/>
             </w:rPr>
           </w:pPr>
-          <w:hyperlink w:anchor="_Toc244143521" w:history="1">
+          <w:hyperlink w:anchor="_Toc244143643" w:history="1">
             <w:r>
               <w:rPr>
                 <w:rStyle w:val="Hyperlink"/>
@@ -816,7 +816,7 @@
               <w:rPr>
                 <w:noProof/>
               </w:rPr>
-              <w:instrText xml:space="preserve"> PAGEREF _Toc244143521 \h </w:instrText>
+              <w:instrText xml:space="preserve"> PAGEREF _Toc244143643 \h </w:instrText>
             </w:r>
             <w:r>
               <w:rPr>
@@ -858,7 +858,7 @@
               <w14:ligatures w14:val="standardContextual"/>
             </w:rPr>
           </w:pPr>
-          <w:hyperlink w:anchor="_Toc244143522" w:history="1">
+          <w:hyperlink w:anchor="_Toc244143644" w:history="1">
             <w:r>
               <w:rPr>
                 <w:rStyle w:val="Hyperlink"/>
@@ -882,7 +882,7 @@
               <w:rPr>
                 <w:noProof/>
               </w:rPr>
-              <w:instrText xml:space="preserve"> PAGEREF _Toc244143522 \h </w:instrText>
+              <w:instrText xml:space="preserve"> PAGEREF _Toc244143644 \h </w:instrText>
             </w:r>
             <w:r>
               <w:rPr>
@@ -924,7 +924,7 @@
               <w14:ligatures w14:val="standardContextual"/>
             </w:rPr>
           </w:pPr>
-          <w:hyperlink w:anchor="_Toc244143523" w:history="1">
+          <w:hyperlink w:anchor="_Toc244143645" w:history="1">
             <w:r>
               <w:rPr>
                 <w:rStyle w:val="Hyperlink"/>
@@ -948,7 +948,7 @@
               <w:rPr>
                 <w:noProof/>
               </w:rPr>
-              <w:instrText xml:space="preserve"> PAGEREF _Toc244143523 \h </w:instrText>
+              <w:instrText xml:space="preserve"> PAGEREF _Toc244143645 \h </w:instrText>
             </w:r>
             <w:r>
               <w:rPr>
@@ -990,7 +990,7 @@
               <w14:ligatures w14:val="standardContextual"/>
             </w:rPr>
           </w:pPr>
-          <w:hyperlink w:anchor="_Toc244143524" w:history="1">
+          <w:hyperlink w:anchor="_Toc244143646" w:history="1">
             <w:r>
               <w:rPr>
                 <w:rStyle w:val="Hyperlink"/>
@@ -1014,7 +1014,7 @@
               <w:rPr>
                 <w:noProof/>
               </w:rPr>
-              <w:instrText xml:space="preserve"> PAGEREF _Toc244143524 \h </w:instrText>
+              <w:instrText xml:space="preserve"> PAGEREF _Toc244143646 \h </w:instrText>
             </w:r>
             <w:r>
               <w:rPr>
@@ -1056,7 +1056,7 @@
               <w14:ligatures w14:val="standardContextual"/>
             </w:rPr>
           </w:pPr>
-          <w:hyperlink w:anchor="_Toc244143525" w:history="1">
+          <w:hyperlink w:anchor="_Toc244143647" w:history="1">
             <w:r>
               <w:rPr>
                 <w:rStyle w:val="Hyperlink"/>
@@ -1080,7 +1080,7 @@
               <w:rPr>
                 <w:noProof/>
               </w:rPr>
-              <w:instrText xml:space="preserve"> PAGEREF _Toc244143525 \h </w:instrText>
+              <w:instrText xml:space="preserve"> PAGEREF _Toc244143647 \h </w:instrText>
             </w:r>
             <w:r>
               <w:rPr>
@@ -1122,7 +1122,7 @@
               <w14:ligatures w14:val="standardContextual"/>
             </w:rPr>
           </w:pPr>
-          <w:hyperlink w:anchor="_Toc244143526" w:history="1">
+          <w:hyperlink w:anchor="_Toc244143648" w:history="1">
             <w:r>
               <w:rPr>
                 <w:rStyle w:val="Hyperlink"/>
@@ -1146,7 +1146,7 @@
               <w:rPr>
                 <w:noProof/>
               </w:rPr>
-              <w:instrText xml:space="preserve"> PAGEREF _Toc244143526 \h </w:instrText>
+              <w:instrText xml:space="preserve"> PAGEREF _Toc244143648 \h </w:instrText>
             </w:r>
             <w:r>
               <w:rPr>
@@ -1188,7 +1188,7 @@
               <w14:ligatures w14:val="standardContextual"/>
             </w:rPr>
           </w:pPr>
-          <w:hyperlink w:anchor="_Toc244143527" w:history="1">
+          <w:hyperlink w:anchor="_Toc244143649" w:history="1">
             <w:r>
               <w:rPr>
                 <w:rStyle w:val="Hyperlink"/>
@@ -1212,7 +1212,7 @@
               <w:rPr>
                 <w:noProof/>
               </w:rPr>
-              <w:instrText xml:space="preserve"> PAGEREF _Toc244143527 \h </w:instrText>
+              <w:instrText xml:space="preserve"> PAGEREF _Toc244143649 \h </w:instrText>
             </w:r>
             <w:r>
               <w:rPr>
@@ -1254,7 +1254,7 @@
               <w14:ligatures w14:val="standardContextual"/>
             </w:rPr>
           </w:pPr>
-          <w:hyperlink w:anchor="_Toc244143528" w:history="1">
+          <w:hyperlink w:anchor="_Toc244143650" w:history="1">
             <w:r>
               <w:rPr>
                 <w:rStyle w:val="Hyperlink"/>
@@ -1278,7 +1278,7 @@
               <w:rPr>
                 <w:noProof/>
               </w:rPr>
-              <w:instrText xml:space="preserve"> PAGEREF _Toc244143528 \h </w:instrText>
+              <w:instrText xml:space="preserve"> PAGEREF _Toc244143650 \h </w:instrText>
             </w:r>
             <w:r>
               <w:rPr>
@@ -1320,7 +1320,7 @@
               <w14:ligatures w14:val="standardContextual"/>
             </w:rPr>
           </w:pPr>
-          <w:hyperlink w:anchor="_Toc244143529" w:history="1">
+          <w:hyperlink w:anchor="_Toc244143651" w:history="1">
             <w:r>
               <w:rPr>
                 <w:rStyle w:val="Hyperlink"/>
@@ -1344,7 +1344,7 @@
               <w:rPr>
                 <w:noProof/>
               </w:rPr>
-              <w:instrText xml:space="preserve"> PAGEREF _Toc244143529 \h </w:instrText>
+              <w:instrText xml:space="preserve"> PAGEREF _Toc244143651 \h </w:instrText>
             </w:r>
             <w:r>
               <w:rPr>
@@ -1386,7 +1386,7 @@
               <w14:ligatures w14:val="standardContextual"/>
             </w:rPr>
           </w:pPr>
-          <w:hyperlink w:anchor="_Toc244143530" w:history="1">
+          <w:hyperlink w:anchor="_Toc244143652" w:history="1">
             <w:r>
               <w:rPr>
                 <w:rStyle w:val="Hyperlink"/>
@@ -1410,7 +1410,7 @@
               <w:rPr>
                 <w:noProof/>
               </w:rPr>
-              <w:instrText xml:space="preserve"> PAGEREF _Toc244143530 \h </w:instrText>
+              <w:instrText xml:space="preserve"> PAGEREF _Toc244143652 \h </w:instrText>
             </w:r>
             <w:r>
               <w:rPr>
@@ -1452,7 +1452,7 @@
               <w14:ligatures w14:val="standardContextual"/>
             </w:rPr>
           </w:pPr>
-          <w:hyperlink w:anchor="_Toc244143531" w:history="1">
+          <w:hyperlink w:anchor="_Toc244143653" w:history="1">
             <w:r>
               <w:rPr>
                 <w:rStyle w:val="Hyperlink"/>
@@ -1476,7 +1476,7 @@
               <w:rPr>
                 <w:noProof/>
               </w:rPr>
-              <w:instrText xml:space="preserve"> PAGEREF _Toc244143531 \h </w:instrText>
+              <w:instrText xml:space="preserve"> PAGEREF _Toc244143653 \h </w:instrText>
             </w:r>
             <w:r>
               <w:rPr>
@@ -1518,7 +1518,7 @@
               <w14:ligatures w14:val="standardContextual"/>
             </w:rPr>
           </w:pPr>
-          <w:hyperlink w:anchor="_Toc244143532" w:history="1">
+          <w:hyperlink w:anchor="_Toc244143654" w:history="1">
             <w:r>
               <w:rPr>
                 <w:rStyle w:val="Hyperlink"/>
@@ -1542,7 +1542,7 @@
               <w:rPr>
                 <w:noProof/>
               </w:rPr>
-              <w:instrText xml:space="preserve"> PAGEREF _Toc244143532 \h </w:instrText>
+              <w:instrText xml:space="preserve"> PAGEREF _Toc244143654 \h </w:instrText>
             </w:r>
             <w:r>
               <w:rPr>
@@ -1584,7 +1584,7 @@
               <w14:ligatures w14:val="standardContextual"/>
             </w:rPr>
           </w:pPr>
-          <w:hyperlink w:anchor="_Toc244143533" w:history="1">
+          <w:hyperlink w:anchor="_Toc244143655" w:history="1">
             <w:r>
               <w:rPr>
                 <w:rStyle w:val="Hyperlink"/>
@@ -1608,7 +1608,7 @@
               <w:rPr>
                 <w:noProof/>
               </w:rPr>
-              <w:instrText xml:space="preserve"> PAGEREF _Toc244143533 \h </w:instrText>
+              <w:instrText xml:space="preserve"> PAGEREF _Toc244143655 \h </w:instrText>
             </w:r>
             <w:r>
               <w:rPr>
@@ -1650,7 +1650,7 @@
               <w14:ligatures w14:val="standardContextual"/>
             </w:rPr>
           </w:pPr>
-          <w:hyperlink w:anchor="_Toc244143534" w:history="1">
+          <w:hyperlink w:anchor="_Toc244143656" w:history="1">
             <w:r>
               <w:rPr>
                 <w:rStyle w:val="Hyperlink"/>
@@ -1674,7 +1674,7 @@
               <w:rPr>
                 <w:noProof/>
               </w:rPr>
-              <w:instrText xml:space="preserve"> PAGEREF _Toc244143534 \h </w:instrText>
+              <w:instrText xml:space="preserve"> PAGEREF _Toc244143656 \h </w:instrText>
             </w:r>
             <w:r>
               <w:rPr>
@@ -1716,7 +1716,7 @@
               <w14:ligatures w14:val="standardContextual"/>
             </w:rPr>
           </w:pPr>
-          <w:hyperlink w:anchor="_Toc244143535" w:history="1">
+          <w:hyperlink w:anchor="_Toc244143657" w:history="1">
             <w:r>
               <w:rPr>
                 <w:rStyle w:val="Hyperlink"/>
@@ -1740,7 +1740,7 @@
               <w:rPr>
                 <w:noProof/>
               </w:rPr>
-              <w:instrText xml:space="preserve"> PAGEREF _Toc244143535 \h </w:instrText>
+              <w:instrText xml:space="preserve"> PAGEREF _Toc244143657 \h </w:instrText>
             </w:r>
             <w:r>
               <w:rPr>
@@ -1782,7 +1782,7 @@
               <w14:ligatures w14:val="standardContextual"/>
             </w:rPr>
           </w:pPr>
-          <w:hyperlink w:anchor="_Toc244143536" w:history="1">
+          <w:hyperlink w:anchor="_Toc244143658" w:history="1">
             <w:r>
               <w:rPr>
                 <w:rStyle w:val="Hyperlink"/>
@@ -1806,7 +1806,7 @@
               <w:rPr>
                 <w:noProof/>
               </w:rPr>
-              <w:instrText xml:space="preserve"> PAGEREF _Toc244143536 \h </w:instrText>
+              <w:instrText xml:space="preserve"> PAGEREF _Toc244143658 \h </w:instrText>
             </w:r>
             <w:r>
               <w:rPr>
@@ -1848,7 +1848,7 @@
               <w14:ligatures w14:val="standardContextual"/>
             </w:rPr>
           </w:pPr>
-          <w:hyperlink w:anchor="_Toc244143537" w:history="1">
+          <w:hyperlink w:anchor="_Toc244143659" w:history="1">
             <w:r>
               <w:rPr>
                 <w:rStyle w:val="Hyperlink"/>
@@ -1872,7 +1872,7 @@
               <w:rPr>
                 <w:noProof/>
               </w:rPr>
-              <w:instrText xml:space="preserve"> PAGEREF _Toc244143537 \h </w:instrText>
+              <w:instrText xml:space="preserve"> PAGEREF _Toc244143659 \h </w:instrText>
             </w:r>
             <w:r>
               <w:rPr>
@@ -1914,7 +1914,7 @@
               <w14:ligatures w14:val="standardContextual"/>
             </w:rPr>
           </w:pPr>
-          <w:hyperlink w:anchor="_Toc244143538" w:history="1">
+          <w:hyperlink w:anchor="_Toc244143660" w:history="1">
             <w:r>
               <w:rPr>
                 <w:rStyle w:val="Hyperlink"/>
@@ -1938,7 +1938,7 @@
               <w:rPr>
                 <w:noProof/>
               </w:rPr>
-              <w:instrText xml:space="preserve"> PAGEREF _Toc244143538 \h </w:instrText>
+              <w:instrText xml:space="preserve"> PAGEREF _Toc244143660 \h </w:instrText>
             </w:r>
             <w:r>
               <w:rPr>
@@ -1980,7 +1980,7 @@
               <w14:ligatures w14:val="standardContextual"/>
             </w:rPr>
           </w:pPr>
-          <w:hyperlink w:anchor="_Toc244143539" w:history="1">
+          <w:hyperlink w:anchor="_Toc244143661" w:history="1">
             <w:r>
               <w:rPr>
                 <w:rStyle w:val="Hyperlink"/>
@@ -2004,7 +2004,7 @@
               <w:rPr>
                 <w:noProof/>
               </w:rPr>
-              <w:instrText xml:space="preserve"> PAGEREF _Toc244143539 \h </w:instrText>
+              <w:instrText xml:space="preserve"> PAGEREF _Toc244143661 \h </w:instrText>
             </w:r>
             <w:r>
               <w:rPr>
@@ -2021,7 +2021,7 @@
               <w:rPr>
                 <w:noProof/>
               </w:rPr>
-              <w:t>19</w:t>
+              <w:t>20</w:t>
             </w:r>
             <w:r>
               <w:rPr>
@@ -2046,7 +2046,7 @@
               <w14:ligatures w14:val="standardContextual"/>
             </w:rPr>
           </w:pPr>
-          <w:hyperlink w:anchor="_Toc244143540" w:history="1">
+          <w:hyperlink w:anchor="_Toc244143662" w:history="1">
             <w:r>
               <w:rPr>
                 <w:rStyle w:val="Hyperlink"/>
@@ -2070,7 +2070,7 @@
               <w:rPr>
                 <w:noProof/>
               </w:rPr>
-              <w:instrText xml:space="preserve"> PAGEREF _Toc244143540 \h </w:instrText>
+              <w:instrText xml:space="preserve"> PAGEREF _Toc244143662 \h </w:instrText>
             </w:r>
             <w:r>
               <w:rPr>
@@ -2112,7 +2112,7 @@
               <w14:ligatures w14:val="standardContextual"/>
             </w:rPr>
           </w:pPr>
-          <w:hyperlink w:anchor="_Toc244143541" w:history="1">
+          <w:hyperlink w:anchor="_Toc244143663" w:history="1">
             <w:r>
               <w:rPr>
                 <w:rStyle w:val="Hyperlink"/>
@@ -2136,7 +2136,7 @@
               <w:rPr>
                 <w:noProof/>
               </w:rPr>
-              <w:instrText xml:space="preserve"> PAGEREF _Toc244143541 \h </w:instrText>
+              <w:instrText xml:space="preserve"> PAGEREF _Toc244143663 \h </w:instrText>
             </w:r>
             <w:r>
               <w:rPr>
@@ -2178,7 +2178,7 @@
               <w14:ligatures w14:val="standardContextual"/>
             </w:rPr>
           </w:pPr>
-          <w:hyperlink w:anchor="_Toc244143542" w:history="1">
+          <w:hyperlink w:anchor="_Toc244143664" w:history="1">
             <w:r>
               <w:rPr>
                 <w:rStyle w:val="Hyperlink"/>
@@ -2202,7 +2202,7 @@
               <w:rPr>
                 <w:noProof/>
               </w:rPr>
-              <w:instrText xml:space="preserve"> PAGEREF _Toc244143542 \h </w:instrText>
+              <w:instrText xml:space="preserve"> PAGEREF _Toc244143664 \h </w:instrText>
             </w:r>
             <w:r>
               <w:rPr>
@@ -2219,7 +2219,7 @@
               <w:rPr>
                 <w:noProof/>
               </w:rPr>
-              <w:t>22</w:t>
+              <w:t>23</w:t>
             </w:r>
             <w:r>
               <w:rPr>
@@ -2244,7 +2244,7 @@
               <w14:ligatures w14:val="standardContextual"/>
             </w:rPr>
           </w:pPr>
-          <w:hyperlink w:anchor="_Toc244143543" w:history="1">
+          <w:hyperlink w:anchor="_Toc244143665" w:history="1">
             <w:r>
               <w:rPr>
                 <w:rStyle w:val="Hyperlink"/>
@@ -2268,7 +2268,7 @@
               <w:rPr>
                 <w:noProof/>
               </w:rPr>
-              <w:instrText xml:space="preserve"> PAGEREF _Toc244143543 \h </w:instrText>
+              <w:instrText xml:space="preserve"> PAGEREF _Toc244143665 \h </w:instrText>
             </w:r>
             <w:r>
               <w:rPr>
@@ -2285,7 +2285,7 @@
               <w:rPr>
                 <w:noProof/>
               </w:rPr>
-              <w:t>22</w:t>
+              <w:t>23</w:t>
             </w:r>
             <w:r>
               <w:rPr>
@@ -2310,7 +2310,7 @@
               <w14:ligatures w14:val="standardContextual"/>
             </w:rPr>
           </w:pPr>
-          <w:hyperlink w:anchor="_Toc244143544" w:history="1">
+          <w:hyperlink w:anchor="_Toc244143666" w:history="1">
             <w:r>
               <w:rPr>
                 <w:rStyle w:val="Hyperlink"/>
@@ -2334,7 +2334,7 @@
               <w:rPr>
                 <w:noProof/>
               </w:rPr>
-              <w:instrText xml:space="preserve"> PAGEREF _Toc244143544 \h </w:instrText>
+              <w:instrText xml:space="preserve"> PAGEREF _Toc244143666 \h </w:instrText>
             </w:r>
             <w:r>
               <w:rPr>
@@ -2351,7 +2351,7 @@
               <w:rPr>
                 <w:noProof/>
               </w:rPr>
-              <w:t>23</w:t>
+              <w:t>24</w:t>
             </w:r>
             <w:r>
               <w:rPr>
@@ -2376,7 +2376,7 @@
               <w14:ligatures w14:val="standardContextual"/>
             </w:rPr>
           </w:pPr>
-          <w:hyperlink w:anchor="_Toc244143545" w:history="1">
+          <w:hyperlink w:anchor="_Toc244143667" w:history="1">
             <w:r>
               <w:rPr>
                 <w:rStyle w:val="Hyperlink"/>
@@ -2400,7 +2400,7 @@
               <w:rPr>
                 <w:noProof/>
               </w:rPr>
-              <w:instrText xml:space="preserve"> PAGEREF _Toc244143545 \h </w:instrText>
+              <w:instrText xml:space="preserve"> PAGEREF _Toc244143667 \h </w:instrText>
             </w:r>
             <w:r>
               <w:rPr>
@@ -2417,7 +2417,7 @@
               <w:rPr>
                 <w:noProof/>
               </w:rPr>
-              <w:t>27</w:t>
+              <w:t>28</w:t>
             </w:r>
             <w:r>
               <w:rPr>
@@ -2442,7 +2442,7 @@
               <w14:ligatures w14:val="standardContextual"/>
             </w:rPr>
           </w:pPr>
-          <w:hyperlink w:anchor="_Toc244143546" w:history="1">
+          <w:hyperlink w:anchor="_Toc244143668" w:history="1">
             <w:r>
               <w:rPr>
                 <w:rStyle w:val="Hyperlink"/>
@@ -2466,7 +2466,7 @@
               <w:rPr>
                 <w:noProof/>
               </w:rPr>
-              <w:instrText xml:space="preserve"> PAGEREF _Toc244143546 \h </w:instrText>
+              <w:instrText xml:space="preserve"> PAGEREF _Toc244143668 \h </w:instrText>
             </w:r>
             <w:r>
               <w:rPr>
@@ -2483,7 +2483,7 @@
               <w:rPr>
                 <w:noProof/>
               </w:rPr>
-              <w:t>37</w:t>
+              <w:t>38</w:t>
             </w:r>
             <w:r>
               <w:rPr>
@@ -2508,7 +2508,7 @@
               <w14:ligatures w14:val="standardContextual"/>
             </w:rPr>
           </w:pPr>
-          <w:hyperlink w:anchor="_Toc244143547" w:history="1">
+          <w:hyperlink w:anchor="_Toc244143669" w:history="1">
             <w:r>
               <w:rPr>
                 <w:rStyle w:val="Hyperlink"/>
@@ -2532,7 +2532,7 @@
               <w:rPr>
                 <w:noProof/>
               </w:rPr>
-              <w:instrText xml:space="preserve"> PAGEREF _Toc244143547 \h </w:instrText>
+              <w:instrText xml:space="preserve"> PAGEREF _Toc244143669 \h </w:instrText>
             </w:r>
             <w:r>
               <w:rPr>
@@ -2549,7 +2549,7 @@
               <w:rPr>
                 <w:noProof/>
               </w:rPr>
-              <w:t>38</w:t>
+              <w:t>39</w:t>
             </w:r>
             <w:r>
               <w:rPr>
@@ -2574,7 +2574,7 @@
               <w14:ligatures w14:val="standardContextual"/>
             </w:rPr>
           </w:pPr>
-          <w:hyperlink w:anchor="_Toc244143548" w:history="1">
+          <w:hyperlink w:anchor="_Toc244143670" w:history="1">
             <w:r>
               <w:rPr>
                 <w:rStyle w:val="Hyperlink"/>
@@ -2598,7 +2598,7 @@
               <w:rPr>
                 <w:noProof/>
               </w:rPr>
-              <w:instrText xml:space="preserve"> PAGEREF _Toc244143548 \h </w:instrText>
+              <w:instrText xml:space="preserve"> PAGEREF _Toc244143670 \h </w:instrText>
             </w:r>
             <w:r>
               <w:rPr>
@@ -2615,7 +2615,7 @@
               <w:rPr>
                 <w:noProof/>
               </w:rPr>
-              <w:t>39</w:t>
+              <w:t>40</w:t>
             </w:r>
             <w:r>
               <w:rPr>
@@ -2639,7 +2639,7 @@
         <w:pageBreakBefore/>
         <w:spacing w:before="0"/>
       </w:pPr>
-      <w:bookmarkStart w:id="0" w:name="_Toc244143512"/>
+      <w:bookmarkStart w:id="0" w:name="_Toc244143634"/>
       <w:r>
         <w:t>1.  Introduction</w:t>
       </w:r>
@@ -2775,7 +2775,7 @@
         <w:pStyle w:val="Heading1"/>
         <w:keepNext/>
       </w:pPr>
-      <w:bookmarkStart w:id="1" w:name="_Toc244143513"/>
+      <w:bookmarkStart w:id="1" w:name="_Toc244143635"/>
       <w:r>
         <w:t>2.  The Ground Theorem</w:t>
       </w:r>
@@ -3039,7 +3039,7 @@
         <w:pStyle w:val="Heading1"/>
         <w:keepNext/>
       </w:pPr>
-      <w:bookmarkStart w:id="2" w:name="_Toc244143514"/>
+      <w:bookmarkStart w:id="2" w:name="_Toc244143636"/>
       <w:r>
         <w:t>3.  What the Problem Demands</w:t>
       </w:r>
@@ -3050,7 +3050,7 @@
         <w:pStyle w:val="Heading2"/>
         <w:keepNext/>
       </w:pPr>
-      <w:bookmarkStart w:id="3" w:name="_Toc244143515"/>
+      <w:bookmarkStart w:id="3" w:name="_Toc244143637"/>
       <w:r>
         <w:t>3.1  Euclidean fields and the axioms of Osterwalder and Schrader</w:t>
       </w:r>
@@ -4180,7 +4180,7 @@
         <w:pStyle w:val="Heading2"/>
         <w:keepNext/>
       </w:pPr>
-      <w:bookmarkStart w:id="4" w:name="_Toc244143516"/>
+      <w:bookmarkStart w:id="4" w:name="_Toc244143638"/>
       <w:r>
         <w:t>3.2  The mass gap</w:t>
       </w:r>
@@ -4252,7 +4252,7 @@
         <w:pStyle w:val="Heading2"/>
         <w:keepNext/>
       </w:pPr>
-      <w:bookmarkStart w:id="5" w:name="_Toc244143517"/>
+      <w:bookmarkStart w:id="5" w:name="_Toc244143639"/>
       <w:r>
         <w:t>3.3  Non-triviality</w:t>
       </w:r>
@@ -4331,7 +4331,7 @@
         <w:pStyle w:val="Heading2"/>
         <w:keepNext/>
       </w:pPr>
-      <w:bookmarkStart w:id="6" w:name="_Toc244143518"/>
+      <w:bookmarkStart w:id="6" w:name="_Toc244143640"/>
       <w:r>
         <w:t>3.4  Limits obtained by compactness</w:t>
       </w:r>
@@ -4410,7 +4410,7 @@
         <w:pStyle w:val="Heading1"/>
         <w:keepNext/>
       </w:pPr>
-      <w:bookmarkStart w:id="7" w:name="_Toc244143519"/>
+      <w:bookmarkStart w:id="7" w:name="_Toc244143641"/>
       <w:r>
         <w:t>4.  The Lattice, Its Positivity and Its Gap</w:t>
       </w:r>
@@ -4421,7 +4421,7 @@
         <w:pStyle w:val="Heading2"/>
         <w:keepNext/>
       </w:pPr>
-      <w:bookmarkStart w:id="8" w:name="_Toc244143520"/>
+      <w:bookmarkStart w:id="8" w:name="_Toc244143642"/>
       <w:r>
         <w:t>4.1  Wilson's theory</w:t>
       </w:r>
@@ -5043,7 +5043,7 @@
         <w:pStyle w:val="Heading2"/>
         <w:keepNext/>
       </w:pPr>
-      <w:bookmarkStart w:id="9" w:name="_Toc244143521"/>
+      <w:bookmarkStart w:id="9" w:name="_Toc244143643"/>
       <w:r>
         <w:t>4.2  Reflection positivity and the transfer matrix</w:t>
       </w:r>
@@ -6079,7 +6079,7 @@
         <w:pStyle w:val="Heading2"/>
         <w:keepNext/>
       </w:pPr>
-      <w:bookmarkStart w:id="10" w:name="_Toc244143522"/>
+      <w:bookmarkStart w:id="10" w:name="_Toc244143644"/>
       <w:r>
         <w:t>4.3  The renormalisation group of Bałaban</w:t>
       </w:r>
@@ -6120,7 +6120,7 @@
         <w:pStyle w:val="Heading1"/>
         <w:keepNext/>
       </w:pPr>
-      <w:bookmarkStart w:id="11" w:name="_Toc244143523"/>
+      <w:bookmarkStart w:id="11" w:name="_Toc244143645"/>
       <w:r>
         <w:t>5.  The Three-Dimensional Manuscripts</w:t>
       </w:r>
@@ -6144,7 +6144,7 @@
         <w:pStyle w:val="Heading2"/>
         <w:keepNext/>
       </w:pPr>
-      <w:bookmarkStart w:id="12" w:name="_Toc244143524"/>
+      <w:bookmarkStart w:id="12" w:name="_Toc244143646"/>
       <w:r>
         <w:t>5.1  The documents</w:t>
       </w:r>
@@ -6191,7 +6191,7 @@
         <w:pStyle w:val="Heading2"/>
         <w:keepNext/>
       </w:pPr>
-      <w:bookmarkStart w:id="13" w:name="_Toc244143525"/>
+      <w:bookmarkStart w:id="13" w:name="_Toc244143647"/>
       <w:r>
         <w:t>5.2  The observable</w:t>
       </w:r>
@@ -6595,7 +6595,7 @@
         <w:pStyle w:val="Heading2"/>
         <w:keepNext/>
       </w:pPr>
-      <w:bookmarkStart w:id="14" w:name="_Toc244143526"/>
+      <w:bookmarkStart w:id="14" w:name="_Toc244143648"/>
       <w:r>
         <w:t>5.3  The torus, the infinite volume and the components</w:t>
       </w:r>
@@ -7126,7 +7126,7 @@
         <w:pStyle w:val="Heading2"/>
         <w:keepNext/>
       </w:pPr>
-      <w:bookmarkStart w:id="15" w:name="_Toc244143527"/>
+      <w:bookmarkStart w:id="15" w:name="_Toc244143649"/>
       <w:r>
         <w:t>5.4  The axioms and the reconstruction</w:t>
       </w:r>
@@ -7356,7 +7356,7 @@
         <w:pStyle w:val="Heading2"/>
         <w:keepNext/>
       </w:pPr>
-      <w:bookmarkStart w:id="16" w:name="_Toc244143528"/>
+      <w:bookmarkStart w:id="16" w:name="_Toc244143650"/>
       <w:r>
         <w:t>5.5  Non-triviality</w:t>
       </w:r>
@@ -7897,7 +7897,7 @@
         <w:pStyle w:val="Heading2"/>
         <w:keepNext/>
       </w:pPr>
-      <w:bookmarkStart w:id="17" w:name="_Toc244143529"/>
+      <w:bookmarkStart w:id="17" w:name="_Toc244143651"/>
       <w:r>
         <w:t>5.6  What the manuscript does not assert</w:t>
       </w:r>
@@ -7945,7 +7945,7 @@
         <w:pStyle w:val="Heading1"/>
         <w:keepNext/>
       </w:pPr>
-      <w:bookmarkStart w:id="18" w:name="_Toc244143530"/>
+      <w:bookmarkStart w:id="18" w:name="_Toc244143652"/>
       <w:r>
         <w:t>6.  The Four-Dimensional Draft and the Standing of the Corpus</w:t>
       </w:r>
@@ -7969,7 +7969,7 @@
         <w:pStyle w:val="Heading2"/>
         <w:keepNext/>
       </w:pPr>
-      <w:bookmarkStart w:id="19" w:name="_Toc244143531"/>
+      <w:bookmarkStart w:id="19" w:name="_Toc244143653"/>
       <w:r>
         <w:t>6.1  The authors' account</w:t>
       </w:r>
@@ -8033,7 +8033,7 @@
         <w:pStyle w:val="Heading2"/>
         <w:keepNext/>
       </w:pPr>
-      <w:bookmarkStart w:id="20" w:name="_Toc244143532"/>
+      <w:bookmarkStart w:id="20" w:name="_Toc244143654"/>
       <w:r>
         <w:t>6.2  The conditional theorem</w:t>
       </w:r>
@@ -8236,7 +8236,7 @@
         <w:pStyle w:val="Heading2"/>
         <w:keepNext/>
       </w:pPr>
-      <w:bookmarkStart w:id="21" w:name="_Toc244143533"/>
+      <w:bookmarkStart w:id="21" w:name="_Toc244143655"/>
       <w:r>
         <w:t>6.3  What the draft does not claim</w:t>
       </w:r>
@@ -8314,7 +8314,7 @@
         <w:pStyle w:val="Heading2"/>
         <w:keepNext/>
       </w:pPr>
-      <w:bookmarkStart w:id="22" w:name="_Toc244143534"/>
+      <w:bookmarkStart w:id="22" w:name="_Toc244143656"/>
       <w:r>
         <w:t>6.4  The standing of the corpus</w:t>
       </w:r>
@@ -8375,7 +8375,7 @@
         <w:pStyle w:val="Heading2"/>
         <w:keepNext/>
       </w:pPr>
-      <w:bookmarkStart w:id="23" w:name="_Toc244143535"/>
+      <w:bookmarkStart w:id="23" w:name="_Toc244143657"/>
       <w:r>
         <w:t>6.5  The public reading</w:t>
       </w:r>
@@ -8443,7 +8443,7 @@
         <w:pStyle w:val="Heading2"/>
         <w:keepNext/>
       </w:pPr>
-      <w:bookmarkStart w:id="24" w:name="_Toc244143536"/>
+      <w:bookmarkStart w:id="24" w:name="_Toc244143658"/>
       <w:r>
         <w:t>6.6  Further claims in public view</w:t>
       </w:r>
@@ -8455,10 +8455,10 @@
         <w:jc w:val="both"/>
       </w:pPr>
       <w:r>
-        <w:t>Four further claims stood in public view when this paper was written, and the ground is not fixed until each is placed beside the corpus. The first is an announcement. On 26 October 2026 OpenAI announced a mathematically rigorous existence proof of interacting quantum field theories in four dimensions, among them the Yang–Mills theory and quantum chromodynamics, stating that "We finished our formalization of Yang–Mills' existence on October 16th, 2026", and that a group led by David Gross, with Arthur Jaffe</w:t>
-      </w:r>
-      <w:r>
-        <w:t>, Michael Douglas, Igor Klebanov and Nikita Nekrasov, would review the work before its release; Woit, who reproduces the announcement's sentences, gives its length as 1,147 pages, and the review group's own statement says that Bałaban's ideas "enabled OpenAI to follow the theory all the way to infinite distances and prove the existence of its proper continuum limit. But confinement and the mass gap remain very important open challenges."</w:t>
+        <w:t>Six further claims stood in public view when this paper was written, and the ground is not fixed until each is placed beside the corpus. The first is an announcement. On 26 October 2026 OpenAI announced a mathematically rigorous existence proof of interacting quantum field theories in four dimensions, among them the Yang–Mills theory and quantum chromodynamics, stating that "We finished our formalization of Yang–Mills' existence on October 16th, 2026", and that a group led by David Gross, with Arthur Jaffe,</w:t>
+      </w:r>
+      <w:r>
+        <w:t xml:space="preserve"> Michael Douglas, Igor Klebanov and Nikita Nekrasov, would review the work before its release; Woit, who reproduces the announcement's sentences, gives its length as 1,147 pages, and the review group's own statement says that Bałaban's ideas "enabled OpenAI to follow the theory all the way to infinite distances and prove the existence of its proper continuum limit. But confinement and the mass gap remain very important open challenges."</w:t>
       </w:r>
       <w:r>
         <w:rPr>
@@ -8734,10 +8734,61 @@
     </w:p>
     <w:p>
       <w:pPr>
+        <w:spacing w:after="120"/>
+        <w:ind w:firstLine="360"/>
+        <w:jc w:val="both"/>
+      </w:pPr>
+      <w:r>
+        <w:t>The fifth and sixth are repositories, read on 29 October at the places where their gaps are obtained. A GitHub repository announcing a resolution of the problem for SU(3), created on 16 October 2026 and last changed on 28 October, carries five volumes and a Lean corpus. Its master theorem is stated under two named hypotheses, a continuum bridge and a non-perturbative cluster decay, and concludes a gap of 1.552 ± 0.038 GeV, a simulation's number with its error bar; the gap enters twice by insertion, as the s</w:t>
+      </w:r>
+      <w:r>
+        <w:t>quare of that number set equal to a Ricci lower bound on the orbit space, which no derivation supports, and as the decay rate of its cluster theorem, and once by assertion, a polymer contraction evaluated at the finest scale only and declared uniform toward the infrared, where asymptotic freedom denies the bound it needs; its own reviewers' guide names the first of these as a trap, and its own README classes the Lean corpus as a conditional reduction whose premise is the cluster decay. The polymer step is g</w:t>
+      </w:r>
+      <w:r>
+        <w:t>roup-blind and would give the four-dimensional U(1) theory a gap: it fails the test of §8.3 where it is asserted.</w:t>
+      </w:r>
+      <w:r>
+        <w:rPr>
+          <w:rStyle w:val="FootnoteReference"/>
+        </w:rPr>
+        <w:footnoteReference w:id="55"/>
+      </w:r>
+      <w:r>
+        <w:t xml:space="preserve"> A Zenodo record of 27 September 2026, written by a language model at its depositor's request and labelled as awaiting the depositor's review, proves a spectral gap for the SU(2) Kogut–Susskind Hamiltonian on open spatial boxes at strong coupling, uniform in the box and the spacing: unconditionally for </w:t>
+      </w:r>
+      <w:r>
+        <w:rPr>
+          <w:i/>
+          <w:iCs/>
+        </w:rPr>
+        <w:t>g</w:t>
+      </w:r>
+      <w:r>
+        <w:t xml:space="preserve">² ≥ 3.978 with its order-2 inputs recomputed, conditionally to </w:t>
+      </w:r>
+      <w:r>
+        <w:rPr>
+          <w:i/>
+          <w:iCs/>
+        </w:rPr>
+        <w:t>g</w:t>
+      </w:r>
+      <w:r>
+        <w:t>² ≥ 3.684 on coefficient bounds read and not re-implemented, by a vacuum equation, a Casimir inequality proved through a supply–demand theorem, and a spectral return. It states its own limit, that the continuum path leaves its domain after finitely many steps, and claims no crossing. It is a sibling of Theorem 8.7 in the Hamiltonian formulation, at a strong-coupling threshold that cannot be ranked against 0.2452 because no exact map joins the two couplings there, and not a claimant.</w:t>
+      </w:r>
+      <w:r>
+        <w:rPr>
+          <w:rStyle w:val="FootnoteReference"/>
+        </w:rPr>
+        <w:footnoteReference w:id="56"/>
+      </w:r>
+    </w:p>
+    <w:p>
+      <w:pPr>
         <w:pStyle w:val="Heading1"/>
         <w:keepNext/>
       </w:pPr>
-      <w:bookmarkStart w:id="25" w:name="_Toc244143537"/>
+      <w:bookmarkStart w:id="25" w:name="_Toc244143659"/>
       <w:r>
         <w:t>7.  The Residue and Its Completion</w:t>
       </w:r>
@@ -8761,7 +8812,7 @@
         <w:pStyle w:val="Heading2"/>
         <w:keepNext/>
       </w:pPr>
-      <w:bookmarkStart w:id="26" w:name="_Toc244143538"/>
+      <w:bookmarkStart w:id="26" w:name="_Toc244143660"/>
       <w:r>
         <w:t>7.1  The residue</w:t>
       </w:r>
@@ -8792,7 +8843,7 @@
           <w:left w:w="10" w:type="dxa"/>
           <w:right w:w="10" w:type="dxa"/>
         </w:tblCellMar>
-        <w:tblLook w:val="04A0" w:firstRow="1" w:lastRow="0" w:firstColumn="1" w:lastColumn="0" w:noHBand="0" w:noVBand="1"/>
+        <w:tblLook w:val="0000" w:firstRow="0" w:lastRow="0" w:firstColumn="0" w:lastColumn="0" w:noHBand="0" w:noVBand="0"/>
       </w:tblPr>
       <w:tblGrid>
         <w:gridCol w:w="2700"/>
@@ -9955,7 +10006,7 @@
         <w:pStyle w:val="Heading2"/>
         <w:keepNext/>
       </w:pPr>
-      <w:bookmarkStart w:id="27" w:name="_Toc244143539"/>
+      <w:bookmarkStart w:id="27" w:name="_Toc244143661"/>
       <w:r>
         <w:t>7.2  The gap is exponential clustering</w:t>
       </w:r>
@@ -11613,7 +11664,7 @@
         <w:rPr>
           <w:rStyle w:val="FootnoteReference"/>
         </w:rPr>
-        <w:footnoteReference w:id="55"/>
+        <w:footnoteReference w:id="57"/>
       </w:r>
     </w:p>
     <w:p>
@@ -11901,7 +11952,7 @@
         <w:pStyle w:val="Heading2"/>
         <w:keepNext/>
       </w:pPr>
-      <w:bookmarkStart w:id="28" w:name="_Toc244143540"/>
+      <w:bookmarkStart w:id="28" w:name="_Toc244143662"/>
       <w:r>
         <w:t>7.3  From the lattice to the limit</w:t>
       </w:r>
@@ -13081,7 +13132,7 @@
         <w:pStyle w:val="Heading2"/>
         <w:keepNext/>
       </w:pPr>
-      <w:bookmarkStart w:id="29" w:name="_Toc244143541"/>
+      <w:bookmarkStart w:id="29" w:name="_Toc244143663"/>
       <w:r>
         <w:t>7.4  The collapse of the components</w:t>
       </w:r>
@@ -13197,7 +13248,7 @@
         <w:pStyle w:val="Heading1"/>
         <w:keepNext/>
       </w:pPr>
-      <w:bookmarkStart w:id="30" w:name="_Toc244143542"/>
+      <w:bookmarkStart w:id="30" w:name="_Toc244143664"/>
       <w:r>
         <w:t>8.  The Ground Handed Over</w:t>
       </w:r>
@@ -13208,7 +13259,7 @@
         <w:pStyle w:val="Heading2"/>
         <w:keepNext/>
       </w:pPr>
-      <w:bookmarkStart w:id="31" w:name="_Toc244143543"/>
+      <w:bookmarkStart w:id="31" w:name="_Toc244143665"/>
       <w:r>
         <w:t>8.1  The object that remains</w:t>
       </w:r>
@@ -13304,7 +13355,7 @@
         <w:rPr>
           <w:rStyle w:val="FootnoteReference"/>
         </w:rPr>
-        <w:footnoteReference w:id="56"/>
+        <w:footnoteReference w:id="58"/>
       </w:r>
       <w:r>
         <w:t xml:space="preserve"> For SU(2) the constant of that gap is a theorem of Edwin Boston III: the conditional law of one link given its six staples, the heat-bath kernel, moves in total variation by at most 2β/(3π) times the change of the staple sum, because the mean absolute deviation of a coordinate of a von Mises–Fisher law on the three-sphere is at most its value 4/(3π) at the uniform law, with equality there alone; so Dobrushin's single-site condition holds on the full lattice for β &lt; 3π/72 = 0.1309, and in the temporal gauge</w:t>
@@ -13316,7 +13367,7 @@
         <w:rPr>
           <w:rStyle w:val="FootnoteReference"/>
         </w:rPr>
-        <w:footnoteReference w:id="57"/>
+        <w:footnoteReference w:id="59"/>
       </w:r>
       <w:r>
         <w:t xml:space="preserve"> The construction's sequence runs into the scaling window of weak bare coupling, where asymptotic freedom ties the bare coupling to the spacing. The inequality must be carried from the one end of the sequence to the other.</w:t>
@@ -13352,7 +13403,7 @@
         <w:pStyle w:val="Heading2"/>
         <w:keepNext/>
       </w:pPr>
-      <w:bookmarkStart w:id="32" w:name="_Toc244143544"/>
+      <w:bookmarkStart w:id="32" w:name="_Toc244143666"/>
       <w:r>
         <w:t>8.2  The instruments in hand</w:t>
       </w:r>
@@ -14120,7 +14171,7 @@
         <w:rPr>
           <w:rStyle w:val="FootnoteReference"/>
         </w:rPr>
-        <w:footnoteReference w:id="58"/>
+        <w:footnoteReference w:id="60"/>
       </w:r>
       <w:r>
         <w:t xml:space="preserve"> Proposition 8.1 turns the gap of Theorem 7.4 into a statement about mixing: a certified bound δ(</w:t>
@@ -17135,7 +17186,7 @@
         <w:rPr>
           <w:rStyle w:val="FootnoteReference"/>
         </w:rPr>
-        <w:footnoteReference w:id="59"/>
+        <w:footnoteReference w:id="61"/>
       </w:r>
     </w:p>
     <w:p>
@@ -18469,7 +18520,7 @@
         <w:rPr>
           <w:rStyle w:val="FootnoteReference"/>
         </w:rPr>
-        <w:footnoteReference w:id="60"/>
+        <w:footnoteReference w:id="62"/>
       </w:r>
     </w:p>
     <w:tbl>
@@ -18487,7 +18538,7 @@
           <w:left w:w="10" w:type="dxa"/>
           <w:right w:w="10" w:type="dxa"/>
         </w:tblCellMar>
-        <w:tblLook w:val="04A0" w:firstRow="1" w:lastRow="0" w:firstColumn="1" w:lastColumn="0" w:noHBand="0" w:noVBand="1"/>
+        <w:tblLook w:val="0000" w:firstRow="0" w:lastRow="0" w:firstColumn="0" w:lastColumn="0" w:noHBand="0" w:noVBand="0"/>
       </w:tblPr>
       <w:tblGrid>
         <w:gridCol w:w="1200"/>
@@ -19593,7 +19644,7 @@
         <w:rPr>
           <w:rStyle w:val="FootnoteReference"/>
         </w:rPr>
-        <w:footnoteReference w:id="61"/>
+        <w:footnoteReference w:id="63"/>
       </w:r>
       <w:r>
         <w:t xml:space="preserve"> At all fourteen cells the brackets contain the eigenvalues computed to forty-five digits by a second engine that shares no computation with the first, and they meet a third, independently certified set of intervals. On the 3×3 cross-section at </w:t>
@@ -19683,7 +19734,7 @@
         <w:rPr>
           <w:rStyle w:val="FootnoteReference"/>
         </w:rPr>
-        <w:footnoteReference w:id="62"/>
+        <w:footnoteReference w:id="64"/>
       </w:r>
       <w:r>
         <w:t xml:space="preserve"> Edwin Boston III reads the first two coefficients of the strong-coupling expansion of the gap exactly on the 3×3 cross-section, meets through them the first three coefficients of the low-temperature series of the Ising correlation length published by Arisue and Tabata, and, solving that published relation for the coefficients that no cross-section of side at most four can read, obtains the expansion on the infinite lattice</w:t>
@@ -19692,7 +19743,7 @@
         <w:rPr>
           <w:rStyle w:val="FootnoteReference"/>
         </w:rPr>
-        <w:footnoteReference w:id="63"/>
+        <w:footnoteReference w:id="65"/>
       </w:r>
     </w:p>
     <w:p>
@@ -20305,7 +20356,7 @@
         <w:rPr>
           <w:rStyle w:val="FootnoteReference"/>
         </w:rPr>
-        <w:footnoteReference w:id="64"/>
+        <w:footnoteReference w:id="66"/>
       </w:r>
     </w:p>
     <w:p>
@@ -20328,7 +20379,7 @@
         <w:rPr>
           <w:rStyle w:val="FootnoteReference"/>
         </w:rPr>
-        <w:footnoteReference w:id="65"/>
+        <w:footnoteReference w:id="67"/>
       </w:r>
       <w:r>
         <w:t xml:space="preserve"> For the transfer matrix of every finite-group lattice theory: every even-time quadratic form is non-negative; the spectral sum holds; the dominant root is simple and strictly dominant, with its residual law; the string energy is the exact limit of two Perron roots; and there is a mass gap on every finite cross-section, at every coupling. For every finite group acting faithfully by a real orthogonal representation, on every finite cross-section, the static potential of a Wilson loop is at least the mass gap</w:t>
@@ -20421,7 +20472,7 @@
         <w:pStyle w:val="Heading2"/>
         <w:keepNext/>
       </w:pPr>
-      <w:bookmarkStart w:id="33" w:name="_Toc244143545"/>
+      <w:bookmarkStart w:id="33" w:name="_Toc244143667"/>
       <w:r>
         <w:t>8.3  The reduction</w:t>
       </w:r>
@@ -25018,7 +25069,7 @@
         <w:rPr>
           <w:rStyle w:val="FootnoteReference"/>
         </w:rPr>
-        <w:footnoteReference w:id="66"/>
+        <w:footnoteReference w:id="68"/>
       </w:r>
       <w:r>
         <w:t xml:space="preserve"> if λ′ has conditional laws that differ from those of λ</w:t>
@@ -28188,7 +28239,7 @@
         <w:rPr>
           <w:rStyle w:val="FootnoteReference"/>
         </w:rPr>
-        <w:footnoteReference w:id="67"/>
+        <w:footnoteReference w:id="69"/>
       </w:r>
       <w:r>
         <w:t xml:space="preserve"> The record also says what the model is not. Its first step from β = 2.2 moves the coupling up where the running of ℤ⁴ moves it down, by an amount of the step's own size, so the model certifies the entry into the disk from its fifth rung and the threshold at its seventh, and not the crossover's first steps, which a flow on ℤ⁴ must read on an object of ℤ⁴. The distance Hypotheses I and II must cross is measured in the blocking steps of ℤ⁴ itself; no step count of the hierarchical model is a reading of it, an</w:t>
@@ -28200,7 +28251,7 @@
         <w:rPr>
           <w:rStyle w:val="FootnoteReference"/>
         </w:rPr>
-        <w:footnoteReference w:id="68"/>
+        <w:footnoteReference w:id="70"/>
       </w:r>
       <w:r>
         <w:t xml:space="preserve"> The inequality the step needs therefore depends on the group, and that dependence is the first property a proof of Hypothesis I must use.</w:t>
@@ -28225,7 +28276,7 @@
         <w:rPr>
           <w:rStyle w:val="FootnoteReference"/>
         </w:rPr>
-        <w:footnoteReference w:id="69"/>
+        <w:footnoteReference w:id="71"/>
       </w:r>
       <w:r>
         <w:t xml:space="preserve"> The paper carries no number for that widening until both are theorems.</w:t>
@@ -28394,7 +28445,7 @@
         <w:rPr>
           <w:rStyle w:val="FootnoteReference"/>
         </w:rPr>
-        <w:footnoteReference w:id="70"/>
+        <w:footnoteReference w:id="72"/>
       </w:r>
       <w:r>
         <w:t xml:space="preserve"> Two consequences are used below: no plaquette contains two links of the cover, and a link outside the cover lies in six plaquettes whose six cover links are distinct, since two links share at most one plaquette.</w:t>
@@ -29872,7 +29923,7 @@
         <w:rPr>
           <w:rStyle w:val="FootnoteReference"/>
         </w:rPr>
-        <w:footnoteReference w:id="71"/>
+        <w:footnoteReference w:id="73"/>
       </w:r>
       <w:r>
         <w:t xml:space="preserve"> makes the </w:t>
@@ -30081,7 +30132,7 @@
         <w:rPr>
           <w:rStyle w:val="FootnoteReference"/>
         </w:rPr>
-        <w:footnoteReference w:id="72"/>
+        <w:footnoteReference w:id="74"/>
       </w:r>
       <w:r>
         <w:t xml:space="preserve"> By (8.10) it gives </w:t>
@@ -33998,7 +34049,7 @@
         <w:rPr>
           <w:rStyle w:val="FootnoteReference"/>
         </w:rPr>
-        <w:footnoteReference w:id="73"/>
+        <w:footnoteReference w:id="75"/>
       </w:r>
       <w:r>
         <w:t xml:space="preserve"> and, since the links of </w:t>
@@ -34082,7 +34133,7 @@
         <w:rPr>
           <w:rStyle w:val="FootnoteReference"/>
         </w:rPr>
-        <w:footnoteReference w:id="74"/>
+        <w:footnoteReference w:id="76"/>
       </w:r>
       <w:r>
         <w:t xml:space="preserve"> the bound applies to θ</w:t>
@@ -34139,7 +34190,7 @@
           <w:left w:w="10" w:type="dxa"/>
           <w:right w:w="10" w:type="dxa"/>
         </w:tblCellMar>
-        <w:tblLook w:val="04A0" w:firstRow="1" w:lastRow="0" w:firstColumn="1" w:lastColumn="0" w:noHBand="0" w:noVBand="1"/>
+        <w:tblLook w:val="0000" w:firstRow="0" w:lastRow="0" w:firstColumn="0" w:lastColumn="0" w:noHBand="0" w:noVBand="0"/>
       </w:tblPr>
       <w:tblGrid>
         <w:gridCol w:w="1200"/>
@@ -35562,7 +35613,7 @@
         <w:rPr>
           <w:rStyle w:val="FootnoteReference"/>
         </w:rPr>
-        <w:footnoteReference w:id="75"/>
+        <w:footnoteReference w:id="77"/>
       </w:r>
       <w:r>
         <w:t xml:space="preserve"> Theorem 8.7 is a theorem at strong coupling, 1.84 times the single link's disk 3π/72 of §8.1, and it reaches no crossover: it claims nothing above β = 0.2452, the test of the abelian group in this section does not bear on it, and the interval between it and the crossover near β = 2.3 is the part of the second link that Hypotheses I and II must still supply. That no decimation of ℤ⁴ places both integrated links of every plaquette opposite one another, which a two-colouring argument shows in every dimension </w:t>
@@ -35574,7 +35625,7 @@
         <w:rPr>
           <w:rStyle w:val="FootnoteReference"/>
         </w:rPr>
-        <w:footnoteReference w:id="76"/>
+        <w:footnoteReference w:id="78"/>
       </w:r>
     </w:p>
     <w:p>
@@ -35695,7 +35746,7 @@
         <w:rPr>
           <w:rStyle w:val="FootnoteReference"/>
         </w:rPr>
-        <w:footnoteReference w:id="77"/>
+        <w:footnoteReference w:id="79"/>
       </w:r>
       <w:r>
         <w:t xml:space="preserve"> Dimock's expositions treat the abelian and scalar cases and state every threshold the same way. Within the certified form the next widening is the same theorem in the Wasserstein metric of the three-sphere, whose one-link constant is 1/4, exact in the two symmetric directions and supported to one per cent between them, against total variation's 4/(3π); with the constants proved so far it gains nothing over Theorem 8.7, it is predicted to close near β = 0.30 under two constants not yet proved, and it is ung</w:t>
@@ -35720,7 +35771,7 @@
         <w:rPr>
           <w:rStyle w:val="FootnoteReference"/>
         </w:rPr>
-        <w:footnoteReference w:id="78"/>
+        <w:footnoteReference w:id="80"/>
       </w:r>
     </w:p>
     <w:p>
@@ -35728,7 +35779,7 @@
         <w:pStyle w:val="Heading2"/>
         <w:keepNext/>
       </w:pPr>
-      <w:bookmarkStart w:id="34" w:name="_Toc244143546"/>
+      <w:bookmarkStart w:id="34" w:name="_Toc244143668"/>
       <w:r>
         <w:t>8.4  Coda</w:t>
       </w:r>
@@ -35753,7 +35804,7 @@
         <w:pageBreakBefore/>
         <w:spacing w:before="0"/>
       </w:pPr>
-      <w:bookmarkStart w:id="35" w:name="_Toc244143547"/>
+      <w:bookmarkStart w:id="35" w:name="_Toc244143669"/>
       <w:r>
         <w:t>Sources</w:t>
       </w:r>
@@ -36833,7 +36884,7 @@
         <w:pStyle w:val="Heading2"/>
         <w:keepNext/>
       </w:pPr>
-      <w:bookmarkStart w:id="36" w:name="_Toc244143548"/>
+      <w:bookmarkStart w:id="36" w:name="_Toc244143670"/>
       <w:r>
         <w:t>Records of the computations of Edwin Boston III</w:t>
       </w:r>
@@ -39002,7 +39053,14 @@
           <w:sz w:val="17"/>
           <w:szCs w:val="17"/>
         </w:rPr>
-        <w:t>Edwin Boston III; listed in the Records under the lattice theorems in Lean.</w:t>
+        <w:t>github.com/garygitton/yang-mills-millennium-problem: Volume V, p. 2 (Theorem 1.2) and p. 5 ((2.6), Theorem 2.1); Volume II, p. 14 (Theorem 4.5 and its proof, evaluated at k = 0) and pp. 23–24 (Theorem 7.1); the README's epistemic note and the REVIEWERS_GUIDE; the Lean theorems dimensional_transmutation_mass_gap_positive, canonical_balaban_polymer_activity_subunitary_evaluation (the inequality 582 &lt; 1000) and scaleway_su3_measured_mass_gap_positive (a typed number); read by the fourth seat of this work on 29</w:t>
+      </w:r>
+      <w:r>
+        <w:rPr>
+          <w:sz w:val="17"/>
+          <w:szCs w:val="17"/>
+        </w:rPr>
+        <w:t xml:space="preserve"> October 2026.</w:t>
       </w:r>
     </w:p>
   </w:footnote>
@@ -39022,23 +39080,7 @@
           <w:sz w:val="17"/>
           <w:szCs w:val="17"/>
         </w:rPr>
-        <w:t xml:space="preserve">Osterwalder and Seiler, </w:t>
-      </w:r>
-      <w:r>
-        <w:rPr>
-          <w:i/>
-          <w:iCs/>
-          <w:sz w:val="17"/>
-          <w:szCs w:val="17"/>
-        </w:rPr>
-        <w:t>op. cit.</w:t>
-      </w:r>
-      <w:r>
-        <w:rPr>
-          <w:sz w:val="17"/>
-          <w:szCs w:val="17"/>
-        </w:rPr>
-        <w:t>, for the strong-coupling gap of the Wilson theory with a compact gauge group; the finite-group form with its explicit coefficients is Edwin Boston III's, listed in the Records.</w:t>
+        <w:t>Zenodo record 23001803, version of 27 September 2026, the Yang–Mills record: §0.3, §1, Theorem 2.1, Lemma 2.2, Corollary 2.6 and Proposition 6.2; read by the fourth seat on 29 October 2026.</w:t>
       </w:r>
     </w:p>
   </w:footnote>
@@ -39058,7 +39100,7 @@
           <w:sz w:val="17"/>
           <w:szCs w:val="17"/>
         </w:rPr>
-        <w:t>Edwin Boston III, the sharp one-link lemma: the bound on the mean absolute deviation is certified by an enclosure of 9,104 rectangles in the plane of the two parameters of the law, no cell undecided, with the axial case by Chebyshev's association inequality and the remainder by hand; the heat-bath kernel's constant follows by the path argument, each law along the path being a von Mises–Fisher law; its record and run of record are listed in the Records. The time-open count is the paper's.</w:t>
+        <w:t>Edwin Boston III; listed in the Records under the lattice theorems in Lean.</w:t>
       </w:r>
     </w:p>
   </w:footnote>
@@ -39078,7 +39120,7 @@
           <w:sz w:val="17"/>
           <w:szCs w:val="17"/>
         </w:rPr>
-        <w:t xml:space="preserve">R. L. Dobrushin, "Central limit theorem for nonstationary Markov chains. I, II", </w:t>
+        <w:t xml:space="preserve">Osterwalder and Seiler, </w:t>
       </w:r>
       <w:r>
         <w:rPr>
@@ -39087,30 +39129,14 @@
           <w:sz w:val="17"/>
           <w:szCs w:val="17"/>
         </w:rPr>
-        <w:t>Theory Probab. Appl.</w:t>
+        <w:t>op. cit.</w:t>
       </w:r>
       <w:r>
         <w:rPr>
           <w:sz w:val="17"/>
           <w:szCs w:val="17"/>
         </w:rPr>
-        <w:t xml:space="preserve"> 1 (1956), 65–80 and 329–383; I. Gelfand, "Normierte Ringe", </w:t>
-      </w:r>
-      <w:r>
-        <w:rPr>
-          <w:i/>
-          <w:iCs/>
-          <w:sz w:val="17"/>
-          <w:szCs w:val="17"/>
-        </w:rPr>
-        <w:t>Mat. Sbornik</w:t>
-      </w:r>
-      <w:r>
-        <w:rPr>
-          <w:sz w:val="17"/>
-          <w:szCs w:val="17"/>
-        </w:rPr>
-        <w:t xml:space="preserve"> 9 (51) (1941), 3–24.</w:t>
+        <w:t>, for the strong-coupling gap of the Wilson theory with a compact gauge group; the finite-group form with its explicit coefficients is Edwin Boston III's, listed in the Records.</w:t>
       </w:r>
     </w:p>
   </w:footnote>
@@ -39130,7 +39156,7 @@
           <w:sz w:val="17"/>
           <w:szCs w:val="17"/>
         </w:rPr>
-        <w:t>Edwin Boston III, the chain lemma; its record and run of record are listed in the Records.</w:t>
+        <w:t>Edwin Boston III, the sharp one-link lemma: the bound on the mean absolute deviation is certified by an enclosure of 9,104 rectangles in the plane of the two parameters of the law, no cell undecided, with the axial case by Chebyshev's association inequality and the remainder by hand; the heat-bath kernel's constant follows by the path argument, each law along the path being a von Mises–Fisher law; its record and run of record are listed in the Records. The time-open count is the paper's.</w:t>
       </w:r>
     </w:p>
   </w:footnote>
@@ -39150,7 +39176,39 @@
           <w:sz w:val="17"/>
           <w:szCs w:val="17"/>
         </w:rPr>
-        <w:t>Edwin Boston III, the shadow ladder; the record and its run of record are listed in the Records at the end of this paper.</w:t>
+        <w:t xml:space="preserve">R. L. Dobrushin, "Central limit theorem for nonstationary Markov chains. I, II", </w:t>
+      </w:r>
+      <w:r>
+        <w:rPr>
+          <w:i/>
+          <w:iCs/>
+          <w:sz w:val="17"/>
+          <w:szCs w:val="17"/>
+        </w:rPr>
+        <w:t>Theory Probab. Appl.</w:t>
+      </w:r>
+      <w:r>
+        <w:rPr>
+          <w:sz w:val="17"/>
+          <w:szCs w:val="17"/>
+        </w:rPr>
+        <w:t xml:space="preserve"> 1 (1956), 65–80 and 329–383; I. Gelfand, "Normierte Ringe", </w:t>
+      </w:r>
+      <w:r>
+        <w:rPr>
+          <w:i/>
+          <w:iCs/>
+          <w:sz w:val="17"/>
+          <w:szCs w:val="17"/>
+        </w:rPr>
+        <w:t>Mat. Sbornik</w:t>
+      </w:r>
+      <w:r>
+        <w:rPr>
+          <w:sz w:val="17"/>
+          <w:szCs w:val="17"/>
+        </w:rPr>
+        <w:t xml:space="preserve"> 9 (51) (1941), 3–24.</w:t>
       </w:r>
     </w:p>
   </w:footnote>
@@ -39170,23 +39228,7 @@
           <w:sz w:val="17"/>
           <w:szCs w:val="17"/>
         </w:rPr>
-        <w:t xml:space="preserve">J. J. Sylvester, "A demonstration of the theorem that every homogeneous quadratic polynomial is reducible by real orthogonal substitutions to the form of a sum of positive and negative squares", </w:t>
-      </w:r>
-      <w:r>
-        <w:rPr>
-          <w:i/>
-          <w:iCs/>
-          <w:sz w:val="17"/>
-          <w:szCs w:val="17"/>
-        </w:rPr>
-        <w:t>Philosophical Magazine</w:t>
-      </w:r>
-      <w:r>
-        <w:rPr>
-          <w:sz w:val="17"/>
-          <w:szCs w:val="17"/>
-        </w:rPr>
-        <w:t xml:space="preserve"> 4 (1852), 138–142. The computation is Edwin Boston III's; its record is listed in the Records.</w:t>
+        <w:t>Edwin Boston III, the chain lemma; its record and run of record are listed in the Records.</w:t>
       </w:r>
     </w:p>
   </w:footnote>
@@ -39206,23 +39248,7 @@
           <w:sz w:val="17"/>
           <w:szCs w:val="17"/>
         </w:rPr>
-        <w:t xml:space="preserve">F. J. Wegner, "Duality in generalized Ising models and phase transitions without local order parameters", </w:t>
-      </w:r>
-      <w:r>
-        <w:rPr>
-          <w:i/>
-          <w:iCs/>
-          <w:sz w:val="17"/>
-          <w:szCs w:val="17"/>
-        </w:rPr>
-        <w:t>J. Math. Phys.</w:t>
-      </w:r>
-      <w:r>
-        <w:rPr>
-          <w:sz w:val="17"/>
-          <w:szCs w:val="17"/>
-        </w:rPr>
-        <w:t xml:space="preserve"> 12 (1971), 2259–2272.</w:t>
+        <w:t>Edwin Boston III, the shadow ladder; the record and its run of record are listed in the Records at the end of this paper.</w:t>
       </w:r>
     </w:p>
   </w:footnote>
@@ -39242,7 +39268,7 @@
           <w:sz w:val="17"/>
           <w:szCs w:val="17"/>
         </w:rPr>
-        <w:t xml:space="preserve">H. Arisue and K. Tabata, "Low-temperature series for the correlation length in d = 3 Ising model", </w:t>
+        <w:t xml:space="preserve">J. J. Sylvester, "A demonstration of the theorem that every homogeneous quadratic polynomial is reducible by real orthogonal substitutions to the form of a sum of positive and negative squares", </w:t>
       </w:r>
       <w:r>
         <w:rPr>
@@ -39251,14 +39277,14 @@
           <w:sz w:val="17"/>
           <w:szCs w:val="17"/>
         </w:rPr>
-        <w:t>Nucl. Phys.</w:t>
+        <w:t>Philosophical Magazine</w:t>
       </w:r>
       <w:r>
         <w:rPr>
           <w:sz w:val="17"/>
           <w:szCs w:val="17"/>
         </w:rPr>
-        <w:t xml:space="preserve"> B435 (1995), 555–566. The reading is Edwin Boston III's; its record is listed in the Records.</w:t>
+        <w:t xml:space="preserve"> 4 (1852), 138–142. The computation is Edwin Boston III's; its record is listed in the Records.</w:t>
       </w:r>
     </w:p>
   </w:footnote>
@@ -39278,7 +39304,23 @@
           <w:sz w:val="17"/>
           <w:szCs w:val="17"/>
         </w:rPr>
-        <w:t>Edwin Boston III, the transform on a tube; the instrument, its records at both cutoffs and the run of record are listed in the Records. The spin-3/2 record at β₃ = 2.3 is posted with its digest in the repository; its gate run follows the run of record named there.</w:t>
+        <w:t xml:space="preserve">F. J. Wegner, "Duality in generalized Ising models and phase transitions without local order parameters", </w:t>
+      </w:r>
+      <w:r>
+        <w:rPr>
+          <w:i/>
+          <w:iCs/>
+          <w:sz w:val="17"/>
+          <w:szCs w:val="17"/>
+        </w:rPr>
+        <w:t>J. Math. Phys.</w:t>
+      </w:r>
+      <w:r>
+        <w:rPr>
+          <w:sz w:val="17"/>
+          <w:szCs w:val="17"/>
+        </w:rPr>
+        <w:t xml:space="preserve"> 12 (1971), 2259–2272.</w:t>
       </w:r>
     </w:p>
   </w:footnote>
@@ -39298,7 +39340,23 @@
           <w:sz w:val="17"/>
           <w:szCs w:val="17"/>
         </w:rPr>
-        <w:t>Edwin Boston III, the lattice theorems in Lean; the files, the theorem names and the run of record are listed in the Records.</w:t>
+        <w:t xml:space="preserve">H. Arisue and K. Tabata, "Low-temperature series for the correlation length in d = 3 Ising model", </w:t>
+      </w:r>
+      <w:r>
+        <w:rPr>
+          <w:i/>
+          <w:iCs/>
+          <w:sz w:val="17"/>
+          <w:szCs w:val="17"/>
+        </w:rPr>
+        <w:t>Nucl. Phys.</w:t>
+      </w:r>
+      <w:r>
+        <w:rPr>
+          <w:sz w:val="17"/>
+          <w:szCs w:val="17"/>
+        </w:rPr>
+        <w:t xml:space="preserve"> B435 (1995), 555–566. The reading is Edwin Boston III's; its record is listed in the Records.</w:t>
       </w:r>
     </w:p>
   </w:footnote>
@@ -39318,39 +39376,7 @@
           <w:sz w:val="17"/>
           <w:szCs w:val="17"/>
         </w:rPr>
-        <w:t xml:space="preserve">R. L. Dobrushin, "Prescribing a system of random variables by conditional distributions", </w:t>
-      </w:r>
-      <w:r>
-        <w:rPr>
-          <w:i/>
-          <w:iCs/>
-          <w:sz w:val="17"/>
-          <w:szCs w:val="17"/>
-        </w:rPr>
-        <w:t>Theory Probab. Appl.</w:t>
-      </w:r>
-      <w:r>
-        <w:rPr>
-          <w:sz w:val="17"/>
-          <w:szCs w:val="17"/>
-        </w:rPr>
-        <w:t xml:space="preserve"> 15 (1970), 458–486, where the uniqueness theorem and the comparison theorem are proved for arbitrary single-site spaces; the comparison theorem is used here in the form of Theorem 8.20 of H.-O. Georgii, </w:t>
-      </w:r>
-      <w:r>
-        <w:rPr>
-          <w:i/>
-          <w:iCs/>
-          <w:sz w:val="17"/>
-          <w:szCs w:val="17"/>
-        </w:rPr>
-        <w:t>Gibbs Measures and Phase Transitions</w:t>
-      </w:r>
-      <w:r>
-        <w:rPr>
-          <w:sz w:val="17"/>
-          <w:szCs w:val="17"/>
-        </w:rPr>
-        <w:t>, second edition, de Gruyter, Berlin, 2011. Its finite form, for finite single-site spaces, is among the theorems checked by machine in §8.2.</w:t>
+        <w:t>Edwin Boston III, the transform on a tube; the instrument, its records at both cutoffs and the run of record are listed in the Records. The spin-3/2 record at β₃ = 2.3 is posted with its digest in the repository; its gate run follows the run of record named there.</w:t>
       </w:r>
     </w:p>
   </w:footnote>
@@ -39370,7 +39396,7 @@
           <w:sz w:val="17"/>
           <w:szCs w:val="17"/>
         </w:rPr>
-        <w:t>Edwin Boston III, the certified descent; the instrument, its records at the four starting couplings and the run of record are listed in the Records. The first step from β = 2.2 is read from the same record: the coefficient rises from 0.464 to 0.486, an effective coupling of 2.34, where the one-loop running of ℤ⁴ takes 2.2 to 1.94 under one doubling of the scale.</w:t>
+        <w:t>Edwin Boston III, the lattice theorems in Lean; the files, the theorem names and the run of record are listed in the Records.</w:t>
       </w:r>
     </w:p>
   </w:footnote>
@@ -39390,7 +39416,7 @@
           <w:sz w:val="17"/>
           <w:szCs w:val="17"/>
         </w:rPr>
-        <w:t xml:space="preserve">A. H. Guth, "Existence proof of a nonconfining phase in four-dimensional U(1) lattice gauge theory", </w:t>
+        <w:t xml:space="preserve">R. L. Dobrushin, "Prescribing a system of random variables by conditional distributions", </w:t>
       </w:r>
       <w:r>
         <w:rPr>
@@ -39399,14 +39425,14 @@
           <w:sz w:val="17"/>
           <w:szCs w:val="17"/>
         </w:rPr>
-        <w:t>Phys. Rev. D</w:t>
+        <w:t>Theory Probab. Appl.</w:t>
       </w:r>
       <w:r>
         <w:rPr>
           <w:sz w:val="17"/>
           <w:szCs w:val="17"/>
         </w:rPr>
-        <w:t xml:space="preserve"> 21 (1980), 2291–2307; J. Fröhlich and T. Spencer, "Massless phases and symmetry restoration in abelian gauge theories and spin systems", </w:t>
+        <w:t xml:space="preserve"> 15 (1970), 458–486, where the uniqueness theorem and the comparison theorem are proved for arbitrary single-site spaces; the comparison theorem is used here in the form of Theorem 8.20 of H.-O. Georgii, </w:t>
       </w:r>
       <w:r>
         <w:rPr>
@@ -39415,14 +39441,14 @@
           <w:sz w:val="17"/>
           <w:szCs w:val="17"/>
         </w:rPr>
-        <w:t>Comm. Math. Phys.</w:t>
+        <w:t>Gibbs Measures and Phase Transitions</w:t>
       </w:r>
       <w:r>
         <w:rPr>
           <w:sz w:val="17"/>
           <w:szCs w:val="17"/>
         </w:rPr>
-        <w:t xml:space="preserve"> 83 (1982), 411–454.</w:t>
+        <w:t>, second edition, de Gruyter, Berlin, 2011. Its finite form, for finite single-site spaces, is among the theorems checked by machine in §8.2.</w:t>
       </w:r>
     </w:p>
   </w:footnote>
@@ -39442,7 +39468,7 @@
           <w:sz w:val="17"/>
           <w:szCs w:val="17"/>
         </w:rPr>
-        <w:t>Edwin Boston III; the block criterion's accounting, the one-face law and the closed form of its covariance are entered on the ledger of the work that follows this paper, with their readings on the exact cube.</w:t>
+        <w:t>Edwin Boston III, the certified descent; the instrument, its records at the four starting couplings and the run of record are listed in the Records. The first step from β = 2.2 is read from the same record: the coefficient rises from 0.464 to 0.486, an effective coupling of 2.34, where the one-loop running of ℤ⁴ takes 2.2 to 1.94 under one doubling of the scale.</w:t>
       </w:r>
     </w:p>
   </w:footnote>
@@ -39462,7 +39488,39 @@
           <w:sz w:val="17"/>
           <w:szCs w:val="17"/>
         </w:rPr>
-        <w:t>Edwin Boston III; the cover was found by an exhaustive search on the torus of side two and checked again, on a road sharing no line with the search, on every plaquette of the tori of side two, four and six, where a single bent site leaves ten plaquettes of the smallest torus with zero or two links of the set; Records R7.</w:t>
+        <w:t xml:space="preserve">A. H. Guth, "Existence proof of a nonconfining phase in four-dimensional U(1) lattice gauge theory", </w:t>
+      </w:r>
+      <w:r>
+        <w:rPr>
+          <w:i/>
+          <w:iCs/>
+          <w:sz w:val="17"/>
+          <w:szCs w:val="17"/>
+        </w:rPr>
+        <w:t>Phys. Rev. D</w:t>
+      </w:r>
+      <w:r>
+        <w:rPr>
+          <w:sz w:val="17"/>
+          <w:szCs w:val="17"/>
+        </w:rPr>
+        <w:t xml:space="preserve"> 21 (1980), 2291–2307; J. Fröhlich and T. Spencer, "Massless phases and symmetry restoration in abelian gauge theories and spin systems", </w:t>
+      </w:r>
+      <w:r>
+        <w:rPr>
+          <w:i/>
+          <w:iCs/>
+          <w:sz w:val="17"/>
+          <w:szCs w:val="17"/>
+        </w:rPr>
+        <w:t>Comm. Math. Phys.</w:t>
+      </w:r>
+      <w:r>
+        <w:rPr>
+          <w:sz w:val="17"/>
+          <w:szCs w:val="17"/>
+        </w:rPr>
+        <w:t xml:space="preserve"> 83 (1982), 411–454.</w:t>
       </w:r>
     </w:p>
   </w:footnote>
@@ -39482,23 +39540,7 @@
           <w:sz w:val="17"/>
           <w:szCs w:val="17"/>
         </w:rPr>
-        <w:t xml:space="preserve">G. N. Watson, </w:t>
-      </w:r>
-      <w:r>
-        <w:rPr>
-          <w:i/>
-          <w:iCs/>
-          <w:sz w:val="17"/>
-          <w:szCs w:val="17"/>
-        </w:rPr>
-        <w:t>A Treatise on the Theory of Bessel Functions</w:t>
-      </w:r>
-      <w:r>
-        <w:rPr>
-          <w:sz w:val="17"/>
-          <w:szCs w:val="17"/>
-        </w:rPr>
-        <w:t>, second edition, Cambridge University Press, 1944, §5.41.</w:t>
+        <w:t>Edwin Boston III; the block criterion's accounting, the one-face law and the closed form of its covariance are entered on the ledger of the work that follows this paper, with their readings on the exact cube.</w:t>
       </w:r>
     </w:p>
   </w:footnote>
@@ -39518,23 +39560,7 @@
           <w:sz w:val="17"/>
           <w:szCs w:val="17"/>
         </w:rPr>
-        <w:t xml:space="preserve">K. V. Thiruvenkatachar and T. S. Nanjundiah, "Inequalities concerning Bessel functions and orthogonal polynomials", </w:t>
-      </w:r>
-      <w:r>
-        <w:rPr>
-          <w:i/>
-          <w:iCs/>
-          <w:sz w:val="17"/>
-          <w:szCs w:val="17"/>
-        </w:rPr>
-        <w:t>Proc. Indian Acad. Sci. A</w:t>
-      </w:r>
-      <w:r>
-        <w:rPr>
-          <w:sz w:val="17"/>
-          <w:szCs w:val="17"/>
-        </w:rPr>
-        <w:t xml:space="preserve"> 33 (1951), 373–384.</w:t>
+        <w:t>Edwin Boston III; the cover was found by an exhaustive search on the torus of side two and checked again, on a road sharing no line with the search, on every plaquette of the tori of side two, four and six, where a single bent site leaves ten plaquettes of the smallest torus with zero or two links of the set; Records R7.</w:t>
       </w:r>
     </w:p>
   </w:footnote>
@@ -39554,7 +39580,7 @@
           <w:sz w:val="17"/>
           <w:szCs w:val="17"/>
         </w:rPr>
-        <w:t xml:space="preserve">R. L. Dobrushin, "Prescribing a system of random variables by conditional distributions", </w:t>
+        <w:t xml:space="preserve">G. N. Watson, </w:t>
       </w:r>
       <w:r>
         <w:rPr>
@@ -39563,14 +39589,14 @@
           <w:sz w:val="17"/>
           <w:szCs w:val="17"/>
         </w:rPr>
-        <w:t>Theory Probab. Appl.</w:t>
+        <w:t>A Treatise on the Theory of Bessel Functions</w:t>
       </w:r>
       <w:r>
         <w:rPr>
           <w:sz w:val="17"/>
           <w:szCs w:val="17"/>
         </w:rPr>
-        <w:t xml:space="preserve"> 15 (1970), 458–486; Sources [17].</w:t>
+        <w:t>, second edition, Cambridge University Press, 1944, §5.41.</w:t>
       </w:r>
     </w:p>
   </w:footnote>
@@ -39590,7 +39616,23 @@
           <w:sz w:val="17"/>
           <w:szCs w:val="17"/>
         </w:rPr>
-        <w:t>K. Osterwalder and E. Seiler, Sources [5]; M. Lüscher, Sources [7].</w:t>
+        <w:t xml:space="preserve">K. V. Thiruvenkatachar and T. S. Nanjundiah, "Inequalities concerning Bessel functions and orthogonal polynomials", </w:t>
+      </w:r>
+      <w:r>
+        <w:rPr>
+          <w:i/>
+          <w:iCs/>
+          <w:sz w:val="17"/>
+          <w:szCs w:val="17"/>
+        </w:rPr>
+        <w:t>Proc. Indian Acad. Sci. A</w:t>
+      </w:r>
+      <w:r>
+        <w:rPr>
+          <w:sz w:val="17"/>
+          <w:szCs w:val="17"/>
+        </w:rPr>
+        <w:t xml:space="preserve"> 33 (1951), 373–384.</w:t>
       </w:r>
     </w:p>
   </w:footnote>
@@ -39610,7 +39652,23 @@
           <w:sz w:val="17"/>
           <w:szCs w:val="17"/>
         </w:rPr>
-        <w:t>Edwin Boston III; the certificate and its sharp pass, the second evaluation, the third road's enclosure and the enclosures of the two constants are Records R7.</w:t>
+        <w:t xml:space="preserve">R. L. Dobrushin, "Prescribing a system of random variables by conditional distributions", </w:t>
+      </w:r>
+      <w:r>
+        <w:rPr>
+          <w:i/>
+          <w:iCs/>
+          <w:sz w:val="17"/>
+          <w:szCs w:val="17"/>
+        </w:rPr>
+        <w:t>Theory Probab. Appl.</w:t>
+      </w:r>
+      <w:r>
+        <w:rPr>
+          <w:sz w:val="17"/>
+          <w:szCs w:val="17"/>
+        </w:rPr>
+        <w:t xml:space="preserve"> 15 (1970), 458–486; Sources [17].</w:t>
       </w:r>
     </w:p>
   </w:footnote>
@@ -39630,7 +39688,7 @@
           <w:sz w:val="17"/>
           <w:szCs w:val="17"/>
         </w:rPr>
-        <w:t>Edwin Boston III; the two-colouring argument, the range of the decimated specification and its row sum are on the ledger of the work that follows this paper, with their records.</w:t>
+        <w:t>K. Osterwalder and E. Seiler, Sources [5]; M. Lüscher, Sources [7].</w:t>
       </w:r>
     </w:p>
   </w:footnote>
@@ -39650,59 +39708,99 @@
           <w:sz w:val="17"/>
           <w:szCs w:val="17"/>
         </w:rPr>
-        <w:t xml:space="preserve">T. Bałaban, </w:t>
-      </w:r>
-      <w:r>
-        <w:rPr>
-          <w:i/>
-          <w:iCs/>
-          <w:sz w:val="17"/>
-          <w:szCs w:val="17"/>
-        </w:rPr>
-        <w:t>Comm. Math. Phys.</w:t>
-      </w:r>
-      <w:r>
-        <w:rPr>
-          <w:sz w:val="17"/>
-          <w:szCs w:val="17"/>
-        </w:rPr>
-        <w:t xml:space="preserve"> 109 (1987), 249–301: Theorem 1 (p. 259) and Theorem 3 (p. 267), the recursion (0.20) (p. 256), the action (0.2) with the normalised trace (p. 252), read from the pages on 29 October 2026. The statement that the sequence can be kept small in four dimensions, his Theorem 2 (pp. 259–260), is deferred there to "a separate paper"; the four-dimensional stability theorem itself is stated in </w:t>
-      </w:r>
-      <w:r>
-        <w:rPr>
-          <w:i/>
-          <w:iCs/>
-          <w:sz w:val="17"/>
-          <w:szCs w:val="17"/>
-        </w:rPr>
-        <w:t>Large field renormalization II</w:t>
-      </w:r>
-      <w:r>
-        <w:rPr>
-          <w:sz w:val="17"/>
-          <w:szCs w:val="17"/>
-        </w:rPr>
-        <w:t xml:space="preserve">, </w:t>
-      </w:r>
-      <w:r>
-        <w:rPr>
-          <w:i/>
-          <w:iCs/>
-          <w:sz w:val="17"/>
-          <w:szCs w:val="17"/>
-        </w:rPr>
-        <w:t>Comm. Math. Phys.</w:t>
-      </w:r>
-      <w:r>
-        <w:rPr>
-          <w:sz w:val="17"/>
-          <w:szCs w:val="17"/>
-        </w:rPr>
-        <w:t xml:space="preserve"> 122 (1989), 355–392, unread at this revision.</w:t>
+        <w:t>Edwin Boston III; the certificate and its sharp pass, the second evaluation, the third road's enclosure and the enclosures of the two constants are Records R7.</w:t>
       </w:r>
     </w:p>
   </w:footnote>
   <w:footnote w:id="78">
+    <w:p>
+      <w:pPr>
+        <w:spacing w:after="40" w:line="240" w:lineRule="auto"/>
+      </w:pPr>
+      <w:r>
+        <w:rPr>
+          <w:rStyle w:val="FootnoteReference"/>
+        </w:rPr>
+        <w:footnoteRef/>
+      </w:r>
+      <w:r>
+        <w:rPr>
+          <w:sz w:val="17"/>
+          <w:szCs w:val="17"/>
+        </w:rPr>
+        <w:t>Edwin Boston III; the two-colouring argument, the range of the decimated specification and its row sum are on the ledger of the work that follows this paper, with their records.</w:t>
+      </w:r>
+    </w:p>
+  </w:footnote>
+  <w:footnote w:id="79">
+    <w:p>
+      <w:pPr>
+        <w:spacing w:after="40" w:line="240" w:lineRule="auto"/>
+      </w:pPr>
+      <w:r>
+        <w:rPr>
+          <w:rStyle w:val="FootnoteReference"/>
+        </w:rPr>
+        <w:footnoteRef/>
+      </w:r>
+      <w:r>
+        <w:rPr>
+          <w:sz w:val="17"/>
+          <w:szCs w:val="17"/>
+        </w:rPr>
+        <w:t xml:space="preserve">T. Bałaban, </w:t>
+      </w:r>
+      <w:r>
+        <w:rPr>
+          <w:i/>
+          <w:iCs/>
+          <w:sz w:val="17"/>
+          <w:szCs w:val="17"/>
+        </w:rPr>
+        <w:t>Comm. Math. Phys.</w:t>
+      </w:r>
+      <w:r>
+        <w:rPr>
+          <w:sz w:val="17"/>
+          <w:szCs w:val="17"/>
+        </w:rPr>
+        <w:t xml:space="preserve"> 109 (1987), 249–301: Theorem 1 (p. 259) and Theorem 3 (p. 267), the recursion (0.20) (p. 256), the action (0.2) with the normalised trace (p. 252), read from the pages on 29 October 2026. The statement that the sequence can be kept small in four dimensions, his Theorem 2 (pp. 259–260), is deferred there to "a separate paper"; the four-dimensional stability theorem itself is stated in </w:t>
+      </w:r>
+      <w:r>
+        <w:rPr>
+          <w:i/>
+          <w:iCs/>
+          <w:sz w:val="17"/>
+          <w:szCs w:val="17"/>
+        </w:rPr>
+        <w:t>Large field renormalization II</w:t>
+      </w:r>
+      <w:r>
+        <w:rPr>
+          <w:sz w:val="17"/>
+          <w:szCs w:val="17"/>
+        </w:rPr>
+        <w:t xml:space="preserve">, </w:t>
+      </w:r>
+      <w:r>
+        <w:rPr>
+          <w:i/>
+          <w:iCs/>
+          <w:sz w:val="17"/>
+          <w:szCs w:val="17"/>
+        </w:rPr>
+        <w:t>Comm. Math. Phys.</w:t>
+      </w:r>
+      <w:r>
+        <w:rPr>
+          <w:sz w:val="17"/>
+          <w:szCs w:val="17"/>
+        </w:rPr>
+        <w:t xml:space="preserve"> 122 (1989), 355–392, unread at this revision.</w:t>
+      </w:r>
+    </w:p>
+  </w:footnote>
+  <w:footnote w:id="80">
     <w:p>
       <w:pPr>
         <w:spacing w:after="40" w:line="240" w:lineRule="auto"/>
@@ -39753,10 +39851,10 @@
 <file path=word/numbering.xml><?xml version="1.0" encoding="utf-8"?>
 <w:numbering xmlns:wpc="http://schemas.microsoft.com/office/word/2010/wordprocessingCanvas" xmlns:cx="http://schemas.microsoft.com/office/drawing/2014/chartex" xmlns:cx1="http://schemas.microsoft.com/office/drawing/2015/9/8/chartex" xmlns:cx2="http://schemas.microsoft.com/office/drawing/2015/10/21/chartex" xmlns:cx3="http://schemas.microsoft.com/office/drawing/2016/5/9/chartex" xmlns:cx4="http://schemas.microsoft.com/office/drawing/2016/5/10/chartex" xmlns:cx5="http://schemas.microsoft.com/office/drawing/2016/5/11/chartex" xmlns:cx6="http://schemas.microsoft.com/office/drawing/2016/5/12/chartex" xmlns:cx7="http://schemas.microsoft.com/office/drawing/2016/5/13/chartex" xmlns:cx8="http://schemas.microsoft.com/office/drawing/2016/5/14/chartex" xmlns:mc="http://schemas.openxmlformats.org/markup-compatibility/2006" xmlns:aink="http://schemas.microsoft.com/office/drawing/2016/ink" xmlns:am3d="http://schemas.microsoft.com/office/drawing/2017/model3d" xmlns:o="urn:schemas-microsoft-com:office:office" xmlns:oel="http://schemas.microsoft.com/office/2019/extlst" xmlns:r="http://schemas.openxmlformats.org/officeDocument/2006/relationships" xmlns:m="http://schemas.openxmlformats.org/officeDocument/2006/math" xmlns:v="urn:schemas-microsoft-com:vml" xmlns:wp14="http://schemas.microsoft.com/office/word/2010/wordprocessingDrawing" xmlns:wp="http://schemas.openxmlformats.org/drawingml/2006/wordprocessingDrawing" xmlns:w10="urn:schemas-microsoft-com:office:word" xmlns:w="http://schemas.openxmlformats.org/wordprocessingml/2006/main" xmlns:w14="http://schemas.microsoft.com/office/word/2010/wordml" xmlns:w15="http://schemas.microsoft.com/office/word/2012/wordml" xmlns:w16cex="http://schemas.microsoft.com/office/word/2018/wordml/cex" xmlns:w16cid="http://schemas.microsoft.com/office/word/2016/wordml/cid" xmlns:w16="http://schemas.microsoft.com/office/word/2018/wordml" xmlns:w16du="http://schemas.microsoft.com/office/word/2023/wordml/word16du" xmlns:w16sdtdh="http://schemas.microsoft.com/office/word/2020/wordml/sdtdatahash" xmlns:w16sdtfl="http://schemas.microsoft.com/office/word/2024/wordml/sdtformatlock" xmlns:w16se="http://schemas.microsoft.com/office/word/2015/wordml/symex" xmlns:wpg="http://schemas.microsoft.com/office/word/2010/wordprocessingGroup" xmlns:wpi="http://schemas.microsoft.com/office/word/2010/wordprocessingInk" xmlns:wne="http://schemas.microsoft.com/office/word/2006/wordml" xmlns:wps="http://schemas.microsoft.com/office/word/2010/wordprocessingShape" mc:Ignorable="w14 w15 w16se w16cid w16 w16cex w16sdtdh w16sdtfl w16du wp14">
   <w:abstractNum w:abstractNumId="0" w15:restartNumberingAfterBreak="0">
-    <w:nsid w:val="541F6318"/>
+    <w:nsid w:val="484C40FE"/>
     <w:multiLevelType w:val="hybridMultilevel"/>
-    <w:tmpl w:val="3B98BAA6"/>
-    <w:lvl w:ilvl="0" w:tplc="ECD086C2">
+    <w:tmpl w:val="6F14CE18"/>
+    <w:lvl w:ilvl="0" w:tplc="293C48EA">
       <w:start w:val="1"/>
       <w:numFmt w:val="bullet"/>
       <w:lvlText w:val="●"/>
@@ -39765,7 +39863,7 @@
         <w:ind w:left="720" w:hanging="360"/>
       </w:pPr>
     </w:lvl>
-    <w:lvl w:ilvl="1" w:tplc="2B0818CC">
+    <w:lvl w:ilvl="1" w:tplc="A9A4A7CC">
       <w:start w:val="1"/>
       <w:numFmt w:val="bullet"/>
       <w:lvlText w:val="○"/>
@@ -39774,7 +39872,7 @@
         <w:ind w:left="1440" w:hanging="360"/>
       </w:pPr>
     </w:lvl>
-    <w:lvl w:ilvl="2" w:tplc="C57250D8">
+    <w:lvl w:ilvl="2" w:tplc="EE6EAD34">
       <w:start w:val="1"/>
       <w:numFmt w:val="bullet"/>
       <w:lvlText w:val="■"/>
@@ -39783,7 +39881,7 @@
         <w:ind w:left="2160" w:hanging="360"/>
       </w:pPr>
     </w:lvl>
-    <w:lvl w:ilvl="3" w:tplc="EF66B0D6">
+    <w:lvl w:ilvl="3" w:tplc="1ACA1354">
       <w:start w:val="1"/>
       <w:numFmt w:val="bullet"/>
       <w:lvlText w:val="●"/>
@@ -39792,7 +39890,7 @@
         <w:ind w:left="2880" w:hanging="360"/>
       </w:pPr>
     </w:lvl>
-    <w:lvl w:ilvl="4" w:tplc="A33A69C6">
+    <w:lvl w:ilvl="4" w:tplc="E2209FB2">
       <w:start w:val="1"/>
       <w:numFmt w:val="bullet"/>
       <w:lvlText w:val="○"/>
@@ -39801,7 +39899,7 @@
         <w:ind w:left="3600" w:hanging="360"/>
       </w:pPr>
     </w:lvl>
-    <w:lvl w:ilvl="5" w:tplc="5BEA98FA">
+    <w:lvl w:ilvl="5" w:tplc="E2AC7E90">
       <w:start w:val="1"/>
       <w:numFmt w:val="bullet"/>
       <w:lvlText w:val="■"/>
@@ -39810,7 +39908,7 @@
         <w:ind w:left="4320" w:hanging="360"/>
       </w:pPr>
     </w:lvl>
-    <w:lvl w:ilvl="6" w:tplc="2B76B28A">
+    <w:lvl w:ilvl="6" w:tplc="D68E7FE0">
       <w:start w:val="1"/>
       <w:numFmt w:val="bullet"/>
       <w:lvlText w:val="●"/>
@@ -39819,7 +39917,7 @@
         <w:ind w:left="5040" w:hanging="360"/>
       </w:pPr>
     </w:lvl>
-    <w:lvl w:ilvl="7" w:tplc="DF0C6642">
+    <w:lvl w:ilvl="7" w:tplc="3E524842">
       <w:start w:val="1"/>
       <w:numFmt w:val="bullet"/>
       <w:lvlText w:val="●"/>
@@ -39828,7 +39926,7 @@
         <w:ind w:left="5760" w:hanging="360"/>
       </w:pPr>
     </w:lvl>
-    <w:lvl w:ilvl="8" w:tplc="7402DC5A">
+    <w:lvl w:ilvl="8" w:tplc="A10E2DB2">
       <w:start w:val="1"/>
       <w:numFmt w:val="bullet"/>
       <w:lvlText w:val="●"/>
@@ -39838,7 +39936,7 @@
       </w:pPr>
     </w:lvl>
   </w:abstractNum>
-  <w:num w:numId="1" w16cid:durableId="1318536993">
+  <w:num w:numId="1" w16cid:durableId="1481727369">
     <w:abstractNumId w:val="0"/>
     <w:lvlOverride w:ilvl="0">
       <w:startOverride w:val="1"/>
@@ -40435,7 +40533,7 @@
     <w:autoRedefine/>
     <w:uiPriority w:val="39"/>
     <w:unhideWhenUsed/>
-    <w:rsid w:val="009A5015"/>
+    <w:rsid w:val="008844C3"/>
     <w:pPr>
       <w:spacing w:after="100"/>
     </w:pPr>
@@ -40447,7 +40545,7 @@
     <w:autoRedefine/>
     <w:uiPriority w:val="39"/>
     <w:unhideWhenUsed/>
-    <w:rsid w:val="009A5015"/>
+    <w:rsid w:val="008844C3"/>
     <w:pPr>
       <w:spacing w:after="100"/>
       <w:ind w:left="220"/>

</xml_diff>

<commit_message>
THE GROUND, revision 21 (Edwin Boston III, 2026-10-29 05:33 EDT): the proof of Balaban's sequence hypothesis never appeared -- the four-dimensional ultraviolet half of every construction of the corpus's kind rests on an announced, unpublished theorem
The zbMATH listing of T. Balaban's publications from 1989 to 2022, read by the fourth seat: the Euclidean fermion block renormalisation and the two large-field papers (1989), the classical N-vector series (1995-1999), the bosonic many-body series with Feldman, Knorrer and Trubowitz (2008-2022), and no paper on four-dimensional gauge theory. CMP 109's Theorem 2, the two-sided bound on the running couplings that would remove the sequence hypothesis from the four-dimensional ultraviolet stability theorem, announced in 1987 and called unpublished in 1989, was never published. Section 8.3 says so with the listing in a footnote; Section 2's sentence and README.md follow. 42 pages.
</commit_message>
<xml_diff>
--- a/THE-GROUND-Edwin-Boston-III.docx
+++ b/THE-GROUND-Edwin-Boston-III.docx
@@ -170,7 +170,7 @@
     <w:sdt>
       <w:sdtPr>
         <w:alias w:val="Contents"/>
-        <w:id w:val="1451354214"/>
+        <w:id w:val="1207769606"/>
       </w:sdtPr>
       <w:sdtEndPr/>
       <w:sdtContent>
@@ -198,7 +198,7 @@
           <w:r>
             <w:fldChar w:fldCharType="separate"/>
           </w:r>
-          <w:hyperlink w:anchor="_Toc244144288" w:history="1">
+          <w:hyperlink w:anchor="_Toc244144482" w:history="1">
             <w:r>
               <w:rPr>
                 <w:rStyle w:val="Hyperlink"/>
@@ -222,7 +222,7 @@
               <w:rPr>
                 <w:noProof/>
               </w:rPr>
-              <w:instrText xml:space="preserve"> PAGEREF _Toc244144288 \h </w:instrText>
+              <w:instrText xml:space="preserve"> PAGEREF _Toc244144482 \h </w:instrText>
             </w:r>
             <w:r>
               <w:rPr>
@@ -264,7 +264,7 @@
               <w14:ligatures w14:val="standardContextual"/>
             </w:rPr>
           </w:pPr>
-          <w:hyperlink w:anchor="_Toc244144289" w:history="1">
+          <w:hyperlink w:anchor="_Toc244144483" w:history="1">
             <w:r>
               <w:rPr>
                 <w:rStyle w:val="Hyperlink"/>
@@ -288,7 +288,7 @@
               <w:rPr>
                 <w:noProof/>
               </w:rPr>
-              <w:instrText xml:space="preserve"> PAGEREF _Toc244144289 \h </w:instrText>
+              <w:instrText xml:space="preserve"> PAGEREF _Toc244144483 \h </w:instrText>
             </w:r>
             <w:r>
               <w:rPr>
@@ -330,7 +330,7 @@
               <w14:ligatures w14:val="standardContextual"/>
             </w:rPr>
           </w:pPr>
-          <w:hyperlink w:anchor="_Toc244144290" w:history="1">
+          <w:hyperlink w:anchor="_Toc244144484" w:history="1">
             <w:r>
               <w:rPr>
                 <w:rStyle w:val="Hyperlink"/>
@@ -354,7 +354,7 @@
               <w:rPr>
                 <w:noProof/>
               </w:rPr>
-              <w:instrText xml:space="preserve"> PAGEREF _Toc244144290 \h </w:instrText>
+              <w:instrText xml:space="preserve"> PAGEREF _Toc244144484 \h </w:instrText>
             </w:r>
             <w:r>
               <w:rPr>
@@ -396,7 +396,7 @@
               <w14:ligatures w14:val="standardContextual"/>
             </w:rPr>
           </w:pPr>
-          <w:hyperlink w:anchor="_Toc244144291" w:history="1">
+          <w:hyperlink w:anchor="_Toc244144485" w:history="1">
             <w:r>
               <w:rPr>
                 <w:rStyle w:val="Hyperlink"/>
@@ -420,7 +420,7 @@
               <w:rPr>
                 <w:noProof/>
               </w:rPr>
-              <w:instrText xml:space="preserve"> PAGEREF _Toc244144291 \h </w:instrText>
+              <w:instrText xml:space="preserve"> PAGEREF _Toc244144485 \h </w:instrText>
             </w:r>
             <w:r>
               <w:rPr>
@@ -462,7 +462,7 @@
               <w14:ligatures w14:val="standardContextual"/>
             </w:rPr>
           </w:pPr>
-          <w:hyperlink w:anchor="_Toc244144292" w:history="1">
+          <w:hyperlink w:anchor="_Toc244144486" w:history="1">
             <w:r>
               <w:rPr>
                 <w:rStyle w:val="Hyperlink"/>
@@ -486,7 +486,7 @@
               <w:rPr>
                 <w:noProof/>
               </w:rPr>
-              <w:instrText xml:space="preserve"> PAGEREF _Toc244144292 \h </w:instrText>
+              <w:instrText xml:space="preserve"> PAGEREF _Toc244144486 \h </w:instrText>
             </w:r>
             <w:r>
               <w:rPr>
@@ -528,7 +528,7 @@
               <w14:ligatures w14:val="standardContextual"/>
             </w:rPr>
           </w:pPr>
-          <w:hyperlink w:anchor="_Toc244144293" w:history="1">
+          <w:hyperlink w:anchor="_Toc244144487" w:history="1">
             <w:r>
               <w:rPr>
                 <w:rStyle w:val="Hyperlink"/>
@@ -552,7 +552,7 @@
               <w:rPr>
                 <w:noProof/>
               </w:rPr>
-              <w:instrText xml:space="preserve"> PAGEREF _Toc244144293 \h </w:instrText>
+              <w:instrText xml:space="preserve"> PAGEREF _Toc244144487 \h </w:instrText>
             </w:r>
             <w:r>
               <w:rPr>
@@ -569,7 +569,7 @@
               <w:rPr>
                 <w:noProof/>
               </w:rPr>
-              <w:t>8</w:t>
+              <w:t>9</w:t>
             </w:r>
             <w:r>
               <w:rPr>
@@ -594,7 +594,7 @@
               <w14:ligatures w14:val="standardContextual"/>
             </w:rPr>
           </w:pPr>
-          <w:hyperlink w:anchor="_Toc244144294" w:history="1">
+          <w:hyperlink w:anchor="_Toc244144488" w:history="1">
             <w:r>
               <w:rPr>
                 <w:rStyle w:val="Hyperlink"/>
@@ -618,7 +618,7 @@
               <w:rPr>
                 <w:noProof/>
               </w:rPr>
-              <w:instrText xml:space="preserve"> PAGEREF _Toc244144294 \h </w:instrText>
+              <w:instrText xml:space="preserve"> PAGEREF _Toc244144488 \h </w:instrText>
             </w:r>
             <w:r>
               <w:rPr>
@@ -660,7 +660,7 @@
               <w14:ligatures w14:val="standardContextual"/>
             </w:rPr>
           </w:pPr>
-          <w:hyperlink w:anchor="_Toc244144295" w:history="1">
+          <w:hyperlink w:anchor="_Toc244144489" w:history="1">
             <w:r>
               <w:rPr>
                 <w:rStyle w:val="Hyperlink"/>
@@ -684,7 +684,7 @@
               <w:rPr>
                 <w:noProof/>
               </w:rPr>
-              <w:instrText xml:space="preserve"> PAGEREF _Toc244144295 \h </w:instrText>
+              <w:instrText xml:space="preserve"> PAGEREF _Toc244144489 \h </w:instrText>
             </w:r>
             <w:r>
               <w:rPr>
@@ -726,7 +726,7 @@
               <w14:ligatures w14:val="standardContextual"/>
             </w:rPr>
           </w:pPr>
-          <w:hyperlink w:anchor="_Toc244144296" w:history="1">
+          <w:hyperlink w:anchor="_Toc244144490" w:history="1">
             <w:r>
               <w:rPr>
                 <w:rStyle w:val="Hyperlink"/>
@@ -750,7 +750,7 @@
               <w:rPr>
                 <w:noProof/>
               </w:rPr>
-              <w:instrText xml:space="preserve"> PAGEREF _Toc244144296 \h </w:instrText>
+              <w:instrText xml:space="preserve"> PAGEREF _Toc244144490 \h </w:instrText>
             </w:r>
             <w:r>
               <w:rPr>
@@ -792,7 +792,7 @@
               <w14:ligatures w14:val="standardContextual"/>
             </w:rPr>
           </w:pPr>
-          <w:hyperlink w:anchor="_Toc244144297" w:history="1">
+          <w:hyperlink w:anchor="_Toc244144491" w:history="1">
             <w:r>
               <w:rPr>
                 <w:rStyle w:val="Hyperlink"/>
@@ -816,7 +816,7 @@
               <w:rPr>
                 <w:noProof/>
               </w:rPr>
-              <w:instrText xml:space="preserve"> PAGEREF _Toc244144297 \h </w:instrText>
+              <w:instrText xml:space="preserve"> PAGEREF _Toc244144491 \h </w:instrText>
             </w:r>
             <w:r>
               <w:rPr>
@@ -858,7 +858,7 @@
               <w14:ligatures w14:val="standardContextual"/>
             </w:rPr>
           </w:pPr>
-          <w:hyperlink w:anchor="_Toc244144298" w:history="1">
+          <w:hyperlink w:anchor="_Toc244144492" w:history="1">
             <w:r>
               <w:rPr>
                 <w:rStyle w:val="Hyperlink"/>
@@ -882,7 +882,7 @@
               <w:rPr>
                 <w:noProof/>
               </w:rPr>
-              <w:instrText xml:space="preserve"> PAGEREF _Toc244144298 \h </w:instrText>
+              <w:instrText xml:space="preserve"> PAGEREF _Toc244144492 \h </w:instrText>
             </w:r>
             <w:r>
               <w:rPr>
@@ -924,7 +924,7 @@
               <w14:ligatures w14:val="standardContextual"/>
             </w:rPr>
           </w:pPr>
-          <w:hyperlink w:anchor="_Toc244144299" w:history="1">
+          <w:hyperlink w:anchor="_Toc244144493" w:history="1">
             <w:r>
               <w:rPr>
                 <w:rStyle w:val="Hyperlink"/>
@@ -948,7 +948,7 @@
               <w:rPr>
                 <w:noProof/>
               </w:rPr>
-              <w:instrText xml:space="preserve"> PAGEREF _Toc244144299 \h </w:instrText>
+              <w:instrText xml:space="preserve"> PAGEREF _Toc244144493 \h </w:instrText>
             </w:r>
             <w:r>
               <w:rPr>
@@ -990,7 +990,7 @@
               <w14:ligatures w14:val="standardContextual"/>
             </w:rPr>
           </w:pPr>
-          <w:hyperlink w:anchor="_Toc244144300" w:history="1">
+          <w:hyperlink w:anchor="_Toc244144494" w:history="1">
             <w:r>
               <w:rPr>
                 <w:rStyle w:val="Hyperlink"/>
@@ -1014,7 +1014,7 @@
               <w:rPr>
                 <w:noProof/>
               </w:rPr>
-              <w:instrText xml:space="preserve"> PAGEREF _Toc244144300 \h </w:instrText>
+              <w:instrText xml:space="preserve"> PAGEREF _Toc244144494 \h </w:instrText>
             </w:r>
             <w:r>
               <w:rPr>
@@ -1056,7 +1056,7 @@
               <w14:ligatures w14:val="standardContextual"/>
             </w:rPr>
           </w:pPr>
-          <w:hyperlink w:anchor="_Toc244144301" w:history="1">
+          <w:hyperlink w:anchor="_Toc244144495" w:history="1">
             <w:r>
               <w:rPr>
                 <w:rStyle w:val="Hyperlink"/>
@@ -1080,7 +1080,7 @@
               <w:rPr>
                 <w:noProof/>
               </w:rPr>
-              <w:instrText xml:space="preserve"> PAGEREF _Toc244144301 \h </w:instrText>
+              <w:instrText xml:space="preserve"> PAGEREF _Toc244144495 \h </w:instrText>
             </w:r>
             <w:r>
               <w:rPr>
@@ -1097,7 +1097,7 @@
               <w:rPr>
                 <w:noProof/>
               </w:rPr>
-              <w:t>11</w:t>
+              <w:t>12</w:t>
             </w:r>
             <w:r>
               <w:rPr>
@@ -1122,7 +1122,7 @@
               <w14:ligatures w14:val="standardContextual"/>
             </w:rPr>
           </w:pPr>
-          <w:hyperlink w:anchor="_Toc244144302" w:history="1">
+          <w:hyperlink w:anchor="_Toc244144496" w:history="1">
             <w:r>
               <w:rPr>
                 <w:rStyle w:val="Hyperlink"/>
@@ -1146,7 +1146,7 @@
               <w:rPr>
                 <w:noProof/>
               </w:rPr>
-              <w:instrText xml:space="preserve"> PAGEREF _Toc244144302 \h </w:instrText>
+              <w:instrText xml:space="preserve"> PAGEREF _Toc244144496 \h </w:instrText>
             </w:r>
             <w:r>
               <w:rPr>
@@ -1188,7 +1188,7 @@
               <w14:ligatures w14:val="standardContextual"/>
             </w:rPr>
           </w:pPr>
-          <w:hyperlink w:anchor="_Toc244144303" w:history="1">
+          <w:hyperlink w:anchor="_Toc244144497" w:history="1">
             <w:r>
               <w:rPr>
                 <w:rStyle w:val="Hyperlink"/>
@@ -1212,7 +1212,7 @@
               <w:rPr>
                 <w:noProof/>
               </w:rPr>
-              <w:instrText xml:space="preserve"> PAGEREF _Toc244144303 \h </w:instrText>
+              <w:instrText xml:space="preserve"> PAGEREF _Toc244144497 \h </w:instrText>
             </w:r>
             <w:r>
               <w:rPr>
@@ -1229,7 +1229,7 @@
               <w:rPr>
                 <w:noProof/>
               </w:rPr>
-              <w:t>12</w:t>
+              <w:t>13</w:t>
             </w:r>
             <w:r>
               <w:rPr>
@@ -1254,7 +1254,7 @@
               <w14:ligatures w14:val="standardContextual"/>
             </w:rPr>
           </w:pPr>
-          <w:hyperlink w:anchor="_Toc244144304" w:history="1">
+          <w:hyperlink w:anchor="_Toc244144498" w:history="1">
             <w:r>
               <w:rPr>
                 <w:rStyle w:val="Hyperlink"/>
@@ -1278,7 +1278,7 @@
               <w:rPr>
                 <w:noProof/>
               </w:rPr>
-              <w:instrText xml:space="preserve"> PAGEREF _Toc244144304 \h </w:instrText>
+              <w:instrText xml:space="preserve"> PAGEREF _Toc244144498 \h </w:instrText>
             </w:r>
             <w:r>
               <w:rPr>
@@ -1320,7 +1320,7 @@
               <w14:ligatures w14:val="standardContextual"/>
             </w:rPr>
           </w:pPr>
-          <w:hyperlink w:anchor="_Toc244144305" w:history="1">
+          <w:hyperlink w:anchor="_Toc244144499" w:history="1">
             <w:r>
               <w:rPr>
                 <w:rStyle w:val="Hyperlink"/>
@@ -1344,7 +1344,7 @@
               <w:rPr>
                 <w:noProof/>
               </w:rPr>
-              <w:instrText xml:space="preserve"> PAGEREF _Toc244144305 \h </w:instrText>
+              <w:instrText xml:space="preserve"> PAGEREF _Toc244144499 \h </w:instrText>
             </w:r>
             <w:r>
               <w:rPr>
@@ -1386,7 +1386,7 @@
               <w14:ligatures w14:val="standardContextual"/>
             </w:rPr>
           </w:pPr>
-          <w:hyperlink w:anchor="_Toc244144306" w:history="1">
+          <w:hyperlink w:anchor="_Toc244144500" w:history="1">
             <w:r>
               <w:rPr>
                 <w:rStyle w:val="Hyperlink"/>
@@ -1410,7 +1410,7 @@
               <w:rPr>
                 <w:noProof/>
               </w:rPr>
-              <w:instrText xml:space="preserve"> PAGEREF _Toc244144306 \h </w:instrText>
+              <w:instrText xml:space="preserve"> PAGEREF _Toc244144500 \h </w:instrText>
             </w:r>
             <w:r>
               <w:rPr>
@@ -1452,7 +1452,7 @@
               <w14:ligatures w14:val="standardContextual"/>
             </w:rPr>
           </w:pPr>
-          <w:hyperlink w:anchor="_Toc244144307" w:history="1">
+          <w:hyperlink w:anchor="_Toc244144501" w:history="1">
             <w:r>
               <w:rPr>
                 <w:rStyle w:val="Hyperlink"/>
@@ -1476,7 +1476,7 @@
               <w:rPr>
                 <w:noProof/>
               </w:rPr>
-              <w:instrText xml:space="preserve"> PAGEREF _Toc244144307 \h </w:instrText>
+              <w:instrText xml:space="preserve"> PAGEREF _Toc244144501 \h </w:instrText>
             </w:r>
             <w:r>
               <w:rPr>
@@ -1518,7 +1518,7 @@
               <w14:ligatures w14:val="standardContextual"/>
             </w:rPr>
           </w:pPr>
-          <w:hyperlink w:anchor="_Toc244144308" w:history="1">
+          <w:hyperlink w:anchor="_Toc244144502" w:history="1">
             <w:r>
               <w:rPr>
                 <w:rStyle w:val="Hyperlink"/>
@@ -1542,7 +1542,7 @@
               <w:rPr>
                 <w:noProof/>
               </w:rPr>
-              <w:instrText xml:space="preserve"> PAGEREF _Toc244144308 \h </w:instrText>
+              <w:instrText xml:space="preserve"> PAGEREF _Toc244144502 \h </w:instrText>
             </w:r>
             <w:r>
               <w:rPr>
@@ -1584,7 +1584,7 @@
               <w14:ligatures w14:val="standardContextual"/>
             </w:rPr>
           </w:pPr>
-          <w:hyperlink w:anchor="_Toc244144309" w:history="1">
+          <w:hyperlink w:anchor="_Toc244144503" w:history="1">
             <w:r>
               <w:rPr>
                 <w:rStyle w:val="Hyperlink"/>
@@ -1608,7 +1608,7 @@
               <w:rPr>
                 <w:noProof/>
               </w:rPr>
-              <w:instrText xml:space="preserve"> PAGEREF _Toc244144309 \h </w:instrText>
+              <w:instrText xml:space="preserve"> PAGEREF _Toc244144503 \h </w:instrText>
             </w:r>
             <w:r>
               <w:rPr>
@@ -1650,7 +1650,7 @@
               <w14:ligatures w14:val="standardContextual"/>
             </w:rPr>
           </w:pPr>
-          <w:hyperlink w:anchor="_Toc244144310" w:history="1">
+          <w:hyperlink w:anchor="_Toc244144504" w:history="1">
             <w:r>
               <w:rPr>
                 <w:rStyle w:val="Hyperlink"/>
@@ -1674,7 +1674,7 @@
               <w:rPr>
                 <w:noProof/>
               </w:rPr>
-              <w:instrText xml:space="preserve"> PAGEREF _Toc244144310 \h </w:instrText>
+              <w:instrText xml:space="preserve"> PAGEREF _Toc244144504 \h </w:instrText>
             </w:r>
             <w:r>
               <w:rPr>
@@ -1716,7 +1716,7 @@
               <w14:ligatures w14:val="standardContextual"/>
             </w:rPr>
           </w:pPr>
-          <w:hyperlink w:anchor="_Toc244144311" w:history="1">
+          <w:hyperlink w:anchor="_Toc244144505" w:history="1">
             <w:r>
               <w:rPr>
                 <w:rStyle w:val="Hyperlink"/>
@@ -1740,7 +1740,7 @@
               <w:rPr>
                 <w:noProof/>
               </w:rPr>
-              <w:instrText xml:space="preserve"> PAGEREF _Toc244144311 \h </w:instrText>
+              <w:instrText xml:space="preserve"> PAGEREF _Toc244144505 \h </w:instrText>
             </w:r>
             <w:r>
               <w:rPr>
@@ -1782,7 +1782,7 @@
               <w14:ligatures w14:val="standardContextual"/>
             </w:rPr>
           </w:pPr>
-          <w:hyperlink w:anchor="_Toc244144312" w:history="1">
+          <w:hyperlink w:anchor="_Toc244144506" w:history="1">
             <w:r>
               <w:rPr>
                 <w:rStyle w:val="Hyperlink"/>
@@ -1806,7 +1806,7 @@
               <w:rPr>
                 <w:noProof/>
               </w:rPr>
-              <w:instrText xml:space="preserve"> PAGEREF _Toc244144312 \h </w:instrText>
+              <w:instrText xml:space="preserve"> PAGEREF _Toc244144506 \h </w:instrText>
             </w:r>
             <w:r>
               <w:rPr>
@@ -1823,7 +1823,7 @@
               <w:rPr>
                 <w:noProof/>
               </w:rPr>
-              <w:t>16</w:t>
+              <w:t>17</w:t>
             </w:r>
             <w:r>
               <w:rPr>
@@ -1848,7 +1848,7 @@
               <w14:ligatures w14:val="standardContextual"/>
             </w:rPr>
           </w:pPr>
-          <w:hyperlink w:anchor="_Toc244144313" w:history="1">
+          <w:hyperlink w:anchor="_Toc244144507" w:history="1">
             <w:r>
               <w:rPr>
                 <w:rStyle w:val="Hyperlink"/>
@@ -1872,7 +1872,7 @@
               <w:rPr>
                 <w:noProof/>
               </w:rPr>
-              <w:instrText xml:space="preserve"> PAGEREF _Toc244144313 \h </w:instrText>
+              <w:instrText xml:space="preserve"> PAGEREF _Toc244144507 \h </w:instrText>
             </w:r>
             <w:r>
               <w:rPr>
@@ -1889,7 +1889,7 @@
               <w:rPr>
                 <w:noProof/>
               </w:rPr>
-              <w:t>19</w:t>
+              <w:t>20</w:t>
             </w:r>
             <w:r>
               <w:rPr>
@@ -1914,7 +1914,7 @@
               <w14:ligatures w14:val="standardContextual"/>
             </w:rPr>
           </w:pPr>
-          <w:hyperlink w:anchor="_Toc244144314" w:history="1">
+          <w:hyperlink w:anchor="_Toc244144508" w:history="1">
             <w:r>
               <w:rPr>
                 <w:rStyle w:val="Hyperlink"/>
@@ -1938,7 +1938,7 @@
               <w:rPr>
                 <w:noProof/>
               </w:rPr>
-              <w:instrText xml:space="preserve"> PAGEREF _Toc244144314 \h </w:instrText>
+              <w:instrText xml:space="preserve"> PAGEREF _Toc244144508 \h </w:instrText>
             </w:r>
             <w:r>
               <w:rPr>
@@ -1955,7 +1955,7 @@
               <w:rPr>
                 <w:noProof/>
               </w:rPr>
-              <w:t>19</w:t>
+              <w:t>20</w:t>
             </w:r>
             <w:r>
               <w:rPr>
@@ -1980,7 +1980,7 @@
               <w14:ligatures w14:val="standardContextual"/>
             </w:rPr>
           </w:pPr>
-          <w:hyperlink w:anchor="_Toc244144315" w:history="1">
+          <w:hyperlink w:anchor="_Toc244144509" w:history="1">
             <w:r>
               <w:rPr>
                 <w:rStyle w:val="Hyperlink"/>
@@ -2004,7 +2004,7 @@
               <w:rPr>
                 <w:noProof/>
               </w:rPr>
-              <w:instrText xml:space="preserve"> PAGEREF _Toc244144315 \h </w:instrText>
+              <w:instrText xml:space="preserve"> PAGEREF _Toc244144509 \h </w:instrText>
             </w:r>
             <w:r>
               <w:rPr>
@@ -2046,7 +2046,7 @@
               <w14:ligatures w14:val="standardContextual"/>
             </w:rPr>
           </w:pPr>
-          <w:hyperlink w:anchor="_Toc244144316" w:history="1">
+          <w:hyperlink w:anchor="_Toc244144510" w:history="1">
             <w:r>
               <w:rPr>
                 <w:rStyle w:val="Hyperlink"/>
@@ -2070,7 +2070,7 @@
               <w:rPr>
                 <w:noProof/>
               </w:rPr>
-              <w:instrText xml:space="preserve"> PAGEREF _Toc244144316 \h </w:instrText>
+              <w:instrText xml:space="preserve"> PAGEREF _Toc244144510 \h </w:instrText>
             </w:r>
             <w:r>
               <w:rPr>
@@ -2087,7 +2087,7 @@
               <w:rPr>
                 <w:noProof/>
               </w:rPr>
-              <w:t>21</w:t>
+              <w:t>22</w:t>
             </w:r>
             <w:r>
               <w:rPr>
@@ -2112,7 +2112,7 @@
               <w14:ligatures w14:val="standardContextual"/>
             </w:rPr>
           </w:pPr>
-          <w:hyperlink w:anchor="_Toc244144317" w:history="1">
+          <w:hyperlink w:anchor="_Toc244144511" w:history="1">
             <w:r>
               <w:rPr>
                 <w:rStyle w:val="Hyperlink"/>
@@ -2136,7 +2136,7 @@
               <w:rPr>
                 <w:noProof/>
               </w:rPr>
-              <w:instrText xml:space="preserve"> PAGEREF _Toc244144317 \h </w:instrText>
+              <w:instrText xml:space="preserve"> PAGEREF _Toc244144511 \h </w:instrText>
             </w:r>
             <w:r>
               <w:rPr>
@@ -2153,7 +2153,7 @@
               <w:rPr>
                 <w:noProof/>
               </w:rPr>
-              <w:t>22</w:t>
+              <w:t>23</w:t>
             </w:r>
             <w:r>
               <w:rPr>
@@ -2178,7 +2178,7 @@
               <w14:ligatures w14:val="standardContextual"/>
             </w:rPr>
           </w:pPr>
-          <w:hyperlink w:anchor="_Toc244144318" w:history="1">
+          <w:hyperlink w:anchor="_Toc244144512" w:history="1">
             <w:r>
               <w:rPr>
                 <w:rStyle w:val="Hyperlink"/>
@@ -2202,7 +2202,7 @@
               <w:rPr>
                 <w:noProof/>
               </w:rPr>
-              <w:instrText xml:space="preserve"> PAGEREF _Toc244144318 \h </w:instrText>
+              <w:instrText xml:space="preserve"> PAGEREF _Toc244144512 \h </w:instrText>
             </w:r>
             <w:r>
               <w:rPr>
@@ -2244,7 +2244,7 @@
               <w14:ligatures w14:val="standardContextual"/>
             </w:rPr>
           </w:pPr>
-          <w:hyperlink w:anchor="_Toc244144319" w:history="1">
+          <w:hyperlink w:anchor="_Toc244144513" w:history="1">
             <w:r>
               <w:rPr>
                 <w:rStyle w:val="Hyperlink"/>
@@ -2268,7 +2268,7 @@
               <w:rPr>
                 <w:noProof/>
               </w:rPr>
-              <w:instrText xml:space="preserve"> PAGEREF _Toc244144319 \h </w:instrText>
+              <w:instrText xml:space="preserve"> PAGEREF _Toc244144513 \h </w:instrText>
             </w:r>
             <w:r>
               <w:rPr>
@@ -2310,7 +2310,7 @@
               <w14:ligatures w14:val="standardContextual"/>
             </w:rPr>
           </w:pPr>
-          <w:hyperlink w:anchor="_Toc244144320" w:history="1">
+          <w:hyperlink w:anchor="_Toc244144514" w:history="1">
             <w:r>
               <w:rPr>
                 <w:rStyle w:val="Hyperlink"/>
@@ -2334,7 +2334,7 @@
               <w:rPr>
                 <w:noProof/>
               </w:rPr>
-              <w:instrText xml:space="preserve"> PAGEREF _Toc244144320 \h </w:instrText>
+              <w:instrText xml:space="preserve"> PAGEREF _Toc244144514 \h </w:instrText>
             </w:r>
             <w:r>
               <w:rPr>
@@ -2376,7 +2376,7 @@
               <w14:ligatures w14:val="standardContextual"/>
             </w:rPr>
           </w:pPr>
-          <w:hyperlink w:anchor="_Toc244144321" w:history="1">
+          <w:hyperlink w:anchor="_Toc244144515" w:history="1">
             <w:r>
               <w:rPr>
                 <w:rStyle w:val="Hyperlink"/>
@@ -2400,7 +2400,7 @@
               <w:rPr>
                 <w:noProof/>
               </w:rPr>
-              <w:instrText xml:space="preserve"> PAGEREF _Toc244144321 \h </w:instrText>
+              <w:instrText xml:space="preserve"> PAGEREF _Toc244144515 \h </w:instrText>
             </w:r>
             <w:r>
               <w:rPr>
@@ -2442,7 +2442,7 @@
               <w14:ligatures w14:val="standardContextual"/>
             </w:rPr>
           </w:pPr>
-          <w:hyperlink w:anchor="_Toc244144322" w:history="1">
+          <w:hyperlink w:anchor="_Toc244144516" w:history="1">
             <w:r>
               <w:rPr>
                 <w:rStyle w:val="Hyperlink"/>
@@ -2466,7 +2466,7 @@
               <w:rPr>
                 <w:noProof/>
               </w:rPr>
-              <w:instrText xml:space="preserve"> PAGEREF _Toc244144322 \h </w:instrText>
+              <w:instrText xml:space="preserve"> PAGEREF _Toc244144516 \h </w:instrText>
             </w:r>
             <w:r>
               <w:rPr>
@@ -2508,7 +2508,7 @@
               <w14:ligatures w14:val="standardContextual"/>
             </w:rPr>
           </w:pPr>
-          <w:hyperlink w:anchor="_Toc244144323" w:history="1">
+          <w:hyperlink w:anchor="_Toc244144517" w:history="1">
             <w:r>
               <w:rPr>
                 <w:rStyle w:val="Hyperlink"/>
@@ -2532,7 +2532,7 @@
               <w:rPr>
                 <w:noProof/>
               </w:rPr>
-              <w:instrText xml:space="preserve"> PAGEREF _Toc244144323 \h </w:instrText>
+              <w:instrText xml:space="preserve"> PAGEREF _Toc244144517 \h </w:instrText>
             </w:r>
             <w:r>
               <w:rPr>
@@ -2574,7 +2574,7 @@
               <w14:ligatures w14:val="standardContextual"/>
             </w:rPr>
           </w:pPr>
-          <w:hyperlink w:anchor="_Toc244144324" w:history="1">
+          <w:hyperlink w:anchor="_Toc244144518" w:history="1">
             <w:r>
               <w:rPr>
                 <w:rStyle w:val="Hyperlink"/>
@@ -2598,7 +2598,7 @@
               <w:rPr>
                 <w:noProof/>
               </w:rPr>
-              <w:instrText xml:space="preserve"> PAGEREF _Toc244144324 \h </w:instrText>
+              <w:instrText xml:space="preserve"> PAGEREF _Toc244144518 \h </w:instrText>
             </w:r>
             <w:r>
               <w:rPr>
@@ -2639,7 +2639,7 @@
         <w:pageBreakBefore/>
         <w:spacing w:before="0"/>
       </w:pPr>
-      <w:bookmarkStart w:id="0" w:name="_Toc244144288"/>
+      <w:bookmarkStart w:id="0" w:name="_Toc244144482"/>
       <w:r>
         <w:t>1.  Introduction</w:t>
       </w:r>
@@ -2692,7 +2692,7 @@
         <w:footnoteReference w:id="2"/>
       </w:r>
       <w:r>
-        <w:t xml:space="preserve"> In three dimensions Bałaban controlled Wilson's lattice theory on a torus by a renormalisation group whose bounds are uniform in the lattice spacing; in four dimensions he proved the same bounds under the hypothesis that the running couplings stay below an uncomputed constant at every scale, a hypothesis whose own proof his paper of record states to be unpublished (§8.3).</w:t>
+        <w:t xml:space="preserve"> In three dimensions Bałaban controlled Wilson's lattice theory on a torus by a renormalisation group whose bounds are uniform in the lattice spacing; in four dimensions he proved the same bounds under the hypothesis that the running couplings stay below an uncomputed constant at every scale, a hypothesis whose own proof his paper of record states to be unpublished and which never appeared (§8.3).</w:t>
       </w:r>
       <w:r>
         <w:rPr>
@@ -2775,7 +2775,7 @@
         <w:pStyle w:val="Heading1"/>
         <w:keepNext/>
       </w:pPr>
-      <w:bookmarkStart w:id="1" w:name="_Toc244144289"/>
+      <w:bookmarkStart w:id="1" w:name="_Toc244144483"/>
       <w:r>
         <w:t>2.  The Ground Theorem</w:t>
       </w:r>
@@ -3039,7 +3039,7 @@
         <w:pStyle w:val="Heading1"/>
         <w:keepNext/>
       </w:pPr>
-      <w:bookmarkStart w:id="2" w:name="_Toc244144290"/>
+      <w:bookmarkStart w:id="2" w:name="_Toc244144484"/>
       <w:r>
         <w:t>3.  What the Problem Demands</w:t>
       </w:r>
@@ -3050,7 +3050,7 @@
         <w:pStyle w:val="Heading2"/>
         <w:keepNext/>
       </w:pPr>
-      <w:bookmarkStart w:id="3" w:name="_Toc244144291"/>
+      <w:bookmarkStart w:id="3" w:name="_Toc244144485"/>
       <w:r>
         <w:t>3.1  Euclidean fields and the axioms of Osterwalder and Schrader</w:t>
       </w:r>
@@ -4180,7 +4180,7 @@
         <w:pStyle w:val="Heading2"/>
         <w:keepNext/>
       </w:pPr>
-      <w:bookmarkStart w:id="4" w:name="_Toc244144292"/>
+      <w:bookmarkStart w:id="4" w:name="_Toc244144486"/>
       <w:r>
         <w:t>3.2  The mass gap</w:t>
       </w:r>
@@ -4252,7 +4252,7 @@
         <w:pStyle w:val="Heading2"/>
         <w:keepNext/>
       </w:pPr>
-      <w:bookmarkStart w:id="5" w:name="_Toc244144293"/>
+      <w:bookmarkStart w:id="5" w:name="_Toc244144487"/>
       <w:r>
         <w:t>3.3  Non-triviality</w:t>
       </w:r>
@@ -4331,7 +4331,7 @@
         <w:pStyle w:val="Heading2"/>
         <w:keepNext/>
       </w:pPr>
-      <w:bookmarkStart w:id="6" w:name="_Toc244144294"/>
+      <w:bookmarkStart w:id="6" w:name="_Toc244144488"/>
       <w:r>
         <w:t>3.4  Limits obtained by compactness</w:t>
       </w:r>
@@ -4410,7 +4410,7 @@
         <w:pStyle w:val="Heading1"/>
         <w:keepNext/>
       </w:pPr>
-      <w:bookmarkStart w:id="7" w:name="_Toc244144295"/>
+      <w:bookmarkStart w:id="7" w:name="_Toc244144489"/>
       <w:r>
         <w:t>4.  The Lattice, Its Positivity and Its Gap</w:t>
       </w:r>
@@ -4421,7 +4421,7 @@
         <w:pStyle w:val="Heading2"/>
         <w:keepNext/>
       </w:pPr>
-      <w:bookmarkStart w:id="8" w:name="_Toc244144296"/>
+      <w:bookmarkStart w:id="8" w:name="_Toc244144490"/>
       <w:r>
         <w:t>4.1  Wilson's theory</w:t>
       </w:r>
@@ -5043,7 +5043,7 @@
         <w:pStyle w:val="Heading2"/>
         <w:keepNext/>
       </w:pPr>
-      <w:bookmarkStart w:id="9" w:name="_Toc244144297"/>
+      <w:bookmarkStart w:id="9" w:name="_Toc244144491"/>
       <w:r>
         <w:t>4.2  Reflection positivity and the transfer matrix</w:t>
       </w:r>
@@ -6079,7 +6079,7 @@
         <w:pStyle w:val="Heading2"/>
         <w:keepNext/>
       </w:pPr>
-      <w:bookmarkStart w:id="10" w:name="_Toc244144298"/>
+      <w:bookmarkStart w:id="10" w:name="_Toc244144492"/>
       <w:r>
         <w:t>4.3  The renormalisation group of Bałaban</w:t>
       </w:r>
@@ -6120,7 +6120,7 @@
         <w:pStyle w:val="Heading1"/>
         <w:keepNext/>
       </w:pPr>
-      <w:bookmarkStart w:id="11" w:name="_Toc244144299"/>
+      <w:bookmarkStart w:id="11" w:name="_Toc244144493"/>
       <w:r>
         <w:t>5.  The Three-Dimensional Manuscripts</w:t>
       </w:r>
@@ -6144,7 +6144,7 @@
         <w:pStyle w:val="Heading2"/>
         <w:keepNext/>
       </w:pPr>
-      <w:bookmarkStart w:id="12" w:name="_Toc244144300"/>
+      <w:bookmarkStart w:id="12" w:name="_Toc244144494"/>
       <w:r>
         <w:t>5.1  The documents</w:t>
       </w:r>
@@ -6191,7 +6191,7 @@
         <w:pStyle w:val="Heading2"/>
         <w:keepNext/>
       </w:pPr>
-      <w:bookmarkStart w:id="13" w:name="_Toc244144301"/>
+      <w:bookmarkStart w:id="13" w:name="_Toc244144495"/>
       <w:r>
         <w:t>5.2  The observable</w:t>
       </w:r>
@@ -6595,7 +6595,7 @@
         <w:pStyle w:val="Heading2"/>
         <w:keepNext/>
       </w:pPr>
-      <w:bookmarkStart w:id="14" w:name="_Toc244144302"/>
+      <w:bookmarkStart w:id="14" w:name="_Toc244144496"/>
       <w:r>
         <w:t>5.3  The torus, the infinite volume and the components</w:t>
       </w:r>
@@ -7126,7 +7126,7 @@
         <w:pStyle w:val="Heading2"/>
         <w:keepNext/>
       </w:pPr>
-      <w:bookmarkStart w:id="15" w:name="_Toc244144303"/>
+      <w:bookmarkStart w:id="15" w:name="_Toc244144497"/>
       <w:r>
         <w:t>5.4  The axioms and the reconstruction</w:t>
       </w:r>
@@ -7356,7 +7356,7 @@
         <w:pStyle w:val="Heading2"/>
         <w:keepNext/>
       </w:pPr>
-      <w:bookmarkStart w:id="16" w:name="_Toc244144304"/>
+      <w:bookmarkStart w:id="16" w:name="_Toc244144498"/>
       <w:r>
         <w:t>5.5  Non-triviality</w:t>
       </w:r>
@@ -7897,7 +7897,7 @@
         <w:pStyle w:val="Heading2"/>
         <w:keepNext/>
       </w:pPr>
-      <w:bookmarkStart w:id="17" w:name="_Toc244144305"/>
+      <w:bookmarkStart w:id="17" w:name="_Toc244144499"/>
       <w:r>
         <w:t>5.6  What the manuscript does not assert</w:t>
       </w:r>
@@ -7945,7 +7945,7 @@
         <w:pStyle w:val="Heading1"/>
         <w:keepNext/>
       </w:pPr>
-      <w:bookmarkStart w:id="18" w:name="_Toc244144306"/>
+      <w:bookmarkStart w:id="18" w:name="_Toc244144500"/>
       <w:r>
         <w:t>6.  The Four-Dimensional Draft and the Standing of the Corpus</w:t>
       </w:r>
@@ -7969,7 +7969,7 @@
         <w:pStyle w:val="Heading2"/>
         <w:keepNext/>
       </w:pPr>
-      <w:bookmarkStart w:id="19" w:name="_Toc244144307"/>
+      <w:bookmarkStart w:id="19" w:name="_Toc244144501"/>
       <w:r>
         <w:t>6.1  The authors' account</w:t>
       </w:r>
@@ -8033,7 +8033,7 @@
         <w:pStyle w:val="Heading2"/>
         <w:keepNext/>
       </w:pPr>
-      <w:bookmarkStart w:id="20" w:name="_Toc244144308"/>
+      <w:bookmarkStart w:id="20" w:name="_Toc244144502"/>
       <w:r>
         <w:t>6.2  The conditional theorem</w:t>
       </w:r>
@@ -8236,7 +8236,7 @@
         <w:pStyle w:val="Heading2"/>
         <w:keepNext/>
       </w:pPr>
-      <w:bookmarkStart w:id="21" w:name="_Toc244144309"/>
+      <w:bookmarkStart w:id="21" w:name="_Toc244144503"/>
       <w:r>
         <w:t>6.3  What the draft does not claim</w:t>
       </w:r>
@@ -8314,7 +8314,7 @@
         <w:pStyle w:val="Heading2"/>
         <w:keepNext/>
       </w:pPr>
-      <w:bookmarkStart w:id="22" w:name="_Toc244144310"/>
+      <w:bookmarkStart w:id="22" w:name="_Toc244144504"/>
       <w:r>
         <w:t>6.4  The standing of the corpus</w:t>
       </w:r>
@@ -8375,7 +8375,7 @@
         <w:pStyle w:val="Heading2"/>
         <w:keepNext/>
       </w:pPr>
-      <w:bookmarkStart w:id="23" w:name="_Toc244144311"/>
+      <w:bookmarkStart w:id="23" w:name="_Toc244144505"/>
       <w:r>
         <w:t>6.5  The public reading</w:t>
       </w:r>
@@ -8443,7 +8443,7 @@
         <w:pStyle w:val="Heading2"/>
         <w:keepNext/>
       </w:pPr>
-      <w:bookmarkStart w:id="24" w:name="_Toc244144312"/>
+      <w:bookmarkStart w:id="24" w:name="_Toc244144506"/>
       <w:r>
         <w:t>6.6  Further claims in public view</w:t>
       </w:r>
@@ -8788,7 +8788,7 @@
         <w:pStyle w:val="Heading1"/>
         <w:keepNext/>
       </w:pPr>
-      <w:bookmarkStart w:id="25" w:name="_Toc244144313"/>
+      <w:bookmarkStart w:id="25" w:name="_Toc244144507"/>
       <w:r>
         <w:t>7.  The Residue and Its Completion</w:t>
       </w:r>
@@ -8812,7 +8812,7 @@
         <w:pStyle w:val="Heading2"/>
         <w:keepNext/>
       </w:pPr>
-      <w:bookmarkStart w:id="26" w:name="_Toc244144314"/>
+      <w:bookmarkStart w:id="26" w:name="_Toc244144508"/>
       <w:r>
         <w:t>7.1  The residue</w:t>
       </w:r>
@@ -8843,7 +8843,7 @@
           <w:left w:w="10" w:type="dxa"/>
           <w:right w:w="10" w:type="dxa"/>
         </w:tblCellMar>
-        <w:tblLook w:val="0000" w:firstRow="0" w:lastRow="0" w:firstColumn="0" w:lastColumn="0" w:noHBand="0" w:noVBand="0"/>
+        <w:tblLook w:val="04A0" w:firstRow="1" w:lastRow="0" w:firstColumn="1" w:lastColumn="0" w:noHBand="0" w:noVBand="1"/>
       </w:tblPr>
       <w:tblGrid>
         <w:gridCol w:w="2700"/>
@@ -10006,7 +10006,7 @@
         <w:pStyle w:val="Heading2"/>
         <w:keepNext/>
       </w:pPr>
-      <w:bookmarkStart w:id="27" w:name="_Toc244144315"/>
+      <w:bookmarkStart w:id="27" w:name="_Toc244144509"/>
       <w:r>
         <w:t>7.2  The gap is exponential clustering</w:t>
       </w:r>
@@ -11952,7 +11952,7 @@
         <w:pStyle w:val="Heading2"/>
         <w:keepNext/>
       </w:pPr>
-      <w:bookmarkStart w:id="28" w:name="_Toc244144316"/>
+      <w:bookmarkStart w:id="28" w:name="_Toc244144510"/>
       <w:r>
         <w:t>7.3  From the lattice to the limit</w:t>
       </w:r>
@@ -13132,7 +13132,7 @@
         <w:pStyle w:val="Heading2"/>
         <w:keepNext/>
       </w:pPr>
-      <w:bookmarkStart w:id="29" w:name="_Toc244144317"/>
+      <w:bookmarkStart w:id="29" w:name="_Toc244144511"/>
       <w:r>
         <w:t>7.4  The collapse of the components</w:t>
       </w:r>
@@ -13248,7 +13248,7 @@
         <w:pStyle w:val="Heading1"/>
         <w:keepNext/>
       </w:pPr>
-      <w:bookmarkStart w:id="30" w:name="_Toc244144318"/>
+      <w:bookmarkStart w:id="30" w:name="_Toc244144512"/>
       <w:r>
         <w:t>8.  The Ground Handed Over</w:t>
       </w:r>
@@ -13259,7 +13259,7 @@
         <w:pStyle w:val="Heading2"/>
         <w:keepNext/>
       </w:pPr>
-      <w:bookmarkStart w:id="31" w:name="_Toc244144319"/>
+      <w:bookmarkStart w:id="31" w:name="_Toc244144513"/>
       <w:r>
         <w:t>8.1  The object that remains</w:t>
       </w:r>
@@ -13403,7 +13403,7 @@
         <w:pStyle w:val="Heading2"/>
         <w:keepNext/>
       </w:pPr>
-      <w:bookmarkStart w:id="32" w:name="_Toc244144320"/>
+      <w:bookmarkStart w:id="32" w:name="_Toc244144514"/>
       <w:r>
         <w:t>8.2  The instruments in hand</w:t>
       </w:r>
@@ -18538,7 +18538,7 @@
           <w:left w:w="10" w:type="dxa"/>
           <w:right w:w="10" w:type="dxa"/>
         </w:tblCellMar>
-        <w:tblLook w:val="0000" w:firstRow="0" w:lastRow="0" w:firstColumn="0" w:lastColumn="0" w:noHBand="0" w:noVBand="0"/>
+        <w:tblLook w:val="04A0" w:firstRow="1" w:lastRow="0" w:firstColumn="1" w:lastColumn="0" w:noHBand="0" w:noVBand="1"/>
       </w:tblPr>
       <w:tblGrid>
         <w:gridCol w:w="1200"/>
@@ -20472,7 +20472,7 @@
         <w:pStyle w:val="Heading2"/>
         <w:keepNext/>
       </w:pPr>
-      <w:bookmarkStart w:id="33" w:name="_Toc244144321"/>
+      <w:bookmarkStart w:id="33" w:name="_Toc244144515"/>
       <w:r>
         <w:t>8.3  The reduction</w:t>
       </w:r>
@@ -34190,7 +34190,7 @@
           <w:left w:w="10" w:type="dxa"/>
           <w:right w:w="10" w:type="dxa"/>
         </w:tblCellMar>
-        <w:tblLook w:val="0000" w:firstRow="0" w:lastRow="0" w:firstColumn="0" w:lastColumn="0" w:noHBand="0" w:noVBand="0"/>
+        <w:tblLook w:val="04A0" w:firstRow="1" w:lastRow="0" w:firstColumn="1" w:lastColumn="0" w:noHBand="0" w:noVBand="1"/>
       </w:tblPr>
       <w:tblGrid>
         <w:gridCol w:w="1200"/>
@@ -35740,7 +35740,7 @@
         <w:t>g</w:t>
       </w:r>
       <w:r>
-        <w:t>², and the distance is the interval [0.2452, 1/γ²] with γ unread. The hypothesis's own proof, his Theorem 2 of 1987 with its two-sided bound on the couplings, is announced there and stated in the 1989 paper to be unpublished, so that the theorem of record is conditional: "so we have Theorem 1 with the assumption"; whether the proof appeared later is being searched, and until it is found the four-dimensional ultraviolet half rests on that assumption.</w:t>
+        <w:t>², and the distance is the interval [0.2452, 1/γ²] with γ unread. The hypothesis's own proof, his Theorem 2 of 1987 with its two-sided bound on the couplings, is announced there and stated in the 1989 paper to be unpublished, so that the theorem of record is conditional: "so we have Theorem 1 with the assumption"; it never appeared: his complete list of publications after 1989 contains no paper on four-dimensional gauge theory,</w:t>
       </w:r>
       <w:r>
         <w:rPr>
@@ -35749,6 +35749,15 @@
         <w:footnoteReference w:id="79"/>
       </w:r>
       <w:r>
+        <w:t xml:space="preserve"> so the four-dimensional ultraviolet half of every construction of the corpus's kind rests on an announced and unpublished theorem, and every sentence of this paper that cites Bałaban's four-dimensional result carries that clause.</w:t>
+      </w:r>
+      <w:r>
+        <w:rPr>
+          <w:rStyle w:val="FootnoteReference"/>
+        </w:rPr>
+        <w:footnoteReference w:id="80"/>
+      </w:r>
+      <w:r>
         <w:t xml:space="preserve"> Dimock's expositions treat the abelian and scalar cases and state every threshold the same way. Within the certified form the next widening is the same theorem in the Wasserstein metric of the three-sphere, whose one-link constant is 1/4, exact in the two symmetric directions and supported to one per cent between them, against total variation's 4/(3π); with the constants proved so far it gains nothing over Theorem 8.7, it is predicted to close near β = 0.30 under two constants not yet proved, and it is ung</w:t>
       </w:r>
       <w:r>
@@ -35771,7 +35780,7 @@
         <w:rPr>
           <w:rStyle w:val="FootnoteReference"/>
         </w:rPr>
-        <w:footnoteReference w:id="80"/>
+        <w:footnoteReference w:id="81"/>
       </w:r>
     </w:p>
     <w:p>
@@ -35779,7 +35788,7 @@
         <w:pStyle w:val="Heading2"/>
         <w:keepNext/>
       </w:pPr>
-      <w:bookmarkStart w:id="34" w:name="_Toc244144322"/>
+      <w:bookmarkStart w:id="34" w:name="_Toc244144516"/>
       <w:r>
         <w:t>8.4  Coda</w:t>
       </w:r>
@@ -35804,7 +35813,7 @@
         <w:pageBreakBefore/>
         <w:spacing w:before="0"/>
       </w:pPr>
-      <w:bookmarkStart w:id="35" w:name="_Toc244144323"/>
+      <w:bookmarkStart w:id="35" w:name="_Toc244144517"/>
       <w:r>
         <w:t>Sources</w:t>
       </w:r>
@@ -36884,7 +36893,7 @@
         <w:pStyle w:val="Heading2"/>
         <w:keepNext/>
       </w:pPr>
-      <w:bookmarkStart w:id="36" w:name="_Toc244144324"/>
+      <w:bookmarkStart w:id="36" w:name="_Toc244144518"/>
       <w:r>
         <w:t>Records of the computations of Edwin Boston III</w:t>
       </w:r>
@@ -39748,59 +39757,79 @@
           <w:sz w:val="17"/>
           <w:szCs w:val="17"/>
         </w:rPr>
-        <w:t xml:space="preserve">T. Bałaban, </w:t>
-      </w:r>
-      <w:r>
-        <w:rPr>
-          <w:i/>
-          <w:iCs/>
-          <w:sz w:val="17"/>
-          <w:szCs w:val="17"/>
-        </w:rPr>
-        <w:t>Comm. Math. Phys.</w:t>
-      </w:r>
-      <w:r>
-        <w:rPr>
-          <w:sz w:val="17"/>
-          <w:szCs w:val="17"/>
-        </w:rPr>
-        <w:t xml:space="preserve"> 109 (1987), 249–301: Theorem 1 (p. 259) and Theorem 3 (p. 267), the recursion (0.20) (p. 256), the action (0.2) with the normalised trace (p. 252), read from the pages on 29 October 2026. The statement that the sequence can be kept small in four dimensions, his Theorem 2 (pp. 259–260), is deferred there to "a separate paper"; the four-dimensional stability theorem itself is Theorem 1 of </w:t>
-      </w:r>
-      <w:r>
-        <w:rPr>
-          <w:i/>
-          <w:iCs/>
-          <w:sz w:val="17"/>
-          <w:szCs w:val="17"/>
-        </w:rPr>
-        <w:t>Large field renormalization II</w:t>
-      </w:r>
-      <w:r>
-        <w:rPr>
-          <w:sz w:val="17"/>
-          <w:szCs w:val="17"/>
-        </w:rPr>
-        <w:t xml:space="preserve">, </w:t>
-      </w:r>
-      <w:r>
-        <w:rPr>
-          <w:i/>
-          <w:iCs/>
-          <w:sz w:val="17"/>
-          <w:szCs w:val="17"/>
-        </w:rPr>
-        <w:t>Comm. Math. Phys.</w:t>
-      </w:r>
-      <w:r>
-        <w:rPr>
-          <w:sz w:val="17"/>
-          <w:szCs w:val="17"/>
-        </w:rPr>
-        <w:t xml:space="preserve"> 122 (1989), 355–392, p. 355, read on 29 October 2026: "If the sequence of the effective coupling constants is contained in an interval ]0, γ] with a sufficiently small positive γ, then the effective densities ρ_k have the form, and satisfy all the conditions and bounds, described in Sect. 2", followed by "Theorem 2 of [I] allows us to remove the assumption … The proof of Theorem 2 … has not been published yet, so we have Theorem 1 with the assumption"; its bibliography names no paper proving Theorem 2.</w:t>
+        <w:t>The zbMATH author listing for T. Bałaban, 1989–2022, read on 29 October 2026: the Euclidean fermion block renormalisation (1989), the two large-field papers (1989), the classical N-vector series (1995–1999), and the bosonic many-body series with Feldman, Knörrer and Trubowitz (2008–2022); no paper on four-dimensional gauge theory.</w:t>
       </w:r>
     </w:p>
   </w:footnote>
   <w:footnote w:id="80">
+    <w:p>
+      <w:pPr>
+        <w:spacing w:after="40" w:line="240" w:lineRule="auto"/>
+      </w:pPr>
+      <w:r>
+        <w:rPr>
+          <w:rStyle w:val="FootnoteReference"/>
+        </w:rPr>
+        <w:footnoteRef/>
+      </w:r>
+      <w:r>
+        <w:rPr>
+          <w:sz w:val="17"/>
+          <w:szCs w:val="17"/>
+        </w:rPr>
+        <w:t xml:space="preserve">T. Bałaban, </w:t>
+      </w:r>
+      <w:r>
+        <w:rPr>
+          <w:i/>
+          <w:iCs/>
+          <w:sz w:val="17"/>
+          <w:szCs w:val="17"/>
+        </w:rPr>
+        <w:t>Comm. Math. Phys.</w:t>
+      </w:r>
+      <w:r>
+        <w:rPr>
+          <w:sz w:val="17"/>
+          <w:szCs w:val="17"/>
+        </w:rPr>
+        <w:t xml:space="preserve"> 109 (1987), 249–301: Theorem 1 (p. 259) and Theorem 3 (p. 267), the recursion (0.20) (p. 256), the action (0.2) with the normalised trace (p. 252), read from the pages on 29 October 2026. The statement that the sequence can be kept small in four dimensions, his Theorem 2 (pp. 259–260), is deferred there to "a separate paper"; the four-dimensional stability theorem itself is Theorem 1 of </w:t>
+      </w:r>
+      <w:r>
+        <w:rPr>
+          <w:i/>
+          <w:iCs/>
+          <w:sz w:val="17"/>
+          <w:szCs w:val="17"/>
+        </w:rPr>
+        <w:t>Large field renormalization II</w:t>
+      </w:r>
+      <w:r>
+        <w:rPr>
+          <w:sz w:val="17"/>
+          <w:szCs w:val="17"/>
+        </w:rPr>
+        <w:t xml:space="preserve">, </w:t>
+      </w:r>
+      <w:r>
+        <w:rPr>
+          <w:i/>
+          <w:iCs/>
+          <w:sz w:val="17"/>
+          <w:szCs w:val="17"/>
+        </w:rPr>
+        <w:t>Comm. Math. Phys.</w:t>
+      </w:r>
+      <w:r>
+        <w:rPr>
+          <w:sz w:val="17"/>
+          <w:szCs w:val="17"/>
+        </w:rPr>
+        <w:t xml:space="preserve"> 122 (1989), 355–392, p. 355, read on 29 October 2026: "If the sequence of the effective coupling constants is contained in an interval ]0, γ] with a sufficiently small positive γ, then the effective densities ρ_k have the form, and satisfy all the conditions and bounds, described in Sect. 2", followed by "Theorem 2 of [I] allows us to remove the assumption … The proof of Theorem 2 … has not been published yet, so we have Theorem 1 with the assumption"; its bibliography names no paper proving Theorem 2.</w:t>
+      </w:r>
+    </w:p>
+  </w:footnote>
+  <w:footnote w:id="81">
     <w:p>
       <w:pPr>
         <w:spacing w:after="40" w:line="240" w:lineRule="auto"/>
@@ -39851,10 +39880,10 @@
 <file path=word/numbering.xml><?xml version="1.0" encoding="utf-8"?>
 <w:numbering xmlns:wpc="http://schemas.microsoft.com/office/word/2010/wordprocessingCanvas" xmlns:cx="http://schemas.microsoft.com/office/drawing/2014/chartex" xmlns:cx1="http://schemas.microsoft.com/office/drawing/2015/9/8/chartex" xmlns:cx2="http://schemas.microsoft.com/office/drawing/2015/10/21/chartex" xmlns:cx3="http://schemas.microsoft.com/office/drawing/2016/5/9/chartex" xmlns:cx4="http://schemas.microsoft.com/office/drawing/2016/5/10/chartex" xmlns:cx5="http://schemas.microsoft.com/office/drawing/2016/5/11/chartex" xmlns:cx6="http://schemas.microsoft.com/office/drawing/2016/5/12/chartex" xmlns:cx7="http://schemas.microsoft.com/office/drawing/2016/5/13/chartex" xmlns:cx8="http://schemas.microsoft.com/office/drawing/2016/5/14/chartex" xmlns:mc="http://schemas.openxmlformats.org/markup-compatibility/2006" xmlns:aink="http://schemas.microsoft.com/office/drawing/2016/ink" xmlns:am3d="http://schemas.microsoft.com/office/drawing/2017/model3d" xmlns:o="urn:schemas-microsoft-com:office:office" xmlns:oel="http://schemas.microsoft.com/office/2019/extlst" xmlns:r="http://schemas.openxmlformats.org/officeDocument/2006/relationships" xmlns:m="http://schemas.openxmlformats.org/officeDocument/2006/math" xmlns:v="urn:schemas-microsoft-com:vml" xmlns:wp14="http://schemas.microsoft.com/office/word/2010/wordprocessingDrawing" xmlns:wp="http://schemas.openxmlformats.org/drawingml/2006/wordprocessingDrawing" xmlns:w10="urn:schemas-microsoft-com:office:word" xmlns:w="http://schemas.openxmlformats.org/wordprocessingml/2006/main" xmlns:w14="http://schemas.microsoft.com/office/word/2010/wordml" xmlns:w15="http://schemas.microsoft.com/office/word/2012/wordml" xmlns:w16cex="http://schemas.microsoft.com/office/word/2018/wordml/cex" xmlns:w16cid="http://schemas.microsoft.com/office/word/2016/wordml/cid" xmlns:w16="http://schemas.microsoft.com/office/word/2018/wordml" xmlns:w16du="http://schemas.microsoft.com/office/word/2023/wordml/word16du" xmlns:w16sdtdh="http://schemas.microsoft.com/office/word/2020/wordml/sdtdatahash" xmlns:w16sdtfl="http://schemas.microsoft.com/office/word/2024/wordml/sdtformatlock" xmlns:w16se="http://schemas.microsoft.com/office/word/2015/wordml/symex" xmlns:wpg="http://schemas.microsoft.com/office/word/2010/wordprocessingGroup" xmlns:wpi="http://schemas.microsoft.com/office/word/2010/wordprocessingInk" xmlns:wne="http://schemas.microsoft.com/office/word/2006/wordml" xmlns:wps="http://schemas.microsoft.com/office/word/2010/wordprocessingShape" mc:Ignorable="w14 w15 w16se w16cid w16 w16cex w16sdtdh w16sdtfl w16du wp14">
   <w:abstractNum w:abstractNumId="0" w15:restartNumberingAfterBreak="0">
-    <w:nsid w:val="07B859A8"/>
+    <w:nsid w:val="41FE5DA4"/>
     <w:multiLevelType w:val="hybridMultilevel"/>
-    <w:tmpl w:val="8D72E5E6"/>
-    <w:lvl w:ilvl="0" w:tplc="69D22F80">
+    <w:tmpl w:val="C012F57A"/>
+    <w:lvl w:ilvl="0" w:tplc="D3DA125A">
       <w:start w:val="1"/>
       <w:numFmt w:val="bullet"/>
       <w:lvlText w:val="●"/>
@@ -39863,7 +39892,7 @@
         <w:ind w:left="720" w:hanging="360"/>
       </w:pPr>
     </w:lvl>
-    <w:lvl w:ilvl="1" w:tplc="8BA47CA2">
+    <w:lvl w:ilvl="1" w:tplc="670EE822">
       <w:start w:val="1"/>
       <w:numFmt w:val="bullet"/>
       <w:lvlText w:val="○"/>
@@ -39872,7 +39901,7 @@
         <w:ind w:left="1440" w:hanging="360"/>
       </w:pPr>
     </w:lvl>
-    <w:lvl w:ilvl="2" w:tplc="CD50F582">
+    <w:lvl w:ilvl="2" w:tplc="F9D633A6">
       <w:start w:val="1"/>
       <w:numFmt w:val="bullet"/>
       <w:lvlText w:val="■"/>
@@ -39881,7 +39910,7 @@
         <w:ind w:left="2160" w:hanging="360"/>
       </w:pPr>
     </w:lvl>
-    <w:lvl w:ilvl="3" w:tplc="42763D0E">
+    <w:lvl w:ilvl="3" w:tplc="E4A89AD2">
       <w:start w:val="1"/>
       <w:numFmt w:val="bullet"/>
       <w:lvlText w:val="●"/>
@@ -39890,7 +39919,7 @@
         <w:ind w:left="2880" w:hanging="360"/>
       </w:pPr>
     </w:lvl>
-    <w:lvl w:ilvl="4" w:tplc="B08448E4">
+    <w:lvl w:ilvl="4" w:tplc="0396DF1E">
       <w:start w:val="1"/>
       <w:numFmt w:val="bullet"/>
       <w:lvlText w:val="○"/>
@@ -39899,7 +39928,7 @@
         <w:ind w:left="3600" w:hanging="360"/>
       </w:pPr>
     </w:lvl>
-    <w:lvl w:ilvl="5" w:tplc="C3DC4944">
+    <w:lvl w:ilvl="5" w:tplc="345C2DD0">
       <w:start w:val="1"/>
       <w:numFmt w:val="bullet"/>
       <w:lvlText w:val="■"/>
@@ -39908,7 +39937,7 @@
         <w:ind w:left="4320" w:hanging="360"/>
       </w:pPr>
     </w:lvl>
-    <w:lvl w:ilvl="6" w:tplc="4D3C47E6">
+    <w:lvl w:ilvl="6" w:tplc="FECA152C">
       <w:start w:val="1"/>
       <w:numFmt w:val="bullet"/>
       <w:lvlText w:val="●"/>
@@ -39917,7 +39946,7 @@
         <w:ind w:left="5040" w:hanging="360"/>
       </w:pPr>
     </w:lvl>
-    <w:lvl w:ilvl="7" w:tplc="D7FEE220">
+    <w:lvl w:ilvl="7" w:tplc="7C983ED2">
       <w:start w:val="1"/>
       <w:numFmt w:val="bullet"/>
       <w:lvlText w:val="●"/>
@@ -39926,7 +39955,7 @@
         <w:ind w:left="5760" w:hanging="360"/>
       </w:pPr>
     </w:lvl>
-    <w:lvl w:ilvl="8" w:tplc="7D34B80C">
+    <w:lvl w:ilvl="8" w:tplc="7A767400">
       <w:start w:val="1"/>
       <w:numFmt w:val="bullet"/>
       <w:lvlText w:val="●"/>
@@ -39936,7 +39965,7 @@
       </w:pPr>
     </w:lvl>
   </w:abstractNum>
-  <w:num w:numId="1" w16cid:durableId="1840458304">
+  <w:num w:numId="1" w16cid:durableId="1190029593">
     <w:abstractNumId w:val="0"/>
     <w:lvlOverride w:ilvl="0">
       <w:startOverride w:val="1"/>
@@ -40533,7 +40562,7 @@
     <w:autoRedefine/>
     <w:uiPriority w:val="39"/>
     <w:unhideWhenUsed/>
-    <w:rsid w:val="005918AF"/>
+    <w:rsid w:val="00742A76"/>
     <w:pPr>
       <w:spacing w:after="100"/>
     </w:pPr>
@@ -40545,7 +40574,7 @@
     <w:autoRedefine/>
     <w:uiPriority w:val="39"/>
     <w:unhideWhenUsed/>
-    <w:rsid w:val="005918AF"/>
+    <w:rsid w:val="00742A76"/>
     <w:pPr>
       <w:spacing w:after="100"/>
       <w:ind w:left="220"/>

</xml_diff>

<commit_message>
THE GROUND, revision 25 (Edwin Boston III, 2026-10-29 07:16 EDT): Douglas and Rajasekaran's Lean formalisation placed beside the comparison
The open part's comparison now names every explicit strong-coupling threshold found in print: Shen, Zhu and Zhu (beta < 1/12 on Z^4 in Wilson's normalisation) and Douglas and Rajasekaran's Lean 4 library lgt (proved 4 May 2026), which formalises for U(n) the Dobrushin route of Chatterjee's 2026 lecture notes at beta < 1/(32n(d-1)) for the action beta * sum(n - Re Tr U_p), that is beta < 1/96 on Z^4 and 1/64 on Z^3 in Wilson's normalisation for n = 2. Theorem 8.7's 0.2452 is about three times the first and more than twenty times the second; Theorem 8.8's 0.3739 on Z^3 stands against 1/8 and 1/64. The Lean paragraph credits their formalisation of the U(n) gap and says the paper's Lean theorems are a separate development. Sources 25 (lgt) and 26 (Chatterjee's notes, as cited by them). 43 pages.
</commit_message>
<xml_diff>
--- a/THE-GROUND-Edwin-Boston-III.docx
+++ b/THE-GROUND-Edwin-Boston-III.docx
@@ -170,7 +170,7 @@
     <w:sdt>
       <w:sdtPr>
         <w:alias w:val="Contents"/>
-        <w:id w:val="-813557167"/>
+        <w:id w:val="-140500027"/>
       </w:sdtPr>
       <w:sdtEndPr/>
       <w:sdtContent>
@@ -198,7 +198,7 @@
           <w:r>
             <w:fldChar w:fldCharType="separate"/>
           </w:r>
-          <w:hyperlink w:anchor="_Toc244148499" w:history="1">
+          <w:hyperlink w:anchor="_Toc244150653" w:history="1">
             <w:r>
               <w:rPr>
                 <w:rStyle w:val="Hyperlink"/>
@@ -222,7 +222,7 @@
               <w:rPr>
                 <w:noProof/>
               </w:rPr>
-              <w:instrText xml:space="preserve"> PAGEREF _Toc244148499 \h </w:instrText>
+              <w:instrText xml:space="preserve"> PAGEREF _Toc244150653 \h </w:instrText>
             </w:r>
             <w:r>
               <w:rPr>
@@ -264,7 +264,7 @@
               <w14:ligatures w14:val="standardContextual"/>
             </w:rPr>
           </w:pPr>
-          <w:hyperlink w:anchor="_Toc244148500" w:history="1">
+          <w:hyperlink w:anchor="_Toc244150654" w:history="1">
             <w:r>
               <w:rPr>
                 <w:rStyle w:val="Hyperlink"/>
@@ -288,7 +288,7 @@
               <w:rPr>
                 <w:noProof/>
               </w:rPr>
-              <w:instrText xml:space="preserve"> PAGEREF _Toc244148500 \h </w:instrText>
+              <w:instrText xml:space="preserve"> PAGEREF _Toc244150654 \h </w:instrText>
             </w:r>
             <w:r>
               <w:rPr>
@@ -330,7 +330,7 @@
               <w14:ligatures w14:val="standardContextual"/>
             </w:rPr>
           </w:pPr>
-          <w:hyperlink w:anchor="_Toc244148501" w:history="1">
+          <w:hyperlink w:anchor="_Toc244150655" w:history="1">
             <w:r>
               <w:rPr>
                 <w:rStyle w:val="Hyperlink"/>
@@ -354,7 +354,7 @@
               <w:rPr>
                 <w:noProof/>
               </w:rPr>
-              <w:instrText xml:space="preserve"> PAGEREF _Toc244148501 \h </w:instrText>
+              <w:instrText xml:space="preserve"> PAGEREF _Toc244150655 \h </w:instrText>
             </w:r>
             <w:r>
               <w:rPr>
@@ -396,7 +396,7 @@
               <w14:ligatures w14:val="standardContextual"/>
             </w:rPr>
           </w:pPr>
-          <w:hyperlink w:anchor="_Toc244148502" w:history="1">
+          <w:hyperlink w:anchor="_Toc244150656" w:history="1">
             <w:r>
               <w:rPr>
                 <w:rStyle w:val="Hyperlink"/>
@@ -420,7 +420,7 @@
               <w:rPr>
                 <w:noProof/>
               </w:rPr>
-              <w:instrText xml:space="preserve"> PAGEREF _Toc244148502 \h </w:instrText>
+              <w:instrText xml:space="preserve"> PAGEREF _Toc244150656 \h </w:instrText>
             </w:r>
             <w:r>
               <w:rPr>
@@ -462,7 +462,7 @@
               <w14:ligatures w14:val="standardContextual"/>
             </w:rPr>
           </w:pPr>
-          <w:hyperlink w:anchor="_Toc244148503" w:history="1">
+          <w:hyperlink w:anchor="_Toc244150657" w:history="1">
             <w:r>
               <w:rPr>
                 <w:rStyle w:val="Hyperlink"/>
@@ -486,7 +486,7 @@
               <w:rPr>
                 <w:noProof/>
               </w:rPr>
-              <w:instrText xml:space="preserve"> PAGEREF _Toc244148503 \h </w:instrText>
+              <w:instrText xml:space="preserve"> PAGEREF _Toc244150657 \h </w:instrText>
             </w:r>
             <w:r>
               <w:rPr>
@@ -528,7 +528,7 @@
               <w14:ligatures w14:val="standardContextual"/>
             </w:rPr>
           </w:pPr>
-          <w:hyperlink w:anchor="_Toc244148504" w:history="1">
+          <w:hyperlink w:anchor="_Toc244150658" w:history="1">
             <w:r>
               <w:rPr>
                 <w:rStyle w:val="Hyperlink"/>
@@ -552,7 +552,7 @@
               <w:rPr>
                 <w:noProof/>
               </w:rPr>
-              <w:instrText xml:space="preserve"> PAGEREF _Toc244148504 \h </w:instrText>
+              <w:instrText xml:space="preserve"> PAGEREF _Toc244150658 \h </w:instrText>
             </w:r>
             <w:r>
               <w:rPr>
@@ -594,7 +594,7 @@
               <w14:ligatures w14:val="standardContextual"/>
             </w:rPr>
           </w:pPr>
-          <w:hyperlink w:anchor="_Toc244148505" w:history="1">
+          <w:hyperlink w:anchor="_Toc244150659" w:history="1">
             <w:r>
               <w:rPr>
                 <w:rStyle w:val="Hyperlink"/>
@@ -618,7 +618,7 @@
               <w:rPr>
                 <w:noProof/>
               </w:rPr>
-              <w:instrText xml:space="preserve"> PAGEREF _Toc244148505 \h </w:instrText>
+              <w:instrText xml:space="preserve"> PAGEREF _Toc244150659 \h </w:instrText>
             </w:r>
             <w:r>
               <w:rPr>
@@ -660,7 +660,7 @@
               <w14:ligatures w14:val="standardContextual"/>
             </w:rPr>
           </w:pPr>
-          <w:hyperlink w:anchor="_Toc244148506" w:history="1">
+          <w:hyperlink w:anchor="_Toc244150660" w:history="1">
             <w:r>
               <w:rPr>
                 <w:rStyle w:val="Hyperlink"/>
@@ -684,7 +684,7 @@
               <w:rPr>
                 <w:noProof/>
               </w:rPr>
-              <w:instrText xml:space="preserve"> PAGEREF _Toc244148506 \h </w:instrText>
+              <w:instrText xml:space="preserve"> PAGEREF _Toc244150660 \h </w:instrText>
             </w:r>
             <w:r>
               <w:rPr>
@@ -726,7 +726,7 @@
               <w14:ligatures w14:val="standardContextual"/>
             </w:rPr>
           </w:pPr>
-          <w:hyperlink w:anchor="_Toc244148507" w:history="1">
+          <w:hyperlink w:anchor="_Toc244150661" w:history="1">
             <w:r>
               <w:rPr>
                 <w:rStyle w:val="Hyperlink"/>
@@ -750,7 +750,7 @@
               <w:rPr>
                 <w:noProof/>
               </w:rPr>
-              <w:instrText xml:space="preserve"> PAGEREF _Toc244148507 \h </w:instrText>
+              <w:instrText xml:space="preserve"> PAGEREF _Toc244150661 \h </w:instrText>
             </w:r>
             <w:r>
               <w:rPr>
@@ -792,7 +792,7 @@
               <w14:ligatures w14:val="standardContextual"/>
             </w:rPr>
           </w:pPr>
-          <w:hyperlink w:anchor="_Toc244148508" w:history="1">
+          <w:hyperlink w:anchor="_Toc244150662" w:history="1">
             <w:r>
               <w:rPr>
                 <w:rStyle w:val="Hyperlink"/>
@@ -816,7 +816,7 @@
               <w:rPr>
                 <w:noProof/>
               </w:rPr>
-              <w:instrText xml:space="preserve"> PAGEREF _Toc244148508 \h </w:instrText>
+              <w:instrText xml:space="preserve"> PAGEREF _Toc244150662 \h </w:instrText>
             </w:r>
             <w:r>
               <w:rPr>
@@ -858,7 +858,7 @@
               <w14:ligatures w14:val="standardContextual"/>
             </w:rPr>
           </w:pPr>
-          <w:hyperlink w:anchor="_Toc244148509" w:history="1">
+          <w:hyperlink w:anchor="_Toc244150663" w:history="1">
             <w:r>
               <w:rPr>
                 <w:rStyle w:val="Hyperlink"/>
@@ -882,7 +882,7 @@
               <w:rPr>
                 <w:noProof/>
               </w:rPr>
-              <w:instrText xml:space="preserve"> PAGEREF _Toc244148509 \h </w:instrText>
+              <w:instrText xml:space="preserve"> PAGEREF _Toc244150663 \h </w:instrText>
             </w:r>
             <w:r>
               <w:rPr>
@@ -924,7 +924,7 @@
               <w14:ligatures w14:val="standardContextual"/>
             </w:rPr>
           </w:pPr>
-          <w:hyperlink w:anchor="_Toc244148510" w:history="1">
+          <w:hyperlink w:anchor="_Toc244150664" w:history="1">
             <w:r>
               <w:rPr>
                 <w:rStyle w:val="Hyperlink"/>
@@ -948,7 +948,7 @@
               <w:rPr>
                 <w:noProof/>
               </w:rPr>
-              <w:instrText xml:space="preserve"> PAGEREF _Toc244148510 \h </w:instrText>
+              <w:instrText xml:space="preserve"> PAGEREF _Toc244150664 \h </w:instrText>
             </w:r>
             <w:r>
               <w:rPr>
@@ -990,7 +990,7 @@
               <w14:ligatures w14:val="standardContextual"/>
             </w:rPr>
           </w:pPr>
-          <w:hyperlink w:anchor="_Toc244148511" w:history="1">
+          <w:hyperlink w:anchor="_Toc244150665" w:history="1">
             <w:r>
               <w:rPr>
                 <w:rStyle w:val="Hyperlink"/>
@@ -1014,7 +1014,7 @@
               <w:rPr>
                 <w:noProof/>
               </w:rPr>
-              <w:instrText xml:space="preserve"> PAGEREF _Toc244148511 \h </w:instrText>
+              <w:instrText xml:space="preserve"> PAGEREF _Toc244150665 \h </w:instrText>
             </w:r>
             <w:r>
               <w:rPr>
@@ -1056,7 +1056,7 @@
               <w14:ligatures w14:val="standardContextual"/>
             </w:rPr>
           </w:pPr>
-          <w:hyperlink w:anchor="_Toc244148512" w:history="1">
+          <w:hyperlink w:anchor="_Toc244150666" w:history="1">
             <w:r>
               <w:rPr>
                 <w:rStyle w:val="Hyperlink"/>
@@ -1080,7 +1080,7 @@
               <w:rPr>
                 <w:noProof/>
               </w:rPr>
-              <w:instrText xml:space="preserve"> PAGEREF _Toc244148512 \h </w:instrText>
+              <w:instrText xml:space="preserve"> PAGEREF _Toc244150666 \h </w:instrText>
             </w:r>
             <w:r>
               <w:rPr>
@@ -1122,7 +1122,7 @@
               <w14:ligatures w14:val="standardContextual"/>
             </w:rPr>
           </w:pPr>
-          <w:hyperlink w:anchor="_Toc244148513" w:history="1">
+          <w:hyperlink w:anchor="_Toc244150667" w:history="1">
             <w:r>
               <w:rPr>
                 <w:rStyle w:val="Hyperlink"/>
@@ -1146,7 +1146,7 @@
               <w:rPr>
                 <w:noProof/>
               </w:rPr>
-              <w:instrText xml:space="preserve"> PAGEREF _Toc244148513 \h </w:instrText>
+              <w:instrText xml:space="preserve"> PAGEREF _Toc244150667 \h </w:instrText>
             </w:r>
             <w:r>
               <w:rPr>
@@ -1188,7 +1188,7 @@
               <w14:ligatures w14:val="standardContextual"/>
             </w:rPr>
           </w:pPr>
-          <w:hyperlink w:anchor="_Toc244148514" w:history="1">
+          <w:hyperlink w:anchor="_Toc244150668" w:history="1">
             <w:r>
               <w:rPr>
                 <w:rStyle w:val="Hyperlink"/>
@@ -1212,7 +1212,7 @@
               <w:rPr>
                 <w:noProof/>
               </w:rPr>
-              <w:instrText xml:space="preserve"> PAGEREF _Toc244148514 \h </w:instrText>
+              <w:instrText xml:space="preserve"> PAGEREF _Toc244150668 \h </w:instrText>
             </w:r>
             <w:r>
               <w:rPr>
@@ -1254,7 +1254,7 @@
               <w14:ligatures w14:val="standardContextual"/>
             </w:rPr>
           </w:pPr>
-          <w:hyperlink w:anchor="_Toc244148515" w:history="1">
+          <w:hyperlink w:anchor="_Toc244150669" w:history="1">
             <w:r>
               <w:rPr>
                 <w:rStyle w:val="Hyperlink"/>
@@ -1278,7 +1278,7 @@
               <w:rPr>
                 <w:noProof/>
               </w:rPr>
-              <w:instrText xml:space="preserve"> PAGEREF _Toc244148515 \h </w:instrText>
+              <w:instrText xml:space="preserve"> PAGEREF _Toc244150669 \h </w:instrText>
             </w:r>
             <w:r>
               <w:rPr>
@@ -1320,7 +1320,7 @@
               <w14:ligatures w14:val="standardContextual"/>
             </w:rPr>
           </w:pPr>
-          <w:hyperlink w:anchor="_Toc244148516" w:history="1">
+          <w:hyperlink w:anchor="_Toc244150670" w:history="1">
             <w:r>
               <w:rPr>
                 <w:rStyle w:val="Hyperlink"/>
@@ -1344,7 +1344,7 @@
               <w:rPr>
                 <w:noProof/>
               </w:rPr>
-              <w:instrText xml:space="preserve"> PAGEREF _Toc244148516 \h </w:instrText>
+              <w:instrText xml:space="preserve"> PAGEREF _Toc244150670 \h </w:instrText>
             </w:r>
             <w:r>
               <w:rPr>
@@ -1386,7 +1386,7 @@
               <w14:ligatures w14:val="standardContextual"/>
             </w:rPr>
           </w:pPr>
-          <w:hyperlink w:anchor="_Toc244148517" w:history="1">
+          <w:hyperlink w:anchor="_Toc244150671" w:history="1">
             <w:r>
               <w:rPr>
                 <w:rStyle w:val="Hyperlink"/>
@@ -1410,7 +1410,7 @@
               <w:rPr>
                 <w:noProof/>
               </w:rPr>
-              <w:instrText xml:space="preserve"> PAGEREF _Toc244148517 \h </w:instrText>
+              <w:instrText xml:space="preserve"> PAGEREF _Toc244150671 \h </w:instrText>
             </w:r>
             <w:r>
               <w:rPr>
@@ -1452,7 +1452,7 @@
               <w14:ligatures w14:val="standardContextual"/>
             </w:rPr>
           </w:pPr>
-          <w:hyperlink w:anchor="_Toc244148518" w:history="1">
+          <w:hyperlink w:anchor="_Toc244150672" w:history="1">
             <w:r>
               <w:rPr>
                 <w:rStyle w:val="Hyperlink"/>
@@ -1476,7 +1476,7 @@
               <w:rPr>
                 <w:noProof/>
               </w:rPr>
-              <w:instrText xml:space="preserve"> PAGEREF _Toc244148518 \h </w:instrText>
+              <w:instrText xml:space="preserve"> PAGEREF _Toc244150672 \h </w:instrText>
             </w:r>
             <w:r>
               <w:rPr>
@@ -1518,7 +1518,7 @@
               <w14:ligatures w14:val="standardContextual"/>
             </w:rPr>
           </w:pPr>
-          <w:hyperlink w:anchor="_Toc244148519" w:history="1">
+          <w:hyperlink w:anchor="_Toc244150673" w:history="1">
             <w:r>
               <w:rPr>
                 <w:rStyle w:val="Hyperlink"/>
@@ -1542,7 +1542,7 @@
               <w:rPr>
                 <w:noProof/>
               </w:rPr>
-              <w:instrText xml:space="preserve"> PAGEREF _Toc244148519 \h </w:instrText>
+              <w:instrText xml:space="preserve"> PAGEREF _Toc244150673 \h </w:instrText>
             </w:r>
             <w:r>
               <w:rPr>
@@ -1584,7 +1584,7 @@
               <w14:ligatures w14:val="standardContextual"/>
             </w:rPr>
           </w:pPr>
-          <w:hyperlink w:anchor="_Toc244148520" w:history="1">
+          <w:hyperlink w:anchor="_Toc244150674" w:history="1">
             <w:r>
               <w:rPr>
                 <w:rStyle w:val="Hyperlink"/>
@@ -1608,7 +1608,7 @@
               <w:rPr>
                 <w:noProof/>
               </w:rPr>
-              <w:instrText xml:space="preserve"> PAGEREF _Toc244148520 \h </w:instrText>
+              <w:instrText xml:space="preserve"> PAGEREF _Toc244150674 \h </w:instrText>
             </w:r>
             <w:r>
               <w:rPr>
@@ -1650,7 +1650,7 @@
               <w14:ligatures w14:val="standardContextual"/>
             </w:rPr>
           </w:pPr>
-          <w:hyperlink w:anchor="_Toc244148521" w:history="1">
+          <w:hyperlink w:anchor="_Toc244150675" w:history="1">
             <w:r>
               <w:rPr>
                 <w:rStyle w:val="Hyperlink"/>
@@ -1674,7 +1674,7 @@
               <w:rPr>
                 <w:noProof/>
               </w:rPr>
-              <w:instrText xml:space="preserve"> PAGEREF _Toc244148521 \h </w:instrText>
+              <w:instrText xml:space="preserve"> PAGEREF _Toc244150675 \h </w:instrText>
             </w:r>
             <w:r>
               <w:rPr>
@@ -1716,7 +1716,7 @@
               <w14:ligatures w14:val="standardContextual"/>
             </w:rPr>
           </w:pPr>
-          <w:hyperlink w:anchor="_Toc244148522" w:history="1">
+          <w:hyperlink w:anchor="_Toc244150676" w:history="1">
             <w:r>
               <w:rPr>
                 <w:rStyle w:val="Hyperlink"/>
@@ -1740,7 +1740,7 @@
               <w:rPr>
                 <w:noProof/>
               </w:rPr>
-              <w:instrText xml:space="preserve"> PAGEREF _Toc244148522 \h </w:instrText>
+              <w:instrText xml:space="preserve"> PAGEREF _Toc244150676 \h </w:instrText>
             </w:r>
             <w:r>
               <w:rPr>
@@ -1782,7 +1782,7 @@
               <w14:ligatures w14:val="standardContextual"/>
             </w:rPr>
           </w:pPr>
-          <w:hyperlink w:anchor="_Toc244148523" w:history="1">
+          <w:hyperlink w:anchor="_Toc244150677" w:history="1">
             <w:r>
               <w:rPr>
                 <w:rStyle w:val="Hyperlink"/>
@@ -1806,7 +1806,7 @@
               <w:rPr>
                 <w:noProof/>
               </w:rPr>
-              <w:instrText xml:space="preserve"> PAGEREF _Toc244148523 \h </w:instrText>
+              <w:instrText xml:space="preserve"> PAGEREF _Toc244150677 \h </w:instrText>
             </w:r>
             <w:r>
               <w:rPr>
@@ -1848,7 +1848,7 @@
               <w14:ligatures w14:val="standardContextual"/>
             </w:rPr>
           </w:pPr>
-          <w:hyperlink w:anchor="_Toc244148524" w:history="1">
+          <w:hyperlink w:anchor="_Toc244150678" w:history="1">
             <w:r>
               <w:rPr>
                 <w:rStyle w:val="Hyperlink"/>
@@ -1872,7 +1872,7 @@
               <w:rPr>
                 <w:noProof/>
               </w:rPr>
-              <w:instrText xml:space="preserve"> PAGEREF _Toc244148524 \h </w:instrText>
+              <w:instrText xml:space="preserve"> PAGEREF _Toc244150678 \h </w:instrText>
             </w:r>
             <w:r>
               <w:rPr>
@@ -1914,7 +1914,7 @@
               <w14:ligatures w14:val="standardContextual"/>
             </w:rPr>
           </w:pPr>
-          <w:hyperlink w:anchor="_Toc244148525" w:history="1">
+          <w:hyperlink w:anchor="_Toc244150679" w:history="1">
             <w:r>
               <w:rPr>
                 <w:rStyle w:val="Hyperlink"/>
@@ -1938,7 +1938,7 @@
               <w:rPr>
                 <w:noProof/>
               </w:rPr>
-              <w:instrText xml:space="preserve"> PAGEREF _Toc244148525 \h </w:instrText>
+              <w:instrText xml:space="preserve"> PAGEREF _Toc244150679 \h </w:instrText>
             </w:r>
             <w:r>
               <w:rPr>
@@ -1980,7 +1980,7 @@
               <w14:ligatures w14:val="standardContextual"/>
             </w:rPr>
           </w:pPr>
-          <w:hyperlink w:anchor="_Toc244148526" w:history="1">
+          <w:hyperlink w:anchor="_Toc244150680" w:history="1">
             <w:r>
               <w:rPr>
                 <w:rStyle w:val="Hyperlink"/>
@@ -2004,7 +2004,7 @@
               <w:rPr>
                 <w:noProof/>
               </w:rPr>
-              <w:instrText xml:space="preserve"> PAGEREF _Toc244148526 \h </w:instrText>
+              <w:instrText xml:space="preserve"> PAGEREF _Toc244150680 \h </w:instrText>
             </w:r>
             <w:r>
               <w:rPr>
@@ -2046,7 +2046,7 @@
               <w14:ligatures w14:val="standardContextual"/>
             </w:rPr>
           </w:pPr>
-          <w:hyperlink w:anchor="_Toc244148527" w:history="1">
+          <w:hyperlink w:anchor="_Toc244150681" w:history="1">
             <w:r>
               <w:rPr>
                 <w:rStyle w:val="Hyperlink"/>
@@ -2070,7 +2070,7 @@
               <w:rPr>
                 <w:noProof/>
               </w:rPr>
-              <w:instrText xml:space="preserve"> PAGEREF _Toc244148527 \h </w:instrText>
+              <w:instrText xml:space="preserve"> PAGEREF _Toc244150681 \h </w:instrText>
             </w:r>
             <w:r>
               <w:rPr>
@@ -2112,7 +2112,7 @@
               <w14:ligatures w14:val="standardContextual"/>
             </w:rPr>
           </w:pPr>
-          <w:hyperlink w:anchor="_Toc244148528" w:history="1">
+          <w:hyperlink w:anchor="_Toc244150682" w:history="1">
             <w:r>
               <w:rPr>
                 <w:rStyle w:val="Hyperlink"/>
@@ -2136,7 +2136,7 @@
               <w:rPr>
                 <w:noProof/>
               </w:rPr>
-              <w:instrText xml:space="preserve"> PAGEREF _Toc244148528 \h </w:instrText>
+              <w:instrText xml:space="preserve"> PAGEREF _Toc244150682 \h </w:instrText>
             </w:r>
             <w:r>
               <w:rPr>
@@ -2178,7 +2178,7 @@
               <w14:ligatures w14:val="standardContextual"/>
             </w:rPr>
           </w:pPr>
-          <w:hyperlink w:anchor="_Toc244148529" w:history="1">
+          <w:hyperlink w:anchor="_Toc244150683" w:history="1">
             <w:r>
               <w:rPr>
                 <w:rStyle w:val="Hyperlink"/>
@@ -2202,7 +2202,7 @@
               <w:rPr>
                 <w:noProof/>
               </w:rPr>
-              <w:instrText xml:space="preserve"> PAGEREF _Toc244148529 \h </w:instrText>
+              <w:instrText xml:space="preserve"> PAGEREF _Toc244150683 \h </w:instrText>
             </w:r>
             <w:r>
               <w:rPr>
@@ -2244,7 +2244,7 @@
               <w14:ligatures w14:val="standardContextual"/>
             </w:rPr>
           </w:pPr>
-          <w:hyperlink w:anchor="_Toc244148530" w:history="1">
+          <w:hyperlink w:anchor="_Toc244150684" w:history="1">
             <w:r>
               <w:rPr>
                 <w:rStyle w:val="Hyperlink"/>
@@ -2268,7 +2268,7 @@
               <w:rPr>
                 <w:noProof/>
               </w:rPr>
-              <w:instrText xml:space="preserve"> PAGEREF _Toc244148530 \h </w:instrText>
+              <w:instrText xml:space="preserve"> PAGEREF _Toc244150684 \h </w:instrText>
             </w:r>
             <w:r>
               <w:rPr>
@@ -2310,7 +2310,7 @@
               <w14:ligatures w14:val="standardContextual"/>
             </w:rPr>
           </w:pPr>
-          <w:hyperlink w:anchor="_Toc244148531" w:history="1">
+          <w:hyperlink w:anchor="_Toc244150685" w:history="1">
             <w:r>
               <w:rPr>
                 <w:rStyle w:val="Hyperlink"/>
@@ -2334,7 +2334,7 @@
               <w:rPr>
                 <w:noProof/>
               </w:rPr>
-              <w:instrText xml:space="preserve"> PAGEREF _Toc244148531 \h </w:instrText>
+              <w:instrText xml:space="preserve"> PAGEREF _Toc244150685 \h </w:instrText>
             </w:r>
             <w:r>
               <w:rPr>
@@ -2376,7 +2376,7 @@
               <w14:ligatures w14:val="standardContextual"/>
             </w:rPr>
           </w:pPr>
-          <w:hyperlink w:anchor="_Toc244148532" w:history="1">
+          <w:hyperlink w:anchor="_Toc244150686" w:history="1">
             <w:r>
               <w:rPr>
                 <w:rStyle w:val="Hyperlink"/>
@@ -2400,7 +2400,7 @@
               <w:rPr>
                 <w:noProof/>
               </w:rPr>
-              <w:instrText xml:space="preserve"> PAGEREF _Toc244148532 \h </w:instrText>
+              <w:instrText xml:space="preserve"> PAGEREF _Toc244150686 \h </w:instrText>
             </w:r>
             <w:r>
               <w:rPr>
@@ -2442,7 +2442,7 @@
               <w14:ligatures w14:val="standardContextual"/>
             </w:rPr>
           </w:pPr>
-          <w:hyperlink w:anchor="_Toc244148533" w:history="1">
+          <w:hyperlink w:anchor="_Toc244150687" w:history="1">
             <w:r>
               <w:rPr>
                 <w:rStyle w:val="Hyperlink"/>
@@ -2466,7 +2466,7 @@
               <w:rPr>
                 <w:noProof/>
               </w:rPr>
-              <w:instrText xml:space="preserve"> PAGEREF _Toc244148533 \h </w:instrText>
+              <w:instrText xml:space="preserve"> PAGEREF _Toc244150687 \h </w:instrText>
             </w:r>
             <w:r>
               <w:rPr>
@@ -2508,7 +2508,7 @@
               <w14:ligatures w14:val="standardContextual"/>
             </w:rPr>
           </w:pPr>
-          <w:hyperlink w:anchor="_Toc244148534" w:history="1">
+          <w:hyperlink w:anchor="_Toc244150688" w:history="1">
             <w:r>
               <w:rPr>
                 <w:rStyle w:val="Hyperlink"/>
@@ -2532,7 +2532,7 @@
               <w:rPr>
                 <w:noProof/>
               </w:rPr>
-              <w:instrText xml:space="preserve"> PAGEREF _Toc244148534 \h </w:instrText>
+              <w:instrText xml:space="preserve"> PAGEREF _Toc244150688 \h </w:instrText>
             </w:r>
             <w:r>
               <w:rPr>
@@ -2574,7 +2574,7 @@
               <w14:ligatures w14:val="standardContextual"/>
             </w:rPr>
           </w:pPr>
-          <w:hyperlink w:anchor="_Toc244148535" w:history="1">
+          <w:hyperlink w:anchor="_Toc244150689" w:history="1">
             <w:r>
               <w:rPr>
                 <w:rStyle w:val="Hyperlink"/>
@@ -2598,7 +2598,7 @@
               <w:rPr>
                 <w:noProof/>
               </w:rPr>
-              <w:instrText xml:space="preserve"> PAGEREF _Toc244148535 \h </w:instrText>
+              <w:instrText xml:space="preserve"> PAGEREF _Toc244150689 \h </w:instrText>
             </w:r>
             <w:r>
               <w:rPr>
@@ -2639,7 +2639,7 @@
         <w:pageBreakBefore/>
         <w:spacing w:before="0"/>
       </w:pPr>
-      <w:bookmarkStart w:id="0" w:name="_Toc244148499"/>
+      <w:bookmarkStart w:id="0" w:name="_Toc244150653"/>
       <w:r>
         <w:t>1.  Introduction</w:t>
       </w:r>
@@ -2775,7 +2775,7 @@
         <w:pStyle w:val="Heading1"/>
         <w:keepNext/>
       </w:pPr>
-      <w:bookmarkStart w:id="1" w:name="_Toc244148500"/>
+      <w:bookmarkStart w:id="1" w:name="_Toc244150654"/>
       <w:r>
         <w:t>2.  The Ground Theorem</w:t>
       </w:r>
@@ -3039,7 +3039,7 @@
         <w:pStyle w:val="Heading1"/>
         <w:keepNext/>
       </w:pPr>
-      <w:bookmarkStart w:id="2" w:name="_Toc244148501"/>
+      <w:bookmarkStart w:id="2" w:name="_Toc244150655"/>
       <w:r>
         <w:t>3.  What the Problem Demands</w:t>
       </w:r>
@@ -3050,7 +3050,7 @@
         <w:pStyle w:val="Heading2"/>
         <w:keepNext/>
       </w:pPr>
-      <w:bookmarkStart w:id="3" w:name="_Toc244148502"/>
+      <w:bookmarkStart w:id="3" w:name="_Toc244150656"/>
       <w:r>
         <w:t>3.1  Euclidean fields and the axioms of Osterwalder and Schrader</w:t>
       </w:r>
@@ -4180,7 +4180,7 @@
         <w:pStyle w:val="Heading2"/>
         <w:keepNext/>
       </w:pPr>
-      <w:bookmarkStart w:id="4" w:name="_Toc244148503"/>
+      <w:bookmarkStart w:id="4" w:name="_Toc244150657"/>
       <w:r>
         <w:t>3.2  The mass gap</w:t>
       </w:r>
@@ -4252,7 +4252,7 @@
         <w:pStyle w:val="Heading2"/>
         <w:keepNext/>
       </w:pPr>
-      <w:bookmarkStart w:id="5" w:name="_Toc244148504"/>
+      <w:bookmarkStart w:id="5" w:name="_Toc244150658"/>
       <w:r>
         <w:t>3.3  Non-triviality</w:t>
       </w:r>
@@ -4331,7 +4331,7 @@
         <w:pStyle w:val="Heading2"/>
         <w:keepNext/>
       </w:pPr>
-      <w:bookmarkStart w:id="6" w:name="_Toc244148505"/>
+      <w:bookmarkStart w:id="6" w:name="_Toc244150659"/>
       <w:r>
         <w:t>3.4  Limits obtained by compactness</w:t>
       </w:r>
@@ -4410,7 +4410,7 @@
         <w:pStyle w:val="Heading1"/>
         <w:keepNext/>
       </w:pPr>
-      <w:bookmarkStart w:id="7" w:name="_Toc244148506"/>
+      <w:bookmarkStart w:id="7" w:name="_Toc244150660"/>
       <w:r>
         <w:t>4.  The Lattice, Its Positivity and Its Gap</w:t>
       </w:r>
@@ -4421,7 +4421,7 @@
         <w:pStyle w:val="Heading2"/>
         <w:keepNext/>
       </w:pPr>
-      <w:bookmarkStart w:id="8" w:name="_Toc244148507"/>
+      <w:bookmarkStart w:id="8" w:name="_Toc244150661"/>
       <w:r>
         <w:t>4.1  Wilson's theory</w:t>
       </w:r>
@@ -5043,7 +5043,7 @@
         <w:pStyle w:val="Heading2"/>
         <w:keepNext/>
       </w:pPr>
-      <w:bookmarkStart w:id="9" w:name="_Toc244148508"/>
+      <w:bookmarkStart w:id="9" w:name="_Toc244150662"/>
       <w:r>
         <w:t>4.2  Reflection positivity and the transfer matrix</w:t>
       </w:r>
@@ -6079,7 +6079,7 @@
         <w:pStyle w:val="Heading2"/>
         <w:keepNext/>
       </w:pPr>
-      <w:bookmarkStart w:id="10" w:name="_Toc244148509"/>
+      <w:bookmarkStart w:id="10" w:name="_Toc244150663"/>
       <w:r>
         <w:t>4.3  The renormalisation group of Bałaban</w:t>
       </w:r>
@@ -6120,7 +6120,7 @@
         <w:pStyle w:val="Heading1"/>
         <w:keepNext/>
       </w:pPr>
-      <w:bookmarkStart w:id="11" w:name="_Toc244148510"/>
+      <w:bookmarkStart w:id="11" w:name="_Toc244150664"/>
       <w:r>
         <w:t>5.  The Three-Dimensional Manuscripts</w:t>
       </w:r>
@@ -6144,7 +6144,7 @@
         <w:pStyle w:val="Heading2"/>
         <w:keepNext/>
       </w:pPr>
-      <w:bookmarkStart w:id="12" w:name="_Toc244148511"/>
+      <w:bookmarkStart w:id="12" w:name="_Toc244150665"/>
       <w:r>
         <w:t>5.1  The documents</w:t>
       </w:r>
@@ -6191,7 +6191,7 @@
         <w:pStyle w:val="Heading2"/>
         <w:keepNext/>
       </w:pPr>
-      <w:bookmarkStart w:id="13" w:name="_Toc244148512"/>
+      <w:bookmarkStart w:id="13" w:name="_Toc244150666"/>
       <w:r>
         <w:t>5.2  The observable</w:t>
       </w:r>
@@ -6595,7 +6595,7 @@
         <w:pStyle w:val="Heading2"/>
         <w:keepNext/>
       </w:pPr>
-      <w:bookmarkStart w:id="14" w:name="_Toc244148513"/>
+      <w:bookmarkStart w:id="14" w:name="_Toc244150667"/>
       <w:r>
         <w:t>5.3  The torus, the infinite volume and the components</w:t>
       </w:r>
@@ -7126,7 +7126,7 @@
         <w:pStyle w:val="Heading2"/>
         <w:keepNext/>
       </w:pPr>
-      <w:bookmarkStart w:id="15" w:name="_Toc244148514"/>
+      <w:bookmarkStart w:id="15" w:name="_Toc244150668"/>
       <w:r>
         <w:t>5.4  The axioms and the reconstruction</w:t>
       </w:r>
@@ -7356,7 +7356,7 @@
         <w:pStyle w:val="Heading2"/>
         <w:keepNext/>
       </w:pPr>
-      <w:bookmarkStart w:id="16" w:name="_Toc244148515"/>
+      <w:bookmarkStart w:id="16" w:name="_Toc244150669"/>
       <w:r>
         <w:t>5.5  Non-triviality</w:t>
       </w:r>
@@ -7897,7 +7897,7 @@
         <w:pStyle w:val="Heading2"/>
         <w:keepNext/>
       </w:pPr>
-      <w:bookmarkStart w:id="17" w:name="_Toc244148516"/>
+      <w:bookmarkStart w:id="17" w:name="_Toc244150670"/>
       <w:r>
         <w:t>5.6  What the manuscript does not assert</w:t>
       </w:r>
@@ -7945,7 +7945,7 @@
         <w:pStyle w:val="Heading1"/>
         <w:keepNext/>
       </w:pPr>
-      <w:bookmarkStart w:id="18" w:name="_Toc244148517"/>
+      <w:bookmarkStart w:id="18" w:name="_Toc244150671"/>
       <w:r>
         <w:t>6.  The Four-Dimensional Draft and the Standing of the Corpus</w:t>
       </w:r>
@@ -7969,7 +7969,7 @@
         <w:pStyle w:val="Heading2"/>
         <w:keepNext/>
       </w:pPr>
-      <w:bookmarkStart w:id="19" w:name="_Toc244148518"/>
+      <w:bookmarkStart w:id="19" w:name="_Toc244150672"/>
       <w:r>
         <w:t>6.1  The authors' account</w:t>
       </w:r>
@@ -8033,7 +8033,7 @@
         <w:pStyle w:val="Heading2"/>
         <w:keepNext/>
       </w:pPr>
-      <w:bookmarkStart w:id="20" w:name="_Toc244148519"/>
+      <w:bookmarkStart w:id="20" w:name="_Toc244150673"/>
       <w:r>
         <w:t>6.2  The conditional theorem</w:t>
       </w:r>
@@ -8236,7 +8236,7 @@
         <w:pStyle w:val="Heading2"/>
         <w:keepNext/>
       </w:pPr>
-      <w:bookmarkStart w:id="21" w:name="_Toc244148520"/>
+      <w:bookmarkStart w:id="21" w:name="_Toc244150674"/>
       <w:r>
         <w:t>6.3  What the draft does not claim</w:t>
       </w:r>
@@ -8314,7 +8314,7 @@
         <w:pStyle w:val="Heading2"/>
         <w:keepNext/>
       </w:pPr>
-      <w:bookmarkStart w:id="22" w:name="_Toc244148521"/>
+      <w:bookmarkStart w:id="22" w:name="_Toc244150675"/>
       <w:r>
         <w:t>6.4  The standing of the corpus</w:t>
       </w:r>
@@ -8375,7 +8375,7 @@
         <w:pStyle w:val="Heading2"/>
         <w:keepNext/>
       </w:pPr>
-      <w:bookmarkStart w:id="23" w:name="_Toc244148522"/>
+      <w:bookmarkStart w:id="23" w:name="_Toc244150676"/>
       <w:r>
         <w:t>6.5  The public reading</w:t>
       </w:r>
@@ -8443,7 +8443,7 @@
         <w:pStyle w:val="Heading2"/>
         <w:keepNext/>
       </w:pPr>
-      <w:bookmarkStart w:id="24" w:name="_Toc244148523"/>
+      <w:bookmarkStart w:id="24" w:name="_Toc244150677"/>
       <w:r>
         <w:t>6.6  Further claims in public view</w:t>
       </w:r>
@@ -8848,7 +8848,7 @@
         <w:pStyle w:val="Heading1"/>
         <w:keepNext/>
       </w:pPr>
-      <w:bookmarkStart w:id="25" w:name="_Toc244148524"/>
+      <w:bookmarkStart w:id="25" w:name="_Toc244150678"/>
       <w:r>
         <w:t>7.  The Residue and Its Completion</w:t>
       </w:r>
@@ -8872,7 +8872,7 @@
         <w:pStyle w:val="Heading2"/>
         <w:keepNext/>
       </w:pPr>
-      <w:bookmarkStart w:id="26" w:name="_Toc244148525"/>
+      <w:bookmarkStart w:id="26" w:name="_Toc244150679"/>
       <w:r>
         <w:t>7.1  The residue</w:t>
       </w:r>
@@ -8903,7 +8903,7 @@
           <w:left w:w="10" w:type="dxa"/>
           <w:right w:w="10" w:type="dxa"/>
         </w:tblCellMar>
-        <w:tblLook w:val="04A0" w:firstRow="1" w:lastRow="0" w:firstColumn="1" w:lastColumn="0" w:noHBand="0" w:noVBand="1"/>
+        <w:tblLook w:val="0000" w:firstRow="0" w:lastRow="0" w:firstColumn="0" w:lastColumn="0" w:noHBand="0" w:noVBand="0"/>
       </w:tblPr>
       <w:tblGrid>
         <w:gridCol w:w="2700"/>
@@ -10066,7 +10066,7 @@
         <w:pStyle w:val="Heading2"/>
         <w:keepNext/>
       </w:pPr>
-      <w:bookmarkStart w:id="27" w:name="_Toc244148526"/>
+      <w:bookmarkStart w:id="27" w:name="_Toc244150680"/>
       <w:r>
         <w:t>7.2  The gap is exponential clustering</w:t>
       </w:r>
@@ -12012,7 +12012,7 @@
         <w:pStyle w:val="Heading2"/>
         <w:keepNext/>
       </w:pPr>
-      <w:bookmarkStart w:id="28" w:name="_Toc244148527"/>
+      <w:bookmarkStart w:id="28" w:name="_Toc244150681"/>
       <w:r>
         <w:t>7.3  From the lattice to the limit</w:t>
       </w:r>
@@ -13192,7 +13192,7 @@
         <w:pStyle w:val="Heading2"/>
         <w:keepNext/>
       </w:pPr>
-      <w:bookmarkStart w:id="29" w:name="_Toc244148528"/>
+      <w:bookmarkStart w:id="29" w:name="_Toc244150682"/>
       <w:r>
         <w:t>7.4  The collapse of the components</w:t>
       </w:r>
@@ -13308,7 +13308,7 @@
         <w:pStyle w:val="Heading1"/>
         <w:keepNext/>
       </w:pPr>
-      <w:bookmarkStart w:id="30" w:name="_Toc244148529"/>
+      <w:bookmarkStart w:id="30" w:name="_Toc244150683"/>
       <w:r>
         <w:t>8.  The Ground Handed Over</w:t>
       </w:r>
@@ -13319,7 +13319,7 @@
         <w:pStyle w:val="Heading2"/>
         <w:keepNext/>
       </w:pPr>
-      <w:bookmarkStart w:id="31" w:name="_Toc244148530"/>
+      <w:bookmarkStart w:id="31" w:name="_Toc244150684"/>
       <w:r>
         <w:t>8.1  The object that remains</w:t>
       </w:r>
@@ -13463,7 +13463,7 @@
         <w:pStyle w:val="Heading2"/>
         <w:keepNext/>
       </w:pPr>
-      <w:bookmarkStart w:id="32" w:name="_Toc244148531"/>
+      <w:bookmarkStart w:id="32" w:name="_Toc244150685"/>
       <w:r>
         <w:t>8.2  The instruments in hand</w:t>
       </w:r>
@@ -18598,7 +18598,7 @@
           <w:left w:w="10" w:type="dxa"/>
           <w:right w:w="10" w:type="dxa"/>
         </w:tblCellMar>
-        <w:tblLook w:val="04A0" w:firstRow="1" w:lastRow="0" w:firstColumn="1" w:lastColumn="0" w:noHBand="0" w:noVBand="1"/>
+        <w:tblLook w:val="0000" w:firstRow="0" w:lastRow="0" w:firstColumn="0" w:lastColumn="0" w:noHBand="0" w:noVBand="0"/>
       </w:tblPr>
       <w:tblGrid>
         <w:gridCol w:w="1200"/>
@@ -20442,10 +20442,10 @@
         <w:footnoteReference w:id="68"/>
       </w:r>
       <w:r>
-        <w:t xml:space="preserve"> For the transfer matrix of every finite-group lattice theory: every even-time quadratic form is non-negative; the spectral sum holds; the dominant root is simple and strictly dominant, with its residual law; the string energy is the exact limit of two Perron roots; and there is a mass gap on every finite cross-section, at every coupling. For every finite group acting faithfully by a real orthogonal representation, on every finite cross-section, the static potential of a Wilson loop is at least the mass gap</w:t>
-      </w:r>
-      <w:r>
-        <w:t xml:space="preserve"> of its sector. For the Z₂ theory: Griffiths' inequalities hold, with the monotonicity in the couplings; the infinite-volume Wilson expectation exists; the string tension exists, with its strong-coupling bound; and on a slab of </w:t>
+        <w:t xml:space="preserve"> A Lean formalisation of the strong-coupling gap of the U(n) theories by Dobrushin's method, at a coupling of order 1/(32n(d − 1)), is Douglas and Rajasekaran's (§8.3); the theorems below are a separate development. For the transfer matrix of every finite-group lattice theory: every even-time quadratic form is non-negative; the spectral sum holds; the dominant root is simple and strictly dominant, with its residual law; the string energy is the exact limit of two Perron roots; and there is a mass gap on eve</w:t>
+      </w:r>
+      <w:r>
+        <w:t xml:space="preserve">ry finite cross-section, at every coupling. For every finite group acting faithfully by a real orthogonal representation, on every finite cross-section, the static potential of a Wilson loop is at least the mass gap of its sector. For the Z₂ theory: Griffiths' inequalities hold, with the monotonicity in the couplings; the infinite-volume Wilson expectation exists; the string tension exists, with its strong-coupling bound; and on a slab of </w:t>
       </w:r>
       <w:r>
         <w:rPr>
@@ -20532,7 +20532,7 @@
         <w:pStyle w:val="Heading2"/>
         <w:keepNext/>
       </w:pPr>
-      <w:bookmarkStart w:id="33" w:name="_Toc244148532"/>
+      <w:bookmarkStart w:id="33" w:name="_Toc244150686"/>
       <w:r>
         <w:t>8.3  The reduction</w:t>
       </w:r>
@@ -34250,7 +34250,7 @@
           <w:left w:w="10" w:type="dxa"/>
           <w:right w:w="10" w:type="dxa"/>
         </w:tblCellMar>
-        <w:tblLook w:val="04A0" w:firstRow="1" w:lastRow="0" w:firstColumn="1" w:lastColumn="0" w:noHBand="0" w:noVBand="1"/>
+        <w:tblLook w:val="0000" w:firstRow="0" w:lastRow="0" w:firstColumn="0" w:lastColumn="0" w:noHBand="0" w:noVBand="0"/>
       </w:tblPr>
       <w:tblGrid>
         <w:gridCol w:w="1200"/>
@@ -36537,7 +36537,25 @@
         <w:footnoteReference w:id="81"/>
       </w:r>
       <w:r>
-        <w:t xml:space="preserve"> Theorem 8.7 reaches 0.2452, and Theorem 8.8 0.3739 on ℤ³, both about three times as far, with the rate and the certified constants.</w:t>
+        <w:t xml:space="preserve"> Douglas and Rajasekaran formalised in Lean, for the U(n) theories, the Dobrushin route of Chatterjee's lecture notes, at β &lt; 1/(32n(d − 1)) for the action β Σ</w:t>
+      </w:r>
+      <w:r>
+        <w:rPr>
+          <w:vertAlign w:val="subscript"/>
+        </w:rPr>
+        <w:t>p</w:t>
+      </w:r>
+      <w:r>
+        <w:t xml:space="preserve"> (n − Re Tr U</w:t>
+      </w:r>
+      <w:r>
+        <w:rPr>
+          <w:vertAlign w:val="subscript"/>
+        </w:rPr>
+        <w:t>p</w:t>
+      </w:r>
+      <w:r>
+        <w:t>), which for n = 2 on ℤ⁴ is β &lt; 1/96 in Wilson's normalisation.</w:t>
       </w:r>
       <w:r>
         <w:rPr>
@@ -36546,6 +36564,15 @@
         <w:footnoteReference w:id="82"/>
       </w:r>
       <w:r>
+        <w:t xml:space="preserve"> Theorem 8.7 reaches 0.2452, about three times the first of these thresholds and more than twenty times the second, and Theorem 8.8 reaches 0.3739 on ℤ³, against 1/8 and 1/64 there, with the rate and the certified constants.</w:t>
+      </w:r>
+      <w:r>
+        <w:rPr>
+          <w:rStyle w:val="FootnoteReference"/>
+        </w:rPr>
+        <w:footnoteReference w:id="83"/>
+      </w:r>
+      <w:r>
         <w:t xml:space="preserve"> Dimock's expositions treat the abelian and scalar cases and state every threshold the same way. Within the certified form the next widening is the same theorem in the Wasserstein metric of the three-sphere, whose one-link constant is 1/4, exact in the two symmetric directions and supported to one per cent between them, against total variation's 4/(3π); with the constants proved so far it gains nothing over Theorem 8.7, it is predicted to close near β = 0.30 under two constants not yet proved, and it is ung</w:t>
       </w:r>
       <w:r>
@@ -36568,7 +36595,7 @@
         <w:rPr>
           <w:rStyle w:val="FootnoteReference"/>
         </w:rPr>
-        <w:footnoteReference w:id="83"/>
+        <w:footnoteReference w:id="84"/>
       </w:r>
     </w:p>
     <w:p>
@@ -36576,7 +36603,7 @@
         <w:pStyle w:val="Heading2"/>
         <w:keepNext/>
       </w:pPr>
-      <w:bookmarkStart w:id="34" w:name="_Toc244148533"/>
+      <w:bookmarkStart w:id="34" w:name="_Toc244150687"/>
       <w:r>
         <w:t>8.4  Coda</w:t>
       </w:r>
@@ -36601,7 +36628,7 @@
         <w:pageBreakBefore/>
         <w:spacing w:before="0"/>
       </w:pPr>
-      <w:bookmarkStart w:id="35" w:name="_Toc244148534"/>
+      <w:bookmarkStart w:id="35" w:name="_Toc244150688"/>
       <w:r>
         <w:t>Sources</w:t>
       </w:r>
@@ -37721,10 +37748,96 @@
     </w:p>
     <w:p>
       <w:pPr>
+        <w:spacing w:after="70" w:line="250" w:lineRule="auto"/>
+        <w:ind w:left="540" w:hanging="540"/>
+      </w:pPr>
+      <w:r>
+        <w:rPr>
+          <w:sz w:val="19"/>
+          <w:szCs w:val="19"/>
+        </w:rPr>
+        <w:t>[25]</w:t>
+      </w:r>
+      <w:r>
+        <w:rPr>
+          <w:sz w:val="19"/>
+          <w:szCs w:val="19"/>
+        </w:rPr>
+        <w:tab/>
+      </w:r>
+      <w:r>
+        <w:rPr>
+          <w:sz w:val="19"/>
+          <w:szCs w:val="19"/>
+        </w:rPr>
+        <w:t xml:space="preserve">M. R. Douglas and F. Rajasekaran, </w:t>
+      </w:r>
+      <w:r>
+        <w:rPr>
+          <w:i/>
+          <w:iCs/>
+          <w:sz w:val="19"/>
+          <w:szCs w:val="19"/>
+        </w:rPr>
+        <w:t>lgt — Lattice Gauge Theory in Lean 4</w:t>
+      </w:r>
+      <w:r>
+        <w:rPr>
+          <w:sz w:val="19"/>
+          <w:szCs w:val="19"/>
+        </w:rPr>
+        <w:t>, github.com/mrdouglasny/lgt, headline theorems proved 4 May 2026, version 0.1.0 of 6 September 2026.</w:t>
+      </w:r>
+    </w:p>
+    <w:p>
+      <w:pPr>
+        <w:spacing w:after="70" w:line="250" w:lineRule="auto"/>
+        <w:ind w:left="540" w:hanging="540"/>
+      </w:pPr>
+      <w:r>
+        <w:rPr>
+          <w:sz w:val="19"/>
+          <w:szCs w:val="19"/>
+        </w:rPr>
+        <w:t>[26]</w:t>
+      </w:r>
+      <w:r>
+        <w:rPr>
+          <w:sz w:val="19"/>
+          <w:szCs w:val="19"/>
+        </w:rPr>
+        <w:tab/>
+      </w:r>
+      <w:r>
+        <w:rPr>
+          <w:sz w:val="19"/>
+          <w:szCs w:val="19"/>
+        </w:rPr>
+        <w:t xml:space="preserve">S. Chatterjee, </w:t>
+      </w:r>
+      <w:r>
+        <w:rPr>
+          <w:i/>
+          <w:iCs/>
+          <w:sz w:val="19"/>
+          <w:szCs w:val="19"/>
+        </w:rPr>
+        <w:t>Gauge Theory Lecture Notes</w:t>
+      </w:r>
+      <w:r>
+        <w:rPr>
+          <w:sz w:val="19"/>
+          <w:szCs w:val="19"/>
+        </w:rPr>
+        <w:t xml:space="preserve"> (2026), Chapters 15–16, as cited by [25].</w:t>
+      </w:r>
+    </w:p>
+    <w:p>
+      <w:pPr>
         <w:pStyle w:val="Heading2"/>
         <w:keepNext/>
       </w:pPr>
-      <w:bookmarkStart w:id="36" w:name="_Toc244148535"/>
+      <w:bookmarkStart w:id="36" w:name="_Toc244150689"/>
       <w:r>
         <w:t>Records of the computations of Edwin Boston III</w:t>
       </w:r>
@@ -40753,7 +40866,7 @@
           <w:sz w:val="17"/>
           <w:szCs w:val="17"/>
         </w:rPr>
-        <w:t xml:space="preserve">T. Bałaban, </w:t>
+        <w:t xml:space="preserve">M. R. Douglas and F. Rajasekaran, </w:t>
       </w:r>
       <w:r>
         <w:rPr>
@@ -40762,50 +40875,132 @@
           <w:sz w:val="17"/>
           <w:szCs w:val="17"/>
         </w:rPr>
-        <w:t>Comm. Math. Phys.</w:t>
+        <w:t>lgt — Lattice Gauge Theory in Lean 4</w:t>
       </w:r>
       <w:r>
         <w:rPr>
           <w:sz w:val="17"/>
           <w:szCs w:val="17"/>
         </w:rPr>
-        <w:t xml:space="preserve"> 109 (1987), 249–301: Theorem 1 (p. 259) and Theorem 3 (p. 267), the recursion (0.20) (p. 256), the action (0.2) with the normalised trace (p. 252), read from the pages on 29 October 2026. The statement that the sequence can be kept small in four dimensions, his Theorem 2 (pp. 259–260), is deferred there to "a separate paper"; the four-dimensional stability theorem itself is Theorem 1 of </w:t>
-      </w:r>
-      <w:r>
-        <w:rPr>
-          <w:i/>
-          <w:iCs/>
+        <w:t>, github.com/mrdouglasny/lgt, the headline theorems of LGT/MassGap/StrongCoupling.lean proved on 4 May 2026 (version 0.1.0, 6 September 2026): for U(n) Wilson theory on (ℤ/Nℤ)^d, d ≥ 2, N ≥ 3, and β &lt; 1/(32n(d − 1)), the connected correlation of two plaquette traces is at most 32n²/(1 − α) α</w:t>
+      </w:r>
+      <w:r>
+        <w:rPr>
           <w:sz w:val="17"/>
           <w:szCs w:val="17"/>
-        </w:rPr>
-        <w:t>Large field renormalization II</w:t>
+          <w:vertAlign w:val="superscript"/>
+        </w:rPr>
+        <w:t>(dist − 1)/2</w:t>
       </w:r>
       <w:r>
         <w:rPr>
           <w:sz w:val="17"/>
           <w:szCs w:val="17"/>
         </w:rPr>
-        <w:t xml:space="preserve">, </w:t>
-      </w:r>
-      <w:r>
-        <w:rPr>
-          <w:i/>
-          <w:iCs/>
+        <w:t xml:space="preserve"> with α &lt; 1, uniformly in N; other compact groups in U(n) by an instance. Their action is β Σ(n − Re Tr U</w:t>
+      </w:r>
+      <w:r>
+        <w:rPr>
           <w:sz w:val="17"/>
           <w:szCs w:val="17"/>
-        </w:rPr>
-        <w:t>Comm. Math. Phys.</w:t>
+          <w:vertAlign w:val="subscript"/>
+        </w:rPr>
+        <w:t>p</w:t>
       </w:r>
       <w:r>
         <w:rPr>
           <w:sz w:val="17"/>
           <w:szCs w:val="17"/>
         </w:rPr>
-        <w:t xml:space="preserve"> 122 (1989), 355–392, p. 355, read on 29 October 2026: "If the sequence of the effective coupling constants is contained in an interval ]0, γ] with a sufficiently small positive γ, then the effective densities ρ_k have the form, and satisfy all the conditions and bounds, described in Sect. 2", followed by "Theorem 2 of [I] allows us to remove the assumption … The proof of Theorem 2 … has not been published yet, so we have Theorem 1 with the assumption"; its bibliography names no paper proving Theorem 2.</w:t>
+        <w:t xml:space="preserve">), so their β is one half of Wilson's for n = 2: β &lt; 1/96 on ℤ⁴ and β &lt; 1/64 on ℤ³ in Wilson's normalisation. They cite S. Chatterjee, </w:t>
+      </w:r>
+      <w:r>
+        <w:rPr>
+          <w:i/>
+          <w:iCs/>
+          <w:sz w:val="17"/>
+          <w:szCs w:val="17"/>
+        </w:rPr>
+        <w:t>Gauge Theory Lecture Notes</w:t>
+      </w:r>
+      <w:r>
+        <w:rPr>
+          <w:sz w:val="17"/>
+          <w:szCs w:val="17"/>
+        </w:rPr>
+        <w:t xml:space="preserve"> (2026), Chapters 15–16, for the route.</w:t>
       </w:r>
     </w:p>
   </w:footnote>
   <w:footnote w:id="83">
+    <w:p>
+      <w:pPr>
+        <w:spacing w:after="40" w:line="240" w:lineRule="auto"/>
+      </w:pPr>
+      <w:r>
+        <w:rPr>
+          <w:rStyle w:val="FootnoteReference"/>
+        </w:rPr>
+        <w:footnoteRef/>
+      </w:r>
+      <w:r>
+        <w:rPr>
+          <w:sz w:val="17"/>
+          <w:szCs w:val="17"/>
+        </w:rPr>
+        <w:t xml:space="preserve">T. Bałaban, </w:t>
+      </w:r>
+      <w:r>
+        <w:rPr>
+          <w:i/>
+          <w:iCs/>
+          <w:sz w:val="17"/>
+          <w:szCs w:val="17"/>
+        </w:rPr>
+        <w:t>Comm. Math. Phys.</w:t>
+      </w:r>
+      <w:r>
+        <w:rPr>
+          <w:sz w:val="17"/>
+          <w:szCs w:val="17"/>
+        </w:rPr>
+        <w:t xml:space="preserve"> 109 (1987), 249–301: Theorem 1 (p. 259) and Theorem 3 (p. 267), the recursion (0.20) (p. 256), the action (0.2) with the normalised trace (p. 252), read from the pages on 29 October 2026. The statement that the sequence can be kept small in four dimensions, his Theorem 2 (pp. 259–260), is deferred there to "a separate paper"; the four-dimensional stability theorem itself is Theorem 1 of </w:t>
+      </w:r>
+      <w:r>
+        <w:rPr>
+          <w:i/>
+          <w:iCs/>
+          <w:sz w:val="17"/>
+          <w:szCs w:val="17"/>
+        </w:rPr>
+        <w:t>Large field renormalization II</w:t>
+      </w:r>
+      <w:r>
+        <w:rPr>
+          <w:sz w:val="17"/>
+          <w:szCs w:val="17"/>
+        </w:rPr>
+        <w:t xml:space="preserve">, </w:t>
+      </w:r>
+      <w:r>
+        <w:rPr>
+          <w:i/>
+          <w:iCs/>
+          <w:sz w:val="17"/>
+          <w:szCs w:val="17"/>
+        </w:rPr>
+        <w:t>Comm. Math. Phys.</w:t>
+      </w:r>
+      <w:r>
+        <w:rPr>
+          <w:sz w:val="17"/>
+          <w:szCs w:val="17"/>
+        </w:rPr>
+        <w:t xml:space="preserve"> 122 (1989), 355–392, p. 355, read on 29 October 2026: "If the sequence of the effective coupling constants is contained in an interval ]0, γ] with a sufficiently small positive γ, then the effective densities ρ_k have the form, and satisfy all the conditions and bounds, described in Sect. 2", followed by "Theorem 2 of [I] allows us to remove the assumption … The proof of Theorem 2 … has not been published yet, so we have Theorem 1 with the assumption"; its bibliography names no paper proving Theorem 2.</w:t>
+      </w:r>
+    </w:p>
+  </w:footnote>
+  <w:footnote w:id="84">
     <w:p>
       <w:pPr>
         <w:spacing w:after="40" w:line="240" w:lineRule="auto"/>
@@ -40856,10 +41051,10 @@
 <file path=word/numbering.xml><?xml version="1.0" encoding="utf-8"?>
 <w:numbering xmlns:wpc="http://schemas.microsoft.com/office/word/2010/wordprocessingCanvas" xmlns:cx="http://schemas.microsoft.com/office/drawing/2014/chartex" xmlns:cx1="http://schemas.microsoft.com/office/drawing/2015/9/8/chartex" xmlns:cx2="http://schemas.microsoft.com/office/drawing/2015/10/21/chartex" xmlns:cx3="http://schemas.microsoft.com/office/drawing/2016/5/9/chartex" xmlns:cx4="http://schemas.microsoft.com/office/drawing/2016/5/10/chartex" xmlns:cx5="http://schemas.microsoft.com/office/drawing/2016/5/11/chartex" xmlns:cx6="http://schemas.microsoft.com/office/drawing/2016/5/12/chartex" xmlns:cx7="http://schemas.microsoft.com/office/drawing/2016/5/13/chartex" xmlns:cx8="http://schemas.microsoft.com/office/drawing/2016/5/14/chartex" xmlns:mc="http://schemas.openxmlformats.org/markup-compatibility/2006" xmlns:aink="http://schemas.microsoft.com/office/drawing/2016/ink" xmlns:am3d="http://schemas.microsoft.com/office/drawing/2017/model3d" xmlns:o="urn:schemas-microsoft-com:office:office" xmlns:oel="http://schemas.microsoft.com/office/2019/extlst" xmlns:r="http://schemas.openxmlformats.org/officeDocument/2006/relationships" xmlns:m="http://schemas.openxmlformats.org/officeDocument/2006/math" xmlns:v="urn:schemas-microsoft-com:vml" xmlns:wp14="http://schemas.microsoft.com/office/word/2010/wordprocessingDrawing" xmlns:wp="http://schemas.openxmlformats.org/drawingml/2006/wordprocessingDrawing" xmlns:w10="urn:schemas-microsoft-com:office:word" xmlns:w="http://schemas.openxmlformats.org/wordprocessingml/2006/main" xmlns:w14="http://schemas.microsoft.com/office/word/2010/wordml" xmlns:w15="http://schemas.microsoft.com/office/word/2012/wordml" xmlns:w16cex="http://schemas.microsoft.com/office/word/2018/wordml/cex" xmlns:w16cid="http://schemas.microsoft.com/office/word/2016/wordml/cid" xmlns:w16="http://schemas.microsoft.com/office/word/2018/wordml" xmlns:w16du="http://schemas.microsoft.com/office/word/2023/wordml/word16du" xmlns:w16sdtdh="http://schemas.microsoft.com/office/word/2020/wordml/sdtdatahash" xmlns:w16sdtfl="http://schemas.microsoft.com/office/word/2024/wordml/sdtformatlock" xmlns:w16se="http://schemas.microsoft.com/office/word/2015/wordml/symex" xmlns:wpg="http://schemas.microsoft.com/office/word/2010/wordprocessingGroup" xmlns:wpi="http://schemas.microsoft.com/office/word/2010/wordprocessingInk" xmlns:wne="http://schemas.microsoft.com/office/word/2006/wordml" xmlns:wps="http://schemas.microsoft.com/office/word/2010/wordprocessingShape" mc:Ignorable="w14 w15 w16se w16cid w16 w16cex w16sdtdh w16sdtfl w16du wp14">
   <w:abstractNum w:abstractNumId="0" w15:restartNumberingAfterBreak="0">
-    <w:nsid w:val="4D98772F"/>
+    <w:nsid w:val="139570D2"/>
     <w:multiLevelType w:val="hybridMultilevel"/>
-    <w:tmpl w:val="75689C92"/>
-    <w:lvl w:ilvl="0" w:tplc="152CB176">
+    <w:tmpl w:val="BDC81582"/>
+    <w:lvl w:ilvl="0" w:tplc="70001A24">
       <w:start w:val="1"/>
       <w:numFmt w:val="bullet"/>
       <w:lvlText w:val="●"/>
@@ -40868,7 +41063,7 @@
         <w:ind w:left="720" w:hanging="360"/>
       </w:pPr>
     </w:lvl>
-    <w:lvl w:ilvl="1" w:tplc="820C7666">
+    <w:lvl w:ilvl="1" w:tplc="45B6EC0E">
       <w:start w:val="1"/>
       <w:numFmt w:val="bullet"/>
       <w:lvlText w:val="○"/>
@@ -40877,7 +41072,7 @@
         <w:ind w:left="1440" w:hanging="360"/>
       </w:pPr>
     </w:lvl>
-    <w:lvl w:ilvl="2" w:tplc="822C3232">
+    <w:lvl w:ilvl="2" w:tplc="824619C8">
       <w:start w:val="1"/>
       <w:numFmt w:val="bullet"/>
       <w:lvlText w:val="■"/>
@@ -40886,7 +41081,7 @@
         <w:ind w:left="2160" w:hanging="360"/>
       </w:pPr>
     </w:lvl>
-    <w:lvl w:ilvl="3" w:tplc="F356D542">
+    <w:lvl w:ilvl="3" w:tplc="622A5FBC">
       <w:start w:val="1"/>
       <w:numFmt w:val="bullet"/>
       <w:lvlText w:val="●"/>
@@ -40895,7 +41090,7 @@
         <w:ind w:left="2880" w:hanging="360"/>
       </w:pPr>
     </w:lvl>
-    <w:lvl w:ilvl="4" w:tplc="CF56BB68">
+    <w:lvl w:ilvl="4" w:tplc="3BC67810">
       <w:start w:val="1"/>
       <w:numFmt w:val="bullet"/>
       <w:lvlText w:val="○"/>
@@ -40904,7 +41099,7 @@
         <w:ind w:left="3600" w:hanging="360"/>
       </w:pPr>
     </w:lvl>
-    <w:lvl w:ilvl="5" w:tplc="07FA5E98">
+    <w:lvl w:ilvl="5" w:tplc="5AB2EE58">
       <w:start w:val="1"/>
       <w:numFmt w:val="bullet"/>
       <w:lvlText w:val="■"/>
@@ -40913,7 +41108,7 @@
         <w:ind w:left="4320" w:hanging="360"/>
       </w:pPr>
     </w:lvl>
-    <w:lvl w:ilvl="6" w:tplc="7952CB4C">
+    <w:lvl w:ilvl="6" w:tplc="6C70A292">
       <w:start w:val="1"/>
       <w:numFmt w:val="bullet"/>
       <w:lvlText w:val="●"/>
@@ -40922,7 +41117,7 @@
         <w:ind w:left="5040" w:hanging="360"/>
       </w:pPr>
     </w:lvl>
-    <w:lvl w:ilvl="7" w:tplc="B1E64552">
+    <w:lvl w:ilvl="7" w:tplc="631EF31E">
       <w:start w:val="1"/>
       <w:numFmt w:val="bullet"/>
       <w:lvlText w:val="●"/>
@@ -40931,7 +41126,7 @@
         <w:ind w:left="5760" w:hanging="360"/>
       </w:pPr>
     </w:lvl>
-    <w:lvl w:ilvl="8" w:tplc="DB5A9FD0">
+    <w:lvl w:ilvl="8" w:tplc="4FCCB428">
       <w:start w:val="1"/>
       <w:numFmt w:val="bullet"/>
       <w:lvlText w:val="●"/>
@@ -40941,7 +41136,7 @@
       </w:pPr>
     </w:lvl>
   </w:abstractNum>
-  <w:num w:numId="1" w16cid:durableId="1322391766">
+  <w:num w:numId="1" w16cid:durableId="897713605">
     <w:abstractNumId w:val="0"/>
     <w:lvlOverride w:ilvl="0">
       <w:startOverride w:val="1"/>
@@ -41538,7 +41733,7 @@
     <w:autoRedefine/>
     <w:uiPriority w:val="39"/>
     <w:unhideWhenUsed/>
-    <w:rsid w:val="00FB6ABA"/>
+    <w:rsid w:val="00697C5E"/>
     <w:pPr>
       <w:spacing w:after="100"/>
     </w:pPr>
@@ -41550,7 +41745,7 @@
     <w:autoRedefine/>
     <w:uiPriority w:val="39"/>
     <w:unhideWhenUsed/>
-    <w:rsid w:val="00FB6ABA"/>
+    <w:rsid w:val="00697C5E"/>
     <w:pPr>
       <w:spacing w:after="100"/>
       <w:ind w:left="220"/>

</xml_diff>